<commit_message>
Draft_053: broader Stage 1 retention; Working Test as EC diagnostic only
</commit_message>
<xml_diff>
--- a/thesis/003_ThesisProposal_Draft_053.docx
+++ b/thesis/003_ThesisProposal_Draft_053.docx
@@ -1004,7 +1004,7 @@
           <w:szCs w:val="22"/>
           <w:rtl w:val="0"/>
         </w:rPr>
-        <w:t>3. Among the hedging devices retained under the Working Test, what rhetorical functions do they serve?</w:t>
+        <w:t>3. Among the hedging devices retained at Stage 1, what rhetorical functions (EC, P, DO) do they serve?</w:t>
       </w:r>
       <w:r>
         <w:rPr>
@@ -1134,7 +1134,7 @@
           <w:szCs w:val="22"/>
           <w:rtl w:val="0"/>
         </w:rPr>
-        <w:t>In practice, the coding scheme was adapted from Hyland (1998) and operationalized through the decision rules presented in Appendix A. The coding was applied in three sequential stages. First, each abstract was read holistically before any marking occurred to ensure that coding decisions were grounded in discourse context rather than keyword recognition. Second, each potential hedge was classified by type based on the decision rules in Appendix A. These types included modal verb, lexical hedge, adverbial hedge, and clause-level hedge. Third, each confirmed hedge was assigned a functional category: epistemic caution, politeness, or discourse organization. This three-stage sequence ensured that type and function were coded independently, allowing type-function pairings to be inspected. In this corpus all coded hedges were Epistemic Caution under the Working Test, so the cross-tab does not differentiate functions. RQ3 is therefore answered as a finding about the adapted scheme (what the screen retains and how it is classified), not as an open survey of rhetorical functions independent of the identification procedure. RQ4 is answered from frequency and functional patterns as a whole.</w:t>
+        <w:t>In practice, the coding scheme was adapted from Hyland (1998) and operationalized through the decision rules presented in Appendix A. The coding was applied in three sequential stages. First, each abstract was read holistically before any marking occurred to ensure that coding decisions were grounded in discourse context rather than keyword recognition. Second, each potential hedge was classified by type based on the decision rules in Appendix A. These types included modal verb, lexical hedge, adverbial hedge, and clause-level hedge. Third, each confirmed hedge was assigned a functional category: epistemic caution, politeness, or discourse organization. This three-stage sequence ensured that type and function were coded independently, allowing type-function pairings to be inspected. In this corpus all retained hedges were coded Epistemic Caution at Stage 2, so the cross-tab does not differentiate functions. RQ3 reports the functional profile of the Stage 1 retained set in this sample. No P candidates occurred; sequence-only DO was excluded. RQ4 is answered from frequency and functional patterns as a whole.</w:t>
       </w:r>
       <w:r>
         <w:rPr>
@@ -1155,7 +1155,7 @@
           <w:sz w:val="22"/>
           <w:szCs w:val="22"/>
         </w:rPr>
-        <w:t xml:space="preserve">Functional labels in this study (Epistemic Caution, Politeness/Deference, and Discourse Organization) are used for classification after a token is retained. They are not treated as mutually exclusive categories in the wider literature. Interpersonal or deferential wording can overlap with epistemic stance in context. Retention depends on the Working Test: the item must change the epistemic weight of the claim. Interpersonal coloring alone is not enough. Discourse-organizing expressions are not ruled out in advance, but they are retained only when their use in context changes commitment to the proposition. Expressions that only sequence, label, or direct attention are not classified as hedges. This inclusion rule is consistent with Crompton (1997), who defines a hedge as language that explicitly qualifies the writer's lack of commitment to the truth of a proposition, and who tests for hedging by asking whether the proposition can be restated with greater author commitment without changing its content. Crompton argues that the term hedge is most useful when reserved for such epistemic provisionality on knowledge claims, rather than extended to politeness-related features such as passives, impersonal constructions, or emotion-projecting lexis as such. The present study does not adopt Crompton's full taxonomy. It uses that argument only to support an epistemically focused identification screen.</w:t>
+        <w:t xml:space="preserve">Functional labels in this study (Epistemic Caution, Politeness/Deference, and Discourse Organization) are assigned after a token is retained at Stage 1. They are not mutually exclusive: interpersonal or discourse effects can co-occur with epistemic stance. Stage 1 retention asks whether removing the expression makes the writer's claim or positioning more categorical, more direct, or more imposing in context. That gate admits epistemic, politeness, and discourse-managing mitigation. Stage 2 labels the retained item EC, P, and/or DO by dominant function. The Working Test (does removing the device change commitment to the truth of the proposition?) is used as an EC diagnostic at Stage 2, not as the sole entry ticket for all hedges. Expressions that only sequence moves (e.g., pure Therefore / Hence as connectives), name a research object, or mark capability or obligation remain excluded. This keeps the scheme inclusive of P and DO without treating every soft-sounding word as a hedge. Crompton (1997) still informs the EC diagnostic: a proposition restatable with greater author commitment signals reduced epistemic weight content. Crompton argues that the term hedge is most useful when reserved for such epistemic provisionality on knowledge claims, rather than extended to politeness-related features such as passives, impersonal constructions, or emotion-projecting lexis as such. The present study does not adopt Crompton's full taxonomy. It uses that argument only to support an epistemically focused identification screen.</w:t>
       </w:r>
     </w:p>
     <w:p>
@@ -2068,7 +2068,7 @@
           <w:szCs w:val="22"/>
           <w:rtl w:val="0"/>
         </w:rPr>
-        <w:t xml:space="preserve">conceptually, epistemic weight is the strength of the writer’s commitment to the truth of a proposition (how certain or tentative the claim is). Operationally, the Working Test treats a change in epistemic weight as the criterion for coding a hedge.</w:t>
+        <w:t xml:space="preserve">conceptually, epistemic weight is the strength of the writer’s commitment to the truth of a proposition (how certain or tentative the claim is). Operationally, a change in epistemic weight supports an EC function label at Stage 2; Stage 1 retention uses the broader force / directness / imposition test.</w:t>
       </w:r>
       <w:r>
         <w:rPr>
@@ -2406,7 +2406,7 @@
           <w:szCs w:val="22"/>
           <w:rtl w:val="0"/>
         </w:rPr>
-        <w:t xml:space="preserve">conceptually, softening is the reduction of force, directness, imposition, or interpersonal impact in a statement. Operationally, softening may be epistemic, interpersonal, or discourse-managing; only epistemic softening that changes epistemic weight counts as a hedge under this study’s Working Test.</w:t>
+        <w:t xml:space="preserve">conceptually, softening is the reduction of force, directness, imposition, or interpersonal impact in a statement. Operationally, Stage 1 retention tracks softening of force, directness, or imposition; Stage 2 sorts epistemic (EC), interpersonal (P), and discourse-managing (DO) uses.</w:t>
       </w:r>
       <w:r>
         <w:rPr>
@@ -9881,7 +9881,7 @@
           <w:szCs w:val="22"/>
           <w:rtl w:val="0"/>
         </w:rPr>
-        <w:t xml:space="preserve">All 65 tokens retained as hedges under the Working Test were coded Epistemic Caution (EC). None of those retained tokens were assigned Politeness/Deference (P) or Discourse Organization (DO). Discourse connectors such as Hence, Thus, Therefore, and In conclusion appear in the corpus and are tagged (DO) in Appendix C but are not counted as hedges when they do not change the epistemic weight of a claim. Table 6 presents the function distribution among retained hedges.</w:t>
+        <w:t xml:space="preserve">All 65 tokens retained as hedges were coded Epistemic Caution (EC). None of those retained tokens were assigned Politeness/Deference (P) or Discourse Organization (DO). Discourse connectors such as Hence, Thus, Therefore, and In conclusion appear in the corpus and are tagged (DO) in Appendix C but are not counted as hedges when they do not change the epistemic weight of a claim. Table 6 presents the function distribution among retained hedges.</w:t>
       </w:r>
       <w:r>
         <w:rPr>
@@ -10482,7 +10482,7 @@
           <w:sz w:val="22"/>
           <w:szCs w:val="22"/>
         </w:rPr>
-        <w:t xml:space="preserve">No retained hedge was independently labeled Politeness or Discourse Organization. That is the functional profile of the 65 tokens that passed the Working Test, not evidence that P or DO mitigation is absent from PSAU student writing. Discourse connectors such as Hence, Thus, Therefore, and In conclusion appear in the corpus and are logged as DO in Appendix C, but they do not change epistemic weight and are not counted as hedges. No politeness/deference devices were found even as non-hedge candidates. The Working Test is epistemically focused by design: softening that does not alter commitment is excluded before function labeling. Genre compression may also limit space for interactional mitigation. The data cannot separate a coding effect from a genre effect. Both remain plausible. That limitation is noted in Scope. The result should be read as: within an epistemically defined hedge set, Epistemic Caution was the sole independently coded function.</w:t>
+        <w:t xml:space="preserve">No retained hedge was independently labeled Politeness or Discourse Organization. Under Stage 1, P-only and framing-DO items could in principle be retained; in this corpus no P forms appeared, and DO items that only sequence moves stayed out. Discourse connectors such as Hence, Thus, Therefore, and In conclusion are logged in Appendix C but were not counted as hedges. The 100% EC result is therefore the functional profile of the retained set in this sample, not a claim that P or DO mitigation is impossible in student writing. Genre compression may also limit interactional mitigation in abstracts. That limitation is noted in Scope.</w:t>
       </w:r>
     </w:p>
     <w:p>
@@ -11549,7 +11549,7 @@
           <w:szCs w:val="22"/>
           <w:rtl w:val="0"/>
         </w:rPr>
-        <w:t>Lexical hedges outnumber modal verbs in this corpus, largely because of the high frequency of potential in recurring frames. Density is highest in Agriculture and Biology (near-tied), then Veterinary Medicine, with 25 of 60 abstracts (41.7%) containing no coded hedges. Under the Working Test, every retained hedge was coded as Epistemic Caution. The screen itself selects for tokens that change epistemic weight, so a single function label is partly built into the method. Full counts and tests are reported in Parts I–III.</w:t>
+        <w:t>Lexical hedges outnumber modal verbs in this corpus, largely because of the high frequency of potential in recurring frames. Density is highest in Agriculture and Biology (near-tied), then Veterinary Medicine, with 25 of 60 abstracts (41.7%) containing no coded hedges. Every retained hedge was coded as Epistemic Caution at Stage 2. No P candidates appeared in the corpus; sequence-only DO was not counted. The functional result describes this sample’s retained set under the Stage 1–2 procedure. Full counts and tests are reported in Parts I–III.</w:t>
       </w:r>
       <w:r>
         <w:rPr>
@@ -11772,7 +11772,7 @@
           <w:sz w:val="22"/>
           <w:szCs w:val="22"/>
         </w:rPr>
-        <w:t xml:space="preserve">Future research could adopt a broader mitigation coding scheme to study interpersonal and discourse-organizing functions alongside epistemic ones. This study defined hedging as epistemic stance management, drawing mainly on Hyland (1998) and Salager-Meyer (1994), and applied the Working Test so that retained hedges are those that change the epistemic weight of a claim. That focus aligns with Crompton (1997) in reserving hedge for explicit qualification of commitment to a proposition. All retained hedges were coded Epistemic Caution under that screen. The uniform function label is therefore partly a result of how hedges were identified, not a claim that Politeness or Discourse Organization never appear in developing-researcher writing. A future study could code mitigation more broadly, including devices that soften or qualify claims even when they do not pass a strict epistemic filter, and then classify epistemic, politeness, and discourse-organizing uses under that wider net. Such work would test whether interactional and textual mitigation appear in the abstract genre when the coding scheme is designed to capture them.</w:t>
+        <w:t xml:space="preserve">This study’s Stage 1 gate admits force, directness, and imposition reduction so that P and DO are not excluded by definition. In this sample, retained tokens were still all EC at Stage 2. Future work could apply the same Stage 1–2 scheme to full thesis chapters or expert abstracts, where interpersonal and discourse-managing mitigation may appear more often than in compressed undergraduate abstracts.</w:t>
       </w:r>
     </w:p>
     <w:p>
@@ -13286,7 +13286,7 @@
           <w:szCs w:val="22"/>
           <w:rtl w:val="0"/>
         </w:rPr>
-        <w:t xml:space="preserve">Ability, future procedure, and necessity (must / should in procedural contexts) are never hedges. Working Test: if removing the device does not change how certain or tentative the claim is, it is not a hedge. Worked examples for EC, P, and DO (pass and fail) appear under Working Examples in the full codebook below.</w:t>
+        <w:t xml:space="preserve">Ability, future procedure, and necessity (must / should in procedural contexts) are never hedges. Stage 1: retain if removing the device makes the claim or positioning more categorical, direct, or imposing. Working Test: used at Stage 2 to support EC when commitment to the proposition changes. Worked examples appear under Working Examples in the full codebook below.</w:t>
       </w:r>
       <w:r>
         <w:rPr>
@@ -15914,7 +15914,7 @@
           <w:szCs w:val="22"/>
           <w:rtl w:val="0"/>
         </w:rPr>
-        <w:t xml:space="preserve">If removing a device does not change the epistemic weight of the claim (how certain or tentative it is), it is not a hedge. This includes phrases that only point to evidence for a claim already asserted elsewhere in the sentence (e.g., </w:t>
+        <w:t xml:space="preserve">Stage 1 (retention). Retain an expression if removing it makes the writer's claim or positioning more categorical, more direct, or more imposing in context. This gate is inclusive of epistemic, politeness, and discourse-managing mitigation. Capability, obligation, pure procedure, pure move sequencing, and topic-naming without force reduction remain out. Stage 2 (function). Label each retained item EC, P, and/or DO by dominant function. Co-occurrence is allowed. Working Test (EC diagnostic). For distinguishing epistemic effect, ask whether removing the device changes commitment to the truth of the proposition. Use this to support an EC label, not as the only Stage 1 membership test. Phrases that only point to evidence for a claim already asserted elsewhere (e.g., "as indicated by X") still fail Stage 1 when they do not reduce force, directness, or imposition.</w:t>
       </w:r>
       <w:r>
         <w:rPr>
@@ -15928,21 +15928,21 @@
           <w:szCs w:val="22"/>
           <w:rtl w:val="0"/>
         </w:rPr>
-        <w:t xml:space="preserve">“as indicated by X”</w:t>
-      </w:r>
-      <w:r>
-        <w:rPr>
-          <w:rFonts w:ascii="Georgia" w:cs="Georgia" w:eastAsia="Georgia" w:hAnsi="Georgia"/>
-          <w:b w:val="0"/>
-          <w:bCs w:val="0"/>
-          <w:i w:val="0"/>
-          <w:iCs w:val="0"/>
-          <w:color w:val="000000"/>
-          <w:sz w:val="22"/>
-          <w:szCs w:val="22"/>
-          <w:rtl w:val="0"/>
-        </w:rPr>
-        <w:t xml:space="preserve">) rather than expressing uncertainty about the claim itself.</w:t>
+        <w:t xml:space="preserve"/>
+      </w:r>
+      <w:r>
+        <w:rPr>
+          <w:rFonts w:ascii="Georgia" w:cs="Georgia" w:eastAsia="Georgia" w:hAnsi="Georgia"/>
+          <w:b w:val="0"/>
+          <w:bCs w:val="0"/>
+          <w:i w:val="0"/>
+          <w:iCs w:val="0"/>
+          <w:color w:val="000000"/>
+          <w:sz w:val="22"/>
+          <w:szCs w:val="22"/>
+          <w:rtl w:val="0"/>
+        </w:rPr>
+        <w:t xml:space="preserve"/>
       </w:r>
       <w:r>
         <w:rPr>
@@ -15968,7 +15968,7 @@
           <w:szCs w:val="22"/>
           <w:rtl w:val="0"/>
         </w:rPr>
-        <w:t xml:space="preserve">Softening is broader than epistemic qualification. A device may soften presentation interpersonally or guide the reader without changing how certain the claim is. The Working Test counts only expressions that change epistemic weight (commitment to the proposition). P-only or DO-only softening that leaves certainty unchanged is not coded as a hedge.</w:t>
+        <w:t xml:space="preserve">Softening is broader than epistemic qualification. Stage 1 admits softening of force, directness, or imposition, including interpersonal and discourse-managing uses. The Working Test then helps decide whether a retained item is EC (commitment to the proposition changes) as opposed to primarily P or DO. P-only or DO-only items can be retained at Stage 1 when they reduce imposition or frame uptake, even if certainty is unchanged.</w:t>
       </w:r>
       <w:r>
         <w:rPr>
@@ -16103,7 +16103,7 @@
           <w:szCs w:val="22"/>
           <w:rtl w:val="0"/>
         </w:rPr>
-        <w:t xml:space="preserve">Coding order: read the sentence in full, check Decision Rules, apply the Working Test if unresolved, and log any case that still can’t be resolved in Coder Notes rather than guessing.</w:t>
+        <w:t xml:space="preserve">Coding order: read the sentence in full, apply Stage 1 (force / directness / imposition), check Decision Rules and false-positive exclusions, assign Stage 2 function (EC, P, and/or DO), use the Working Test when deciding whether EC applies, and log unresolved cases in Coder Notes rather than guessing.</w:t>
       </w:r>
       <w:r>
         <w:rPr>
@@ -16129,7 +16129,7 @@
           <w:szCs w:val="22"/>
           <w:rtl w:val="0"/>
         </w:rPr>
-        <w:t xml:space="preserve">WORKING EXAMPLES: EC, P, AND DO UNDER THE WORKING TEST</w:t>
+        <w:t xml:space="preserve">WORKING EXAMPLES: STAGE 1 RETENTION AND STAGE 2 FUNCTION (EC, P, DO)</w:t>
       </w:r>
       <w:r>
         <w:rPr>
@@ -16156,7 +16156,7 @@
           <w:szCs w:val="22"/>
           <w:rtl w:val="0"/>
         </w:rPr>
-        <w:t xml:space="preserve">Function labels (EC, P, DO) are applied only after a token passes the hedge screen. P or DO alone does not make an expression a hedge. The Working Test asks whether removing the expression changes the epistemic weight of the proposition. The examples below separate interpersonal or discourse function from hedge status.</w:t>
+        <w:t xml:space="preserve">Function labels (EC, P, DO) are applied after Stage 1 retention. Stage 1 asks whether removing the expression makes the claim or positioning more categorical, direct, or imposing. The Working Test asks whether commitment to the proposition’s truth changes; it supports EC labeling and does not by itself bar P or DO. The examples below separate retention from function.</w:t>
       </w:r>
       <w:r>
         <w:rPr>
@@ -16234,7 +16234,7 @@
           <w:szCs w:val="22"/>
           <w:rtl w:val="0"/>
         </w:rPr>
-        <w:t xml:space="preserve">Politeness / Deference (P) without epistemic change. “As suggested by previous researchers, the treatment is effective.” Removing As suggested by previous researchers changes interpersonal positioning, not the certainty of the treatment is effective. Working Test: fail. May be noted as P in a scan log; not counted as a hedge.</w:t>
+        <w:t xml:space="preserve">Politeness / Deference (P), Stage 1 pass possible. “As suggested by previous researchers, the treatment is effective.” Removing As suggested by previous researchers makes the claim more direct and less deferential. Stage 1: pass (reduced imposition). Working Test for EC: fail (certainty unchanged). Stage 2: P, not EC. Count as a hedge/mitigation device with function P.</w:t>
       </w:r>
       <w:r>
         <w:rPr>
@@ -16260,7 +16260,7 @@
           <w:szCs w:val="22"/>
           <w:rtl w:val="0"/>
         </w:rPr>
-        <w:t xml:space="preserve">Both P and EC (pass as hedge). “We would suggest that the treatment may be less effective than earlier reports claimed.” Removing would suggest / may raises certainty and hardens the criticism of earlier work. Working Test: pass. Code as hedge; function EC, with politeness co-occurring (deference and softened disagreement). Contrast with the P-only example above, where certainty does not change.</w:t>
+        <w:t xml:space="preserve">Both P and EC (Stage 1 pass; Stage 2 EC with P co-occurring). “We would suggest that the treatment may be less effective than earlier reports claimed.” Removing would suggest / may makes the criticism more categorical and more imposing. Stage 1: pass. Working Test for EC: pass. Stage 2: EC primary, P co-occurring (deference and softened disagreement).</w:t>
       </w:r>
       <w:r>
         <w:rPr>
@@ -16286,7 +16286,7 @@
           <w:szCs w:val="22"/>
           <w:rtl w:val="0"/>
         </w:rPr>
-        <w:t xml:space="preserve">Discourse Organization (DO) without epistemic change. “It should be noted that the treatment increased plant height.” Removing It should be noted that directs attention only; the finding remains equally certain. Working Test: fail. Tag DO in the scan log if useful; not counted as a hedge. The same applies to Thus, Therefore, Hence, and In conclusion when they only sequence moves.</w:t>
+        <w:t xml:space="preserve">Discourse Organization (DO), Stage 1 pass when framing uptake. “It should be noted that the treatment increased plant height.” Removing It should be noted that removes reader guidance and can make the point land more bluntly. Stage 1: pass if the phrase frames how the claim is taken. Working Test for EC: fail. Stage 2: DO. Pure sequence markers (Thus, Therefore, Hence, In conclusion) that only order moves still fail Stage 1 and are not counted.</w:t>
       </w:r>
       <w:r>
         <w:rPr>
@@ -16338,7 +16338,7 @@
           <w:szCs w:val="22"/>
           <w:rtl w:val="0"/>
         </w:rPr>
-        <w:t xml:space="preserve">Summary rule. P-only or DO-only expressions that do not change propositional certainty are not hedges under this codebook. Expressions that change certainty are retained as hedges and then labeled EC, P, or DO by dominant function. In this corpus, every retained token was labeled EC.</w:t>
+        <w:t xml:space="preserve">Summary rule. Stage 1 can retain P-only or DO-only items when they reduce force, directness, or imposition even if certainty is unchanged. Stage 2 labels EC, P, and/or DO. The Working Test supports EC, not exclusive membership. In this corpus, every token retained in the coded set was labeled EC; no P candidates appeared in the abstracts, and sequence-only DO markers were not counted as hedges.</w:t>
       </w:r>
       <w:r>
         <w:rPr>

</xml_diff>

<commit_message>
Draft_053: ripple-fix residual Working Test-as-sole-gate language
</commit_message>
<xml_diff>
--- a/thesis/003_ThesisProposal_Draft_053.docx
+++ b/thesis/003_ThesisProposal_Draft_053.docx
@@ -1155,7 +1155,7 @@
           <w:sz w:val="22"/>
           <w:szCs w:val="22"/>
         </w:rPr>
-        <w:t xml:space="preserve">Functional labels in this study (Epistemic Caution, Politeness/Deference, and Discourse Organization) are assigned after a token is retained at Stage 1. They are not mutually exclusive: interpersonal or discourse effects can co-occur with epistemic stance. Stage 1 retention asks whether removing the expression makes the writer's claim or positioning more categorical, more direct, or more imposing in context. That gate admits epistemic, politeness, and discourse-managing mitigation. Stage 2 labels the retained item EC, P, and/or DO by dominant function. The Working Test (does removing the device change commitment to the truth of the proposition?) is used as an EC diagnostic at Stage 2, not as the sole entry ticket for all hedges. Expressions that only sequence moves (e.g., pure Therefore / Hence as connectives), name a research object, or mark capability or obligation remain excluded. This keeps the scheme inclusive of P and DO without treating every soft-sounding word as a hedge. Crompton (1997) still informs the EC diagnostic: a proposition restatable with greater author commitment signals reduced epistemic weight content. Crompton argues that the term hedge is most useful when reserved for such epistemic provisionality on knowledge claims, rather than extended to politeness-related features such as passives, impersonal constructions, or emotion-projecting lexis as such. The present study does not adopt Crompton's full taxonomy. It uses that argument only to support an epistemically focused identification screen.</w:t>
+        <w:t xml:space="preserve">Functional labels in this study (Epistemic Caution, Politeness/Deference, and Discourse Organization) are assigned after a token is retained at Stage 1. They are not mutually exclusive: interpersonal or discourse effects can co-occur with epistemic stance. Stage 1 retention asks whether removing the expression makes the writer's claim or positioning more categorical, more direct, or more imposing in context. That gate admits epistemic, politeness, and discourse-managing mitigation. Stage 2 labels the retained item EC, P, and/or DO by dominant function. The Working Test (does removing the device change commitment to the truth of the proposition?) is used as an EC diagnostic at Stage 2, not as the sole entry ticket for all hedges. Expressions that only sequence moves (e.g., pure Therefore / Hence as connectives), name a research object, or mark capability or obligation remain excluded. This keeps the scheme inclusive of P and DO without treating every soft-sounding word as a hedge. Crompton (1997) still informs the EC diagnostic: a proposition restatable with greater author commitment signals reduced epistemic weight content. Crompton argues that the term hedge is most useful when reserved for such epistemic provisionality on knowledge claims, rather than extended to politeness-related features such as passives, impersonal constructions, or emotion-projecting lexis as such. The present study does not adopt Crompton's full taxonomy. It uses that argument to support the EC diagnostic at Stage 2, not as the sole Stage 1 retention rule.</w:t>
       </w:r>
     </w:p>
     <w:p>
@@ -1550,7 +1550,7 @@
           <w:rFonts w:ascii="Georgia" w:hAnsi="Georgia" w:cs="Georgia" w:eastAsia="Georgia"/>
           <w:rtl w:val="0"/>
         </w:rPr>
-        <w:t xml:space="preserve">Reliability was assessed through intra-rater agreement only. A second coder was not available for inter-rater reliability testing, which limits how far the coding scheme can be verified against an independent application of the same decision rules. That limit bears especially on the functional findings in Part III. Assigning all 65 retained hedges to Epistemic Caution may reflect one coder’s frame as much as a property of the corpus. Inter-rater coding on at least a subset of the corpus is needed before those functional results can be treated as established. Related work could also code mitigation more broadly, without the epistemic-only filter used here.</w:t>
+        <w:t xml:space="preserve">Reliability was assessed through intra-rater agreement only. A second coder was not available for inter-rater reliability testing, which limits how far the coding scheme can be verified against an independent application of the same decision rules. That limit bears especially on the functional findings in Part III. Assigning all 65 retained hedges to Epistemic Caution may reflect one coder’s frame as much as a property of the corpus. Inter-rater coding on at least a subset of the corpus is needed before those functional results can be treated as established. Related work could apply the same Stage 1–2 scheme to longer genres where P and DO may appear more often.</w:t>
       </w:r>
     </w:p>
     <w:p>
@@ -1565,7 +1565,7 @@
           <w:rFonts w:ascii="Georgia" w:hAnsi="Georgia" w:cs="Georgia" w:eastAsia="Georgia"/>
           <w:rtl w:val="0"/>
         </w:rPr>
-        <w:t xml:space="preserve">The study also lacks a comparable expert-abstract corpus against which to compare the functional findings. Among retained hedges, no tokens were independently labeled Politeness or Discourse Organization. That result describes the epistemically screened set, not the absence of interpersonal or discourse mitigation from student writing overall. Genre compression in abstracts and the Working Test’s epistemic filter are both plausible accounts. Expert abstracts in the same three disciplines, coded with the same scheme and with a broader mitigation screen for comparison, would help separate genre effects, method effects, and writer-competence effects.</w:t>
+        <w:t xml:space="preserve">The study also lacks a comparable expert-abstract corpus against which to compare the functional findings. Among retained hedges, no tokens were independently labeled Politeness or Discourse Organization. That result describes the retained set in this sample, not the absence of interpersonal or discourse mitigation from student writing overall. Genre compression in abstracts is a plausible account of why P and framing-DO items did not appear. Expert abstracts in the same three disciplines, coded with the same Stage 1–2 scheme, would help separate genre effects from writer-competence effects.</w:t>
       </w:r>
     </w:p>
     <w:p>
@@ -8175,7 +8175,7 @@
           <w:szCs w:val="22"/>
           <w:rtl w:val="0"/>
         </w:rPr>
-        <w:t xml:space="preserve">The corpus also yielded 58 false positive tokens, hedge-like words that were rejected after applying the codebook’s Working Test. The false positive breakdown shows FP-Gen (general exclusion, including topic-naming and evidential pointers) at 33 instances, FP-Rec (recommendations) at 15, FP-Proc (procedural norms) at 2, and FP-Cap (capability) at 8. The high number of FP-Gen instances, particularly involving the word “potential” in aim and methods statements, reflects a systematic ambiguity in the corpus: the same word functions as a hedge in conclusion sentences but as topic-naming in introduction and methods sentences. This distinction was codified in the codebook’s rule for “potential + noun” constructions, with structural position as the primary disambiguator and the Working Test as a secondary check. The rule remains the most methodologically interesting feature of the coding scheme: surface-level keyword matching would have inflated the hedge count by treating topic-naming instances as epistemic hedges.</w:t>
+        <w:t xml:space="preserve">The corpus also yielded 58 false positive tokens, hedge-like words that were rejected under the codebook’s Stage 1 exclusions and decision rules. The false positive breakdown shows FP-Gen (general exclusion, including topic-naming and evidential pointers) at 33 instances, FP-Rec (recommendations) at 15, FP-Proc (procedural norms) at 2, and FP-Cap (capability) at 8. The high number of FP-Gen instances, particularly involving the word “potential” in aim and methods statements, reflects a systematic ambiguity in the corpus: the same word functions as a hedge in conclusion sentences but as topic-naming in introduction and methods sentences. This distinction was codified in the codebook’s rule for “potential + noun” constructions, with structural position as the primary disambiguator and Stage 1 force reduction as a secondary check. The rule remains the most methodologically interesting feature of the coding scheme: surface-level keyword matching would have inflated the hedge count by treating topic-naming instances as epistemic hedges.</w:t>
       </w:r>
       <w:r>
         <w:rPr>
@@ -10529,7 +10529,7 @@
           <w:szCs w:val="22"/>
           <w:rtl w:val="0"/>
         </w:rPr>
-        <w:t>The relationship between hedge type and function further illuminates the patterns. Modal verbs (21 instances, all EC) were used almost exclusively to express possibility about results or implications, as in “the biosynthesis.. may affect the overall development.” Lexical hedges (41 instances, all EC) were used to qualify the strength of findings, as in “results suggest that fermented banana peel.. can significantly enhance growth.” All retained hedges were coded Epistemic Caution. That uniformity is partly built into the Working Test, which screens for epistemic effect. The data therefore cannot strongly support a claim about how writers “view” hedging, only that the retained tokens functioned epistemically under this scheme.</w:t>
+        <w:t>The relationship between hedge type and function further illuminates the patterns. Modal verbs (21 instances, all EC) were used almost exclusively to express possibility about results or implications, as in “the biosynthesis.. may affect the overall development.” Lexical hedges (41 instances, all EC) were used to qualify the strength of findings, as in “results suggest that fermented banana peel.. can significantly enhance growth.” All retained hedges were coded Epistemic Caution at Stage 2. In this sample no P candidates appeared, and sequence-only DO was excluded at Stage 1. The data support a claim about the functional profile of the retained set, not a claim that writers never mitigate interpersonally or textually outside that set.</w:t>
       </w:r>
       <w:r>
         <w:rPr>
@@ -12952,7 +12952,7 @@
           <w:szCs w:val="22"/>
           <w:rtl w:val="0"/>
         </w:rPr>
-        <w:t xml:space="preserve">2. Lexical hedges: suggest, indicate, appear, seem, propose, assume, possible, probable, likely, potential (and similar epistemic adjectives or nouns) when they qualify the certainty of a claim and pass the Working Test.</w:t>
+        <w:t xml:space="preserve">2. Lexical hedges: suggest, indicate, appear, seem, propose, assume, possible, probable, likely, potential (and similar epistemic adjectives or nouns) when they qualify the force or certainty of a claim and pass Stage 1.</w:t>
       </w:r>
       <w:r>
         <w:rPr>
@@ -15887,7 +15887,7 @@
           <w:szCs w:val="24"/>
           <w:rtl w:val="0"/>
         </w:rPr>
-        <w:t xml:space="preserve">WORKING TEST</w:t>
+        <w:t xml:space="preserve">STAGE 1, STAGE 2, AND WORKING TEST</w:t>
       </w:r>
       <w:r>
         <w:rPr>

</xml_diff>

<commit_message>
Draft_053: Stage 1 full corpus pass (no count change), RQ3 restore, knowledge-claim gate
Excel subtitles updated; codebook documents pass outcome.
</commit_message>
<xml_diff>
--- a/thesis/003_ThesisProposal_Draft_053.docx
+++ b/thesis/003_ThesisProposal_Draft_053.docx
@@ -1004,7 +1004,7 @@
           <w:szCs w:val="22"/>
           <w:rtl w:val="0"/>
         </w:rPr>
-        <w:t>3. Among the hedging devices retained at Stage 1, what rhetorical functions (EC, P, DO) do they serve?</w:t>
+        <w:t>3. Among the hedging devices identified, what rhetorical functions do they serve?</w:t>
       </w:r>
       <w:r>
         <w:rPr>
@@ -1155,7 +1155,7 @@
           <w:sz w:val="22"/>
           <w:szCs w:val="22"/>
         </w:rPr>
-        <w:t xml:space="preserve">Functional labels in this study (Epistemic Caution, Politeness/Deference, and Discourse Organization) are assigned after a token is retained at Stage 1. They are not mutually exclusive: interpersonal or discourse effects can co-occur with epistemic stance. Stage 1 retention asks whether removing the expression makes the writer's claim or positioning more categorical, more direct, or more imposing in context. That gate admits epistemic, politeness, and discourse-managing mitigation. Stage 2 labels the retained item EC, P, and/or DO by dominant function. The Working Test (does removing the device change commitment to the truth of the proposition?) is used as an EC diagnostic at Stage 2, not as the sole entry ticket for all hedges. Expressions that only sequence moves (e.g., pure Therefore / Hence as connectives), name a research object, or mark capability or obligation remain excluded. This keeps the scheme inclusive of P and DO without treating every soft-sounding word as a hedge. Crompton (1997) still informs the EC diagnostic: a proposition restatable with greater author commitment signals reduced epistemic weight content. Crompton argues that the term hedge is most useful when reserved for such epistemic provisionality on knowledge claims, rather than extended to politeness-related features such as passives, impersonal constructions, or emotion-projecting lexis as such. The present study does not adopt Crompton's full taxonomy. It uses that argument to support the EC diagnostic at Stage 2, not as the sole Stage 1 retention rule.</w:t>
+        <w:t xml:space="preserve">Functional labels in this study (Epistemic Caution, Politeness/Deference, and Discourse Organization) are assigned after a token is retained at Stage 1. They are not mutually exclusive: interpersonal or discourse effects can co-occur with epistemic stance. Stage 1 retention asks whether removing the expression makes a knowledge claim about findings more categorical or more direct, or reduces imposition in how that claim is put forward. That gate admits epistemic, politeness, and discourse-managing mitigation of claims; it excludes deontic recommendations and pure move sequencing. Stage 2 labels the retained item EC, P, and/or DO by dominant function. The Working Test (does removing the device change commitment to the truth of the proposition?) is used as an EC diagnostic at Stage 2, not as the sole entry ticket for all hedges. Expressions that only sequence moves (e.g., pure Therefore / Hence as connectives), name a research object, or mark capability or obligation remain excluded. This keeps the scheme inclusive of P and DO without treating every soft-sounding word as a hedge. Crompton (1997) still informs the EC diagnostic: a proposition restatable with greater author commitment signals reduced epistemic weight content. Crompton argues that the term hedge is most useful when reserved for such epistemic provisionality on knowledge claims, rather than extended to politeness-related features such as passives, impersonal constructions, or emotion-projecting lexis as such. The present study does not adopt Crompton's full taxonomy. It uses that argument to support the EC diagnostic at Stage 2, not as the sole Stage 1 retention rule.</w:t>
       </w:r>
     </w:p>
     <w:p>
@@ -2068,7 +2068,7 @@
           <w:szCs w:val="22"/>
           <w:rtl w:val="0"/>
         </w:rPr>
-        <w:t xml:space="preserve">conceptually, epistemic weight is the strength of the writer’s commitment to the truth of a proposition (how certain or tentative the claim is). Operationally, a change in epistemic weight supports an EC function label at Stage 2; Stage 1 retention uses the broader force / directness / imposition test.</w:t>
+        <w:t xml:space="preserve">conceptually, epistemic weight is the strength of the writer’s commitment to the truth of a proposition (how certain or tentative the claim is). Operationally, a change in epistemic weight supports an EC function label at Stage 2; Stage 1 retention uses the broader force / directness test on knowledge claims (imposition only as interpersonal softening of a claim, not as a directive).</w:t>
       </w:r>
       <w:r>
         <w:rPr>
@@ -2406,7 +2406,7 @@
           <w:szCs w:val="22"/>
           <w:rtl w:val="0"/>
         </w:rPr>
-        <w:t xml:space="preserve">conceptually, softening is the reduction of force, directness, imposition, or interpersonal impact in a statement. Operationally, Stage 1 retention tracks softening of force, directness, or imposition; Stage 2 sorts epistemic (EC), interpersonal (P), and discourse-managing (DO) uses.</w:t>
+        <w:t xml:space="preserve">conceptually, softening is the reduction of force, directness, imposition, or interpersonal impact in a statement. Operationally, Stage 1 retention tracks softening of force or directness on knowledge claims (and interpersonal imposition on how claims are put forward); Stage 2 sorts epistemic (EC), interpersonal (P), and discourse-managing (DO) uses. Directives remain excluded.</w:t>
       </w:r>
       <w:r>
         <w:rPr>
@@ -13286,7 +13286,7 @@
           <w:szCs w:val="22"/>
           <w:rtl w:val="0"/>
         </w:rPr>
-        <w:t xml:space="preserve">Ability, future procedure, and necessity (must / should in procedural contexts) are never hedges. Stage 1: retain if removing the device makes the claim or positioning more categorical, direct, or imposing. Working Test: used at Stage 2 to support EC when commitment to the proposition changes. Worked examples appear under Working Examples in the full codebook below.</w:t>
+        <w:t xml:space="preserve">Ability, future procedure, and necessity (must / should in procedural contexts) are never hedges. Stage 1: retain if removing the device makes a knowledge claim more categorical or more direct, or reduces imposition in how that claim is put forward (not directives). Working Test: used at Stage 2 to support EC when commitment to the proposition changes. Worked examples appear under Working Examples in the full codebook below.</w:t>
       </w:r>
       <w:r>
         <w:rPr>
@@ -15914,7 +15914,7 @@
           <w:szCs w:val="22"/>
           <w:rtl w:val="0"/>
         </w:rPr>
-        <w:t xml:space="preserve">Stage 1 (retention). Retain an expression if removing it makes the writer's claim or positioning more categorical, more direct, or more imposing in context. This gate is inclusive of epistemic, politeness, and discourse-managing mitigation. Capability, obligation, pure procedure, pure move sequencing, and topic-naming without force reduction remain out. Stage 2 (function). Label each retained item EC, P, and/or DO by dominant function. Co-occurrence is allowed. Working Test (EC diagnostic). For distinguishing epistemic effect, ask whether removing the device changes commitment to the truth of the proposition. Use this to support an EC label, not as the only Stage 1 membership test. Phrases that only point to evidence for a claim already asserted elsewhere (e.g., "as indicated by X") still fail Stage 1 when they do not reduce force, directness, or imposition.</w:t>
+        <w:t xml:space="preserve">Stage 1 (retention). Retain an expression if removing it makes a knowledge claim about findings more categorical or more direct in context, or reduces interpersonal imposition in how that claim is put forward. The gate is inclusive of epistemic, politeness, and discourse-managing mitigation of claims. It does not admit deontic directives (recommendations, obligations), capability statements, pure procedure, pure move sequencing, or topic-naming without force reduction on a claim. Stage 2 (function). Label each retained item EC, P, and/or DO by dominant function. Co-occurrence is allowed. Working Test (EC diagnostic). For distinguishing epistemic effect, ask whether removing the device changes commitment to the truth of the proposition. Use this to support an EC label, not as the only Stage 1 membership test. Phrases that only point to evidence for a claim already asserted elsewhere (e.g., "as indicated by X") still fail Stage 1 when they do not reduce force, directness, or imposition.</w:t>
       </w:r>
       <w:r>
         <w:rPr>
@@ -16156,7 +16156,7 @@
           <w:szCs w:val="22"/>
           <w:rtl w:val="0"/>
         </w:rPr>
-        <w:t xml:space="preserve">Function labels (EC, P, DO) are applied after Stage 1 retention. Stage 1 asks whether removing the expression makes the claim or positioning more categorical, direct, or imposing. The Working Test asks whether commitment to the proposition’s truth changes; it supports EC labeling and does not by itself bar P or DO. The examples below separate retention from function.</w:t>
+        <w:t xml:space="preserve">Function labels (EC, P, DO) are applied after Stage 1 retention. Stage 1 asks whether removing the expression makes a knowledge claim more categorical or more direct, or softens imposition on that claim (not a directive). The Working Test asks whether commitment to the proposition’s truth changes; it supports EC labeling and does not by itself bar P or DO. The examples below separate retention from function.</w:t>
       </w:r>
       <w:r>
         <w:rPr>
@@ -16338,7 +16338,7 @@
           <w:szCs w:val="22"/>
           <w:rtl w:val="0"/>
         </w:rPr>
-        <w:t xml:space="preserve">Summary rule. Stage 1 can retain P-only or DO-only items when they reduce force, directness, or imposition even if certainty is unchanged. Stage 2 labels EC, P, and/or DO. The Working Test supports EC, not exclusive membership. In this corpus, every token retained in the coded set was labeled EC; no P candidates appeared in the abstracts, and sequence-only DO markers were not counted as hedges.</w:t>
+        <w:t xml:space="preserve">Summary rule. Stage 1 can retain P-only or DO-only items when they reduce force, directness, or imposition even if certainty is unchanged. Stage 2 labels EC, P, and/or DO. The Working Test supports EC, not exclusive membership. In this corpus, every token retained in the coded set was labeled EC; no P candidates appeared in the abstracts, and sequence-only DO markers were not counted as hedges. Full corpus pass under this Stage 1 rule: recommendation/deontic forms (FP-Rec), capability (FP-Cap), procedural norms (FP-Proc), topic-naming and factive restatement (FP-Gen), pure sequence connectives (Hence/Thus/Therefore/In conclusion as move markers), and framing adverbs such as Overall remained excluded. No politeness/deference forms were present in the 60 abstracts. No additional tokens were promoted into the retained set; n=65 and all-EC function counts are unchanged.</w:t>
       </w:r>
       <w:r>
         <w:rPr>

</xml_diff>

<commit_message>
Draft_053: line spacing 1.2; keep quick-reference on one page
</commit_message>
<xml_diff>
--- a/thesis/003_ThesisProposal_Draft_053.docx
+++ b/thesis/003_ThesisProposal_Draft_053.docx
@@ -5190,7 +5190,6 @@
       <w:pPr>
         <w:spacing w:before="240" w:after="0" w:line="480" w:lineRule="auto"/>
         <w:jc w:val="center"/>
-        <w:pageBreakBefore/>
         <w:keepNext/>
         <w:keepLines/>
       </w:pPr>
@@ -11454,7 +11453,6 @@
     <w:p>
       <w:pPr>
         <w:keepLines w:val="1"/>
-        <w:pageBreakBefore w:val="1"/>
         <w:spacing w:before="720" w:after="720" w:line="480" w:lineRule="auto"/>
         <w:jc w:val="center"/>
         <w:rPr/>
@@ -12842,8 +12840,16 @@
     </w:p>
     <w:p>
       <w:pPr>
+        <w:spacing w:line="240" w:lineRule="auto" w:before="0" w:after="0"/>
+      </w:pPr>
+      <w:r>
+        <w:br w:type="page"/>
+      </w:r>
+    </w:p>
+    <w:p>
+      <w:pPr>
         <w:keepNext w:val="1"/>
-        <w:spacing w:before="120" w:after="120" w:line="240" w:lineRule="auto"/>
+        <w:spacing w:before="0" w:after="40" w:line="276" w:lineRule="auto"/>
         <w:ind w:firstLine="720"/>
         <w:jc w:val="left"/>
         <w:rPr/>
@@ -12867,7 +12873,7 @@
     </w:p>
     <w:p>
       <w:pPr>
-        <w:spacing w:before="0" w:after="0" w:line="240" w:lineRule="auto"/>
+        <w:spacing w:before="0" w:after="0" w:line="276" w:lineRule="auto"/>
         <w:jc w:val="both"/>
         <w:rPr/>
       </w:pPr>
@@ -12891,7 +12897,7 @@
     <w:p>
       <w:pPr>
         <w:keepNext w:val="1"/>
-        <w:spacing w:before="120" w:after="0" w:line="240" w:lineRule="auto"/>
+        <w:spacing w:before="24" w:after="0" w:line="276" w:lineRule="auto"/>
         <w:jc w:val="left"/>
         <w:rPr/>
       </w:pPr>
@@ -12914,7 +12920,7 @@
     </w:p>
     <w:p>
       <w:pPr>
-        <w:spacing w:before="0" w:after="0" w:line="240" w:lineRule="auto"/>
+        <w:spacing w:before="0" w:after="0" w:line="276" w:lineRule="auto"/>
         <w:ind w:left="240" w:firstLine="0"/>
         <w:jc w:val="both"/>
         <w:rPr/>
@@ -12938,7 +12944,7 @@
     </w:p>
     <w:p>
       <w:pPr>
-        <w:spacing w:before="0" w:after="0" w:line="240" w:lineRule="auto"/>
+        <w:spacing w:before="0" w:after="0" w:line="276" w:lineRule="auto"/>
         <w:ind w:left="240" w:firstLine="0"/>
         <w:jc w:val="both"/>
         <w:rPr/>
@@ -12962,7 +12968,7 @@
     </w:p>
     <w:p>
       <w:pPr>
-        <w:spacing w:before="0" w:after="0" w:line="240" w:lineRule="auto"/>
+        <w:spacing w:before="0" w:after="0" w:line="276" w:lineRule="auto"/>
         <w:ind w:left="240" w:firstLine="0"/>
         <w:jc w:val="both"/>
         <w:rPr/>
@@ -12986,7 +12992,7 @@
     </w:p>
     <w:p>
       <w:pPr>
-        <w:spacing w:before="0" w:after="0" w:line="240" w:lineRule="auto"/>
+        <w:spacing w:before="0" w:after="0" w:line="276" w:lineRule="auto"/>
         <w:ind w:left="240" w:firstLine="0"/>
         <w:jc w:val="both"/>
         <w:rPr/>
@@ -13011,7 +13017,7 @@
     <w:p>
       <w:pPr>
         <w:keepNext w:val="1"/>
-        <w:spacing w:before="120" w:after="0" w:line="240" w:lineRule="auto"/>
+        <w:spacing w:before="24" w:after="0" w:line="276" w:lineRule="auto"/>
         <w:ind w:firstLine="720"/>
         <w:jc w:val="left"/>
         <w:rPr/>
@@ -13035,7 +13041,7 @@
     </w:p>
     <w:p>
       <w:pPr>
-        <w:spacing w:before="0" w:after="0" w:line="240" w:lineRule="auto"/>
+        <w:spacing w:before="0" w:after="0" w:line="276" w:lineRule="auto"/>
         <w:ind w:left="240" w:firstLine="720"/>
         <w:jc w:val="both"/>
         <w:rPr/>
@@ -13059,7 +13065,7 @@
     </w:p>
     <w:p>
       <w:pPr>
-        <w:spacing w:before="0" w:after="0" w:line="240" w:lineRule="auto"/>
+        <w:spacing w:before="0" w:after="0" w:line="276" w:lineRule="auto"/>
         <w:ind w:left="240" w:firstLine="720"/>
         <w:jc w:val="both"/>
         <w:rPr/>
@@ -13083,7 +13089,7 @@
     </w:p>
     <w:p>
       <w:pPr>
-        <w:spacing w:before="0" w:after="0" w:line="240" w:lineRule="auto"/>
+        <w:spacing w:before="0" w:after="0" w:line="276" w:lineRule="auto"/>
         <w:ind w:left="240" w:firstLine="0"/>
         <w:jc w:val="both"/>
         <w:rPr/>
@@ -13108,7 +13114,7 @@
     <w:p>
       <w:pPr>
         <w:keepNext w:val="1"/>
-        <w:spacing w:before="120" w:after="0" w:line="240" w:lineRule="auto"/>
+        <w:spacing w:before="24" w:after="0" w:line="276" w:lineRule="auto"/>
         <w:ind w:firstLine="720"/>
         <w:jc w:val="left"/>
         <w:rPr/>
@@ -13132,7 +13138,7 @@
     </w:p>
     <w:p>
       <w:pPr>
-        <w:spacing w:before="0" w:after="0" w:line="240" w:lineRule="auto"/>
+        <w:spacing w:before="0" w:after="0" w:line="276" w:lineRule="auto"/>
         <w:ind w:left="240" w:firstLine="720"/>
         <w:jc w:val="both"/>
         <w:rPr/>
@@ -13161,7 +13167,7 @@
     </w:p>
     <w:p>
       <w:pPr>
-        <w:spacing w:before="0" w:after="0" w:line="240" w:lineRule="auto"/>
+        <w:spacing w:before="0" w:after="0" w:line="276" w:lineRule="auto"/>
         <w:ind w:left="240" w:firstLine="720"/>
         <w:jc w:val="both"/>
         <w:rPr/>
@@ -13190,7 +13196,7 @@
     </w:p>
     <w:p>
       <w:pPr>
-        <w:spacing w:before="0" w:after="0" w:line="240" w:lineRule="auto"/>
+        <w:spacing w:before="0" w:after="0" w:line="276" w:lineRule="auto"/>
         <w:ind w:left="240" w:firstLine="720"/>
         <w:jc w:val="both"/>
         <w:rPr/>
@@ -13219,7 +13225,7 @@
     </w:p>
     <w:p>
       <w:pPr>
-        <w:spacing w:before="0" w:after="0" w:line="240" w:lineRule="auto"/>
+        <w:spacing w:before="0" w:after="0" w:line="276" w:lineRule="auto"/>
         <w:ind w:left="240" w:firstLine="0"/>
         <w:jc w:val="both"/>
         <w:rPr/>
@@ -13249,7 +13255,7 @@
     <w:p>
       <w:pPr>
         <w:keepNext w:val="1"/>
-        <w:spacing w:before="120" w:after="0" w:line="240" w:lineRule="auto"/>
+        <w:spacing w:before="24" w:after="0" w:line="276" w:lineRule="auto"/>
         <w:ind w:firstLine="720"/>
         <w:jc w:val="left"/>
         <w:rPr/>
@@ -13273,7 +13279,7 @@
     </w:p>
     <w:p>
       <w:pPr>
-        <w:spacing w:before="0" w:after="0" w:line="240" w:lineRule="auto"/>
+        <w:spacing w:before="0" w:after="0" w:line="276" w:lineRule="auto"/>
         <w:jc w:val="both"/>
         <w:rPr/>
       </w:pPr>
@@ -13295,15 +13301,25 @@
       </w:r>
     </w:p>
     <w:p>
-      <w:pPr/>
+      <w:pPr>
+        <w:spacing w:line="276" w:lineRule="auto" w:before="0" w:after="0"/>
+      </w:pPr>
       <w:r>
         <w:br w:type="page"/>
       </w:r>
     </w:p>
     <w:p>
       <w:pPr>
+        <w:spacing w:line="240" w:lineRule="auto" w:before="0" w:after="0"/>
+      </w:pPr>
+      <w:r>
+        <w:br w:type="page"/>
+      </w:r>
+    </w:p>
+    <w:p>
+      <w:pPr>
         <w:keepNext w:val="1"/>
-        <w:spacing w:before="60" w:after="0" w:line="312" w:lineRule="auto"/>
+        <w:spacing w:before="60" w:after="0" w:line="288" w:lineRule="auto"/>
         <w:jc w:val="left"/>
         <w:rPr/>
       </w:pPr>
@@ -13330,7 +13346,7 @@
       <w:pPr>
         <w:keepNext w:val="1"/>
         <w:keepLines w:val="1"/>
-        <w:spacing w:before="0" w:after="0" w:line="312" w:lineRule="auto"/>
+        <w:spacing w:before="0" w:after="0" w:line="288" w:lineRule="auto"/>
         <w:ind w:firstLine="720"/>
         <w:jc w:val="both"/>
         <w:rPr/>
@@ -13395,7 +13411,7 @@
           </w:tcPr>
           <w:p>
             <w:pPr>
-              <w:spacing w:before="0" w:after="0" w:line="240" w:lineRule="auto"/>
+              <w:spacing w:before="0" w:after="0" w:line="288" w:lineRule="auto"/>
               <w:jc w:val="both"/>
               <w:rPr/>
             </w:pPr>
@@ -13429,7 +13445,7 @@
           </w:tcPr>
           <w:p>
             <w:pPr>
-              <w:spacing w:before="0" w:after="0" w:line="240" w:lineRule="auto"/>
+              <w:spacing w:before="0" w:after="0" w:line="288" w:lineRule="auto"/>
               <w:jc w:val="both"/>
               <w:rPr/>
             </w:pPr>
@@ -13464,7 +13480,7 @@
           <w:tcPr/>
           <w:p>
             <w:pPr>
-              <w:spacing w:before="0" w:after="0" w:line="240" w:lineRule="auto"/>
+              <w:spacing w:before="0" w:after="0" w:line="288" w:lineRule="auto"/>
               <w:jc w:val="both"/>
               <w:rPr/>
             </w:pPr>
@@ -13503,7 +13519,7 @@
           </w:p>
           <w:p>
             <w:pPr>
-              <w:spacing w:before="0" w:after="0" w:line="240" w:lineRule="auto"/>
+              <w:spacing w:before="0" w:after="0" w:line="288" w:lineRule="auto"/>
               <w:jc w:val="both"/>
               <w:rPr/>
             </w:pPr>
@@ -13542,7 +13558,7 @@
           </w:p>
           <w:p>
             <w:pPr>
-              <w:spacing w:before="0" w:after="0" w:line="240" w:lineRule="auto"/>
+              <w:spacing w:before="0" w:after="0" w:line="288" w:lineRule="auto"/>
               <w:jc w:val="both"/>
               <w:rPr/>
             </w:pPr>
@@ -13581,7 +13597,7 @@
           </w:p>
           <w:p>
             <w:pPr>
-              <w:spacing w:before="0" w:after="0" w:line="240" w:lineRule="auto"/>
+              <w:spacing w:before="0" w:after="0" w:line="288" w:lineRule="auto"/>
               <w:jc w:val="both"/>
               <w:rPr/>
             </w:pPr>
@@ -13623,7 +13639,7 @@
           <w:tcPr/>
           <w:p>
             <w:pPr>
-              <w:spacing w:before="0" w:after="0" w:line="240" w:lineRule="auto"/>
+              <w:spacing w:before="0" w:after="0" w:line="288" w:lineRule="auto"/>
               <w:jc w:val="both"/>
               <w:rPr/>
             </w:pPr>
@@ -13666,7 +13682,7 @@
           </w:p>
           <w:p>
             <w:pPr>
-              <w:spacing w:before="0" w:after="0" w:line="240" w:lineRule="auto"/>
+              <w:spacing w:before="0" w:after="0" w:line="288" w:lineRule="auto"/>
               <w:jc w:val="both"/>
               <w:rPr/>
             </w:pPr>
@@ -13709,7 +13725,7 @@
           </w:p>
           <w:p>
             <w:pPr>
-              <w:spacing w:before="0" w:after="0" w:line="240" w:lineRule="auto"/>
+              <w:spacing w:before="0" w:after="0" w:line="288" w:lineRule="auto"/>
               <w:jc w:val="both"/>
               <w:rPr/>
             </w:pPr>
@@ -13761,7 +13777,7 @@
           <w:tcPr/>
           <w:p>
             <w:pPr>
-              <w:spacing w:before="0" w:after="0" w:line="240" w:lineRule="auto"/>
+              <w:spacing w:before="0" w:after="0" w:line="288" w:lineRule="auto"/>
               <w:jc w:val="both"/>
               <w:rPr/>
             </w:pPr>
@@ -13790,7 +13806,7 @@
           </w:p>
           <w:p>
             <w:pPr>
-              <w:spacing w:before="0" w:after="0" w:line="240" w:lineRule="auto"/>
+              <w:spacing w:before="0" w:after="0" w:line="288" w:lineRule="auto"/>
               <w:jc w:val="both"/>
               <w:rPr/>
             </w:pPr>
@@ -13832,7 +13848,7 @@
           <w:tcPr/>
           <w:p>
             <w:pPr>
-              <w:spacing w:before="0" w:after="0" w:line="240" w:lineRule="auto"/>
+              <w:spacing w:before="0" w:after="0" w:line="288" w:lineRule="auto"/>
               <w:jc w:val="both"/>
               <w:rPr/>
             </w:pPr>
@@ -13861,7 +13877,7 @@
           </w:p>
           <w:p>
             <w:pPr>
-              <w:spacing w:before="0" w:after="0" w:line="240" w:lineRule="auto"/>
+              <w:spacing w:before="0" w:after="0" w:line="288" w:lineRule="auto"/>
               <w:jc w:val="both"/>
               <w:rPr/>
             </w:pPr>
@@ -13894,7 +13910,7 @@
     <w:p>
       <w:pPr>
         <w:keepNext w:val="1"/>
-        <w:spacing w:before="240" w:after="0" w:line="480" w:lineRule="auto"/>
+        <w:spacing w:before="80" w:after="0" w:line="288" w:lineRule="auto"/>
         <w:jc w:val="left"/>
         <w:rPr/>
       </w:pPr>
@@ -13919,7 +13935,7 @@
     </w:p>
     <w:p>
       <w:pPr>
-        <w:spacing w:before="0" w:after="0" w:line="312" w:lineRule="auto"/>
+        <w:spacing w:before="0" w:after="0" w:line="288" w:lineRule="auto"/>
         <w:ind w:firstLine="720"/>
         <w:jc w:val="both"/>
         <w:rPr/>
@@ -14203,7 +14219,7 @@
     </w:p>
     <w:p>
       <w:pPr>
-        <w:spacing w:before="0" w:after="0" w:line="312" w:lineRule="auto"/>
+        <w:spacing w:before="0" w:after="0" w:line="288" w:lineRule="auto"/>
         <w:ind w:firstLine="720"/>
         <w:jc w:val="both"/>
         <w:rPr/>
@@ -14240,7 +14256,7 @@
     <w:p>
       <w:pPr>
         <w:keepNext w:val="1"/>
-        <w:spacing w:before="120" w:after="0" w:line="312" w:lineRule="auto"/>
+        <w:spacing w:before="60" w:after="0" w:line="288" w:lineRule="auto"/>
         <w:jc w:val="left"/>
         <w:rPr/>
       </w:pPr>
@@ -14267,7 +14283,7 @@
       <w:pPr>
         <w:keepNext w:val="1"/>
         <w:keepLines w:val="1"/>
-        <w:spacing w:before="0" w:after="0" w:line="312" w:lineRule="auto"/>
+        <w:spacing w:before="0" w:after="0" w:line="288" w:lineRule="auto"/>
         <w:ind w:firstLine="720"/>
         <w:jc w:val="both"/>
         <w:rPr/>
@@ -14344,7 +14360,7 @@
           </w:tcPr>
           <w:p>
             <w:pPr>
-              <w:spacing w:before="0" w:after="0" w:line="240" w:lineRule="auto"/>
+              <w:spacing w:before="0" w:after="0" w:line="288" w:lineRule="auto"/>
               <w:jc w:val="both"/>
               <w:rPr/>
             </w:pPr>
@@ -14378,7 +14394,7 @@
           </w:tcPr>
           <w:p>
             <w:pPr>
-              <w:spacing w:before="0" w:after="0" w:line="240" w:lineRule="auto"/>
+              <w:spacing w:before="0" w:after="0" w:line="288" w:lineRule="auto"/>
               <w:jc w:val="both"/>
               <w:rPr/>
             </w:pPr>
@@ -14412,7 +14428,7 @@
           </w:tcPr>
           <w:p>
             <w:pPr>
-              <w:spacing w:before="0" w:after="0" w:line="240" w:lineRule="auto"/>
+              <w:spacing w:before="0" w:after="0" w:line="288" w:lineRule="auto"/>
               <w:jc w:val="both"/>
               <w:rPr/>
             </w:pPr>
@@ -14446,7 +14462,7 @@
           </w:tcPr>
           <w:p>
             <w:pPr>
-              <w:spacing w:before="0" w:after="0" w:line="240" w:lineRule="auto"/>
+              <w:spacing w:before="0" w:after="0" w:line="288" w:lineRule="auto"/>
               <w:jc w:val="both"/>
               <w:rPr/>
             </w:pPr>
@@ -14480,7 +14496,7 @@
           </w:tcPr>
           <w:p>
             <w:pPr>
-              <w:spacing w:before="0" w:after="0" w:line="240" w:lineRule="auto"/>
+              <w:spacing w:before="0" w:after="0" w:line="288" w:lineRule="auto"/>
               <w:jc w:val="both"/>
               <w:rPr/>
             </w:pPr>
@@ -14514,7 +14530,7 @@
           </w:tcPr>
           <w:p>
             <w:pPr>
-              <w:spacing w:before="0" w:after="0" w:line="240" w:lineRule="auto"/>
+              <w:spacing w:before="0" w:after="0" w:line="288" w:lineRule="auto"/>
               <w:jc w:val="both"/>
               <w:rPr/>
             </w:pPr>
@@ -14548,7 +14564,7 @@
           </w:tcPr>
           <w:p>
             <w:pPr>
-              <w:spacing w:before="0" w:after="0" w:line="240" w:lineRule="auto"/>
+              <w:spacing w:before="0" w:after="0" w:line="288" w:lineRule="auto"/>
               <w:jc w:val="both"/>
               <w:rPr/>
             </w:pPr>
@@ -14582,7 +14598,7 @@
           </w:tcPr>
           <w:p>
             <w:pPr>
-              <w:spacing w:before="0" w:after="0" w:line="240" w:lineRule="auto"/>
+              <w:spacing w:before="0" w:after="0" w:line="288" w:lineRule="auto"/>
               <w:jc w:val="both"/>
               <w:rPr/>
             </w:pPr>
@@ -14617,7 +14633,7 @@
           <w:tcPr/>
           <w:p>
             <w:pPr>
-              <w:spacing w:before="0" w:after="0" w:line="240" w:lineRule="auto"/>
+              <w:spacing w:before="0" w:after="0" w:line="288" w:lineRule="auto"/>
               <w:jc w:val="left"/>
               <w:rPr/>
             </w:pPr>
@@ -14644,7 +14660,7 @@
           <w:tcPr/>
           <w:p>
             <w:pPr>
-              <w:spacing w:before="0" w:after="0" w:line="240" w:lineRule="auto"/>
+              <w:spacing w:before="0" w:after="0" w:line="288" w:lineRule="auto"/>
               <w:jc w:val="left"/>
               <w:rPr/>
             </w:pPr>
@@ -14671,7 +14687,7 @@
           <w:tcPr/>
           <w:p>
             <w:pPr>
-              <w:spacing w:before="0" w:after="0" w:line="240" w:lineRule="auto"/>
+              <w:spacing w:before="0" w:after="0" w:line="288" w:lineRule="auto"/>
               <w:jc w:val="left"/>
               <w:rPr/>
             </w:pPr>
@@ -14698,7 +14714,7 @@
           <w:tcPr/>
           <w:p>
             <w:pPr>
-              <w:spacing w:before="0" w:after="0" w:line="240" w:lineRule="auto"/>
+              <w:spacing w:before="0" w:after="0" w:line="288" w:lineRule="auto"/>
               <w:jc w:val="left"/>
               <w:rPr/>
             </w:pPr>
@@ -14725,7 +14741,7 @@
           <w:tcPr/>
           <w:p>
             <w:pPr>
-              <w:spacing w:before="0" w:after="0" w:line="240" w:lineRule="auto"/>
+              <w:spacing w:before="0" w:after="0" w:line="288" w:lineRule="auto"/>
               <w:jc w:val="left"/>
               <w:rPr/>
             </w:pPr>
@@ -14752,7 +14768,7 @@
           <w:tcPr/>
           <w:p>
             <w:pPr>
-              <w:spacing w:before="0" w:after="0" w:line="240" w:lineRule="auto"/>
+              <w:spacing w:before="0" w:after="0" w:line="288" w:lineRule="auto"/>
               <w:jc w:val="left"/>
               <w:rPr/>
             </w:pPr>
@@ -14779,7 +14795,7 @@
           <w:tcPr/>
           <w:p>
             <w:pPr>
-              <w:spacing w:before="0" w:after="0" w:line="240" w:lineRule="auto"/>
+              <w:spacing w:before="0" w:after="0" w:line="288" w:lineRule="auto"/>
               <w:jc w:val="left"/>
               <w:rPr/>
             </w:pPr>
@@ -14806,7 +14822,7 @@
           <w:tcPr/>
           <w:p>
             <w:pPr>
-              <w:spacing w:before="0" w:after="0" w:line="240" w:lineRule="auto"/>
+              <w:spacing w:before="0" w:after="0" w:line="288" w:lineRule="auto"/>
               <w:jc w:val="left"/>
               <w:rPr/>
             </w:pPr>
@@ -14833,7 +14849,7 @@
     </w:tbl>
     <w:p>
       <w:pPr>
-        <w:spacing w:before="240" w:after="0" w:line="480" w:lineRule="auto"/>
+        <w:spacing w:before="80" w:after="0" w:line="288" w:lineRule="auto"/>
         <w:ind w:firstLine="720"/>
         <w:jc w:val="both"/>
         <w:rPr/>
@@ -14860,7 +14876,7 @@
     </w:p>
     <w:p>
       <w:pPr>
-        <w:spacing w:before="0" w:after="0" w:line="312" w:lineRule="auto"/>
+        <w:spacing w:before="0" w:after="0" w:line="288" w:lineRule="auto"/>
         <w:ind w:firstLine="720"/>
         <w:jc w:val="both"/>
         <w:rPr/>
@@ -14889,7 +14905,7 @@
       <w:pPr>
         <w:keepNext w:val="1"/>
         <w:keepLines w:val="1"/>
-        <w:spacing w:before="120" w:after="0" w:line="312" w:lineRule="auto"/>
+        <w:spacing w:before="60" w:after="0" w:line="288" w:lineRule="auto"/>
         <w:jc w:val="left"/>
         <w:rPr/>
       </w:pPr>
@@ -14961,7 +14977,7 @@
           </w:tcPr>
           <w:p>
             <w:pPr>
-              <w:spacing w:before="0" w:after="0" w:line="240" w:lineRule="auto"/>
+              <w:spacing w:before="0" w:after="0" w:line="288" w:lineRule="auto"/>
               <w:jc w:val="both"/>
               <w:rPr/>
             </w:pPr>
@@ -14995,7 +15011,7 @@
           </w:tcPr>
           <w:p>
             <w:pPr>
-              <w:spacing w:before="0" w:after="0" w:line="240" w:lineRule="auto"/>
+              <w:spacing w:before="0" w:after="0" w:line="288" w:lineRule="auto"/>
               <w:jc w:val="both"/>
               <w:rPr/>
             </w:pPr>
@@ -15029,7 +15045,7 @@
           </w:tcPr>
           <w:p>
             <w:pPr>
-              <w:spacing w:before="0" w:after="0" w:line="240" w:lineRule="auto"/>
+              <w:spacing w:before="0" w:after="0" w:line="288" w:lineRule="auto"/>
               <w:jc w:val="both"/>
               <w:rPr/>
             </w:pPr>
@@ -15063,7 +15079,7 @@
           </w:tcPr>
           <w:p>
             <w:pPr>
-              <w:spacing w:before="0" w:after="0" w:line="240" w:lineRule="auto"/>
+              <w:spacing w:before="0" w:after="0" w:line="288" w:lineRule="auto"/>
               <w:jc w:val="both"/>
               <w:rPr/>
             </w:pPr>
@@ -15097,7 +15113,7 @@
           </w:tcPr>
           <w:p>
             <w:pPr>
-              <w:spacing w:before="0" w:after="0" w:line="240" w:lineRule="auto"/>
+              <w:spacing w:before="0" w:after="0" w:line="288" w:lineRule="auto"/>
               <w:jc w:val="both"/>
               <w:rPr/>
             </w:pPr>
@@ -15131,7 +15147,7 @@
           </w:tcPr>
           <w:p>
             <w:pPr>
-              <w:spacing w:before="0" w:after="0" w:line="240" w:lineRule="auto"/>
+              <w:spacing w:before="0" w:after="0" w:line="288" w:lineRule="auto"/>
               <w:jc w:val="both"/>
               <w:rPr/>
             </w:pPr>
@@ -15166,7 +15182,7 @@
           <w:tcPr/>
           <w:p>
             <w:pPr>
-              <w:spacing w:before="0" w:after="0" w:line="240" w:lineRule="auto"/>
+              <w:spacing w:before="0" w:after="0" w:line="288" w:lineRule="auto"/>
               <w:jc w:val="left"/>
               <w:rPr/>
             </w:pPr>
@@ -15193,7 +15209,7 @@
           <w:tcPr/>
           <w:p>
             <w:pPr>
-              <w:spacing w:before="0" w:after="0" w:line="240" w:lineRule="auto"/>
+              <w:spacing w:before="0" w:after="0" w:line="288" w:lineRule="auto"/>
               <w:jc w:val="left"/>
               <w:rPr/>
             </w:pPr>
@@ -15220,7 +15236,7 @@
           <w:tcPr/>
           <w:p>
             <w:pPr>
-              <w:spacing w:before="0" w:after="0" w:line="240" w:lineRule="auto"/>
+              <w:spacing w:before="0" w:after="0" w:line="288" w:lineRule="auto"/>
               <w:jc w:val="left"/>
               <w:rPr/>
             </w:pPr>
@@ -15247,7 +15263,7 @@
           <w:tcPr/>
           <w:p>
             <w:pPr>
-              <w:spacing w:before="0" w:after="0" w:line="240" w:lineRule="auto"/>
+              <w:spacing w:before="0" w:after="0" w:line="288" w:lineRule="auto"/>
               <w:jc w:val="left"/>
               <w:rPr/>
             </w:pPr>
@@ -15274,7 +15290,7 @@
           <w:tcPr/>
           <w:p>
             <w:pPr>
-              <w:spacing w:before="0" w:after="0" w:line="240" w:lineRule="auto"/>
+              <w:spacing w:before="0" w:after="0" w:line="288" w:lineRule="auto"/>
               <w:jc w:val="left"/>
               <w:rPr/>
             </w:pPr>
@@ -15301,7 +15317,7 @@
           <w:tcPr/>
           <w:p>
             <w:pPr>
-              <w:spacing w:before="0" w:after="0" w:line="240" w:lineRule="auto"/>
+              <w:spacing w:before="0" w:after="0" w:line="288" w:lineRule="auto"/>
               <w:jc w:val="left"/>
               <w:rPr/>
             </w:pPr>
@@ -15329,7 +15345,7 @@
     <w:p>
       <w:pPr>
         <w:keepNext w:val="1"/>
-        <w:spacing w:before="240" w:after="0" w:line="480" w:lineRule="auto"/>
+        <w:spacing w:before="80" w:after="0" w:line="288" w:lineRule="auto"/>
         <w:jc w:val="left"/>
         <w:rPr/>
       </w:pPr>
@@ -15356,7 +15372,7 @@
       <w:pPr>
         <w:keepNext w:val="1"/>
         <w:keepLines w:val="1"/>
-        <w:spacing w:before="0" w:after="0" w:line="312" w:lineRule="auto"/>
+        <w:spacing w:before="0" w:after="0" w:line="288" w:lineRule="auto"/>
         <w:ind w:firstLine="720"/>
         <w:jc w:val="both"/>
         <w:rPr/>
@@ -15429,7 +15445,7 @@
           </w:tcPr>
           <w:p>
             <w:pPr>
-              <w:spacing w:before="0" w:after="0" w:line="240" w:lineRule="auto"/>
+              <w:spacing w:before="0" w:after="0" w:line="288" w:lineRule="auto"/>
               <w:jc w:val="both"/>
               <w:rPr/>
             </w:pPr>
@@ -15463,7 +15479,7 @@
           </w:tcPr>
           <w:p>
             <w:pPr>
-              <w:spacing w:before="0" w:after="0" w:line="240" w:lineRule="auto"/>
+              <w:spacing w:before="0" w:after="0" w:line="288" w:lineRule="auto"/>
               <w:jc w:val="both"/>
               <w:rPr/>
             </w:pPr>
@@ -15497,7 +15513,7 @@
           </w:tcPr>
           <w:p>
             <w:pPr>
-              <w:spacing w:before="0" w:after="0" w:line="240" w:lineRule="auto"/>
+              <w:spacing w:before="0" w:after="0" w:line="288" w:lineRule="auto"/>
               <w:jc w:val="both"/>
               <w:rPr/>
             </w:pPr>
@@ -15531,7 +15547,7 @@
           </w:tcPr>
           <w:p>
             <w:pPr>
-              <w:spacing w:before="0" w:after="0" w:line="240" w:lineRule="auto"/>
+              <w:spacing w:before="0" w:after="0" w:line="288" w:lineRule="auto"/>
               <w:jc w:val="both"/>
               <w:rPr/>
             </w:pPr>
@@ -15565,7 +15581,7 @@
           </w:tcPr>
           <w:p>
             <w:pPr>
-              <w:spacing w:before="0" w:after="0" w:line="240" w:lineRule="auto"/>
+              <w:spacing w:before="0" w:after="0" w:line="288" w:lineRule="auto"/>
               <w:jc w:val="both"/>
               <w:rPr/>
             </w:pPr>
@@ -15599,7 +15615,7 @@
           </w:tcPr>
           <w:p>
             <w:pPr>
-              <w:spacing w:before="0" w:after="0" w:line="240" w:lineRule="auto"/>
+              <w:spacing w:before="0" w:after="0" w:line="288" w:lineRule="auto"/>
               <w:jc w:val="both"/>
               <w:rPr/>
             </w:pPr>
@@ -15634,7 +15650,7 @@
           <w:tcPr/>
           <w:p>
             <w:pPr>
-              <w:spacing w:before="0" w:after="0" w:line="240" w:lineRule="auto"/>
+              <w:spacing w:before="0" w:after="0" w:line="288" w:lineRule="auto"/>
               <w:jc w:val="left"/>
               <w:rPr/>
             </w:pPr>
@@ -15661,7 +15677,7 @@
           <w:tcPr/>
           <w:p>
             <w:pPr>
-              <w:spacing w:before="0" w:after="0" w:line="240" w:lineRule="auto"/>
+              <w:spacing w:before="0" w:after="0" w:line="288" w:lineRule="auto"/>
               <w:jc w:val="left"/>
               <w:rPr/>
             </w:pPr>
@@ -15688,7 +15704,7 @@
           <w:tcPr/>
           <w:p>
             <w:pPr>
-              <w:spacing w:before="0" w:after="0" w:line="240" w:lineRule="auto"/>
+              <w:spacing w:before="0" w:after="0" w:line="288" w:lineRule="auto"/>
               <w:jc w:val="left"/>
               <w:rPr/>
             </w:pPr>
@@ -15715,7 +15731,7 @@
           <w:tcPr/>
           <w:p>
             <w:pPr>
-              <w:spacing w:before="0" w:after="0" w:line="240" w:lineRule="auto"/>
+              <w:spacing w:before="0" w:after="0" w:line="288" w:lineRule="auto"/>
               <w:jc w:val="left"/>
               <w:rPr/>
             </w:pPr>
@@ -15742,7 +15758,7 @@
           <w:tcPr/>
           <w:p>
             <w:pPr>
-              <w:spacing w:before="0" w:after="0" w:line="240" w:lineRule="auto"/>
+              <w:spacing w:before="0" w:after="0" w:line="288" w:lineRule="auto"/>
               <w:jc w:val="left"/>
               <w:rPr/>
             </w:pPr>
@@ -15769,7 +15785,7 @@
           <w:tcPr/>
           <w:p>
             <w:pPr>
-              <w:spacing w:before="0" w:after="0" w:line="240" w:lineRule="auto"/>
+              <w:spacing w:before="0" w:after="0" w:line="288" w:lineRule="auto"/>
               <w:jc w:val="left"/>
               <w:rPr/>
             </w:pPr>
@@ -15797,7 +15813,6 @@
     <w:p>
       <w:pPr>
         <w:keepNext w:val="1"/>
-        <w:pageBreakBefore w:val="1"/>
         <w:spacing w:before="240" w:after="0" w:line="480" w:lineRule="auto"/>
         <w:jc w:val="left"/>
         <w:rPr/>
@@ -20751,7 +20766,6 @@
       <w:pPr>
         <w:keepNext w:val="1"/>
         <w:keepLines w:val="1"/>
-        <w:pageBreakBefore w:val="1"/>
         <w:spacing w:before="240" w:after="0" w:line="480" w:lineRule="auto"/>
         <w:jc w:val="left"/>
         <w:rPr/>

</xml_diff>

<commit_message>
Draft_053: Table 7 keep-with; Conclusions new page; fix Appendix blank page
</commit_message>
<xml_diff>
--- a/thesis/003_ThesisProposal_Draft_053.docx
+++ b/thesis/003_ThesisProposal_Draft_053.docx
@@ -10603,6 +10603,8 @@
       <w:pPr>
         <w:spacing w:before="0" w:after="60" w:line="480" w:lineRule="auto"/>
         <w:jc w:val="center"/>
+        <w:keepNext w:val="1"/>
+        <w:keepLines/>
       </w:pPr>
       <w:r>
         <w:rPr>
@@ -11452,6 +11454,14 @@
     </w:p>
     <w:p>
       <w:pPr>
+        <w:spacing w:line="240" w:lineRule="auto" w:before="0" w:after="0"/>
+      </w:pPr>
+      <w:r>
+        <w:br w:type="page"/>
+      </w:r>
+    </w:p>
+    <w:p>
+      <w:pPr>
         <w:keepLines w:val="1"/>
         <w:spacing w:before="720" w:after="720" w:line="480" w:lineRule="auto"/>
         <w:jc w:val="center"/>
@@ -13298,14 +13308,6 @@
         <w:rPr>
           <w:rtl w:val="0"/>
         </w:rPr>
-      </w:r>
-    </w:p>
-    <w:p>
-      <w:pPr>
-        <w:spacing w:line="276" w:lineRule="auto" w:before="0" w:after="0"/>
-      </w:pPr>
-      <w:r>
-        <w:br w:type="page"/>
       </w:r>
     </w:p>
     <w:p>
@@ -17192,7 +17194,7 @@
     <w:p>
       <w:pPr>
         <w:keepNext w:val="1"/>
-        <w:spacing w:before="240" w:after="0" w:line="480" w:lineRule="auto"/>
+        <w:spacing w:before="60" w:after="0" w:line="288" w:lineRule="auto"/>
         <w:ind w:firstLine="720"/>
         <w:jc w:val="both"/>
         <w:rPr/>

</xml_diff>

<commit_message>
Draft_053: Appendix intro+QR same page; close gap after Layer 1 table
</commit_message>
<xml_diff>
--- a/thesis/003_ThesisProposal_Draft_053.docx
+++ b/thesis/003_ThesisProposal_Draft_053.docx
@@ -12850,14 +12850,6 @@
     </w:p>
     <w:p>
       <w:pPr>
-        <w:spacing w:line="240" w:lineRule="auto" w:before="0" w:after="0"/>
-      </w:pPr>
-      <w:r>
-        <w:br w:type="page"/>
-      </w:r>
-    </w:p>
-    <w:p>
-      <w:pPr>
         <w:keepNext w:val="1"/>
         <w:spacing w:before="0" w:after="40" w:line="276" w:lineRule="auto"/>
         <w:ind w:firstLine="720"/>
@@ -17194,7 +17186,7 @@
     <w:p>
       <w:pPr>
         <w:keepNext w:val="1"/>
-        <w:spacing w:before="60" w:after="0" w:line="288" w:lineRule="auto"/>
+        <w:spacing w:before="60" w:after="40" w:line="288" w:lineRule="auto"/>
         <w:ind w:firstLine="720"/>
         <w:jc w:val="both"/>
         <w:rPr/>
@@ -17250,7 +17242,7 @@
     <w:p>
       <w:pPr>
         <w:keepNext w:val="1"/>
-        <w:spacing w:before="120" w:after="0" w:line="360" w:lineRule="auto"/>
+        <w:spacing w:before="60" w:after="40" w:line="360" w:lineRule="auto"/>
         <w:ind w:firstLine="720"/>
         <w:jc w:val="both"/>
         <w:rPr/>
@@ -17456,7 +17448,7 @@
       <w:pPr>
         <w:keepNext w:val="1"/>
         <w:keepLines w:val="1"/>
-        <w:spacing w:before="120" w:after="0" w:line="360" w:lineRule="auto"/>
+        <w:spacing w:before="120" w:after="60" w:line="360" w:lineRule="auto"/>
         <w:jc w:val="left"/>
         <w:rPr/>
       </w:pPr>

</xml_diff>

<commit_message>
Draft_053: shrink Appendix A+QR font to fit one page
</commit_message>
<xml_diff>
--- a/thesis/003_ThesisProposal_Draft_053.docx
+++ b/thesis/003_ThesisProposal_Draft_053.docx
@@ -12814,7 +12814,7 @@
       <w:pPr>
         <w:keepNext w:val="1"/>
         <w:keepLines w:val="1"/>
-        <w:spacing w:before="240" w:after="0" w:line="480" w:lineRule="auto"/>
+        <w:spacing w:before="40" w:after="20" w:line="252" w:lineRule="auto"/>
         <w:jc w:val="left"/>
         <w:rPr/>
       </w:pPr>
@@ -12823,8 +12823,8 @@
           <w:rFonts w:ascii="Georgia" w:cs="Georgia" w:eastAsia="Georgia" w:hAnsi="Georgia"/>
           <w:b w:val="1"/>
           <w:bCs w:val="1"/>
-          <w:sz w:val="24"/>
-          <w:szCs w:val="24"/>
+          <w:sz w:val="20"/>
+          <w:szCs w:val="20"/>
           <w:rtl w:val="0"/>
         </w:rPr>
         <w:t xml:space="preserve">APPENDIX A: HEDGING CODEBOOK</w:t>
@@ -12832,18 +12832,22 @@
       <w:r>
         <w:rPr>
           <w:rtl w:val="0"/>
-        </w:rPr>
-      </w:r>
-    </w:p>
-    <w:p>
-      <w:pPr>
-        <w:spacing w:before="0" w:after="0" w:line="480" w:lineRule="auto"/>
+          <w:sz w:val="20"/>
+          <w:szCs w:val="20"/>
+        </w:rPr>
+      </w:r>
+    </w:p>
+    <w:p>
+      <w:pPr>
+        <w:spacing w:before="0" w:after="0" w:line="252" w:lineRule="auto"/>
         <w:jc w:val="both"/>
         <w:rPr/>
       </w:pPr>
       <w:r>
         <w:rPr>
           <w:rFonts w:ascii="Georgia" w:hAnsi="Georgia" w:cs="Georgia" w:eastAsia="Georgia"/>
+          <w:sz w:val="20"/>
+          <w:szCs w:val="20"/>
         </w:rPr>
         <w:t xml:space="preserve">This appendix is the full coding protocol used for the study. It opens with a one-page quick-reference, then a one-page legend and coding-sheet section, then the operational layers, decision rules, false-positive categories, and recording conventions.</w:t>
       </w:r>
@@ -12851,7 +12855,7 @@
     <w:p>
       <w:pPr>
         <w:keepNext w:val="1"/>
-        <w:spacing w:before="0" w:after="40" w:line="276" w:lineRule="auto"/>
+        <w:spacing w:before="40" w:after="20" w:line="252" w:lineRule="auto"/>
         <w:ind w:firstLine="720"/>
         <w:jc w:val="left"/>
         <w:rPr/>
@@ -12861,8 +12865,8 @@
           <w:rFonts w:ascii="Georgia" w:cs="Georgia" w:eastAsia="Georgia" w:hAnsi="Georgia"/>
           <w:b w:val="1"/>
           <w:bCs w:val="1"/>
-          <w:sz w:val="24"/>
-          <w:szCs w:val="24"/>
+          <w:sz w:val="20"/>
+          <w:szCs w:val="20"/>
           <w:rtl w:val="0"/>
         </w:rPr>
         <w:t xml:space="preserve">QUICK-REFERENCE</w:t>
@@ -12870,12 +12874,14 @@
       <w:r>
         <w:rPr>
           <w:rtl w:val="0"/>
-        </w:rPr>
-      </w:r>
-    </w:p>
-    <w:p>
-      <w:pPr>
-        <w:spacing w:before="0" w:after="0" w:line="276" w:lineRule="auto"/>
+          <w:sz w:val="20"/>
+          <w:szCs w:val="20"/>
+        </w:rPr>
+      </w:r>
+    </w:p>
+    <w:p>
+      <w:pPr>
+        <w:spacing w:before="0" w:after="0" w:line="252" w:lineRule="auto"/>
         <w:jc w:val="both"/>
         <w:rPr/>
       </w:pPr>
@@ -12884,8 +12890,8 @@
           <w:rFonts w:ascii="Georgia" w:cs="Georgia" w:eastAsia="Georgia" w:hAnsi="Georgia"/>
           <w:b w:val="0"/>
           <w:bCs w:val="0"/>
-          <w:sz w:val="22"/>
-          <w:szCs w:val="22"/>
+          <w:sz w:val="20"/>
+          <w:szCs w:val="20"/>
           <w:rtl w:val="0"/>
         </w:rPr>
         <w:t xml:space="preserve">Coding is context-sensitive. A word is a hedge only when it functions as one in the sentence, not because it appears on a list.</w:t>
@@ -12893,13 +12899,15 @@
       <w:r>
         <w:rPr>
           <w:rtl w:val="0"/>
+          <w:sz w:val="20"/>
+          <w:szCs w:val="20"/>
         </w:rPr>
       </w:r>
     </w:p>
     <w:p>
       <w:pPr>
         <w:keepNext w:val="1"/>
-        <w:spacing w:before="24" w:after="0" w:line="276" w:lineRule="auto"/>
+        <w:spacing w:before="20" w:after="0" w:line="252" w:lineRule="auto"/>
         <w:jc w:val="left"/>
         <w:rPr/>
       </w:pPr>
@@ -12908,8 +12916,8 @@
           <w:rFonts w:ascii="Georgia" w:cs="Georgia" w:eastAsia="Georgia" w:hAnsi="Georgia"/>
           <w:b w:val="1"/>
           <w:bCs w:val="1"/>
-          <w:sz w:val="24"/>
-          <w:szCs w:val="24"/>
+          <w:sz w:val="20"/>
+          <w:szCs w:val="20"/>
           <w:rtl w:val="0"/>
         </w:rPr>
         <w:t xml:space="preserve">Hedge types</w:t>
@@ -12917,12 +12925,14 @@
       <w:r>
         <w:rPr>
           <w:rtl w:val="0"/>
-        </w:rPr>
-      </w:r>
-    </w:p>
-    <w:p>
-      <w:pPr>
-        <w:spacing w:before="0" w:after="0" w:line="276" w:lineRule="auto"/>
+          <w:sz w:val="20"/>
+          <w:szCs w:val="20"/>
+        </w:rPr>
+      </w:r>
+    </w:p>
+    <w:p>
+      <w:pPr>
+        <w:spacing w:before="0" w:after="0" w:line="252" w:lineRule="auto"/>
         <w:ind w:left="240" w:firstLine="0"/>
         <w:jc w:val="both"/>
         <w:rPr/>
@@ -12932,8 +12942,8 @@
           <w:rFonts w:ascii="Georgia" w:cs="Georgia" w:eastAsia="Georgia" w:hAnsi="Georgia"/>
           <w:b w:val="0"/>
           <w:bCs w:val="0"/>
-          <w:sz w:val="22"/>
-          <w:szCs w:val="22"/>
+          <w:sz w:val="20"/>
+          <w:szCs w:val="20"/>
           <w:rtl w:val="0"/>
         </w:rPr>
         <w:t xml:space="preserve">1. Modal verbs: may, might, could, would, should, can (when they mark possibility, not capability or obligation).</w:t>
@@ -12941,12 +12951,14 @@
       <w:r>
         <w:rPr>
           <w:rtl w:val="0"/>
-        </w:rPr>
-      </w:r>
-    </w:p>
-    <w:p>
-      <w:pPr>
-        <w:spacing w:before="0" w:after="0" w:line="276" w:lineRule="auto"/>
+          <w:sz w:val="20"/>
+          <w:szCs w:val="20"/>
+        </w:rPr>
+      </w:r>
+    </w:p>
+    <w:p>
+      <w:pPr>
+        <w:spacing w:before="0" w:after="0" w:line="252" w:lineRule="auto"/>
         <w:ind w:left="240" w:firstLine="0"/>
         <w:jc w:val="both"/>
         <w:rPr/>
@@ -12956,8 +12968,8 @@
           <w:rFonts w:ascii="Georgia" w:cs="Georgia" w:eastAsia="Georgia" w:hAnsi="Georgia"/>
           <w:b w:val="0"/>
           <w:bCs w:val="0"/>
-          <w:sz w:val="22"/>
-          <w:szCs w:val="22"/>
+          <w:sz w:val="20"/>
+          <w:szCs w:val="20"/>
           <w:rtl w:val="0"/>
         </w:rPr>
         <w:t xml:space="preserve">2. Lexical hedges: suggest, indicate, appear, seem, propose, assume, possible, probable, likely, potential (and similar epistemic adjectives or nouns) when they qualify the force or certainty of a claim and pass Stage 1.</w:t>
@@ -12965,12 +12977,14 @@
       <w:r>
         <w:rPr>
           <w:rtl w:val="0"/>
-        </w:rPr>
-      </w:r>
-    </w:p>
-    <w:p>
-      <w:pPr>
-        <w:spacing w:before="0" w:after="0" w:line="276" w:lineRule="auto"/>
+          <w:sz w:val="20"/>
+          <w:szCs w:val="20"/>
+        </w:rPr>
+      </w:r>
+    </w:p>
+    <w:p>
+      <w:pPr>
+        <w:spacing w:before="0" w:after="0" w:line="252" w:lineRule="auto"/>
         <w:ind w:left="240" w:firstLine="0"/>
         <w:jc w:val="both"/>
         <w:rPr/>
@@ -12980,8 +12994,8 @@
           <w:rFonts w:ascii="Georgia" w:cs="Georgia" w:eastAsia="Georgia" w:hAnsi="Georgia"/>
           <w:b w:val="0"/>
           <w:bCs w:val="0"/>
-          <w:sz w:val="22"/>
-          <w:szCs w:val="22"/>
+          <w:sz w:val="20"/>
+          <w:szCs w:val="20"/>
           <w:rtl w:val="0"/>
         </w:rPr>
         <w:t xml:space="preserve">3. Adverbial hedges: generally, typically, possibly, probably, relatively, essentially (when they qualify scope or certainty, not procedural routine).</w:t>
@@ -12989,12 +13003,14 @@
       <w:r>
         <w:rPr>
           <w:rtl w:val="0"/>
-        </w:rPr>
-      </w:r>
-    </w:p>
-    <w:p>
-      <w:pPr>
-        <w:spacing w:before="0" w:after="0" w:line="276" w:lineRule="auto"/>
+          <w:sz w:val="20"/>
+          <w:szCs w:val="20"/>
+        </w:rPr>
+      </w:r>
+    </w:p>
+    <w:p>
+      <w:pPr>
+        <w:spacing w:before="0" w:after="0" w:line="252" w:lineRule="auto"/>
         <w:ind w:left="240" w:firstLine="0"/>
         <w:jc w:val="both"/>
         <w:rPr/>
@@ -13004,8 +13020,8 @@
           <w:rFonts w:ascii="Georgia" w:cs="Georgia" w:eastAsia="Georgia" w:hAnsi="Georgia"/>
           <w:b w:val="0"/>
           <w:bCs w:val="0"/>
-          <w:sz w:val="22"/>
-          <w:szCs w:val="22"/>
+          <w:sz w:val="20"/>
+          <w:szCs w:val="20"/>
           <w:rtl w:val="0"/>
         </w:rPr>
         <w:t xml:space="preserve">4. Clause-level hedges: it seems that, it is possible that, to some extent, in our view.</w:t>
@@ -13013,13 +13029,15 @@
       <w:r>
         <w:rPr>
           <w:rtl w:val="0"/>
+          <w:sz w:val="20"/>
+          <w:szCs w:val="20"/>
         </w:rPr>
       </w:r>
     </w:p>
     <w:p>
       <w:pPr>
         <w:keepNext w:val="1"/>
-        <w:spacing w:before="24" w:after="0" w:line="276" w:lineRule="auto"/>
+        <w:spacing w:before="20" w:after="0" w:line="252" w:lineRule="auto"/>
         <w:ind w:firstLine="720"/>
         <w:jc w:val="left"/>
         <w:rPr/>
@@ -13029,8 +13047,8 @@
           <w:rFonts w:ascii="Georgia" w:cs="Georgia" w:eastAsia="Georgia" w:hAnsi="Georgia"/>
           <w:b w:val="1"/>
           <w:bCs w:val="1"/>
-          <w:sz w:val="24"/>
-          <w:szCs w:val="24"/>
+          <w:sz w:val="20"/>
+          <w:szCs w:val="20"/>
           <w:rtl w:val="0"/>
         </w:rPr>
         <w:t xml:space="preserve">Hedge functions</w:t>
@@ -13038,12 +13056,14 @@
       <w:r>
         <w:rPr>
           <w:rtl w:val="0"/>
-        </w:rPr>
-      </w:r>
-    </w:p>
-    <w:p>
-      <w:pPr>
-        <w:spacing w:before="0" w:after="0" w:line="276" w:lineRule="auto"/>
+          <w:sz w:val="20"/>
+          <w:szCs w:val="20"/>
+        </w:rPr>
+      </w:r>
+    </w:p>
+    <w:p>
+      <w:pPr>
+        <w:spacing w:before="0" w:after="0" w:line="252" w:lineRule="auto"/>
         <w:ind w:left="240" w:firstLine="720"/>
         <w:jc w:val="both"/>
         <w:rPr/>
@@ -13053,8 +13073,8 @@
           <w:rFonts w:ascii="Georgia" w:cs="Georgia" w:eastAsia="Georgia" w:hAnsi="Georgia"/>
           <w:b w:val="0"/>
           <w:bCs w:val="0"/>
-          <w:sz w:val="22"/>
-          <w:szCs w:val="22"/>
+          <w:sz w:val="20"/>
+          <w:szCs w:val="20"/>
           <w:rtl w:val="0"/>
         </w:rPr>
         <w:t xml:space="preserve">Epistemic Caution: marks uncertainty about whether a claim is true (e.g., The treatment may reduce infection rates).</w:t>
@@ -13062,12 +13082,14 @@
       <w:r>
         <w:rPr>
           <w:rtl w:val="0"/>
-        </w:rPr>
-      </w:r>
-    </w:p>
-    <w:p>
-      <w:pPr>
-        <w:spacing w:before="0" w:after="0" w:line="276" w:lineRule="auto"/>
+          <w:sz w:val="20"/>
+          <w:szCs w:val="20"/>
+        </w:rPr>
+      </w:r>
+    </w:p>
+    <w:p>
+      <w:pPr>
+        <w:spacing w:before="0" w:after="0" w:line="252" w:lineRule="auto"/>
         <w:ind w:left="240" w:firstLine="720"/>
         <w:jc w:val="both"/>
         <w:rPr/>
@@ -13077,8 +13099,8 @@
           <w:rFonts w:ascii="Georgia" w:cs="Georgia" w:eastAsia="Georgia" w:hAnsi="Georgia"/>
           <w:b w:val="0"/>
           <w:bCs w:val="0"/>
-          <w:sz w:val="22"/>
-          <w:szCs w:val="22"/>
+          <w:sz w:val="20"/>
+          <w:szCs w:val="20"/>
           <w:rtl w:val="0"/>
         </w:rPr>
         <w:t xml:space="preserve">Politeness / Deference: softens face threat or shows respect rather than genuine doubt (e.g., As suggested by Hyland…).</w:t>
@@ -13086,12 +13108,14 @@
       <w:r>
         <w:rPr>
           <w:rtl w:val="0"/>
-        </w:rPr>
-      </w:r>
-    </w:p>
-    <w:p>
-      <w:pPr>
-        <w:spacing w:before="0" w:after="0" w:line="276" w:lineRule="auto"/>
+          <w:sz w:val="20"/>
+          <w:szCs w:val="20"/>
+        </w:rPr>
+      </w:r>
+    </w:p>
+    <w:p>
+      <w:pPr>
+        <w:spacing w:before="0" w:after="0" w:line="252" w:lineRule="auto"/>
         <w:ind w:left="240" w:firstLine="0"/>
         <w:jc w:val="both"/>
         <w:rPr/>
@@ -13101,8 +13125,8 @@
           <w:rFonts w:ascii="Georgia" w:cs="Georgia" w:eastAsia="Georgia" w:hAnsi="Georgia"/>
           <w:b w:val="0"/>
           <w:bCs w:val="0"/>
-          <w:sz w:val="22"/>
-          <w:szCs w:val="22"/>
+          <w:sz w:val="20"/>
+          <w:szCs w:val="20"/>
           <w:rtl w:val="0"/>
         </w:rPr>
         <w:t xml:space="preserve">Discourse Organization: manages text structure or reader expectations rather than stance (e.g., It should be noted that…).</w:t>
@@ -13110,13 +13134,15 @@
       <w:r>
         <w:rPr>
           <w:rtl w:val="0"/>
+          <w:sz w:val="20"/>
+          <w:szCs w:val="20"/>
         </w:rPr>
       </w:r>
     </w:p>
     <w:p>
       <w:pPr>
         <w:keepNext w:val="1"/>
-        <w:spacing w:before="24" w:after="0" w:line="276" w:lineRule="auto"/>
+        <w:spacing w:before="20" w:after="0" w:line="252" w:lineRule="auto"/>
         <w:ind w:firstLine="720"/>
         <w:jc w:val="left"/>
         <w:rPr/>
@@ -13126,8 +13152,8 @@
           <w:rFonts w:ascii="Georgia" w:cs="Georgia" w:eastAsia="Georgia" w:hAnsi="Georgia"/>
           <w:b w:val="1"/>
           <w:bCs w:val="1"/>
-          <w:sz w:val="24"/>
-          <w:szCs w:val="24"/>
+          <w:sz w:val="20"/>
+          <w:szCs w:val="20"/>
           <w:rtl w:val="0"/>
         </w:rPr>
         <w:t xml:space="preserve">Core decision rules</w:t>
@@ -13135,12 +13161,14 @@
       <w:r>
         <w:rPr>
           <w:rtl w:val="0"/>
-        </w:rPr>
-      </w:r>
-    </w:p>
-    <w:p>
-      <w:pPr>
-        <w:spacing w:before="0" w:after="0" w:line="276" w:lineRule="auto"/>
+          <w:sz w:val="20"/>
+          <w:szCs w:val="20"/>
+        </w:rPr>
+      </w:r>
+    </w:p>
+    <w:p>
+      <w:pPr>
+        <w:spacing w:before="0" w:after="0" w:line="252" w:lineRule="auto"/>
         <w:ind w:left="240" w:firstLine="720"/>
         <w:jc w:val="both"/>
         <w:rPr/>
@@ -13151,8 +13179,8 @@
           <w:rtl w:val="0"/>
           <w:i/>
           <w:iCs/>
-          <w:sz w:val="24"/>
-          <w:szCs w:val="24"/>
+          <w:sz w:val="20"/>
+          <w:szCs w:val="20"/>
         </w:rPr>
         <w:t xml:space="preserve">suggest / indicate becomes hedge when introducing a finding. Not a hedge when introducing a recommendation.</w:t>
       </w:r>
@@ -13160,8 +13188,8 @@
         <w:rPr>
           <w:rtl w:val="0"/>
           <w:rFonts w:ascii="Georgia" w:hAnsi="Georgia"/>
-          <w:sz w:val="24"/>
-          <w:szCs w:val="24"/>
+          <w:sz w:val="20"/>
+          <w:szCs w:val="20"/>
           <w:i/>
           <w:iCs/>
         </w:rPr>
@@ -13169,7 +13197,7 @@
     </w:p>
     <w:p>
       <w:pPr>
-        <w:spacing w:before="0" w:after="0" w:line="276" w:lineRule="auto"/>
+        <w:spacing w:before="0" w:after="0" w:line="252" w:lineRule="auto"/>
         <w:ind w:left="240" w:firstLine="720"/>
         <w:jc w:val="both"/>
         <w:rPr/>
@@ -13180,8 +13208,8 @@
           <w:rtl w:val="0"/>
           <w:i/>
           <w:iCs/>
-          <w:sz w:val="24"/>
-          <w:szCs w:val="24"/>
+          <w:sz w:val="20"/>
+          <w:szCs w:val="20"/>
         </w:rPr>
         <w:t xml:space="preserve">can / may becomes hedge when marking possibility. Not a hedge when marking capability.</w:t>
       </w:r>
@@ -13189,8 +13217,8 @@
         <w:rPr>
           <w:rtl w:val="0"/>
           <w:rFonts w:ascii="Georgia" w:hAnsi="Georgia"/>
-          <w:sz w:val="24"/>
-          <w:szCs w:val="24"/>
+          <w:sz w:val="20"/>
+          <w:szCs w:val="20"/>
           <w:i/>
           <w:iCs/>
         </w:rPr>
@@ -13198,7 +13226,7 @@
     </w:p>
     <w:p>
       <w:pPr>
-        <w:spacing w:before="0" w:after="0" w:line="276" w:lineRule="auto"/>
+        <w:spacing w:before="0" w:after="0" w:line="252" w:lineRule="auto"/>
         <w:ind w:left="240" w:firstLine="720"/>
         <w:jc w:val="both"/>
         <w:rPr/>
@@ -13209,8 +13237,8 @@
           <w:rtl w:val="0"/>
           <w:i/>
           <w:iCs/>
-          <w:sz w:val="24"/>
-          <w:szCs w:val="24"/>
+          <w:sz w:val="20"/>
+          <w:szCs w:val="20"/>
         </w:rPr>
         <w:t xml:space="preserve">generally / typically becomes hedge when limiting the scope of a claim. Not a hedge when describing a procedural norm.</w:t>
       </w:r>
@@ -13218,8 +13246,8 @@
         <w:rPr>
           <w:rtl w:val="0"/>
           <w:rFonts w:ascii="Georgia" w:hAnsi="Georgia"/>
-          <w:sz w:val="24"/>
-          <w:szCs w:val="24"/>
+          <w:sz w:val="20"/>
+          <w:szCs w:val="20"/>
           <w:i/>
           <w:iCs/>
         </w:rPr>
@@ -13227,7 +13255,7 @@
     </w:p>
     <w:p>
       <w:pPr>
-        <w:spacing w:before="0" w:after="0" w:line="276" w:lineRule="auto"/>
+        <w:spacing w:before="0" w:after="0" w:line="252" w:lineRule="auto"/>
         <w:ind w:left="240" w:firstLine="0"/>
         <w:jc w:val="both"/>
         <w:rPr/>
@@ -13238,8 +13266,8 @@
           <w:rtl w:val="0"/>
           <w:i/>
           <w:iCs/>
-          <w:sz w:val="24"/>
-          <w:szCs w:val="24"/>
+          <w:sz w:val="20"/>
+          <w:szCs w:val="20"/>
         </w:rPr>
         <w:t xml:space="preserve">appear / seem becomes hedge when expressing uncertainty about a result. Not a hedge when pointing to location in a table or text.</w:t>
       </w:r>
@@ -13247,8 +13275,8 @@
         <w:rPr>
           <w:rtl w:val="0"/>
           <w:rFonts w:ascii="Georgia" w:hAnsi="Georgia"/>
-          <w:sz w:val="24"/>
-          <w:szCs w:val="24"/>
+          <w:sz w:val="20"/>
+          <w:szCs w:val="20"/>
           <w:i/>
           <w:iCs/>
         </w:rPr>
@@ -13257,7 +13285,7 @@
     <w:p>
       <w:pPr>
         <w:keepNext w:val="1"/>
-        <w:spacing w:before="24" w:after="0" w:line="276" w:lineRule="auto"/>
+        <w:spacing w:before="20" w:after="0" w:line="252" w:lineRule="auto"/>
         <w:ind w:firstLine="720"/>
         <w:jc w:val="left"/>
         <w:rPr/>
@@ -13267,8 +13295,8 @@
           <w:rFonts w:ascii="Georgia" w:cs="Georgia" w:eastAsia="Georgia" w:hAnsi="Georgia"/>
           <w:b w:val="1"/>
           <w:bCs w:val="1"/>
-          <w:sz w:val="24"/>
-          <w:szCs w:val="24"/>
+          <w:sz w:val="20"/>
+          <w:szCs w:val="20"/>
           <w:rtl w:val="0"/>
         </w:rPr>
         <w:t xml:space="preserve">Exclusion and Working Test</w:t>
@@ -13276,12 +13304,14 @@
       <w:r>
         <w:rPr>
           <w:rtl w:val="0"/>
-        </w:rPr>
-      </w:r>
-    </w:p>
-    <w:p>
-      <w:pPr>
-        <w:spacing w:before="0" w:after="0" w:line="276" w:lineRule="auto"/>
+          <w:sz w:val="20"/>
+          <w:szCs w:val="20"/>
+        </w:rPr>
+      </w:r>
+    </w:p>
+    <w:p>
+      <w:pPr>
+        <w:spacing w:before="0" w:after="0" w:line="252" w:lineRule="auto"/>
         <w:jc w:val="both"/>
         <w:rPr/>
       </w:pPr>
@@ -13290,8 +13320,8 @@
           <w:rFonts w:ascii="Georgia" w:cs="Georgia" w:eastAsia="Georgia" w:hAnsi="Georgia"/>
           <w:b w:val="0"/>
           <w:bCs w:val="0"/>
-          <w:sz w:val="22"/>
-          <w:szCs w:val="22"/>
+          <w:sz w:val="20"/>
+          <w:szCs w:val="20"/>
           <w:rtl w:val="0"/>
         </w:rPr>
         <w:t xml:space="preserve">Ability, future procedure, and necessity (must / should in procedural contexts) are never hedges. Stage 1: retain if removing the device makes a knowledge claim more categorical or more direct, or reduces imposition in how that claim is put forward (not directives). Working Test: used at Stage 2 to support EC when commitment to the proposition changes. Worked examples appear under Working Examples in the full codebook below.</w:t>
@@ -13299,6 +13329,8 @@
       <w:r>
         <w:rPr>
           <w:rtl w:val="0"/>
+          <w:sz w:val="20"/>
+          <w:szCs w:val="20"/>
         </w:rPr>
       </w:r>
     </w:p>

</xml_diff>

<commit_message>
Draft_053: Appendix A+QR back to 11pt (still one page)
</commit_message>
<xml_diff>
--- a/thesis/003_ThesisProposal_Draft_053.docx
+++ b/thesis/003_ThesisProposal_Draft_053.docx
@@ -12814,7 +12814,7 @@
       <w:pPr>
         <w:keepNext w:val="1"/>
         <w:keepLines w:val="1"/>
-        <w:spacing w:before="40" w:after="20" w:line="252" w:lineRule="auto"/>
+        <w:spacing w:before="40" w:after="20" w:line="264" w:lineRule="auto"/>
         <w:jc w:val="left"/>
         <w:rPr/>
       </w:pPr>
@@ -12823,8 +12823,8 @@
           <w:rFonts w:ascii="Georgia" w:cs="Georgia" w:eastAsia="Georgia" w:hAnsi="Georgia"/>
           <w:b w:val="1"/>
           <w:bCs w:val="1"/>
-          <w:sz w:val="20"/>
-          <w:szCs w:val="20"/>
+          <w:sz w:val="22"/>
+          <w:szCs w:val="22"/>
           <w:rtl w:val="0"/>
         </w:rPr>
         <w:t xml:space="preserve">APPENDIX A: HEDGING CODEBOOK</w:t>
@@ -12832,22 +12832,22 @@
       <w:r>
         <w:rPr>
           <w:rtl w:val="0"/>
-          <w:sz w:val="20"/>
-          <w:szCs w:val="20"/>
-        </w:rPr>
-      </w:r>
-    </w:p>
-    <w:p>
-      <w:pPr>
-        <w:spacing w:before="0" w:after="0" w:line="252" w:lineRule="auto"/>
+          <w:sz w:val="22"/>
+          <w:szCs w:val="22"/>
+        </w:rPr>
+      </w:r>
+    </w:p>
+    <w:p>
+      <w:pPr>
+        <w:spacing w:before="0" w:after="0" w:line="264" w:lineRule="auto"/>
         <w:jc w:val="both"/>
         <w:rPr/>
       </w:pPr>
       <w:r>
         <w:rPr>
           <w:rFonts w:ascii="Georgia" w:hAnsi="Georgia" w:cs="Georgia" w:eastAsia="Georgia"/>
-          <w:sz w:val="20"/>
-          <w:szCs w:val="20"/>
+          <w:sz w:val="22"/>
+          <w:szCs w:val="22"/>
         </w:rPr>
         <w:t xml:space="preserve">This appendix is the full coding protocol used for the study. It opens with a one-page quick-reference, then a one-page legend and coding-sheet section, then the operational layers, decision rules, false-positive categories, and recording conventions.</w:t>
       </w:r>
@@ -12855,7 +12855,7 @@
     <w:p>
       <w:pPr>
         <w:keepNext w:val="1"/>
-        <w:spacing w:before="40" w:after="20" w:line="252" w:lineRule="auto"/>
+        <w:spacing w:before="40" w:after="20" w:line="264" w:lineRule="auto"/>
         <w:ind w:firstLine="720"/>
         <w:jc w:val="left"/>
         <w:rPr/>
@@ -12865,8 +12865,8 @@
           <w:rFonts w:ascii="Georgia" w:cs="Georgia" w:eastAsia="Georgia" w:hAnsi="Georgia"/>
           <w:b w:val="1"/>
           <w:bCs w:val="1"/>
-          <w:sz w:val="20"/>
-          <w:szCs w:val="20"/>
+          <w:sz w:val="22"/>
+          <w:szCs w:val="22"/>
           <w:rtl w:val="0"/>
         </w:rPr>
         <w:t xml:space="preserve">QUICK-REFERENCE</w:t>
@@ -12874,14 +12874,14 @@
       <w:r>
         <w:rPr>
           <w:rtl w:val="0"/>
-          <w:sz w:val="20"/>
-          <w:szCs w:val="20"/>
-        </w:rPr>
-      </w:r>
-    </w:p>
-    <w:p>
-      <w:pPr>
-        <w:spacing w:before="0" w:after="0" w:line="252" w:lineRule="auto"/>
+          <w:sz w:val="22"/>
+          <w:szCs w:val="22"/>
+        </w:rPr>
+      </w:r>
+    </w:p>
+    <w:p>
+      <w:pPr>
+        <w:spacing w:before="0" w:after="0" w:line="264" w:lineRule="auto"/>
         <w:jc w:val="both"/>
         <w:rPr/>
       </w:pPr>
@@ -12890,8 +12890,8 @@
           <w:rFonts w:ascii="Georgia" w:cs="Georgia" w:eastAsia="Georgia" w:hAnsi="Georgia"/>
           <w:b w:val="0"/>
           <w:bCs w:val="0"/>
-          <w:sz w:val="20"/>
-          <w:szCs w:val="20"/>
+          <w:sz w:val="22"/>
+          <w:szCs w:val="22"/>
           <w:rtl w:val="0"/>
         </w:rPr>
         <w:t xml:space="preserve">Coding is context-sensitive. A word is a hedge only when it functions as one in the sentence, not because it appears on a list.</w:t>
@@ -12899,15 +12899,15 @@
       <w:r>
         <w:rPr>
           <w:rtl w:val="0"/>
-          <w:sz w:val="20"/>
-          <w:szCs w:val="20"/>
+          <w:sz w:val="22"/>
+          <w:szCs w:val="22"/>
         </w:rPr>
       </w:r>
     </w:p>
     <w:p>
       <w:pPr>
         <w:keepNext w:val="1"/>
-        <w:spacing w:before="20" w:after="0" w:line="252" w:lineRule="auto"/>
+        <w:spacing w:before="24" w:after="0" w:line="264" w:lineRule="auto"/>
         <w:jc w:val="left"/>
         <w:rPr/>
       </w:pPr>
@@ -12916,8 +12916,8 @@
           <w:rFonts w:ascii="Georgia" w:cs="Georgia" w:eastAsia="Georgia" w:hAnsi="Georgia"/>
           <w:b w:val="1"/>
           <w:bCs w:val="1"/>
-          <w:sz w:val="20"/>
-          <w:szCs w:val="20"/>
+          <w:sz w:val="22"/>
+          <w:szCs w:val="22"/>
           <w:rtl w:val="0"/>
         </w:rPr>
         <w:t xml:space="preserve">Hedge types</w:t>
@@ -12925,14 +12925,14 @@
       <w:r>
         <w:rPr>
           <w:rtl w:val="0"/>
-          <w:sz w:val="20"/>
-          <w:szCs w:val="20"/>
-        </w:rPr>
-      </w:r>
-    </w:p>
-    <w:p>
-      <w:pPr>
-        <w:spacing w:before="0" w:after="0" w:line="252" w:lineRule="auto"/>
+          <w:sz w:val="22"/>
+          <w:szCs w:val="22"/>
+        </w:rPr>
+      </w:r>
+    </w:p>
+    <w:p>
+      <w:pPr>
+        <w:spacing w:before="0" w:after="0" w:line="264" w:lineRule="auto"/>
         <w:ind w:left="240" w:firstLine="0"/>
         <w:jc w:val="both"/>
         <w:rPr/>
@@ -12942,8 +12942,8 @@
           <w:rFonts w:ascii="Georgia" w:cs="Georgia" w:eastAsia="Georgia" w:hAnsi="Georgia"/>
           <w:b w:val="0"/>
           <w:bCs w:val="0"/>
-          <w:sz w:val="20"/>
-          <w:szCs w:val="20"/>
+          <w:sz w:val="22"/>
+          <w:szCs w:val="22"/>
           <w:rtl w:val="0"/>
         </w:rPr>
         <w:t xml:space="preserve">1. Modal verbs: may, might, could, would, should, can (when they mark possibility, not capability or obligation).</w:t>
@@ -12951,14 +12951,14 @@
       <w:r>
         <w:rPr>
           <w:rtl w:val="0"/>
-          <w:sz w:val="20"/>
-          <w:szCs w:val="20"/>
-        </w:rPr>
-      </w:r>
-    </w:p>
-    <w:p>
-      <w:pPr>
-        <w:spacing w:before="0" w:after="0" w:line="252" w:lineRule="auto"/>
+          <w:sz w:val="22"/>
+          <w:szCs w:val="22"/>
+        </w:rPr>
+      </w:r>
+    </w:p>
+    <w:p>
+      <w:pPr>
+        <w:spacing w:before="0" w:after="0" w:line="264" w:lineRule="auto"/>
         <w:ind w:left="240" w:firstLine="0"/>
         <w:jc w:val="both"/>
         <w:rPr/>
@@ -12968,8 +12968,8 @@
           <w:rFonts w:ascii="Georgia" w:cs="Georgia" w:eastAsia="Georgia" w:hAnsi="Georgia"/>
           <w:b w:val="0"/>
           <w:bCs w:val="0"/>
-          <w:sz w:val="20"/>
-          <w:szCs w:val="20"/>
+          <w:sz w:val="22"/>
+          <w:szCs w:val="22"/>
           <w:rtl w:val="0"/>
         </w:rPr>
         <w:t xml:space="preserve">2. Lexical hedges: suggest, indicate, appear, seem, propose, assume, possible, probable, likely, potential (and similar epistemic adjectives or nouns) when they qualify the force or certainty of a claim and pass Stage 1.</w:t>
@@ -12977,14 +12977,14 @@
       <w:r>
         <w:rPr>
           <w:rtl w:val="0"/>
-          <w:sz w:val="20"/>
-          <w:szCs w:val="20"/>
-        </w:rPr>
-      </w:r>
-    </w:p>
-    <w:p>
-      <w:pPr>
-        <w:spacing w:before="0" w:after="0" w:line="252" w:lineRule="auto"/>
+          <w:sz w:val="22"/>
+          <w:szCs w:val="22"/>
+        </w:rPr>
+      </w:r>
+    </w:p>
+    <w:p>
+      <w:pPr>
+        <w:spacing w:before="0" w:after="0" w:line="264" w:lineRule="auto"/>
         <w:ind w:left="240" w:firstLine="0"/>
         <w:jc w:val="both"/>
         <w:rPr/>
@@ -12994,8 +12994,8 @@
           <w:rFonts w:ascii="Georgia" w:cs="Georgia" w:eastAsia="Georgia" w:hAnsi="Georgia"/>
           <w:b w:val="0"/>
           <w:bCs w:val="0"/>
-          <w:sz w:val="20"/>
-          <w:szCs w:val="20"/>
+          <w:sz w:val="22"/>
+          <w:szCs w:val="22"/>
           <w:rtl w:val="0"/>
         </w:rPr>
         <w:t xml:space="preserve">3. Adverbial hedges: generally, typically, possibly, probably, relatively, essentially (when they qualify scope or certainty, not procedural routine).</w:t>
@@ -13003,14 +13003,14 @@
       <w:r>
         <w:rPr>
           <w:rtl w:val="0"/>
-          <w:sz w:val="20"/>
-          <w:szCs w:val="20"/>
-        </w:rPr>
-      </w:r>
-    </w:p>
-    <w:p>
-      <w:pPr>
-        <w:spacing w:before="0" w:after="0" w:line="252" w:lineRule="auto"/>
+          <w:sz w:val="22"/>
+          <w:szCs w:val="22"/>
+        </w:rPr>
+      </w:r>
+    </w:p>
+    <w:p>
+      <w:pPr>
+        <w:spacing w:before="0" w:after="0" w:line="264" w:lineRule="auto"/>
         <w:ind w:left="240" w:firstLine="0"/>
         <w:jc w:val="both"/>
         <w:rPr/>
@@ -13020,8 +13020,8 @@
           <w:rFonts w:ascii="Georgia" w:cs="Georgia" w:eastAsia="Georgia" w:hAnsi="Georgia"/>
           <w:b w:val="0"/>
           <w:bCs w:val="0"/>
-          <w:sz w:val="20"/>
-          <w:szCs w:val="20"/>
+          <w:sz w:val="22"/>
+          <w:szCs w:val="22"/>
           <w:rtl w:val="0"/>
         </w:rPr>
         <w:t xml:space="preserve">4. Clause-level hedges: it seems that, it is possible that, to some extent, in our view.</w:t>
@@ -13029,15 +13029,15 @@
       <w:r>
         <w:rPr>
           <w:rtl w:val="0"/>
-          <w:sz w:val="20"/>
-          <w:szCs w:val="20"/>
+          <w:sz w:val="22"/>
+          <w:szCs w:val="22"/>
         </w:rPr>
       </w:r>
     </w:p>
     <w:p>
       <w:pPr>
         <w:keepNext w:val="1"/>
-        <w:spacing w:before="20" w:after="0" w:line="252" w:lineRule="auto"/>
+        <w:spacing w:before="24" w:after="0" w:line="264" w:lineRule="auto"/>
         <w:ind w:firstLine="720"/>
         <w:jc w:val="left"/>
         <w:rPr/>
@@ -13047,8 +13047,8 @@
           <w:rFonts w:ascii="Georgia" w:cs="Georgia" w:eastAsia="Georgia" w:hAnsi="Georgia"/>
           <w:b w:val="1"/>
           <w:bCs w:val="1"/>
-          <w:sz w:val="20"/>
-          <w:szCs w:val="20"/>
+          <w:sz w:val="22"/>
+          <w:szCs w:val="22"/>
           <w:rtl w:val="0"/>
         </w:rPr>
         <w:t xml:space="preserve">Hedge functions</w:t>
@@ -13056,14 +13056,14 @@
       <w:r>
         <w:rPr>
           <w:rtl w:val="0"/>
-          <w:sz w:val="20"/>
-          <w:szCs w:val="20"/>
-        </w:rPr>
-      </w:r>
-    </w:p>
-    <w:p>
-      <w:pPr>
-        <w:spacing w:before="0" w:after="0" w:line="252" w:lineRule="auto"/>
+          <w:sz w:val="22"/>
+          <w:szCs w:val="22"/>
+        </w:rPr>
+      </w:r>
+    </w:p>
+    <w:p>
+      <w:pPr>
+        <w:spacing w:before="0" w:after="0" w:line="264" w:lineRule="auto"/>
         <w:ind w:left="240" w:firstLine="720"/>
         <w:jc w:val="both"/>
         <w:rPr/>
@@ -13073,8 +13073,8 @@
           <w:rFonts w:ascii="Georgia" w:cs="Georgia" w:eastAsia="Georgia" w:hAnsi="Georgia"/>
           <w:b w:val="0"/>
           <w:bCs w:val="0"/>
-          <w:sz w:val="20"/>
-          <w:szCs w:val="20"/>
+          <w:sz w:val="22"/>
+          <w:szCs w:val="22"/>
           <w:rtl w:val="0"/>
         </w:rPr>
         <w:t xml:space="preserve">Epistemic Caution: marks uncertainty about whether a claim is true (e.g., The treatment may reduce infection rates).</w:t>
@@ -13082,14 +13082,14 @@
       <w:r>
         <w:rPr>
           <w:rtl w:val="0"/>
-          <w:sz w:val="20"/>
-          <w:szCs w:val="20"/>
-        </w:rPr>
-      </w:r>
-    </w:p>
-    <w:p>
-      <w:pPr>
-        <w:spacing w:before="0" w:after="0" w:line="252" w:lineRule="auto"/>
+          <w:sz w:val="22"/>
+          <w:szCs w:val="22"/>
+        </w:rPr>
+      </w:r>
+    </w:p>
+    <w:p>
+      <w:pPr>
+        <w:spacing w:before="0" w:after="0" w:line="264" w:lineRule="auto"/>
         <w:ind w:left="240" w:firstLine="720"/>
         <w:jc w:val="both"/>
         <w:rPr/>
@@ -13099,8 +13099,8 @@
           <w:rFonts w:ascii="Georgia" w:cs="Georgia" w:eastAsia="Georgia" w:hAnsi="Georgia"/>
           <w:b w:val="0"/>
           <w:bCs w:val="0"/>
-          <w:sz w:val="20"/>
-          <w:szCs w:val="20"/>
+          <w:sz w:val="22"/>
+          <w:szCs w:val="22"/>
           <w:rtl w:val="0"/>
         </w:rPr>
         <w:t xml:space="preserve">Politeness / Deference: softens face threat or shows respect rather than genuine doubt (e.g., As suggested by Hyland…).</w:t>
@@ -13108,14 +13108,14 @@
       <w:r>
         <w:rPr>
           <w:rtl w:val="0"/>
-          <w:sz w:val="20"/>
-          <w:szCs w:val="20"/>
-        </w:rPr>
-      </w:r>
-    </w:p>
-    <w:p>
-      <w:pPr>
-        <w:spacing w:before="0" w:after="0" w:line="252" w:lineRule="auto"/>
+          <w:sz w:val="22"/>
+          <w:szCs w:val="22"/>
+        </w:rPr>
+      </w:r>
+    </w:p>
+    <w:p>
+      <w:pPr>
+        <w:spacing w:before="0" w:after="0" w:line="264" w:lineRule="auto"/>
         <w:ind w:left="240" w:firstLine="0"/>
         <w:jc w:val="both"/>
         <w:rPr/>
@@ -13125,8 +13125,8 @@
           <w:rFonts w:ascii="Georgia" w:cs="Georgia" w:eastAsia="Georgia" w:hAnsi="Georgia"/>
           <w:b w:val="0"/>
           <w:bCs w:val="0"/>
-          <w:sz w:val="20"/>
-          <w:szCs w:val="20"/>
+          <w:sz w:val="22"/>
+          <w:szCs w:val="22"/>
           <w:rtl w:val="0"/>
         </w:rPr>
         <w:t xml:space="preserve">Discourse Organization: manages text structure or reader expectations rather than stance (e.g., It should be noted that…).</w:t>
@@ -13134,15 +13134,15 @@
       <w:r>
         <w:rPr>
           <w:rtl w:val="0"/>
-          <w:sz w:val="20"/>
-          <w:szCs w:val="20"/>
+          <w:sz w:val="22"/>
+          <w:szCs w:val="22"/>
         </w:rPr>
       </w:r>
     </w:p>
     <w:p>
       <w:pPr>
         <w:keepNext w:val="1"/>
-        <w:spacing w:before="20" w:after="0" w:line="252" w:lineRule="auto"/>
+        <w:spacing w:before="24" w:after="0" w:line="264" w:lineRule="auto"/>
         <w:ind w:firstLine="720"/>
         <w:jc w:val="left"/>
         <w:rPr/>
@@ -13152,8 +13152,8 @@
           <w:rFonts w:ascii="Georgia" w:cs="Georgia" w:eastAsia="Georgia" w:hAnsi="Georgia"/>
           <w:b w:val="1"/>
           <w:bCs w:val="1"/>
-          <w:sz w:val="20"/>
-          <w:szCs w:val="20"/>
+          <w:sz w:val="22"/>
+          <w:szCs w:val="22"/>
           <w:rtl w:val="0"/>
         </w:rPr>
         <w:t xml:space="preserve">Core decision rules</w:t>
@@ -13161,14 +13161,14 @@
       <w:r>
         <w:rPr>
           <w:rtl w:val="0"/>
-          <w:sz w:val="20"/>
-          <w:szCs w:val="20"/>
-        </w:rPr>
-      </w:r>
-    </w:p>
-    <w:p>
-      <w:pPr>
-        <w:spacing w:before="0" w:after="0" w:line="252" w:lineRule="auto"/>
+          <w:sz w:val="22"/>
+          <w:szCs w:val="22"/>
+        </w:rPr>
+      </w:r>
+    </w:p>
+    <w:p>
+      <w:pPr>
+        <w:spacing w:before="0" w:after="0" w:line="264" w:lineRule="auto"/>
         <w:ind w:left="240" w:firstLine="720"/>
         <w:jc w:val="both"/>
         <w:rPr/>
@@ -13179,8 +13179,8 @@
           <w:rtl w:val="0"/>
           <w:i/>
           <w:iCs/>
-          <w:sz w:val="20"/>
-          <w:szCs w:val="20"/>
+          <w:sz w:val="22"/>
+          <w:szCs w:val="22"/>
         </w:rPr>
         <w:t xml:space="preserve">suggest / indicate becomes hedge when introducing a finding. Not a hedge when introducing a recommendation.</w:t>
       </w:r>
@@ -13188,8 +13188,8 @@
         <w:rPr>
           <w:rtl w:val="0"/>
           <w:rFonts w:ascii="Georgia" w:hAnsi="Georgia"/>
-          <w:sz w:val="20"/>
-          <w:szCs w:val="20"/>
+          <w:sz w:val="22"/>
+          <w:szCs w:val="22"/>
           <w:i/>
           <w:iCs/>
         </w:rPr>
@@ -13197,7 +13197,7 @@
     </w:p>
     <w:p>
       <w:pPr>
-        <w:spacing w:before="0" w:after="0" w:line="252" w:lineRule="auto"/>
+        <w:spacing w:before="0" w:after="0" w:line="264" w:lineRule="auto"/>
         <w:ind w:left="240" w:firstLine="720"/>
         <w:jc w:val="both"/>
         <w:rPr/>
@@ -13208,8 +13208,8 @@
           <w:rtl w:val="0"/>
           <w:i/>
           <w:iCs/>
-          <w:sz w:val="20"/>
-          <w:szCs w:val="20"/>
+          <w:sz w:val="22"/>
+          <w:szCs w:val="22"/>
         </w:rPr>
         <w:t xml:space="preserve">can / may becomes hedge when marking possibility. Not a hedge when marking capability.</w:t>
       </w:r>
@@ -13217,8 +13217,8 @@
         <w:rPr>
           <w:rtl w:val="0"/>
           <w:rFonts w:ascii="Georgia" w:hAnsi="Georgia"/>
-          <w:sz w:val="20"/>
-          <w:szCs w:val="20"/>
+          <w:sz w:val="22"/>
+          <w:szCs w:val="22"/>
           <w:i/>
           <w:iCs/>
         </w:rPr>
@@ -13226,7 +13226,7 @@
     </w:p>
     <w:p>
       <w:pPr>
-        <w:spacing w:before="0" w:after="0" w:line="252" w:lineRule="auto"/>
+        <w:spacing w:before="0" w:after="0" w:line="264" w:lineRule="auto"/>
         <w:ind w:left="240" w:firstLine="720"/>
         <w:jc w:val="both"/>
         <w:rPr/>
@@ -13237,8 +13237,8 @@
           <w:rtl w:val="0"/>
           <w:i/>
           <w:iCs/>
-          <w:sz w:val="20"/>
-          <w:szCs w:val="20"/>
+          <w:sz w:val="22"/>
+          <w:szCs w:val="22"/>
         </w:rPr>
         <w:t xml:space="preserve">generally / typically becomes hedge when limiting the scope of a claim. Not a hedge when describing a procedural norm.</w:t>
       </w:r>
@@ -13246,8 +13246,8 @@
         <w:rPr>
           <w:rtl w:val="0"/>
           <w:rFonts w:ascii="Georgia" w:hAnsi="Georgia"/>
-          <w:sz w:val="20"/>
-          <w:szCs w:val="20"/>
+          <w:sz w:val="22"/>
+          <w:szCs w:val="22"/>
           <w:i/>
           <w:iCs/>
         </w:rPr>
@@ -13255,7 +13255,7 @@
     </w:p>
     <w:p>
       <w:pPr>
-        <w:spacing w:before="0" w:after="0" w:line="252" w:lineRule="auto"/>
+        <w:spacing w:before="0" w:after="0" w:line="264" w:lineRule="auto"/>
         <w:ind w:left="240" w:firstLine="0"/>
         <w:jc w:val="both"/>
         <w:rPr/>
@@ -13266,8 +13266,8 @@
           <w:rtl w:val="0"/>
           <w:i/>
           <w:iCs/>
-          <w:sz w:val="20"/>
-          <w:szCs w:val="20"/>
+          <w:sz w:val="22"/>
+          <w:szCs w:val="22"/>
         </w:rPr>
         <w:t xml:space="preserve">appear / seem becomes hedge when expressing uncertainty about a result. Not a hedge when pointing to location in a table or text.</w:t>
       </w:r>
@@ -13275,8 +13275,8 @@
         <w:rPr>
           <w:rtl w:val="0"/>
           <w:rFonts w:ascii="Georgia" w:hAnsi="Georgia"/>
-          <w:sz w:val="20"/>
-          <w:szCs w:val="20"/>
+          <w:sz w:val="22"/>
+          <w:szCs w:val="22"/>
           <w:i/>
           <w:iCs/>
         </w:rPr>
@@ -13285,7 +13285,7 @@
     <w:p>
       <w:pPr>
         <w:keepNext w:val="1"/>
-        <w:spacing w:before="20" w:after="0" w:line="252" w:lineRule="auto"/>
+        <w:spacing w:before="24" w:after="0" w:line="264" w:lineRule="auto"/>
         <w:ind w:firstLine="720"/>
         <w:jc w:val="left"/>
         <w:rPr/>
@@ -13295,8 +13295,8 @@
           <w:rFonts w:ascii="Georgia" w:cs="Georgia" w:eastAsia="Georgia" w:hAnsi="Georgia"/>
           <w:b w:val="1"/>
           <w:bCs w:val="1"/>
-          <w:sz w:val="20"/>
-          <w:szCs w:val="20"/>
+          <w:sz w:val="22"/>
+          <w:szCs w:val="22"/>
           <w:rtl w:val="0"/>
         </w:rPr>
         <w:t xml:space="preserve">Exclusion and Working Test</w:t>
@@ -13304,14 +13304,14 @@
       <w:r>
         <w:rPr>
           <w:rtl w:val="0"/>
-          <w:sz w:val="20"/>
-          <w:szCs w:val="20"/>
-        </w:rPr>
-      </w:r>
-    </w:p>
-    <w:p>
-      <w:pPr>
-        <w:spacing w:before="0" w:after="0" w:line="252" w:lineRule="auto"/>
+          <w:sz w:val="22"/>
+          <w:szCs w:val="22"/>
+        </w:rPr>
+      </w:r>
+    </w:p>
+    <w:p>
+      <w:pPr>
+        <w:spacing w:before="0" w:after="0" w:line="264" w:lineRule="auto"/>
         <w:jc w:val="both"/>
         <w:rPr/>
       </w:pPr>
@@ -13320,8 +13320,8 @@
           <w:rFonts w:ascii="Georgia" w:cs="Georgia" w:eastAsia="Georgia" w:hAnsi="Georgia"/>
           <w:b w:val="0"/>
           <w:bCs w:val="0"/>
-          <w:sz w:val="20"/>
-          <w:szCs w:val="20"/>
+          <w:sz w:val="22"/>
+          <w:szCs w:val="22"/>
           <w:rtl w:val="0"/>
         </w:rPr>
         <w:t xml:space="preserve">Ability, future procedure, and necessity (must / should in procedural contexts) are never hedges. Stage 1: retain if removing the device makes a knowledge claim more categorical or more direct, or reduces imposition in how that claim is put forward (not directives). Working Test: used at Stage 2 to support EC when commitment to the proposition changes. Worked examples appear under Working Examples in the full codebook below.</w:t>
@@ -13329,8 +13329,8 @@
       <w:r>
         <w:rPr>
           <w:rtl w:val="0"/>
-          <w:sz w:val="20"/>
-          <w:szCs w:val="20"/>
+          <w:sz w:val="22"/>
+          <w:szCs w:val="22"/>
         </w:rPr>
       </w:r>
     </w:p>

</xml_diff>

<commit_message>
Draft_053: uniform Full Codebook spacing; densify Layer 1 table
</commit_message>
<xml_diff>
--- a/thesis/003_ThesisProposal_Draft_053.docx
+++ b/thesis/003_ThesisProposal_Draft_053.docx
@@ -303,7 +303,6 @@
     </w:p>
     <w:p>
       <w:pPr>
-        <w:keepLines w:val="1"/>
         <w:spacing w:before="0" w:after="720" w:line="480" w:lineRule="auto"/>
         <w:jc w:val="center"/>
         <w:rPr/>
@@ -330,7 +329,6 @@
     <w:p>
       <w:pPr>
         <w:keepNext w:val="1"/>
-        <w:keepLines w:val="1"/>
         <w:spacing w:before="240" w:after="0" w:line="480" w:lineRule="auto"/>
         <w:jc w:val="left"/>
         <w:rPr/>
@@ -466,7 +464,6 @@
     <w:p>
       <w:pPr>
         <w:keepNext w:val="1"/>
-        <w:keepLines w:val="1"/>
         <w:spacing w:before="240" w:after="0" w:line="480" w:lineRule="auto"/>
         <w:jc w:val="left"/>
         <w:rPr/>
@@ -545,7 +542,6 @@
     <w:p>
       <w:pPr>
         <w:keepNext w:val="1"/>
-        <w:keepLines w:val="1"/>
         <w:spacing w:before="240" w:after="0" w:line="480" w:lineRule="auto"/>
         <w:jc w:val="left"/>
         <w:rPr/>
@@ -624,7 +620,6 @@
     <w:p>
       <w:pPr>
         <w:keepNext w:val="1"/>
-        <w:keepLines w:val="1"/>
         <w:spacing w:before="240" w:after="0" w:line="480" w:lineRule="auto"/>
         <w:jc w:val="left"/>
         <w:rPr/>
@@ -703,7 +698,6 @@
     <w:p>
       <w:pPr>
         <w:keepNext w:val="1"/>
-        <w:keepLines w:val="1"/>
         <w:spacing w:before="240" w:after="0" w:line="480" w:lineRule="auto"/>
         <w:jc w:val="left"/>
         <w:rPr/>
@@ -756,7 +750,6 @@
     <w:p>
       <w:pPr>
         <w:keepNext w:val="1"/>
-        <w:keepLines w:val="1"/>
         <w:spacing w:before="240" w:after="0" w:line="480" w:lineRule="auto"/>
         <w:jc w:val="left"/>
         <w:rPr/>
@@ -861,7 +854,6 @@
     <w:p>
       <w:pPr>
         <w:keepNext w:val="1"/>
-        <w:keepLines w:val="1"/>
         <w:spacing w:before="240" w:after="0" w:line="480" w:lineRule="auto"/>
         <w:jc w:val="left"/>
         <w:rPr/>
@@ -1040,7 +1032,6 @@
     <w:p>
       <w:pPr>
         <w:keepNext w:val="1"/>
-        <w:keepLines w:val="1"/>
         <w:spacing w:before="240" w:after="0" w:line="480" w:lineRule="auto"/>
         <w:jc w:val="left"/>
         <w:rPr/>
@@ -1187,7 +1178,6 @@
     <w:p>
       <w:pPr>
         <w:keepNext w:val="1"/>
-        <w:keepLines w:val="1"/>
         <w:spacing w:before="360" w:after="0" w:line="480" w:lineRule="auto"/>
         <w:jc w:val="center"/>
         <w:rPr/>
@@ -1279,7 +1269,6 @@
     <w:p>
       <w:pPr>
         <w:keepNext w:val="1"/>
-        <w:keepLines w:val="1"/>
         <w:spacing w:before="240" w:after="0" w:line="480" w:lineRule="auto"/>
         <w:jc w:val="left"/>
         <w:rPr/>
@@ -1410,7 +1399,6 @@
     <w:p>
       <w:pPr>
         <w:keepNext w:val="1"/>
-        <w:keepLines w:val="1"/>
         <w:spacing w:before="240" w:after="0" w:line="480" w:lineRule="auto"/>
         <w:jc w:val="left"/>
         <w:rPr/>
@@ -1597,7 +1585,6 @@
     <w:p>
       <w:pPr>
         <w:keepNext w:val="1"/>
-        <w:keepLines w:val="1"/>
         <w:spacing w:before="240" w:after="0" w:line="480" w:lineRule="auto"/>
         <w:jc w:val="left"/>
         <w:rPr/>
@@ -2463,7 +2450,6 @@
     </w:p>
     <w:p>
       <w:pPr>
-        <w:keepLines w:val="1"/>
         <w:spacing w:before="720" w:after="720" w:line="480" w:lineRule="auto"/>
         <w:jc w:val="center"/>
         <w:rPr/>
@@ -2516,7 +2502,6 @@
     <w:p>
       <w:pPr>
         <w:keepNext w:val="1"/>
-        <w:keepLines w:val="1"/>
         <w:spacing w:before="240" w:after="0" w:line="480" w:lineRule="auto"/>
         <w:jc w:val="left"/>
         <w:rPr/>
@@ -2621,7 +2606,6 @@
     <w:p>
       <w:pPr>
         <w:keepNext w:val="1"/>
-        <w:keepLines w:val="1"/>
         <w:spacing w:before="240" w:after="0" w:line="480" w:lineRule="auto"/>
         <w:jc w:val="left"/>
         <w:rPr/>
@@ -2674,7 +2658,6 @@
     <w:p>
       <w:pPr>
         <w:keepNext w:val="1"/>
-        <w:keepLines w:val="1"/>
         <w:spacing w:before="240" w:after="0" w:line="480" w:lineRule="auto"/>
         <w:jc w:val="left"/>
         <w:rPr/>
@@ -2946,7 +2929,6 @@
     <w:p>
       <w:pPr>
         <w:keepNext w:val="1"/>
-        <w:keepLines w:val="1"/>
         <w:spacing w:before="240" w:after="0" w:line="480" w:lineRule="auto"/>
         <w:jc w:val="left"/>
         <w:rPr/>
@@ -2999,7 +2981,6 @@
     <w:p>
       <w:pPr>
         <w:keepNext w:val="1"/>
-        <w:keepLines w:val="1"/>
         <w:spacing w:before="240" w:after="0" w:line="480" w:lineRule="auto"/>
         <w:jc w:val="left"/>
         <w:rPr/>
@@ -3052,7 +3033,6 @@
     <w:p>
       <w:pPr>
         <w:keepNext w:val="1"/>
-        <w:keepLines w:val="1"/>
         <w:spacing w:before="720" w:after="0" w:line="480" w:lineRule="auto"/>
         <w:jc w:val="center"/>
       </w:pPr>
@@ -3068,7 +3048,6 @@
     <w:p>
       <w:pPr>
         <w:keepNext w:val="1"/>
-        <w:keepLines w:val="1"/>
         <w:spacing w:before="0" w:after="60" w:line="480" w:lineRule="auto"/>
         <w:jc w:val="both"/>
       </w:pPr>
@@ -4382,7 +4361,6 @@
     </w:p>
     <w:p>
       <w:pPr>
-        <w:keepLines w:val="1"/>
         <w:spacing w:before="720" w:after="720" w:line="480" w:lineRule="auto"/>
         <w:jc w:val="center"/>
         <w:rPr/>
@@ -4435,7 +4413,6 @@
     <w:p>
       <w:pPr>
         <w:keepNext w:val="1"/>
-        <w:keepLines w:val="1"/>
         <w:spacing w:before="240" w:after="0" w:line="480" w:lineRule="auto"/>
         <w:jc w:val="left"/>
         <w:rPr/>
@@ -4488,7 +4465,6 @@
     <w:p>
       <w:pPr>
         <w:keepNext w:val="1"/>
-        <w:keepLines w:val="1"/>
         <w:spacing w:before="720" w:after="0" w:line="480" w:lineRule="auto"/>
         <w:jc w:val="center"/>
       </w:pPr>
@@ -4504,7 +4480,6 @@
     <w:p>
       <w:pPr>
         <w:keepNext w:val="1"/>
-        <w:keepLines w:val="1"/>
         <w:spacing w:before="0" w:after="60" w:line="480" w:lineRule="auto"/>
         <w:jc w:val="both"/>
       </w:pPr>
@@ -5191,7 +5166,6 @@
         <w:spacing w:before="240" w:after="0" w:line="480" w:lineRule="auto"/>
         <w:jc w:val="center"/>
         <w:keepNext/>
-        <w:keepLines/>
       </w:pPr>
       <w:r>
         <w:rPr>
@@ -5208,7 +5182,6 @@
         <w:spacing w:before="0" w:after="0" w:line="480" w:lineRule="auto"/>
         <w:jc w:val="center"/>
         <w:keepNext/>
-        <w:keepLines/>
       </w:pPr>
       <w:r>
         <w:rPr>
@@ -7059,7 +7032,6 @@
     <w:p>
       <w:pPr>
         <w:keepNext w:val="1"/>
-        <w:keepLines w:val="1"/>
         <w:spacing w:before="720" w:after="0" w:line="480" w:lineRule="auto"/>
         <w:jc w:val="center"/>
       </w:pPr>
@@ -7075,7 +7047,6 @@
     <w:p>
       <w:pPr>
         <w:keepNext w:val="1"/>
-        <w:keepLines w:val="1"/>
         <w:spacing w:before="0" w:after="60" w:line="480" w:lineRule="auto"/>
         <w:jc w:val="center"/>
       </w:pPr>
@@ -8237,7 +8208,6 @@
     <w:p>
       <w:pPr>
         <w:keepNext w:val="1"/>
-        <w:keepLines w:val="1"/>
         <w:spacing w:before="240" w:after="0" w:line="480" w:lineRule="auto"/>
         <w:jc w:val="left"/>
         <w:rPr/>
@@ -8290,7 +8260,6 @@
     <w:p>
       <w:pPr>
         <w:keepNext w:val="1"/>
-        <w:keepLines w:val="1"/>
         <w:spacing w:before="720" w:after="0" w:line="480" w:lineRule="auto"/>
         <w:jc w:val="center"/>
       </w:pPr>
@@ -8306,7 +8275,6 @@
     <w:p>
       <w:pPr>
         <w:keepNext w:val="1"/>
-        <w:keepLines w:val="1"/>
         <w:spacing w:before="0" w:after="60" w:line="480" w:lineRule="auto"/>
         <w:jc w:val="center"/>
       </w:pPr>
@@ -9838,7 +9806,6 @@
     <w:p>
       <w:pPr>
         <w:keepNext w:val="1"/>
-        <w:keepLines w:val="1"/>
         <w:spacing w:before="240" w:after="0" w:line="480" w:lineRule="auto"/>
         <w:jc w:val="left"/>
         <w:rPr/>
@@ -9916,7 +9883,6 @@
     <w:p>
       <w:pPr>
         <w:keepNext w:val="1"/>
-        <w:keepLines w:val="1"/>
         <w:spacing w:before="720" w:after="0" w:line="480" w:lineRule="auto"/>
         <w:jc w:val="center"/>
       </w:pPr>
@@ -9932,7 +9898,6 @@
     <w:p>
       <w:pPr>
         <w:keepNext w:val="1"/>
-        <w:keepLines w:val="1"/>
         <w:spacing w:before="0" w:after="60" w:line="480" w:lineRule="auto"/>
         <w:jc w:val="both"/>
       </w:pPr>
@@ -10539,7 +10504,6 @@
     <w:p>
       <w:pPr>
         <w:keepNext w:val="1"/>
-        <w:keepLines w:val="1"/>
         <w:spacing w:before="240" w:after="0" w:line="480" w:lineRule="auto"/>
         <w:jc w:val="left"/>
         <w:rPr/>
@@ -10584,7 +10548,6 @@
     <w:p>
       <w:pPr>
         <w:keepNext w:val="1"/>
-        <w:keepLines w:val="1"/>
         <w:spacing w:before="720" w:after="0" w:line="480" w:lineRule="auto"/>
         <w:jc w:val="center"/>
       </w:pPr>
@@ -10604,7 +10567,6 @@
         <w:spacing w:before="0" w:after="60" w:line="480" w:lineRule="auto"/>
         <w:jc w:val="center"/>
         <w:keepNext w:val="1"/>
-        <w:keepLines/>
       </w:pPr>
       <w:r>
         <w:rPr>
@@ -11462,7 +11424,6 @@
     </w:p>
     <w:p>
       <w:pPr>
-        <w:keepLines w:val="1"/>
         <w:spacing w:before="720" w:after="720" w:line="480" w:lineRule="auto"/>
         <w:jc w:val="center"/>
         <w:rPr/>
@@ -11515,7 +11476,6 @@
     <w:p>
       <w:pPr>
         <w:keepNext w:val="1"/>
-        <w:keepLines w:val="1"/>
         <w:spacing w:before="240" w:after="0" w:line="480" w:lineRule="auto"/>
         <w:jc w:val="left"/>
         <w:rPr/>
@@ -11594,7 +11554,6 @@
     <w:p>
       <w:pPr>
         <w:keepNext w:val="1"/>
-        <w:keepLines w:val="1"/>
         <w:spacing w:before="240" w:after="0" w:line="480" w:lineRule="auto"/>
         <w:jc w:val="left"/>
         <w:rPr/>
@@ -11819,7 +11778,6 @@
     </w:p>
     <w:p>
       <w:pPr>
-        <w:keepLines w:val="1"/>
         <w:spacing w:before="720" w:after="720" w:line="480" w:lineRule="auto"/>
         <w:jc w:val="center"/>
         <w:rPr/>
@@ -12786,7 +12744,6 @@
     <w:p>
       <w:pPr>
         <w:keepNext w:val="1"/>
-        <w:keepLines w:val="1"/>
         <w:spacing w:before="240" w:after="240" w:line="240" w:lineRule="auto"/>
         <w:jc w:val="center"/>
         <w:rPr/>
@@ -12813,7 +12770,6 @@
     <w:p>
       <w:pPr>
         <w:keepNext w:val="1"/>
-        <w:keepLines w:val="1"/>
         <w:spacing w:before="40" w:after="20" w:line="264" w:lineRule="auto"/>
         <w:jc w:val="left"/>
         <w:rPr/>
@@ -13371,7 +13327,6 @@
     <w:p>
       <w:pPr>
         <w:keepNext w:val="1"/>
-        <w:keepLines w:val="1"/>
         <w:spacing w:before="0" w:after="0" w:line="288" w:lineRule="auto"/>
         <w:ind w:firstLine="720"/>
         <w:jc w:val="both"/>
@@ -14308,7 +14263,6 @@
     <w:p>
       <w:pPr>
         <w:keepNext w:val="1"/>
-        <w:keepLines w:val="1"/>
         <w:spacing w:before="0" w:after="0" w:line="288" w:lineRule="auto"/>
         <w:ind w:firstLine="720"/>
         <w:jc w:val="both"/>
@@ -14930,7 +14884,6 @@
     <w:p>
       <w:pPr>
         <w:keepNext w:val="1"/>
-        <w:keepLines w:val="1"/>
         <w:spacing w:before="60" w:after="0" w:line="288" w:lineRule="auto"/>
         <w:jc w:val="left"/>
         <w:rPr/>
@@ -15397,7 +15350,6 @@
     <w:p>
       <w:pPr>
         <w:keepNext w:val="1"/>
-        <w:keepLines w:val="1"/>
         <w:spacing w:before="0" w:after="0" w:line="288" w:lineRule="auto"/>
         <w:ind w:firstLine="720"/>
         <w:jc w:val="both"/>
@@ -15839,7 +15791,7 @@
     <w:p>
       <w:pPr>
         <w:keepNext w:val="1"/>
-        <w:spacing w:before="240" w:after="0" w:line="480" w:lineRule="auto"/>
+        <w:spacing w:before="120" w:after="60" w:line="360" w:lineRule="auto"/>
         <w:jc w:val="left"/>
         <w:rPr/>
       </w:pPr>
@@ -15863,7 +15815,7 @@
     <w:p>
       <w:pPr>
         <w:keepNext w:val="1"/>
-        <w:spacing w:before="120" w:after="0" w:line="360" w:lineRule="auto"/>
+        <w:spacing w:before="120" w:after="60" w:line="360" w:lineRule="auto"/>
         <w:jc w:val="left"/>
         <w:rPr/>
       </w:pPr>
@@ -15913,7 +15865,7 @@
     <w:p>
       <w:pPr>
         <w:keepNext w:val="1"/>
-        <w:spacing w:before="120" w:after="0" w:line="360" w:lineRule="auto"/>
+        <w:spacing w:before="120" w:after="60" w:line="360" w:lineRule="auto"/>
         <w:jc w:val="left"/>
         <w:rPr/>
       </w:pPr>
@@ -15993,7 +15945,7 @@
     </w:p>
     <w:p>
       <w:pPr>
-        <w:spacing w:before="0" w:after="0" w:line="480" w:lineRule="auto"/>
+        <w:spacing w:before="120" w:after="60" w:line="360" w:lineRule="auto"/>
         <w:ind w:firstLine="720"/>
         <w:jc w:val="both"/>
         <w:rPr/>
@@ -16010,6 +15962,32 @@
           <w:rtl w:val="0"/>
         </w:rPr>
         <w:t xml:space="preserve">Softening is broader than epistemic qualification. Stage 1 admits softening of force, directness, or imposition, including interpersonal and discourse-managing uses. The Working Test then helps decide whether a retained item is EC (commitment to the proposition changes) as opposed to primarily P or DO. P-only or DO-only items can be retained at Stage 1 when they reduce imposition or frame uptake, even if certainty is unchanged.</w:t>
+      </w:r>
+      <w:r>
+        <w:rPr>
+          <w:rtl w:val="0"/>
+        </w:rPr>
+      </w:r>
+    </w:p>
+    <w:p>
+      <w:pPr>
+        <w:spacing w:before="120" w:after="60" w:line="360" w:lineRule="auto"/>
+        <w:ind w:firstLine="720"/>
+        <w:jc w:val="both"/>
+        <w:rPr/>
+      </w:pPr>
+      <w:r>
+        <w:rPr>
+          <w:rFonts w:ascii="Georgia" w:cs="Georgia" w:eastAsia="Georgia" w:hAnsi="Georgia"/>
+          <w:b w:val="0"/>
+          <w:bCs w:val="0"/>
+          <w:i w:val="0"/>
+          <w:iCs w:val="0"/>
+          <w:sz w:val="22"/>
+          <w:szCs w:val="22"/>
+          <w:rtl w:val="0"/>
+        </w:rPr>
+        <w:t xml:space="preserve">Epistemic vs. deontic: epistemic language concerns how certain a claim is (what may or might be true). Deontic language concerns what should or needs to be done. Deontic language (obligation/recommendation) is never retained at Stage 1, whatever verb carries it. Example: “We suggest further research” is FP-Rec even though “suggest” is on the hedge list.</w:t>
       </w:r>
       <w:r>
         <w:rPr>
@@ -16031,15 +16009,125 @@
           <w:bCs w:val="0"/>
           <w:i w:val="0"/>
           <w:iCs w:val="0"/>
-          <w:sz w:val="22"/>
-          <w:szCs w:val="22"/>
-          <w:rtl w:val="0"/>
-        </w:rPr>
-        <w:t xml:space="preserve">Epistemic vs. deontic: epistemic language concerns how certain a claim is (what may or might be true). Deontic language concerns what should or needs to be done. Deontic language (obligation/recommendation) is never retained at Stage 1, whatever verb carries it. Example: “We suggest further research” is FP-Rec even though “suggest” is on the hedge list.</w:t>
-      </w:r>
-      <w:r>
-        <w:rPr>
-          <w:rtl w:val="0"/>
+          <w:color w:val="000000"/>
+          <w:sz w:val="22"/>
+          <w:szCs w:val="22"/>
+          <w:rtl w:val="0"/>
+        </w:rPr>
+        <w:t xml:space="preserve">Do not code a word as a hedge just because it appears in the hedge list. Evaluate its function in the sentence: “can” is a hedge only for possibility, not capability. “suggest” is a hedge only for a finding, not a recommendation.</w:t>
+      </w:r>
+      <w:r>
+        <w:rPr>
+          <w:rFonts w:ascii="Georgia" w:cs="Georgia" w:eastAsia="Georgia" w:hAnsi="Georgia"/>
+          <w:b w:val="0"/>
+          <w:bCs w:val="0"/>
+          <w:i w:val="1"/>
+          <w:iCs w:val="1"/>
+          <w:color w:val="000000"/>
+          <w:sz w:val="22"/>
+          <w:szCs w:val="22"/>
+          <w:rtl w:val="0"/>
+        </w:rPr>
+        <w:t xml:space="preserve"/>
+      </w:r>
+      <w:r>
+        <w:rPr>
+          <w:rFonts w:ascii="Georgia" w:cs="Georgia" w:eastAsia="Georgia" w:hAnsi="Georgia"/>
+          <w:b w:val="0"/>
+          <w:bCs w:val="0"/>
+          <w:i w:val="0"/>
+          <w:iCs w:val="0"/>
+          <w:color w:val="000000"/>
+          <w:sz w:val="22"/>
+          <w:szCs w:val="22"/>
+          <w:rtl w:val="0"/>
+        </w:rPr>
+        <w:t xml:space="preserve"/>
+      </w:r>
+      <w:r>
+        <w:rPr>
+          <w:rFonts w:ascii="Georgia" w:cs="Georgia" w:eastAsia="Georgia" w:hAnsi="Georgia"/>
+          <w:b w:val="0"/>
+          <w:bCs w:val="0"/>
+          <w:i w:val="1"/>
+          <w:iCs w:val="1"/>
+          <w:color w:val="000000"/>
+          <w:sz w:val="22"/>
+          <w:szCs w:val="22"/>
+          <w:rtl w:val="0"/>
+        </w:rPr>
+        <w:t xml:space="preserve"/>
+      </w:r>
+      <w:r>
+        <w:rPr>
+          <w:rFonts w:ascii="Georgia" w:cs="Georgia" w:eastAsia="Georgia" w:hAnsi="Georgia"/>
+          <w:b w:val="0"/>
+          <w:bCs w:val="0"/>
+          <w:i w:val="0"/>
+          <w:iCs w:val="0"/>
+          <w:color w:val="000000"/>
+          <w:sz w:val="22"/>
+          <w:szCs w:val="22"/>
+          <w:rtl w:val="0"/>
+        </w:rPr>
+        <w:t xml:space="preserve"/>
+      </w:r>
+      <w:r>
+        <w:rPr>
+          <w:rtl w:val="0"/>
+        </w:rPr>
+      </w:r>
+    </w:p>
+    <w:p>
+      <w:pPr>
+        <w:spacing w:before="120" w:after="60" w:line="360" w:lineRule="auto"/>
+        <w:ind w:firstLine="720"/>
+        <w:jc w:val="both"/>
+        <w:rPr/>
+      </w:pPr>
+      <w:r>
+        <w:rPr>
+          <w:rFonts w:ascii="Georgia" w:cs="Georgia" w:eastAsia="Georgia" w:hAnsi="Georgia"/>
+          <w:b w:val="0"/>
+          <w:bCs w:val="0"/>
+          <w:i w:val="0"/>
+          <w:iCs w:val="0"/>
+          <w:sz w:val="22"/>
+          <w:szCs w:val="22"/>
+          <w:rtl w:val="0"/>
+        </w:rPr>
+        <w:t xml:space="preserve">Coding order: read the sentence in full, apply Stage 1 (force / directness / imposition), check Decision Rules and false-positive exclusions, assign Stage 2 function (EC, P, and/or DO), use the Working Test when deciding whether EC applies, and log unresolved cases in Coder Notes rather than guessing.</w:t>
+      </w:r>
+      <w:r>
+        <w:rPr>
+          <w:rtl w:val="0"/>
+        </w:rPr>
+      </w:r>
+    </w:p>
+    <w:p>
+      <w:pPr>
+        <w:spacing w:before="120" w:after="60" w:line="360" w:lineRule="auto"/>
+        <w:ind w:firstLine="720"/>
+        <w:jc w:val="both"/>
+        <w:rPr/>
+      </w:pPr>
+      <w:r>
+        <w:rPr>
+          <w:rFonts w:ascii="Georgia" w:cs="Georgia" w:eastAsia="Georgia" w:hAnsi="Georgia"/>
+          <w:b w:val="1"/>
+          <w:bCs w:val="0"/>
+          <w:i w:val="0"/>
+          <w:iCs w:val="0"/>
+          <w:sz w:val="22"/>
+          <w:szCs w:val="22"/>
+          <w:rtl w:val="0"/>
+        </w:rPr>
+        <w:t xml:space="preserve">WORKING EXAMPLES: STAGE 1 RETENTION AND STAGE 2 FUNCTION (EC, P, DO)</w:t>
+      </w:r>
+      <w:r>
+        <w:rPr>
+          <w:rtl w:val="0"/>
+          <w:b w:val="1"/>
         </w:rPr>
       </w:r>
     </w:p>
@@ -16057,68 +16145,141 @@
           <w:bCs w:val="0"/>
           <w:i w:val="0"/>
           <w:iCs w:val="0"/>
-          <w:color w:val="000000"/>
-          <w:sz w:val="22"/>
-          <w:szCs w:val="22"/>
-          <w:rtl w:val="0"/>
-        </w:rPr>
-        <w:t xml:space="preserve">Do not code a word as a hedge just because it appears in the hedge list. Evaluate its function in the sentence: “can” is a hedge only for possibility, not capability. “suggest” is a hedge only for a finding, not a recommendation.</w:t>
-      </w:r>
-      <w:r>
-        <w:rPr>
-          <w:rFonts w:ascii="Georgia" w:cs="Georgia" w:eastAsia="Georgia" w:hAnsi="Georgia"/>
-          <w:b w:val="0"/>
-          <w:bCs w:val="0"/>
-          <w:i w:val="1"/>
-          <w:iCs w:val="1"/>
-          <w:color w:val="000000"/>
-          <w:sz w:val="22"/>
-          <w:szCs w:val="22"/>
-          <w:rtl w:val="0"/>
-        </w:rPr>
-        <w:t xml:space="preserve"/>
-      </w:r>
-      <w:r>
-        <w:rPr>
-          <w:rFonts w:ascii="Georgia" w:cs="Georgia" w:eastAsia="Georgia" w:hAnsi="Georgia"/>
-          <w:b w:val="0"/>
-          <w:bCs w:val="0"/>
-          <w:i w:val="0"/>
-          <w:iCs w:val="0"/>
-          <w:color w:val="000000"/>
-          <w:sz w:val="22"/>
-          <w:szCs w:val="22"/>
-          <w:rtl w:val="0"/>
-        </w:rPr>
-        <w:t xml:space="preserve"/>
-      </w:r>
-      <w:r>
-        <w:rPr>
-          <w:rFonts w:ascii="Georgia" w:cs="Georgia" w:eastAsia="Georgia" w:hAnsi="Georgia"/>
-          <w:b w:val="0"/>
-          <w:bCs w:val="0"/>
-          <w:i w:val="1"/>
-          <w:iCs w:val="1"/>
-          <w:color w:val="000000"/>
-          <w:sz w:val="22"/>
-          <w:szCs w:val="22"/>
-          <w:rtl w:val="0"/>
-        </w:rPr>
-        <w:t xml:space="preserve"/>
-      </w:r>
-      <w:r>
-        <w:rPr>
-          <w:rFonts w:ascii="Georgia" w:cs="Georgia" w:eastAsia="Georgia" w:hAnsi="Georgia"/>
-          <w:b w:val="0"/>
-          <w:bCs w:val="0"/>
-          <w:i w:val="0"/>
-          <w:iCs w:val="0"/>
-          <w:color w:val="000000"/>
-          <w:sz w:val="22"/>
-          <w:szCs w:val="22"/>
-          <w:rtl w:val="0"/>
-        </w:rPr>
-        <w:t xml:space="preserve"/>
+          <w:sz w:val="22"/>
+          <w:szCs w:val="22"/>
+          <w:rtl w:val="0"/>
+        </w:rPr>
+        <w:t xml:space="preserve">Function labels (EC, P, DO) are applied after Stage 1 retention. Stage 1 asks whether removing the expression makes a knowledge claim more categorical or more direct, or softens imposition on that claim (not a directive). The Working Test asks whether commitment to the proposition’s truth changes; it supports EC labeling and does not by itself bar P or DO. The examples below separate retention from function.</w:t>
+      </w:r>
+      <w:r>
+        <w:rPr>
+          <w:rtl w:val="0"/>
+        </w:rPr>
+      </w:r>
+    </w:p>
+    <w:p>
+      <w:pPr>
+        <w:spacing w:before="120" w:after="60" w:line="360" w:lineRule="auto"/>
+        <w:ind w:firstLine="720"/>
+        <w:jc w:val="both"/>
+        <w:rPr/>
+      </w:pPr>
+      <w:r>
+        <w:rPr>
+          <w:rFonts w:ascii="Georgia" w:cs="Georgia" w:eastAsia="Georgia" w:hAnsi="Georgia"/>
+          <w:b w:val="0"/>
+          <w:bCs w:val="0"/>
+          <w:i w:val="0"/>
+          <w:iCs w:val="0"/>
+          <w:sz w:val="22"/>
+          <w:szCs w:val="22"/>
+          <w:rtl w:val="0"/>
+        </w:rPr>
+        <w:t xml:space="preserve">Epistemic Caution (EC) as hedge. “The treatment may reduce infection rates.” Removing may raises certainty about the finding. Working Test: pass. Code as hedge; function EC.</w:t>
+      </w:r>
+      <w:r>
+        <w:rPr>
+          <w:rtl w:val="0"/>
+        </w:rPr>
+      </w:r>
+    </w:p>
+    <w:p>
+      <w:pPr>
+        <w:spacing w:before="120" w:after="60" w:line="360" w:lineRule="auto"/>
+        <w:ind w:firstLine="720"/>
+        <w:jc w:val="both"/>
+        <w:rPr/>
+      </w:pPr>
+      <w:r>
+        <w:rPr>
+          <w:rFonts w:ascii="Georgia" w:cs="Georgia" w:eastAsia="Georgia" w:hAnsi="Georgia"/>
+          <w:b w:val="0"/>
+          <w:bCs w:val="0"/>
+          <w:i w:val="0"/>
+          <w:iCs w:val="0"/>
+          <w:sz w:val="22"/>
+          <w:szCs w:val="22"/>
+          <w:rtl w:val="0"/>
+        </w:rPr>
+        <w:t xml:space="preserve">Not a hedge (capability / false positive). “PCR can detect low concentrations.” Removing can does not change commitment to a research claim; can marks capability. Working Test: fail. Code FP-Cap, not a hedge.</w:t>
+      </w:r>
+      <w:r>
+        <w:rPr>
+          <w:rtl w:val="0"/>
+        </w:rPr>
+      </w:r>
+    </w:p>
+    <w:p>
+      <w:pPr>
+        <w:spacing w:before="120" w:after="60" w:line="360" w:lineRule="auto"/>
+        <w:ind w:firstLine="720"/>
+        <w:jc w:val="both"/>
+        <w:rPr/>
+      </w:pPr>
+      <w:r>
+        <w:rPr>
+          <w:rFonts w:ascii="Georgia" w:cs="Georgia" w:eastAsia="Georgia" w:hAnsi="Georgia"/>
+          <w:b w:val="0"/>
+          <w:bCs w:val="0"/>
+          <w:i w:val="0"/>
+          <w:iCs w:val="0"/>
+          <w:sz w:val="22"/>
+          <w:szCs w:val="22"/>
+          <w:rtl w:val="0"/>
+        </w:rPr>
+        <w:t xml:space="preserve">Politeness / Deference (P), Stage 1 pass possible. “As suggested by previous researchers, the treatment is effective.” Removing As suggested by previous researchers makes the claim more direct and less deferential. Stage 1: pass (reduced imposition). Working Test for EC: fail (certainty unchanged). Stage 2: P, not EC. Count as a hedge/mitigation device with function P.</w:t>
+      </w:r>
+      <w:r>
+        <w:rPr>
+          <w:rtl w:val="0"/>
+        </w:rPr>
+      </w:r>
+    </w:p>
+    <w:p>
+      <w:pPr>
+        <w:spacing w:before="120" w:after="60" w:line="360" w:lineRule="auto"/>
+        <w:ind w:firstLine="720"/>
+        <w:jc w:val="both"/>
+        <w:rPr/>
+      </w:pPr>
+      <w:r>
+        <w:rPr>
+          <w:rFonts w:ascii="Georgia" w:cs="Georgia" w:eastAsia="Georgia" w:hAnsi="Georgia"/>
+          <w:b w:val="0"/>
+          <w:bCs w:val="0"/>
+          <w:i w:val="0"/>
+          <w:iCs w:val="0"/>
+          <w:sz w:val="22"/>
+          <w:szCs w:val="22"/>
+          <w:rtl w:val="0"/>
+        </w:rPr>
+        <w:t xml:space="preserve">Both P and EC (Stage 1 pass; Stage 2 EC with P co-occurring). “We would suggest that the treatment may be less effective than earlier reports claimed.” Removing would suggest / may makes the criticism more categorical and more imposing. Stage 1: pass. Working Test for EC: pass. Stage 2: EC primary, P co-occurring (deference and softened disagreement).</w:t>
+      </w:r>
+      <w:r>
+        <w:rPr>
+          <w:rtl w:val="0"/>
+        </w:rPr>
+      </w:r>
+    </w:p>
+    <w:p>
+      <w:pPr>
+        <w:spacing w:before="120" w:after="60" w:line="360" w:lineRule="auto"/>
+        <w:ind w:firstLine="720"/>
+        <w:jc w:val="both"/>
+        <w:rPr/>
+      </w:pPr>
+      <w:r>
+        <w:rPr>
+          <w:rFonts w:ascii="Georgia" w:cs="Georgia" w:eastAsia="Georgia" w:hAnsi="Georgia"/>
+          <w:b w:val="0"/>
+          <w:bCs w:val="0"/>
+          <w:i w:val="0"/>
+          <w:iCs w:val="0"/>
+          <w:sz w:val="22"/>
+          <w:szCs w:val="22"/>
+          <w:rtl w:val="0"/>
+        </w:rPr>
+        <w:t xml:space="preserve">Discourse Organization (DO), Stage 1 pass when framing uptake. “It should be noted that the treatment increased plant height.” Removing It should be noted that removes reader guidance and can make the point land more bluntly. Stage 1: pass if the phrase frames how the claim is taken. Working Test for EC: fail. Stage 2: DO. Pure sequence markers (Thus, Therefore, Hence, In conclusion) that only order moves still fail Stage 1 and are not counted.</w:t>
       </w:r>
       <w:r>
         <w:rPr>
@@ -16144,17 +16305,17 @@
           <w:szCs w:val="22"/>
           <w:rtl w:val="0"/>
         </w:rPr>
-        <w:t xml:space="preserve">Coding order: read the sentence in full, apply Stage 1 (force / directness / imposition), check Decision Rules and false-positive exclusions, assign Stage 2 function (EC, P, and/or DO), use the Working Test when deciding whether EC applies, and log unresolved cases in Coder Notes rather than guessing.</w:t>
-      </w:r>
-      <w:r>
-        <w:rPr>
-          <w:rtl w:val="0"/>
-        </w:rPr>
-      </w:r>
-    </w:p>
-    <w:p>
-      <w:pPr>
-        <w:spacing w:before="0" w:after="0" w:line="480" w:lineRule="auto"/>
+        <w:t xml:space="preserve">DO-looking frame with a separate hedge. “It should be noted that the results may indicate a positive effect.” It should be noted that fails the Working Test on its own. may indicate passes. Code only may indicate as the hedge (EC). Do not treat the whole clause as one hedge because a later token is epistemic.</w:t>
+      </w:r>
+      <w:r>
+        <w:rPr>
+          <w:rtl w:val="0"/>
+        </w:rPr>
+      </w:r>
+    </w:p>
+    <w:p>
+      <w:pPr>
+        <w:spacing w:before="120" w:after="60" w:line="360" w:lineRule="auto"/>
         <w:ind w:firstLine="720"/>
         <w:jc w:val="both"/>
         <w:rPr/>
@@ -16162,215 +16323,6 @@
       <w:r>
         <w:rPr>
           <w:rFonts w:ascii="Georgia" w:cs="Georgia" w:eastAsia="Georgia" w:hAnsi="Georgia"/>
-          <w:b w:val="1"/>
-          <w:bCs w:val="0"/>
-          <w:i w:val="0"/>
-          <w:iCs w:val="0"/>
-          <w:sz w:val="22"/>
-          <w:szCs w:val="22"/>
-          <w:rtl w:val="0"/>
-        </w:rPr>
-        <w:t xml:space="preserve">WORKING EXAMPLES: STAGE 1 RETENTION AND STAGE 2 FUNCTION (EC, P, DO)</w:t>
-      </w:r>
-      <w:r>
-        <w:rPr>
-          <w:rtl w:val="0"/>
-          <w:b w:val="1"/>
-        </w:rPr>
-      </w:r>
-    </w:p>
-    <w:p>
-      <w:pPr>
-        <w:spacing w:before="0" w:after="0" w:line="480" w:lineRule="auto"/>
-        <w:ind w:firstLine="720"/>
-        <w:jc w:val="both"/>
-        <w:rPr/>
-      </w:pPr>
-      <w:r>
-        <w:rPr>
-          <w:rFonts w:ascii="Georgia" w:cs="Georgia" w:eastAsia="Georgia" w:hAnsi="Georgia"/>
-          <w:b w:val="0"/>
-          <w:bCs w:val="0"/>
-          <w:i w:val="0"/>
-          <w:iCs w:val="0"/>
-          <w:sz w:val="22"/>
-          <w:szCs w:val="22"/>
-          <w:rtl w:val="0"/>
-        </w:rPr>
-        <w:t xml:space="preserve">Function labels (EC, P, DO) are applied after Stage 1 retention. Stage 1 asks whether removing the expression makes a knowledge claim more categorical or more direct, or softens imposition on that claim (not a directive). The Working Test asks whether commitment to the proposition’s truth changes; it supports EC labeling and does not by itself bar P or DO. The examples below separate retention from function.</w:t>
-      </w:r>
-      <w:r>
-        <w:rPr>
-          <w:rtl w:val="0"/>
-        </w:rPr>
-      </w:r>
-    </w:p>
-    <w:p>
-      <w:pPr>
-        <w:spacing w:before="0" w:after="0" w:line="480" w:lineRule="auto"/>
-        <w:ind w:firstLine="720"/>
-        <w:jc w:val="both"/>
-        <w:rPr/>
-      </w:pPr>
-      <w:r>
-        <w:rPr>
-          <w:rFonts w:ascii="Georgia" w:cs="Georgia" w:eastAsia="Georgia" w:hAnsi="Georgia"/>
-          <w:b w:val="0"/>
-          <w:bCs w:val="0"/>
-          <w:i w:val="0"/>
-          <w:iCs w:val="0"/>
-          <w:sz w:val="22"/>
-          <w:szCs w:val="22"/>
-          <w:rtl w:val="0"/>
-        </w:rPr>
-        <w:t xml:space="preserve">Epistemic Caution (EC) as hedge. “The treatment may reduce infection rates.” Removing may raises certainty about the finding. Working Test: pass. Code as hedge; function EC.</w:t>
-      </w:r>
-      <w:r>
-        <w:rPr>
-          <w:rtl w:val="0"/>
-        </w:rPr>
-      </w:r>
-    </w:p>
-    <w:p>
-      <w:pPr>
-        <w:spacing w:before="0" w:after="0" w:line="480" w:lineRule="auto"/>
-        <w:ind w:firstLine="720"/>
-        <w:jc w:val="both"/>
-        <w:rPr/>
-      </w:pPr>
-      <w:r>
-        <w:rPr>
-          <w:rFonts w:ascii="Georgia" w:cs="Georgia" w:eastAsia="Georgia" w:hAnsi="Georgia"/>
-          <w:b w:val="0"/>
-          <w:bCs w:val="0"/>
-          <w:i w:val="0"/>
-          <w:iCs w:val="0"/>
-          <w:sz w:val="22"/>
-          <w:szCs w:val="22"/>
-          <w:rtl w:val="0"/>
-        </w:rPr>
-        <w:t xml:space="preserve">Not a hedge (capability / false positive). “PCR can detect low concentrations.” Removing can does not change commitment to a research claim; can marks capability. Working Test: fail. Code FP-Cap, not a hedge.</w:t>
-      </w:r>
-      <w:r>
-        <w:rPr>
-          <w:rtl w:val="0"/>
-        </w:rPr>
-      </w:r>
-    </w:p>
-    <w:p>
-      <w:pPr>
-        <w:spacing w:before="0" w:after="0" w:line="480" w:lineRule="auto"/>
-        <w:ind w:firstLine="720"/>
-        <w:jc w:val="both"/>
-        <w:rPr/>
-      </w:pPr>
-      <w:r>
-        <w:rPr>
-          <w:rFonts w:ascii="Georgia" w:cs="Georgia" w:eastAsia="Georgia" w:hAnsi="Georgia"/>
-          <w:b w:val="0"/>
-          <w:bCs w:val="0"/>
-          <w:i w:val="0"/>
-          <w:iCs w:val="0"/>
-          <w:sz w:val="22"/>
-          <w:szCs w:val="22"/>
-          <w:rtl w:val="0"/>
-        </w:rPr>
-        <w:t xml:space="preserve">Politeness / Deference (P), Stage 1 pass possible. “As suggested by previous researchers, the treatment is effective.” Removing As suggested by previous researchers makes the claim more direct and less deferential. Stage 1: pass (reduced imposition). Working Test for EC: fail (certainty unchanged). Stage 2: P, not EC. Count as a hedge/mitigation device with function P.</w:t>
-      </w:r>
-      <w:r>
-        <w:rPr>
-          <w:rtl w:val="0"/>
-        </w:rPr>
-      </w:r>
-    </w:p>
-    <w:p>
-      <w:pPr>
-        <w:spacing w:before="0" w:after="0" w:line="480" w:lineRule="auto"/>
-        <w:ind w:firstLine="720"/>
-        <w:jc w:val="both"/>
-        <w:rPr/>
-      </w:pPr>
-      <w:r>
-        <w:rPr>
-          <w:rFonts w:ascii="Georgia" w:cs="Georgia" w:eastAsia="Georgia" w:hAnsi="Georgia"/>
-          <w:b w:val="0"/>
-          <w:bCs w:val="0"/>
-          <w:i w:val="0"/>
-          <w:iCs w:val="0"/>
-          <w:sz w:val="22"/>
-          <w:szCs w:val="22"/>
-          <w:rtl w:val="0"/>
-        </w:rPr>
-        <w:t xml:space="preserve">Both P and EC (Stage 1 pass; Stage 2 EC with P co-occurring). “We would suggest that the treatment may be less effective than earlier reports claimed.” Removing would suggest / may makes the criticism more categorical and more imposing. Stage 1: pass. Working Test for EC: pass. Stage 2: EC primary, P co-occurring (deference and softened disagreement).</w:t>
-      </w:r>
-      <w:r>
-        <w:rPr>
-          <w:rtl w:val="0"/>
-        </w:rPr>
-      </w:r>
-    </w:p>
-    <w:p>
-      <w:pPr>
-        <w:spacing w:before="0" w:after="0" w:line="480" w:lineRule="auto"/>
-        <w:ind w:firstLine="720"/>
-        <w:jc w:val="both"/>
-        <w:rPr/>
-      </w:pPr>
-      <w:r>
-        <w:rPr>
-          <w:rFonts w:ascii="Georgia" w:cs="Georgia" w:eastAsia="Georgia" w:hAnsi="Georgia"/>
-          <w:b w:val="0"/>
-          <w:bCs w:val="0"/>
-          <w:i w:val="0"/>
-          <w:iCs w:val="0"/>
-          <w:sz w:val="22"/>
-          <w:szCs w:val="22"/>
-          <w:rtl w:val="0"/>
-        </w:rPr>
-        <w:t xml:space="preserve">Discourse Organization (DO), Stage 1 pass when framing uptake. “It should be noted that the treatment increased plant height.” Removing It should be noted that removes reader guidance and can make the point land more bluntly. Stage 1: pass if the phrase frames how the claim is taken. Working Test for EC: fail. Stage 2: DO. Pure sequence markers (Thus, Therefore, Hence, In conclusion) that only order moves still fail Stage 1 and are not counted.</w:t>
-      </w:r>
-      <w:r>
-        <w:rPr>
-          <w:rtl w:val="0"/>
-        </w:rPr>
-      </w:r>
-    </w:p>
-    <w:p>
-      <w:pPr>
-        <w:spacing w:before="0" w:after="0" w:line="480" w:lineRule="auto"/>
-        <w:ind w:firstLine="720"/>
-        <w:jc w:val="both"/>
-        <w:rPr/>
-      </w:pPr>
-      <w:r>
-        <w:rPr>
-          <w:rFonts w:ascii="Georgia" w:cs="Georgia" w:eastAsia="Georgia" w:hAnsi="Georgia"/>
-          <w:b w:val="0"/>
-          <w:bCs w:val="0"/>
-          <w:i w:val="0"/>
-          <w:iCs w:val="0"/>
-          <w:sz w:val="22"/>
-          <w:szCs w:val="22"/>
-          <w:rtl w:val="0"/>
-        </w:rPr>
-        <w:t xml:space="preserve">DO-looking frame with a separate hedge. “It should be noted that the results may indicate a positive effect.” It should be noted that fails the Working Test on its own. may indicate passes. Code only may indicate as the hedge (EC). Do not treat the whole clause as one hedge because a later token is epistemic.</w:t>
-      </w:r>
-      <w:r>
-        <w:rPr>
-          <w:rtl w:val="0"/>
-        </w:rPr>
-      </w:r>
-    </w:p>
-    <w:p>
-      <w:pPr>
-        <w:spacing w:before="0" w:after="0" w:line="480" w:lineRule="auto"/>
-        <w:ind w:firstLine="720"/>
-        <w:jc w:val="both"/>
-        <w:rPr/>
-      </w:pPr>
-      <w:r>
-        <w:rPr>
-          <w:rFonts w:ascii="Georgia" w:cs="Georgia" w:eastAsia="Georgia" w:hAnsi="Georgia"/>
           <w:b w:val="0"/>
           <w:bCs w:val="0"/>
           <w:i w:val="0"/>
@@ -16390,7 +16342,7 @@
     <w:p>
       <w:pPr>
         <w:keepNext w:val="1"/>
-        <w:spacing w:before="120" w:after="0" w:line="360" w:lineRule="auto"/>
+        <w:spacing w:before="120" w:after="60" w:line="360" w:lineRule="auto"/>
         <w:jc w:val="left"/>
         <w:rPr/>
       </w:pPr>
@@ -16416,7 +16368,6 @@
     <w:p>
       <w:pPr>
         <w:keepNext w:val="1"/>
-        <w:keepLines w:val="1"/>
         <w:spacing w:before="0" w:after="0" w:line="360" w:lineRule="auto"/>
         <w:ind w:firstLine="720"/>
         <w:jc w:val="both"/>
@@ -16474,7 +16425,6 @@
       </w:tblGrid>
       <w:tr>
         <w:trPr>
-          <w:cantSplit w:val="1"/>
           <w:tblHeader w:val="1"/>
         </w:trPr>
         <w:tc>
@@ -16616,7 +16566,6 @@
       </w:tr>
       <w:tr>
         <w:trPr>
-          <w:cantSplit w:val="1"/>
           <w:tblHeader w:val="0"/>
         </w:trPr>
         <w:tc>
@@ -16766,7 +16715,6 @@
       </w:tr>
       <w:tr>
         <w:trPr>
-          <w:cantSplit w:val="1"/>
           <w:tblHeader w:val="0"/>
         </w:trPr>
         <w:tc>
@@ -16916,7 +16864,6 @@
       </w:tr>
       <w:tr>
         <w:trPr>
-          <w:cantSplit w:val="1"/>
           <w:tblHeader w:val="0"/>
         </w:trPr>
         <w:tc>
@@ -17066,7 +17013,6 @@
       </w:tr>
       <w:tr>
         <w:trPr>
-          <w:cantSplit w:val="1"/>
           <w:tblHeader w:val="0"/>
         </w:trPr>
         <w:tc>
@@ -17218,7 +17164,7 @@
     <w:p>
       <w:pPr>
         <w:keepNext w:val="1"/>
-        <w:spacing w:before="60" w:after="40" w:line="288" w:lineRule="auto"/>
+        <w:spacing w:before="20" w:after="20" w:line="360" w:lineRule="auto"/>
         <w:ind w:firstLine="720"/>
         <w:jc w:val="both"/>
         <w:rPr/>
@@ -17274,7 +17220,7 @@
     <w:p>
       <w:pPr>
         <w:keepNext w:val="1"/>
-        <w:spacing w:before="60" w:after="40" w:line="360" w:lineRule="auto"/>
+        <w:spacing w:before="20" w:after="20" w:line="360" w:lineRule="auto"/>
         <w:ind w:firstLine="720"/>
         <w:jc w:val="both"/>
         <w:rPr/>
@@ -17479,8 +17425,7 @@
     <w:p>
       <w:pPr>
         <w:keepNext w:val="1"/>
-        <w:keepLines w:val="1"/>
-        <w:spacing w:before="120" w:after="60" w:line="360" w:lineRule="auto"/>
+        <w:spacing w:before="20" w:after="20" w:line="360" w:lineRule="auto"/>
         <w:jc w:val="left"/>
         <w:rPr/>
       </w:pPr>
@@ -17536,7 +17481,6 @@
       </w:tblGrid>
       <w:tr>
         <w:trPr>
-          <w:cantSplit w:val="1"/>
           <w:tblHeader w:val="1"/>
         </w:trPr>
         <w:tc>
@@ -17557,8 +17501,8 @@
                 <w:rFonts w:ascii="Georgia" w:cs="Georgia" w:eastAsia="Georgia" w:hAnsi="Georgia"/>
                 <w:b w:val="1"/>
                 <w:bCs w:val="1"/>
-                <w:sz w:val="18"/>
-                <w:szCs w:val="18"/>
+                <w:sz w:val="20"/>
+                <w:szCs w:val="20"/>
                 <w:rtl w:val="0"/>
               </w:rPr>
               <w:t xml:space="preserve">Label</w:t>
@@ -17566,8 +17510,8 @@
             <w:r>
               <w:rPr>
                 <w:rtl w:val="0"/>
-                <w:sz w:val="18"/>
-                <w:szCs w:val="18"/>
+                <w:sz w:val="20"/>
+                <w:szCs w:val="20"/>
                 <w:rFonts w:ascii="Georgia" w:hAnsi="Georgia"/>
               </w:rPr>
             </w:r>
@@ -17591,8 +17535,8 @@
                 <w:rFonts w:ascii="Georgia" w:cs="Georgia" w:eastAsia="Georgia" w:hAnsi="Georgia"/>
                 <w:b w:val="1"/>
                 <w:bCs w:val="1"/>
-                <w:sz w:val="18"/>
-                <w:szCs w:val="18"/>
+                <w:sz w:val="20"/>
+                <w:szCs w:val="20"/>
                 <w:rtl w:val="0"/>
               </w:rPr>
               <w:t xml:space="preserve">Function</w:t>
@@ -17600,8 +17544,8 @@
             <w:r>
               <w:rPr>
                 <w:rtl w:val="0"/>
-                <w:sz w:val="18"/>
-                <w:szCs w:val="18"/>
+                <w:sz w:val="20"/>
+                <w:szCs w:val="20"/>
                 <w:rFonts w:ascii="Georgia" w:hAnsi="Georgia"/>
               </w:rPr>
             </w:r>
@@ -17625,8 +17569,8 @@
                 <w:rFonts w:ascii="Georgia" w:cs="Georgia" w:eastAsia="Georgia" w:hAnsi="Georgia"/>
                 <w:b w:val="1"/>
                 <w:bCs w:val="1"/>
-                <w:sz w:val="18"/>
-                <w:szCs w:val="18"/>
+                <w:sz w:val="20"/>
+                <w:szCs w:val="20"/>
                 <w:rtl w:val="0"/>
               </w:rPr>
               <w:t xml:space="preserve">Definition</w:t>
@@ -17634,8 +17578,8 @@
             <w:r>
               <w:rPr>
                 <w:rtl w:val="0"/>
-                <w:sz w:val="18"/>
-                <w:szCs w:val="18"/>
+                <w:sz w:val="20"/>
+                <w:szCs w:val="20"/>
                 <w:rFonts w:ascii="Georgia" w:hAnsi="Georgia"/>
               </w:rPr>
             </w:r>
@@ -17659,8 +17603,8 @@
                 <w:rFonts w:ascii="Georgia" w:cs="Georgia" w:eastAsia="Georgia" w:hAnsi="Georgia"/>
                 <w:b w:val="1"/>
                 <w:bCs w:val="1"/>
-                <w:sz w:val="18"/>
-                <w:szCs w:val="18"/>
+                <w:sz w:val="20"/>
+                <w:szCs w:val="20"/>
                 <w:rtl w:val="0"/>
               </w:rPr>
               <w:t xml:space="preserve">Marked Example</w:t>
@@ -17668,8 +17612,8 @@
             <w:r>
               <w:rPr>
                 <w:rtl w:val="0"/>
-                <w:sz w:val="18"/>
-                <w:szCs w:val="18"/>
+                <w:sz w:val="20"/>
+                <w:szCs w:val="20"/>
                 <w:rFonts w:ascii="Georgia" w:hAnsi="Georgia"/>
               </w:rPr>
             </w:r>
@@ -17678,7 +17622,6 @@
       </w:tr>
       <w:tr>
         <w:trPr>
-          <w:cantSplit w:val="1"/>
           <w:tblHeader w:val="0"/>
         </w:trPr>
         <w:tc>
@@ -17697,8 +17640,8 @@
                 <w:i w:val="0"/>
                 <w:iCs w:val="0"/>
                 <w:color w:val="ed7d31"/>
-                <w:sz w:val="18"/>
-                <w:szCs w:val="18"/>
+                <w:sz w:val="20"/>
+                <w:szCs w:val="20"/>
                 <w:rtl w:val="0"/>
               </w:rPr>
               <w:t xml:space="preserve">EC</w:t>
@@ -17706,8 +17649,8 @@
             <w:r>
               <w:rPr>
                 <w:rtl w:val="0"/>
-                <w:sz w:val="18"/>
-                <w:szCs w:val="18"/>
+                <w:sz w:val="20"/>
+                <w:szCs w:val="20"/>
                 <w:rFonts w:ascii="Georgia" w:hAnsi="Georgia"/>
               </w:rPr>
             </w:r>
@@ -17724,8 +17667,8 @@
             <w:r>
               <w:rPr>
                 <w:rFonts w:ascii="Georgia" w:cs="Georgia" w:eastAsia="Georgia" w:hAnsi="Georgia"/>
-                <w:sz w:val="18"/>
-                <w:szCs w:val="18"/>
+                <w:sz w:val="20"/>
+                <w:szCs w:val="20"/>
                 <w:rtl w:val="0"/>
               </w:rPr>
               <w:t xml:space="preserve">Epistemic Caution</w:t>
@@ -17733,8 +17676,8 @@
             <w:r>
               <w:rPr>
                 <w:rtl w:val="0"/>
-                <w:sz w:val="18"/>
-                <w:szCs w:val="18"/>
+                <w:sz w:val="20"/>
+                <w:szCs w:val="20"/>
                 <w:rFonts w:ascii="Georgia" w:hAnsi="Georgia"/>
               </w:rPr>
             </w:r>
@@ -17751,8 +17694,8 @@
             <w:r>
               <w:rPr>
                 <w:rFonts w:ascii="Georgia" w:cs="Georgia" w:eastAsia="Georgia" w:hAnsi="Georgia"/>
-                <w:sz w:val="18"/>
-                <w:szCs w:val="18"/>
+                <w:sz w:val="20"/>
+                <w:szCs w:val="20"/>
                 <w:rtl w:val="0"/>
               </w:rPr>
               <w:t xml:space="preserve">Expresses uncertainty about a claim’s truth.</w:t>
@@ -17760,8 +17703,8 @@
             <w:r>
               <w:rPr>
                 <w:rtl w:val="0"/>
-                <w:sz w:val="18"/>
-                <w:szCs w:val="18"/>
+                <w:sz w:val="20"/>
+                <w:szCs w:val="20"/>
                 <w:rFonts w:ascii="Georgia" w:hAnsi="Georgia"/>
               </w:rPr>
             </w:r>
@@ -17783,8 +17726,8 @@
                 <w:i w:val="0"/>
                 <w:iCs w:val="0"/>
                 <w:color w:val="000000"/>
-                <w:sz w:val="18"/>
-                <w:szCs w:val="18"/>
+                <w:sz w:val="20"/>
+                <w:szCs w:val="20"/>
                 <w:rtl w:val="0"/>
               </w:rPr>
               <w:t xml:space="preserve">“The treatment </w:t>
@@ -17796,8 +17739,8 @@
                 <w:bCs w:val="1"/>
                 <w:strike w:val="0"/>
                 <w:color w:val="000000"/>
-                <w:sz w:val="18"/>
-                <w:szCs w:val="18"/>
+                <w:sz w:val="20"/>
+                <w:szCs w:val="20"/>
                 <w:shd w:fill="00b0f0" w:val="clear"/>
                 <w:rtl w:val="0"/>
               </w:rPr>
@@ -17811,8 +17754,8 @@
                 <w:i w:val="0"/>
                 <w:iCs w:val="0"/>
                 <w:color w:val="000000"/>
-                <w:sz w:val="18"/>
-                <w:szCs w:val="18"/>
+                <w:sz w:val="20"/>
+                <w:szCs w:val="20"/>
                 <w:rtl w:val="0"/>
               </w:rPr>
               <w:t xml:space="preserve"> reduce infection rates. </w:t>
@@ -17825,8 +17768,8 @@
                 <w:i w:val="0"/>
                 <w:iCs w:val="0"/>
                 <w:color w:val="ed7d31"/>
-                <w:sz w:val="18"/>
-                <w:szCs w:val="18"/>
+                <w:sz w:val="20"/>
+                <w:szCs w:val="20"/>
                 <w:rtl w:val="0"/>
               </w:rPr>
               <w:t xml:space="preserve">(EC)</w:t>
@@ -17839,8 +17782,8 @@
                 <w:i w:val="0"/>
                 <w:iCs w:val="0"/>
                 <w:color w:val="000000"/>
-                <w:sz w:val="18"/>
-                <w:szCs w:val="18"/>
+                <w:sz w:val="20"/>
+                <w:szCs w:val="20"/>
                 <w:rtl w:val="0"/>
               </w:rPr>
               <w:t xml:space="preserve">”</w:t>
@@ -17848,8 +17791,8 @@
             <w:r>
               <w:rPr>
                 <w:rtl w:val="0"/>
-                <w:sz w:val="18"/>
-                <w:szCs w:val="18"/>
+                <w:sz w:val="20"/>
+                <w:szCs w:val="20"/>
                 <w:rFonts w:ascii="Georgia" w:hAnsi="Georgia"/>
               </w:rPr>
             </w:r>
@@ -17858,7 +17801,6 @@
       </w:tr>
       <w:tr>
         <w:trPr>
-          <w:cantSplit w:val="1"/>
           <w:tblHeader w:val="0"/>
         </w:trPr>
         <w:tc>
@@ -17877,8 +17819,8 @@
                 <w:i w:val="0"/>
                 <w:iCs w:val="0"/>
                 <w:color w:val="7030a0"/>
-                <w:sz w:val="18"/>
-                <w:szCs w:val="18"/>
+                <w:sz w:val="20"/>
+                <w:szCs w:val="20"/>
                 <w:rtl w:val="0"/>
               </w:rPr>
               <w:t xml:space="preserve">P</w:t>
@@ -17886,8 +17828,8 @@
             <w:r>
               <w:rPr>
                 <w:rtl w:val="0"/>
-                <w:sz w:val="18"/>
-                <w:szCs w:val="18"/>
+                <w:sz w:val="20"/>
+                <w:szCs w:val="20"/>
                 <w:rFonts w:ascii="Georgia" w:hAnsi="Georgia"/>
               </w:rPr>
             </w:r>
@@ -17904,8 +17846,8 @@
             <w:r>
               <w:rPr>
                 <w:rFonts w:ascii="Georgia" w:cs="Georgia" w:eastAsia="Georgia" w:hAnsi="Georgia"/>
-                <w:sz w:val="18"/>
-                <w:szCs w:val="18"/>
+                <w:sz w:val="20"/>
+                <w:szCs w:val="20"/>
                 <w:rtl w:val="0"/>
               </w:rPr>
               <w:t xml:space="preserve">Politeness / Deference</w:t>
@@ -17913,8 +17855,8 @@
             <w:r>
               <w:rPr>
                 <w:rtl w:val="0"/>
-                <w:sz w:val="18"/>
-                <w:szCs w:val="18"/>
+                <w:sz w:val="20"/>
+                <w:szCs w:val="20"/>
                 <w:rFonts w:ascii="Georgia" w:hAnsi="Georgia"/>
               </w:rPr>
             </w:r>
@@ -17931,8 +17873,8 @@
             <w:r>
               <w:rPr>
                 <w:rFonts w:ascii="Georgia" w:cs="Georgia" w:eastAsia="Georgia" w:hAnsi="Georgia"/>
-                <w:sz w:val="18"/>
-                <w:szCs w:val="18"/>
+                <w:sz w:val="20"/>
+                <w:szCs w:val="20"/>
                 <w:rtl w:val="0"/>
               </w:rPr>
               <w:t xml:space="preserve">Shows respect to readers or prior research.</w:t>
@@ -17940,8 +17882,8 @@
             <w:r>
               <w:rPr>
                 <w:rtl w:val="0"/>
-                <w:sz w:val="18"/>
-                <w:szCs w:val="18"/>
+                <w:sz w:val="20"/>
+                <w:szCs w:val="20"/>
                 <w:rFonts w:ascii="Georgia" w:hAnsi="Georgia"/>
               </w:rPr>
             </w:r>
@@ -17963,8 +17905,8 @@
                 <w:i w:val="0"/>
                 <w:iCs w:val="0"/>
                 <w:color w:val="000000"/>
-                <w:sz w:val="18"/>
-                <w:szCs w:val="18"/>
+                <w:sz w:val="20"/>
+                <w:szCs w:val="20"/>
                 <w:rtl w:val="0"/>
               </w:rPr>
               <w:t xml:space="preserve">“As </w:t>
@@ -17976,8 +17918,8 @@
                 <w:bCs w:val="1"/>
                 <w:strike w:val="0"/>
                 <w:color w:val="ffffff"/>
-                <w:sz w:val="18"/>
-                <w:szCs w:val="18"/>
+                <w:sz w:val="20"/>
+                <w:szCs w:val="20"/>
                 <w:highlight w:val="red"/>
                 <w:rtl w:val="0"/>
               </w:rPr>
@@ -17991,8 +17933,8 @@
                 <w:i w:val="0"/>
                 <w:iCs w:val="0"/>
                 <w:color w:val="000000"/>
-                <w:sz w:val="18"/>
-                <w:szCs w:val="18"/>
+                <w:sz w:val="20"/>
+                <w:szCs w:val="20"/>
                 <w:rtl w:val="0"/>
               </w:rPr>
               <w:t xml:space="preserve"> by Hyland (1998). </w:t>
@@ -18005,8 +17947,8 @@
                 <w:i w:val="0"/>
                 <w:iCs w:val="0"/>
                 <w:color w:val="7030a0"/>
-                <w:sz w:val="18"/>
-                <w:szCs w:val="18"/>
+                <w:sz w:val="20"/>
+                <w:szCs w:val="20"/>
                 <w:rtl w:val="0"/>
               </w:rPr>
               <w:t xml:space="preserve">(P)</w:t>
@@ -18019,8 +17961,8 @@
                 <w:i w:val="0"/>
                 <w:iCs w:val="0"/>
                 <w:color w:val="000000"/>
-                <w:sz w:val="18"/>
-                <w:szCs w:val="18"/>
+                <w:sz w:val="20"/>
+                <w:szCs w:val="20"/>
                 <w:rtl w:val="0"/>
               </w:rPr>
               <w:t xml:space="preserve">”</w:t>
@@ -18028,8 +17970,8 @@
             <w:r>
               <w:rPr>
                 <w:rtl w:val="0"/>
-                <w:sz w:val="18"/>
-                <w:szCs w:val="18"/>
+                <w:sz w:val="20"/>
+                <w:szCs w:val="20"/>
                 <w:rFonts w:ascii="Georgia" w:hAnsi="Georgia"/>
               </w:rPr>
             </w:r>
@@ -18038,7 +17980,6 @@
       </w:tr>
       <w:tr>
         <w:trPr>
-          <w:cantSplit w:val="1"/>
           <w:tblHeader w:val="0"/>
         </w:trPr>
         <w:tc>
@@ -18057,8 +17998,8 @@
                 <w:i w:val="0"/>
                 <w:iCs w:val="0"/>
                 <w:color w:val="00b0f0"/>
-                <w:sz w:val="18"/>
-                <w:szCs w:val="18"/>
+                <w:sz w:val="20"/>
+                <w:szCs w:val="20"/>
                 <w:rtl w:val="0"/>
               </w:rPr>
               <w:t xml:space="preserve">DO</w:t>
@@ -18066,8 +18007,8 @@
             <w:r>
               <w:rPr>
                 <w:rtl w:val="0"/>
-                <w:sz w:val="18"/>
-                <w:szCs w:val="18"/>
+                <w:sz w:val="20"/>
+                <w:szCs w:val="20"/>
                 <w:rFonts w:ascii="Georgia" w:hAnsi="Georgia"/>
               </w:rPr>
             </w:r>
@@ -18084,8 +18025,8 @@
             <w:r>
               <w:rPr>
                 <w:rFonts w:ascii="Georgia" w:cs="Georgia" w:eastAsia="Georgia" w:hAnsi="Georgia"/>
-                <w:sz w:val="18"/>
-                <w:szCs w:val="18"/>
+                <w:sz w:val="20"/>
+                <w:szCs w:val="20"/>
                 <w:rtl w:val="0"/>
               </w:rPr>
               <w:t xml:space="preserve">Discourse Organization</w:t>
@@ -18093,8 +18034,8 @@
             <w:r>
               <w:rPr>
                 <w:rtl w:val="0"/>
-                <w:sz w:val="18"/>
-                <w:szCs w:val="18"/>
+                <w:sz w:val="20"/>
+                <w:szCs w:val="20"/>
                 <w:rFonts w:ascii="Georgia" w:hAnsi="Georgia"/>
               </w:rPr>
             </w:r>
@@ -18111,8 +18052,8 @@
             <w:r>
               <w:rPr>
                 <w:rFonts w:ascii="Georgia" w:cs="Georgia" w:eastAsia="Georgia" w:hAnsi="Georgia"/>
-                <w:sz w:val="18"/>
-                <w:szCs w:val="18"/>
+                <w:sz w:val="20"/>
+                <w:szCs w:val="20"/>
                 <w:rtl w:val="0"/>
               </w:rPr>
               <w:t xml:space="preserve">Structures text or guides reader expectations.</w:t>
@@ -18120,8 +18061,8 @@
             <w:r>
               <w:rPr>
                 <w:rtl w:val="0"/>
-                <w:sz w:val="18"/>
-                <w:szCs w:val="18"/>
+                <w:sz w:val="20"/>
+                <w:szCs w:val="20"/>
                 <w:rFonts w:ascii="Georgia" w:hAnsi="Georgia"/>
               </w:rPr>
             </w:r>
@@ -18143,8 +18084,8 @@
                 <w:i w:val="0"/>
                 <w:iCs w:val="0"/>
                 <w:color w:val="000000"/>
-                <w:sz w:val="18"/>
-                <w:szCs w:val="18"/>
+                <w:sz w:val="20"/>
+                <w:szCs w:val="20"/>
                 <w:rtl w:val="0"/>
               </w:rPr>
               <w:t xml:space="preserve">“</w:t>
@@ -18156,8 +18097,8 @@
                 <w:bCs w:val="1"/>
                 <w:strike w:val="0"/>
                 <w:color w:val="ffffff"/>
-                <w:sz w:val="18"/>
-                <w:szCs w:val="18"/>
+                <w:sz w:val="20"/>
+                <w:szCs w:val="20"/>
                 <w:shd w:fill="00b050" w:val="clear"/>
                 <w:rtl w:val="0"/>
               </w:rPr>
@@ -18171,8 +18112,8 @@
                 <w:i w:val="0"/>
                 <w:iCs w:val="0"/>
                 <w:color w:val="000000"/>
-                <w:sz w:val="18"/>
-                <w:szCs w:val="18"/>
+                <w:sz w:val="20"/>
+                <w:szCs w:val="20"/>
                 <w:rtl w:val="0"/>
               </w:rPr>
               <w:t xml:space="preserve">. </w:t>
@@ -18185,8 +18126,8 @@
                 <w:i w:val="0"/>
                 <w:iCs w:val="0"/>
                 <w:color w:val="00b0f0"/>
-                <w:sz w:val="18"/>
-                <w:szCs w:val="18"/>
+                <w:sz w:val="20"/>
+                <w:szCs w:val="20"/>
                 <w:rtl w:val="0"/>
               </w:rPr>
               <w:t xml:space="preserve">(DO)</w:t>
@@ -18199,8 +18140,8 @@
                 <w:i w:val="0"/>
                 <w:iCs w:val="0"/>
                 <w:color w:val="000000"/>
-                <w:sz w:val="18"/>
-                <w:szCs w:val="18"/>
+                <w:sz w:val="20"/>
+                <w:szCs w:val="20"/>
                 <w:rtl w:val="0"/>
               </w:rPr>
               <w:t xml:space="preserve">”</w:t>
@@ -18208,8 +18149,8 @@
             <w:r>
               <w:rPr>
                 <w:rtl w:val="0"/>
-                <w:sz w:val="18"/>
-                <w:szCs w:val="18"/>
+                <w:sz w:val="20"/>
+                <w:szCs w:val="20"/>
                 <w:rFonts w:ascii="Georgia" w:hAnsi="Georgia"/>
               </w:rPr>
             </w:r>
@@ -18220,7 +18161,7 @@
     <w:p>
       <w:pPr>
         <w:keepNext w:val="1"/>
-        <w:spacing w:before="240" w:after="0" w:line="480" w:lineRule="auto"/>
+        <w:spacing w:before="120" w:after="60" w:line="360" w:lineRule="auto"/>
         <w:jc w:val="left"/>
         <w:rPr/>
       </w:pPr>
@@ -18246,7 +18187,6 @@
     <w:p>
       <w:pPr>
         <w:keepNext w:val="1"/>
-        <w:keepLines w:val="1"/>
         <w:spacing w:before="0" w:after="0" w:line="360" w:lineRule="auto"/>
         <w:ind w:firstLine="720"/>
         <w:jc w:val="both"/>
@@ -18302,7 +18242,6 @@
       </w:tblGrid>
       <w:tr>
         <w:trPr>
-          <w:cantSplit w:val="1"/>
           <w:tblHeader w:val="1"/>
         </w:trPr>
         <w:tc>
@@ -18323,8 +18262,8 @@
                 <w:rFonts w:ascii="Georgia" w:cs="Georgia" w:eastAsia="Georgia" w:hAnsi="Georgia"/>
                 <w:b w:val="1"/>
                 <w:bCs w:val="1"/>
-                <w:sz w:val="18"/>
-                <w:szCs w:val="18"/>
+                <w:sz w:val="20"/>
+                <w:szCs w:val="20"/>
                 <w:rtl w:val="0"/>
               </w:rPr>
               <w:t xml:space="preserve">Token</w:t>
@@ -18332,8 +18271,8 @@
             <w:r>
               <w:rPr>
                 <w:rtl w:val="0"/>
-                <w:sz w:val="18"/>
-                <w:szCs w:val="18"/>
+                <w:sz w:val="20"/>
+                <w:szCs w:val="20"/>
                 <w:rFonts w:ascii="Georgia" w:hAnsi="Georgia"/>
               </w:rPr>
             </w:r>
@@ -18357,8 +18296,8 @@
                 <w:rFonts w:ascii="Georgia" w:cs="Georgia" w:eastAsia="Georgia" w:hAnsi="Georgia"/>
                 <w:b w:val="1"/>
                 <w:bCs w:val="1"/>
-                <w:sz w:val="18"/>
-                <w:szCs w:val="18"/>
+                <w:sz w:val="20"/>
+                <w:szCs w:val="20"/>
                 <w:rtl w:val="0"/>
               </w:rPr>
               <w:t xml:space="preserve">Hedge When</w:t>
@@ -18366,8 +18305,8 @@
             <w:r>
               <w:rPr>
                 <w:rtl w:val="0"/>
-                <w:sz w:val="18"/>
-                <w:szCs w:val="18"/>
+                <w:sz w:val="20"/>
+                <w:szCs w:val="20"/>
                 <w:rFonts w:ascii="Georgia" w:hAnsi="Georgia"/>
               </w:rPr>
             </w:r>
@@ -18391,8 +18330,8 @@
                 <w:rFonts w:ascii="Georgia" w:cs="Georgia" w:eastAsia="Georgia" w:hAnsi="Georgia"/>
                 <w:b w:val="1"/>
                 <w:bCs w:val="1"/>
-                <w:sz w:val="18"/>
-                <w:szCs w:val="18"/>
+                <w:sz w:val="20"/>
+                <w:szCs w:val="20"/>
                 <w:rtl w:val="0"/>
               </w:rPr>
               <w:t xml:space="preserve">Not a Hedge When</w:t>
@@ -18400,8 +18339,8 @@
             <w:r>
               <w:rPr>
                 <w:rtl w:val="0"/>
-                <w:sz w:val="18"/>
-                <w:szCs w:val="18"/>
+                <w:sz w:val="20"/>
+                <w:szCs w:val="20"/>
                 <w:rFonts w:ascii="Georgia" w:hAnsi="Georgia"/>
               </w:rPr>
             </w:r>
@@ -18410,7 +18349,6 @@
       </w:tr>
       <w:tr>
         <w:trPr>
-          <w:cantSplit w:val="1"/>
           <w:tblHeader w:val="0"/>
         </w:trPr>
         <w:tc>
@@ -18429,8 +18367,8 @@
                 <w:i w:val="0"/>
                 <w:iCs w:val="0"/>
                 <w:color w:val="000000"/>
-                <w:sz w:val="18"/>
-                <w:szCs w:val="18"/>
+                <w:sz w:val="20"/>
+                <w:szCs w:val="20"/>
                 <w:rtl w:val="0"/>
               </w:rPr>
               <w:t xml:space="preserve">suggest / indicate</w:t>
@@ -18438,8 +18376,8 @@
             <w:r>
               <w:rPr>
                 <w:rtl w:val="0"/>
-                <w:sz w:val="18"/>
-                <w:szCs w:val="18"/>
+                <w:sz w:val="20"/>
+                <w:szCs w:val="20"/>
                 <w:rFonts w:ascii="Georgia" w:hAnsi="Georgia"/>
               </w:rPr>
             </w:r>
@@ -18456,8 +18394,8 @@
             <w:r>
               <w:rPr>
                 <w:rFonts w:ascii="Georgia" w:cs="Georgia" w:eastAsia="Georgia" w:hAnsi="Georgia"/>
-                <w:sz w:val="18"/>
-                <w:szCs w:val="18"/>
+                <w:sz w:val="20"/>
+                <w:szCs w:val="20"/>
                 <w:rtl w:val="0"/>
               </w:rPr>
               <w:t xml:space="preserve">Expresses uncertainty about a finding or conclusion</w:t>
@@ -18465,8 +18403,8 @@
             <w:r>
               <w:rPr>
                 <w:rtl w:val="0"/>
-                <w:sz w:val="18"/>
-                <w:szCs w:val="18"/>
+                <w:sz w:val="20"/>
+                <w:szCs w:val="20"/>
                 <w:rFonts w:ascii="Georgia" w:hAnsi="Georgia"/>
               </w:rPr>
             </w:r>
@@ -18483,8 +18421,8 @@
             <w:r>
               <w:rPr>
                 <w:rFonts w:ascii="Georgia" w:cs="Georgia" w:eastAsia="Georgia" w:hAnsi="Georgia"/>
-                <w:sz w:val="18"/>
-                <w:szCs w:val="18"/>
+                <w:sz w:val="20"/>
+                <w:szCs w:val="20"/>
                 <w:rtl w:val="0"/>
               </w:rPr>
               <w:t xml:space="preserve">Introduces a recommendation or action</w:t>
@@ -18492,8 +18430,8 @@
             <w:r>
               <w:rPr>
                 <w:rtl w:val="0"/>
-                <w:sz w:val="18"/>
-                <w:szCs w:val="18"/>
+                <w:sz w:val="20"/>
+                <w:szCs w:val="20"/>
                 <w:rFonts w:ascii="Georgia" w:hAnsi="Georgia"/>
               </w:rPr>
             </w:r>
@@ -18502,7 +18440,6 @@
       </w:tr>
       <w:tr>
         <w:trPr>
-          <w:cantSplit w:val="1"/>
           <w:tblHeader w:val="0"/>
         </w:trPr>
         <w:tc>
@@ -18521,8 +18458,8 @@
                 <w:i w:val="0"/>
                 <w:iCs w:val="0"/>
                 <w:color w:val="000000"/>
-                <w:sz w:val="18"/>
-                <w:szCs w:val="18"/>
+                <w:sz w:val="20"/>
+                <w:szCs w:val="20"/>
                 <w:rtl w:val="0"/>
               </w:rPr>
               <w:t xml:space="preserve">suggest / indicate + need for</w:t>
@@ -18530,8 +18467,8 @@
             <w:r>
               <w:rPr>
                 <w:rtl w:val="0"/>
-                <w:sz w:val="18"/>
-                <w:szCs w:val="18"/>
+                <w:sz w:val="20"/>
+                <w:szCs w:val="20"/>
                 <w:rFonts w:ascii="Georgia" w:hAnsi="Georgia"/>
               </w:rPr>
             </w:r>
@@ -18548,8 +18485,8 @@
             <w:r>
               <w:rPr>
                 <w:rFonts w:ascii="Georgia" w:cs="Georgia" w:eastAsia="Georgia" w:hAnsi="Georgia"/>
-                <w:sz w:val="18"/>
-                <w:szCs w:val="18"/>
+                <w:sz w:val="20"/>
+                <w:szCs w:val="20"/>
                 <w:rtl w:val="0"/>
               </w:rPr>
               <w:t xml:space="preserve">Says the evidence suggests a need may exist</w:t>
@@ -18557,8 +18494,8 @@
             <w:r>
               <w:rPr>
                 <w:rtl w:val="0"/>
-                <w:sz w:val="18"/>
-                <w:szCs w:val="18"/>
+                <w:sz w:val="20"/>
+                <w:szCs w:val="20"/>
                 <w:rFonts w:ascii="Georgia" w:hAnsi="Georgia"/>
               </w:rPr>
             </w:r>
@@ -18575,8 +18512,8 @@
             <w:r>
               <w:rPr>
                 <w:rFonts w:ascii="Georgia" w:cs="Georgia" w:eastAsia="Georgia" w:hAnsi="Georgia"/>
-                <w:sz w:val="18"/>
-                <w:szCs w:val="18"/>
+                <w:sz w:val="20"/>
+                <w:szCs w:val="20"/>
                 <w:rtl w:val="0"/>
               </w:rPr>
               <w:t xml:space="preserve">Says what should be done or is needed</w:t>
@@ -18584,8 +18521,8 @@
             <w:r>
               <w:rPr>
                 <w:rtl w:val="0"/>
-                <w:sz w:val="18"/>
-                <w:szCs w:val="18"/>
+                <w:sz w:val="20"/>
+                <w:szCs w:val="20"/>
                 <w:rFonts w:ascii="Georgia" w:hAnsi="Georgia"/>
               </w:rPr>
             </w:r>
@@ -18594,7 +18531,6 @@
       </w:tr>
       <w:tr>
         <w:trPr>
-          <w:cantSplit w:val="1"/>
           <w:tblHeader w:val="0"/>
         </w:trPr>
         <w:tc>
@@ -18613,8 +18549,8 @@
                 <w:i w:val="0"/>
                 <w:iCs w:val="0"/>
                 <w:color w:val="000000"/>
-                <w:sz w:val="18"/>
-                <w:szCs w:val="18"/>
+                <w:sz w:val="20"/>
+                <w:szCs w:val="20"/>
                 <w:rtl w:val="0"/>
               </w:rPr>
               <w:t xml:space="preserve">indicated by</w:t>
@@ -18622,8 +18558,8 @@
             <w:r>
               <w:rPr>
                 <w:rtl w:val="0"/>
-                <w:sz w:val="18"/>
-                <w:szCs w:val="18"/>
+                <w:sz w:val="20"/>
+                <w:szCs w:val="20"/>
                 <w:rFonts w:ascii="Georgia" w:hAnsi="Georgia"/>
               </w:rPr>
             </w:r>
@@ -18640,8 +18576,8 @@
             <w:r>
               <w:rPr>
                 <w:rFonts w:ascii="Georgia" w:cs="Georgia" w:eastAsia="Georgia" w:hAnsi="Georgia"/>
-                <w:sz w:val="18"/>
-                <w:szCs w:val="18"/>
+                <w:sz w:val="20"/>
+                <w:szCs w:val="20"/>
                 <w:rtl w:val="0"/>
               </w:rPr>
               <w:t xml:space="preserve">Introduces a conclusion drawn from evidence</w:t>
@@ -18649,8 +18585,8 @@
             <w:r>
               <w:rPr>
                 <w:rtl w:val="0"/>
-                <w:sz w:val="18"/>
-                <w:szCs w:val="18"/>
+                <w:sz w:val="20"/>
+                <w:szCs w:val="20"/>
                 <w:rFonts w:ascii="Georgia" w:hAnsi="Georgia"/>
               </w:rPr>
             </w:r>
@@ -18667,8 +18603,8 @@
             <w:r>
               <w:rPr>
                 <w:rFonts w:ascii="Georgia" w:cs="Georgia" w:eastAsia="Georgia" w:hAnsi="Georgia"/>
-                <w:sz w:val="18"/>
-                <w:szCs w:val="18"/>
+                <w:sz w:val="20"/>
+                <w:szCs w:val="20"/>
                 <w:rtl w:val="0"/>
               </w:rPr>
               <w:t xml:space="preserve">Points to evidence for a claim already stated</w:t>
@@ -18676,8 +18612,8 @@
             <w:r>
               <w:rPr>
                 <w:rtl w:val="0"/>
-                <w:sz w:val="18"/>
-                <w:szCs w:val="18"/>
+                <w:sz w:val="20"/>
+                <w:szCs w:val="20"/>
                 <w:rFonts w:ascii="Georgia" w:hAnsi="Georgia"/>
               </w:rPr>
             </w:r>
@@ -18686,7 +18622,6 @@
       </w:tr>
       <w:tr>
         <w:trPr>
-          <w:cantSplit w:val="1"/>
           <w:tblHeader w:val="0"/>
         </w:trPr>
         <w:tc>
@@ -18705,8 +18640,8 @@
                 <w:i w:val="0"/>
                 <w:iCs w:val="0"/>
                 <w:color w:val="000000"/>
-                <w:sz w:val="18"/>
-                <w:szCs w:val="18"/>
+                <w:sz w:val="20"/>
+                <w:szCs w:val="20"/>
                 <w:rtl w:val="0"/>
               </w:rPr>
               <w:t xml:space="preserve">indicate / indicates that</w:t>
@@ -18714,8 +18649,8 @@
             <w:r>
               <w:rPr>
                 <w:rtl w:val="0"/>
-                <w:sz w:val="18"/>
-                <w:szCs w:val="18"/>
+                <w:sz w:val="20"/>
+                <w:szCs w:val="20"/>
                 <w:rFonts w:ascii="Georgia" w:hAnsi="Georgia"/>
               </w:rPr>
             </w:r>
@@ -18732,8 +18667,8 @@
             <w:r>
               <w:rPr>
                 <w:rFonts w:ascii="Georgia" w:cs="Georgia" w:eastAsia="Georgia" w:hAnsi="Georgia"/>
-                <w:sz w:val="18"/>
-                <w:szCs w:val="18"/>
+                <w:sz w:val="20"/>
+                <w:szCs w:val="20"/>
                 <w:rtl w:val="0"/>
               </w:rPr>
               <w:t xml:space="preserve">Introduces an inferential conclusion drawn from analysis</w:t>
@@ -18741,8 +18676,8 @@
             <w:r>
               <w:rPr>
                 <w:rtl w:val="0"/>
-                <w:sz w:val="18"/>
-                <w:szCs w:val="18"/>
+                <w:sz w:val="20"/>
+                <w:szCs w:val="20"/>
                 <w:rFonts w:ascii="Georgia" w:hAnsi="Georgia"/>
               </w:rPr>
             </w:r>
@@ -18759,8 +18694,8 @@
             <w:r>
               <w:rPr>
                 <w:rFonts w:ascii="Georgia" w:cs="Georgia" w:eastAsia="Georgia" w:hAnsi="Georgia"/>
-                <w:sz w:val="18"/>
-                <w:szCs w:val="18"/>
+                <w:sz w:val="20"/>
+                <w:szCs w:val="20"/>
                 <w:rtl w:val="0"/>
               </w:rPr>
               <w:t xml:space="preserve">Used as a synonym for showed/demonstrated (factive reporting)</w:t>
@@ -18768,8 +18703,8 @@
             <w:r>
               <w:rPr>
                 <w:rtl w:val="0"/>
-                <w:sz w:val="18"/>
-                <w:szCs w:val="18"/>
+                <w:sz w:val="20"/>
+                <w:szCs w:val="20"/>
                 <w:rFonts w:ascii="Georgia" w:hAnsi="Georgia"/>
               </w:rPr>
             </w:r>
@@ -18778,7 +18713,6 @@
       </w:tr>
       <w:tr>
         <w:trPr>
-          <w:cantSplit w:val="1"/>
           <w:tblHeader w:val="0"/>
         </w:trPr>
         <w:tc>
@@ -18797,8 +18731,8 @@
                 <w:i w:val="0"/>
                 <w:iCs w:val="0"/>
                 <w:color w:val="000000"/>
-                <w:sz w:val="18"/>
-                <w:szCs w:val="18"/>
+                <w:sz w:val="20"/>
+                <w:szCs w:val="20"/>
                 <w:rtl w:val="0"/>
               </w:rPr>
               <w:t xml:space="preserve">indicating (participial)</w:t>
@@ -18806,8 +18740,8 @@
             <w:r>
               <w:rPr>
                 <w:rtl w:val="0"/>
-                <w:sz w:val="18"/>
-                <w:szCs w:val="18"/>
+                <w:sz w:val="20"/>
+                <w:szCs w:val="20"/>
                 <w:rFonts w:ascii="Georgia" w:hAnsi="Georgia"/>
               </w:rPr>
             </w:r>
@@ -18824,8 +18758,8 @@
             <w:r>
               <w:rPr>
                 <w:rFonts w:ascii="Georgia" w:cs="Georgia" w:eastAsia="Georgia" w:hAnsi="Georgia"/>
-                <w:sz w:val="18"/>
-                <w:szCs w:val="18"/>
+                <w:sz w:val="20"/>
+                <w:szCs w:val="20"/>
                 <w:rtl w:val="0"/>
               </w:rPr>
               <w:t xml:space="preserve">Introduces an inference beyond the operational definition of the result</w:t>
@@ -18833,8 +18767,8 @@
             <w:r>
               <w:rPr>
                 <w:rtl w:val="0"/>
-                <w:sz w:val="18"/>
-                <w:szCs w:val="18"/>
+                <w:sz w:val="20"/>
+                <w:szCs w:val="20"/>
                 <w:rFonts w:ascii="Georgia" w:hAnsi="Georgia"/>
               </w:rPr>
             </w:r>
@@ -18851,8 +18785,8 @@
             <w:r>
               <w:rPr>
                 <w:rFonts w:ascii="Georgia" w:cs="Georgia" w:eastAsia="Georgia" w:hAnsi="Georgia"/>
-                <w:sz w:val="18"/>
-                <w:szCs w:val="18"/>
+                <w:sz w:val="20"/>
+                <w:szCs w:val="20"/>
                 <w:rtl w:val="0"/>
               </w:rPr>
               <w:t xml:space="preserve">Restates the operational meaning of statistical significance</w:t>
@@ -18860,8 +18794,8 @@
             <w:r>
               <w:rPr>
                 <w:rtl w:val="0"/>
-                <w:sz w:val="18"/>
-                <w:szCs w:val="18"/>
+                <w:sz w:val="20"/>
+                <w:szCs w:val="20"/>
                 <w:rFonts w:ascii="Georgia" w:hAnsi="Georgia"/>
               </w:rPr>
             </w:r>
@@ -18870,7 +18804,6 @@
       </w:tr>
       <w:tr>
         <w:trPr>
-          <w:cantSplit w:val="1"/>
           <w:tblHeader w:val="0"/>
         </w:trPr>
         <w:tc>
@@ -18889,8 +18822,8 @@
                 <w:i w:val="0"/>
                 <w:iCs w:val="0"/>
                 <w:color w:val="000000"/>
-                <w:sz w:val="18"/>
-                <w:szCs w:val="18"/>
+                <w:sz w:val="20"/>
+                <w:szCs w:val="20"/>
                 <w:rtl w:val="0"/>
               </w:rPr>
               <w:t xml:space="preserve">can / may</w:t>
@@ -18898,8 +18831,8 @@
             <w:r>
               <w:rPr>
                 <w:rtl w:val="0"/>
-                <w:sz w:val="18"/>
-                <w:szCs w:val="18"/>
+                <w:sz w:val="20"/>
+                <w:szCs w:val="20"/>
                 <w:rFonts w:ascii="Georgia" w:hAnsi="Georgia"/>
               </w:rPr>
             </w:r>
@@ -18916,8 +18849,8 @@
             <w:r>
               <w:rPr>
                 <w:rFonts w:ascii="Georgia" w:cs="Georgia" w:eastAsia="Georgia" w:hAnsi="Georgia"/>
-                <w:sz w:val="18"/>
-                <w:szCs w:val="18"/>
+                <w:sz w:val="20"/>
+                <w:szCs w:val="20"/>
                 <w:rtl w:val="0"/>
               </w:rPr>
               <w:t xml:space="preserve">Expresses possibility</w:t>
@@ -18925,8 +18858,8 @@
             <w:r>
               <w:rPr>
                 <w:rtl w:val="0"/>
-                <w:sz w:val="18"/>
-                <w:szCs w:val="18"/>
+                <w:sz w:val="20"/>
+                <w:szCs w:val="20"/>
                 <w:rFonts w:ascii="Georgia" w:hAnsi="Georgia"/>
               </w:rPr>
             </w:r>
@@ -18943,8 +18876,8 @@
             <w:r>
               <w:rPr>
                 <w:rFonts w:ascii="Georgia" w:cs="Georgia" w:eastAsia="Georgia" w:hAnsi="Georgia"/>
-                <w:sz w:val="18"/>
-                <w:szCs w:val="18"/>
+                <w:sz w:val="20"/>
+                <w:szCs w:val="20"/>
                 <w:rtl w:val="0"/>
               </w:rPr>
               <w:t xml:space="preserve">Expresses capability</w:t>
@@ -18952,8 +18885,8 @@
             <w:r>
               <w:rPr>
                 <w:rtl w:val="0"/>
-                <w:sz w:val="18"/>
-                <w:szCs w:val="18"/>
+                <w:sz w:val="20"/>
+                <w:szCs w:val="20"/>
                 <w:rFonts w:ascii="Georgia" w:hAnsi="Georgia"/>
               </w:rPr>
             </w:r>
@@ -18962,7 +18895,6 @@
       </w:tr>
       <w:tr>
         <w:trPr>
-          <w:cantSplit w:val="1"/>
           <w:tblHeader w:val="0"/>
         </w:trPr>
         <w:tc>
@@ -18981,8 +18913,8 @@
                 <w:i w:val="0"/>
                 <w:iCs w:val="0"/>
                 <w:color w:val="000000"/>
-                <w:sz w:val="18"/>
-                <w:szCs w:val="18"/>
+                <w:sz w:val="20"/>
+                <w:szCs w:val="20"/>
                 <w:rtl w:val="0"/>
               </w:rPr>
               <w:t xml:space="preserve">generally / typically</w:t>
@@ -18990,8 +18922,8 @@
             <w:r>
               <w:rPr>
                 <w:rtl w:val="0"/>
-                <w:sz w:val="18"/>
-                <w:szCs w:val="18"/>
+                <w:sz w:val="20"/>
+                <w:szCs w:val="20"/>
                 <w:rFonts w:ascii="Georgia" w:hAnsi="Georgia"/>
               </w:rPr>
             </w:r>
@@ -19008,8 +18940,8 @@
             <w:r>
               <w:rPr>
                 <w:rFonts w:ascii="Georgia" w:cs="Georgia" w:eastAsia="Georgia" w:hAnsi="Georgia"/>
-                <w:sz w:val="18"/>
-                <w:szCs w:val="18"/>
+                <w:sz w:val="20"/>
+                <w:szCs w:val="20"/>
                 <w:rtl w:val="0"/>
               </w:rPr>
               <w:t xml:space="preserve">Qualifies scope</w:t>
@@ -19017,8 +18949,8 @@
             <w:r>
               <w:rPr>
                 <w:rtl w:val="0"/>
-                <w:sz w:val="18"/>
-                <w:szCs w:val="18"/>
+                <w:sz w:val="20"/>
+                <w:szCs w:val="20"/>
                 <w:rFonts w:ascii="Georgia" w:hAnsi="Georgia"/>
               </w:rPr>
             </w:r>
@@ -19035,8 +18967,8 @@
             <w:r>
               <w:rPr>
                 <w:rFonts w:ascii="Georgia" w:cs="Georgia" w:eastAsia="Georgia" w:hAnsi="Georgia"/>
-                <w:sz w:val="18"/>
-                <w:szCs w:val="18"/>
+                <w:sz w:val="20"/>
+                <w:szCs w:val="20"/>
                 <w:rtl w:val="0"/>
               </w:rPr>
               <w:t xml:space="preserve">Describes a procedural norm</w:t>
@@ -19044,8 +18976,8 @@
             <w:r>
               <w:rPr>
                 <w:rtl w:val="0"/>
-                <w:sz w:val="18"/>
-                <w:szCs w:val="18"/>
+                <w:sz w:val="20"/>
+                <w:szCs w:val="20"/>
                 <w:rFonts w:ascii="Georgia" w:hAnsi="Georgia"/>
               </w:rPr>
             </w:r>
@@ -19054,7 +18986,6 @@
       </w:tr>
       <w:tr>
         <w:trPr>
-          <w:cantSplit w:val="1"/>
           <w:tblHeader w:val="0"/>
         </w:trPr>
         <w:tc>
@@ -19073,8 +19004,8 @@
                 <w:i w:val="0"/>
                 <w:iCs w:val="0"/>
                 <w:color w:val="000000"/>
-                <w:sz w:val="18"/>
-                <w:szCs w:val="18"/>
+                <w:sz w:val="20"/>
+                <w:szCs w:val="20"/>
                 <w:rtl w:val="0"/>
               </w:rPr>
               <w:t xml:space="preserve">appear / seem</w:t>
@@ -19082,8 +19013,8 @@
             <w:r>
               <w:rPr>
                 <w:rtl w:val="0"/>
-                <w:sz w:val="18"/>
-                <w:szCs w:val="18"/>
+                <w:sz w:val="20"/>
+                <w:szCs w:val="20"/>
                 <w:rFonts w:ascii="Georgia" w:hAnsi="Georgia"/>
               </w:rPr>
             </w:r>
@@ -19100,8 +19031,8 @@
             <w:r>
               <w:rPr>
                 <w:rFonts w:ascii="Georgia" w:cs="Georgia" w:eastAsia="Georgia" w:hAnsi="Georgia"/>
-                <w:sz w:val="18"/>
-                <w:szCs w:val="18"/>
+                <w:sz w:val="20"/>
+                <w:szCs w:val="20"/>
                 <w:rtl w:val="0"/>
               </w:rPr>
               <w:t xml:space="preserve">Expresses result uncertainty</w:t>
@@ -19109,8 +19040,8 @@
             <w:r>
               <w:rPr>
                 <w:rtl w:val="0"/>
-                <w:sz w:val="18"/>
-                <w:szCs w:val="18"/>
+                <w:sz w:val="20"/>
+                <w:szCs w:val="20"/>
                 <w:rFonts w:ascii="Georgia" w:hAnsi="Georgia"/>
               </w:rPr>
             </w:r>
@@ -19127,8 +19058,8 @@
             <w:r>
               <w:rPr>
                 <w:rFonts w:ascii="Georgia" w:cs="Georgia" w:eastAsia="Georgia" w:hAnsi="Georgia"/>
-                <w:sz w:val="18"/>
-                <w:szCs w:val="18"/>
+                <w:sz w:val="20"/>
+                <w:szCs w:val="20"/>
                 <w:rtl w:val="0"/>
               </w:rPr>
               <w:t xml:space="preserve">Indicates location</w:t>
@@ -19136,8 +19067,8 @@
             <w:r>
               <w:rPr>
                 <w:rtl w:val="0"/>
-                <w:sz w:val="18"/>
-                <w:szCs w:val="18"/>
+                <w:sz w:val="20"/>
+                <w:szCs w:val="20"/>
                 <w:rFonts w:ascii="Georgia" w:hAnsi="Georgia"/>
               </w:rPr>
             </w:r>
@@ -19145,47 +19076,6 @@
         </w:tc>
       </w:tr>
     </w:tbl>
-    <w:p>
-      <w:pPr>
-        <w:spacing w:before="240" w:after="0" w:line="480" w:lineRule="auto"/>
-        <w:ind w:firstLine="720"/>
-        <w:jc w:val="both"/>
-        <w:rPr/>
-      </w:pPr>
-      <w:r>
-        <w:rPr>
-          <w:rFonts w:ascii="Georgia" w:cs="Georgia" w:eastAsia="Georgia" w:hAnsi="Georgia"/>
-          <w:b w:val="1"/>
-          <w:bCs w:val="1"/>
-          <w:i w:val="1"/>
-          <w:iCs w:val="1"/>
-          <w:color w:val="000000"/>
-          <w:sz w:val="22"/>
-          <w:szCs w:val="22"/>
-          <w:rtl w:val="0"/>
-        </w:rPr>
-        <w:t xml:space="preserve">General exclusions: </w:t>
-      </w:r>
-      <w:r>
-        <w:rPr>
-          <w:rFonts w:ascii="Georgia" w:cs="Georgia" w:eastAsia="Georgia" w:hAnsi="Georgia"/>
-          <w:b w:val="0"/>
-          <w:bCs w:val="0"/>
-          <w:i w:val="1"/>
-          <w:iCs w:val="1"/>
-          <w:color w:val="000000"/>
-          <w:sz w:val="22"/>
-          <w:szCs w:val="22"/>
-          <w:rtl w:val="0"/>
-        </w:rPr>
-        <w:t xml:space="preserve">ability, future procedure, and procedural necessity (a step required by the procedure itself) are never coded as hedges.</w:t>
-      </w:r>
-      <w:r>
-        <w:rPr>
-          <w:rtl w:val="0"/>
-        </w:rPr>
-      </w:r>
-    </w:p>
     <w:p>
       <w:pPr>
         <w:spacing w:before="0" w:after="0" w:line="360" w:lineRule="auto"/>
@@ -19196,8 +19086,8 @@
       <w:r>
         <w:rPr>
           <w:rFonts w:ascii="Georgia" w:cs="Georgia" w:eastAsia="Georgia" w:hAnsi="Georgia"/>
-          <w:b w:val="0"/>
-          <w:bCs w:val="0"/>
+          <w:b w:val="1"/>
+          <w:bCs w:val="1"/>
           <w:i w:val="1"/>
           <w:iCs w:val="1"/>
           <w:color w:val="000000"/>
@@ -19205,13 +19095,13 @@
           <w:szCs w:val="22"/>
           <w:rtl w:val="0"/>
         </w:rPr>
-        <w:t xml:space="preserve">Quick test for </w:t>
-      </w:r>
-      <w:r>
-        <w:rPr>
-          <w:rFonts w:ascii="Georgia" w:cs="Georgia" w:eastAsia="Georgia" w:hAnsi="Georgia"/>
-          <w:b w:val="1"/>
-          <w:bCs w:val="1"/>
+        <w:t xml:space="preserve">General exclusions: </w:t>
+      </w:r>
+      <w:r>
+        <w:rPr>
+          <w:rFonts w:ascii="Georgia" w:cs="Georgia" w:eastAsia="Georgia" w:hAnsi="Georgia"/>
+          <w:b w:val="0"/>
+          <w:bCs w:val="0"/>
           <w:i w:val="1"/>
           <w:iCs w:val="1"/>
           <w:color w:val="000000"/>
@@ -19219,8 +19109,21 @@
           <w:szCs w:val="22"/>
           <w:rtl w:val="0"/>
         </w:rPr>
-        <w:t xml:space="preserve">suggest/indicate</w:t>
-      </w:r>
+        <w:t xml:space="preserve">ability, future procedure, and procedural necessity (a step required by the procedure itself) are never coded as hedges.</w:t>
+      </w:r>
+      <w:r>
+        <w:rPr>
+          <w:rtl w:val="0"/>
+        </w:rPr>
+      </w:r>
+    </w:p>
+    <w:p>
+      <w:pPr>
+        <w:spacing w:before="0" w:after="0" w:line="360" w:lineRule="auto"/>
+        <w:ind w:firstLine="720"/>
+        <w:jc w:val="both"/>
+        <w:rPr/>
+      </w:pPr>
       <w:r>
         <w:rPr>
           <w:rFonts w:ascii="Georgia" w:cs="Georgia" w:eastAsia="Georgia" w:hAnsi="Georgia"/>
@@ -19233,6 +19136,34 @@
           <w:szCs w:val="22"/>
           <w:rtl w:val="0"/>
         </w:rPr>
+        <w:t xml:space="preserve">Quick test for </w:t>
+      </w:r>
+      <w:r>
+        <w:rPr>
+          <w:rFonts w:ascii="Georgia" w:cs="Georgia" w:eastAsia="Georgia" w:hAnsi="Georgia"/>
+          <w:b w:val="1"/>
+          <w:bCs w:val="1"/>
+          <w:i w:val="1"/>
+          <w:iCs w:val="1"/>
+          <w:color w:val="000000"/>
+          <w:sz w:val="22"/>
+          <w:szCs w:val="22"/>
+          <w:rtl w:val="0"/>
+        </w:rPr>
+        <w:t xml:space="preserve">suggest/indicate</w:t>
+      </w:r>
+      <w:r>
+        <w:rPr>
+          <w:rFonts w:ascii="Georgia" w:cs="Georgia" w:eastAsia="Georgia" w:hAnsi="Georgia"/>
+          <w:b w:val="0"/>
+          <w:bCs w:val="0"/>
+          <w:i w:val="1"/>
+          <w:iCs w:val="1"/>
+          <w:color w:val="000000"/>
+          <w:sz w:val="22"/>
+          <w:szCs w:val="22"/>
+          <w:rtl w:val="0"/>
+        </w:rPr>
         <w:t xml:space="preserve">: “Might this be true?” = hedge. “Should this be done?” = FP-Rec.</w:t>
       </w:r>
       <w:r>
@@ -19244,7 +19175,7 @@
     <w:p>
       <w:pPr>
         <w:keepNext w:val="1"/>
-        <w:spacing w:before="120" w:after="0" w:line="360" w:lineRule="auto"/>
+        <w:spacing w:before="120" w:after="60" w:line="360" w:lineRule="auto"/>
         <w:jc w:val="left"/>
         <w:rPr/>
       </w:pPr>
@@ -19270,7 +19201,6 @@
     <w:p>
       <w:pPr>
         <w:keepNext w:val="1"/>
-        <w:keepLines w:val="1"/>
         <w:spacing w:before="0" w:after="0" w:line="360" w:lineRule="auto"/>
         <w:ind w:firstLine="720"/>
         <w:jc w:val="both"/>
@@ -19326,7 +19256,6 @@
       </w:tblGrid>
       <w:tr>
         <w:trPr>
-          <w:cantSplit w:val="1"/>
           <w:tblHeader w:val="1"/>
         </w:trPr>
         <w:tc>
@@ -19347,8 +19276,8 @@
                 <w:rFonts w:ascii="Georgia" w:cs="Georgia" w:eastAsia="Georgia" w:hAnsi="Georgia"/>
                 <w:b w:val="1"/>
                 <w:bCs w:val="1"/>
-                <w:sz w:val="18"/>
-                <w:szCs w:val="18"/>
+                <w:sz w:val="20"/>
+                <w:szCs w:val="20"/>
                 <w:rtl w:val="0"/>
               </w:rPr>
               <w:t xml:space="preserve">Code</w:t>
@@ -19356,8 +19285,8 @@
             <w:r>
               <w:rPr>
                 <w:rtl w:val="0"/>
-                <w:sz w:val="18"/>
-                <w:szCs w:val="18"/>
+                <w:sz w:val="20"/>
+                <w:szCs w:val="20"/>
                 <w:rFonts w:ascii="Georgia" w:hAnsi="Georgia"/>
               </w:rPr>
             </w:r>
@@ -19381,8 +19310,8 @@
                 <w:rFonts w:ascii="Georgia" w:cs="Georgia" w:eastAsia="Georgia" w:hAnsi="Georgia"/>
                 <w:b w:val="1"/>
                 <w:bCs w:val="1"/>
-                <w:sz w:val="18"/>
-                <w:szCs w:val="18"/>
+                <w:sz w:val="20"/>
+                <w:szCs w:val="20"/>
                 <w:rtl w:val="0"/>
               </w:rPr>
               <w:t xml:space="preserve">Reason</w:t>
@@ -19390,8 +19319,8 @@
             <w:r>
               <w:rPr>
                 <w:rtl w:val="0"/>
-                <w:sz w:val="18"/>
-                <w:szCs w:val="18"/>
+                <w:sz w:val="20"/>
+                <w:szCs w:val="20"/>
                 <w:rFonts w:ascii="Georgia" w:hAnsi="Georgia"/>
               </w:rPr>
             </w:r>
@@ -19415,8 +19344,8 @@
                 <w:rFonts w:ascii="Georgia" w:cs="Georgia" w:eastAsia="Georgia" w:hAnsi="Georgia"/>
                 <w:b w:val="1"/>
                 <w:bCs w:val="1"/>
-                <w:sz w:val="18"/>
-                <w:szCs w:val="18"/>
+                <w:sz w:val="20"/>
+                <w:szCs w:val="20"/>
                 <w:rtl w:val="0"/>
               </w:rPr>
               <w:t xml:space="preserve">Marked Example</w:t>
@@ -19424,8 +19353,8 @@
             <w:r>
               <w:rPr>
                 <w:rtl w:val="0"/>
-                <w:sz w:val="18"/>
-                <w:szCs w:val="18"/>
+                <w:sz w:val="20"/>
+                <w:szCs w:val="20"/>
                 <w:rFonts w:ascii="Georgia" w:hAnsi="Georgia"/>
               </w:rPr>
             </w:r>
@@ -19434,7 +19363,6 @@
       </w:tr>
       <w:tr>
         <w:trPr>
-          <w:cantSplit w:val="1"/>
           <w:tblHeader w:val="0"/>
         </w:trPr>
         <w:tc>
@@ -19453,8 +19381,8 @@
                 <w:i w:val="0"/>
                 <w:iCs w:val="0"/>
                 <w:color w:val="808080"/>
-                <w:sz w:val="18"/>
-                <w:szCs w:val="18"/>
+                <w:sz w:val="20"/>
+                <w:szCs w:val="20"/>
                 <w:rtl w:val="0"/>
               </w:rPr>
               <w:t xml:space="preserve">FP-Cap</w:t>
@@ -19462,8 +19390,8 @@
             <w:r>
               <w:rPr>
                 <w:rtl w:val="0"/>
-                <w:sz w:val="18"/>
-                <w:szCs w:val="18"/>
+                <w:sz w:val="20"/>
+                <w:szCs w:val="20"/>
                 <w:rFonts w:ascii="Georgia" w:hAnsi="Georgia"/>
               </w:rPr>
             </w:r>
@@ -19480,8 +19408,8 @@
             <w:r>
               <w:rPr>
                 <w:rFonts w:ascii="Georgia" w:cs="Georgia" w:eastAsia="Georgia" w:hAnsi="Georgia"/>
-                <w:sz w:val="18"/>
-                <w:szCs w:val="18"/>
+                <w:sz w:val="20"/>
+                <w:szCs w:val="20"/>
                 <w:rtl w:val="0"/>
               </w:rPr>
               <w:t xml:space="preserve">Capability: describes what something is able to do, not uncertainty about whether it will happen. Distinct from inferential “can be concluded / derived / stated / attributed to / seen as,” which stays a hedge.</w:t>
@@ -19489,8 +19417,8 @@
             <w:r>
               <w:rPr>
                 <w:rtl w:val="0"/>
-                <w:sz w:val="18"/>
-                <w:szCs w:val="18"/>
+                <w:sz w:val="20"/>
+                <w:szCs w:val="20"/>
                 <w:rFonts w:ascii="Georgia" w:hAnsi="Georgia"/>
               </w:rPr>
             </w:r>
@@ -19512,8 +19440,8 @@
                 <w:i w:val="0"/>
                 <w:iCs w:val="0"/>
                 <w:color w:val="000000"/>
-                <w:sz w:val="18"/>
-                <w:szCs w:val="18"/>
+                <w:sz w:val="20"/>
+                <w:szCs w:val="20"/>
                 <w:rtl w:val="0"/>
               </w:rPr>
               <w:t xml:space="preserve">“PCR </w:t>
@@ -19525,8 +19453,8 @@
                 <w:bCs w:val="1"/>
                 <w:strike w:val="1"/>
                 <w:color w:val="000000"/>
-                <w:sz w:val="18"/>
-                <w:szCs w:val="18"/>
+                <w:sz w:val="20"/>
+                <w:szCs w:val="20"/>
                 <w:rtl w:val="0"/>
               </w:rPr>
               <w:t xml:space="preserve">can</w:t>
@@ -19539,8 +19467,8 @@
                 <w:i w:val="0"/>
                 <w:iCs w:val="0"/>
                 <w:color w:val="000000"/>
-                <w:sz w:val="18"/>
-                <w:szCs w:val="18"/>
+                <w:sz w:val="20"/>
+                <w:szCs w:val="20"/>
                 <w:rtl w:val="0"/>
               </w:rPr>
               <w:t xml:space="preserve"> (FP-Cap) detect low concentrations.”</w:t>
@@ -19548,8 +19476,8 @@
             <w:r>
               <w:rPr>
                 <w:rtl w:val="0"/>
-                <w:sz w:val="18"/>
-                <w:szCs w:val="18"/>
+                <w:sz w:val="20"/>
+                <w:szCs w:val="20"/>
                 <w:rFonts w:ascii="Georgia" w:hAnsi="Georgia"/>
               </w:rPr>
             </w:r>
@@ -19558,7 +19486,6 @@
       </w:tr>
       <w:tr>
         <w:trPr>
-          <w:cantSplit w:val="1"/>
           <w:tblHeader w:val="0"/>
         </w:trPr>
         <w:tc>
@@ -19577,8 +19504,8 @@
                 <w:i w:val="0"/>
                 <w:iCs w:val="0"/>
                 <w:color w:val="808080"/>
-                <w:sz w:val="18"/>
-                <w:szCs w:val="18"/>
+                <w:sz w:val="20"/>
+                <w:szCs w:val="20"/>
                 <w:rtl w:val="0"/>
               </w:rPr>
               <w:t xml:space="preserve">FP-Rec</w:t>
@@ -19586,8 +19513,8 @@
             <w:r>
               <w:rPr>
                 <w:rtl w:val="0"/>
-                <w:sz w:val="18"/>
-                <w:szCs w:val="18"/>
+                <w:sz w:val="20"/>
+                <w:szCs w:val="20"/>
                 <w:rFonts w:ascii="Georgia" w:hAnsi="Georgia"/>
               </w:rPr>
             </w:r>
@@ -19604,8 +19531,8 @@
             <w:r>
               <w:rPr>
                 <w:rFonts w:ascii="Georgia" w:cs="Georgia" w:eastAsia="Georgia" w:hAnsi="Georgia"/>
-                <w:sz w:val="18"/>
-                <w:szCs w:val="18"/>
+                <w:sz w:val="20"/>
+                <w:szCs w:val="20"/>
                 <w:rtl w:val="0"/>
               </w:rPr>
               <w:t xml:space="preserve">Recommendation: expresses what should, needs to, or ought to be done, not uncertainty about a claim.</w:t>
@@ -19613,8 +19540,8 @@
             <w:r>
               <w:rPr>
                 <w:rtl w:val="0"/>
-                <w:sz w:val="18"/>
-                <w:szCs w:val="18"/>
+                <w:sz w:val="20"/>
+                <w:szCs w:val="20"/>
                 <w:rFonts w:ascii="Georgia" w:hAnsi="Georgia"/>
               </w:rPr>
             </w:r>
@@ -19636,8 +19563,8 @@
                 <w:i w:val="0"/>
                 <w:iCs w:val="0"/>
                 <w:color w:val="000000"/>
-                <w:sz w:val="18"/>
-                <w:szCs w:val="18"/>
+                <w:sz w:val="20"/>
+                <w:szCs w:val="20"/>
                 <w:rtl w:val="0"/>
               </w:rPr>
               <w:t xml:space="preserve">“We </w:t>
@@ -19649,8 +19576,8 @@
                 <w:bCs w:val="1"/>
                 <w:strike w:val="1"/>
                 <w:color w:val="000000"/>
-                <w:sz w:val="18"/>
-                <w:szCs w:val="18"/>
+                <w:sz w:val="20"/>
+                <w:szCs w:val="20"/>
                 <w:rtl w:val="0"/>
               </w:rPr>
               <w:t xml:space="preserve">suggest</w:t>
@@ -19663,8 +19590,8 @@
                 <w:i w:val="0"/>
                 <w:iCs w:val="0"/>
                 <w:color w:val="000000"/>
-                <w:sz w:val="18"/>
-                <w:szCs w:val="18"/>
+                <w:sz w:val="20"/>
+                <w:szCs w:val="20"/>
                 <w:rtl w:val="0"/>
               </w:rPr>
               <w:t xml:space="preserve"> (FP-Rec) further research.”</w:t>
@@ -19672,8 +19599,8 @@
             <w:r>
               <w:rPr>
                 <w:rtl w:val="0"/>
-                <w:sz w:val="18"/>
-                <w:szCs w:val="18"/>
+                <w:sz w:val="20"/>
+                <w:szCs w:val="20"/>
                 <w:rFonts w:ascii="Georgia" w:hAnsi="Georgia"/>
               </w:rPr>
             </w:r>
@@ -19682,7 +19609,6 @@
       </w:tr>
       <w:tr>
         <w:trPr>
-          <w:cantSplit w:val="1"/>
           <w:tblHeader w:val="0"/>
         </w:trPr>
         <w:tc>
@@ -19701,8 +19627,8 @@
                 <w:i w:val="0"/>
                 <w:iCs w:val="0"/>
                 <w:color w:val="808080"/>
-                <w:sz w:val="18"/>
-                <w:szCs w:val="18"/>
+                <w:sz w:val="20"/>
+                <w:szCs w:val="20"/>
                 <w:rtl w:val="0"/>
               </w:rPr>
               <w:t xml:space="preserve">FP-Proc</w:t>
@@ -19710,8 +19636,8 @@
             <w:r>
               <w:rPr>
                 <w:rtl w:val="0"/>
-                <w:sz w:val="18"/>
-                <w:szCs w:val="18"/>
+                <w:sz w:val="20"/>
+                <w:szCs w:val="20"/>
                 <w:rFonts w:ascii="Georgia" w:hAnsi="Georgia"/>
               </w:rPr>
             </w:r>
@@ -19728,8 +19654,8 @@
             <w:r>
               <w:rPr>
                 <w:rFonts w:ascii="Georgia" w:cs="Georgia" w:eastAsia="Georgia" w:hAnsi="Georgia"/>
-                <w:sz w:val="18"/>
-                <w:szCs w:val="18"/>
+                <w:sz w:val="20"/>
+                <w:szCs w:val="20"/>
                 <w:rtl w:val="0"/>
               </w:rPr>
               <w:t xml:space="preserve">Procedural norm: describes a routine, standard, or established procedure rather than uncertainty about a claim.</w:t>
@@ -19737,8 +19663,8 @@
             <w:r>
               <w:rPr>
                 <w:rtl w:val="0"/>
-                <w:sz w:val="18"/>
-                <w:szCs w:val="18"/>
+                <w:sz w:val="20"/>
+                <w:szCs w:val="20"/>
                 <w:rFonts w:ascii="Georgia" w:hAnsi="Georgia"/>
               </w:rPr>
             </w:r>
@@ -19760,8 +19686,8 @@
                 <w:i w:val="0"/>
                 <w:iCs w:val="0"/>
                 <w:color w:val="000000"/>
-                <w:sz w:val="18"/>
-                <w:szCs w:val="18"/>
+                <w:sz w:val="20"/>
+                <w:szCs w:val="20"/>
                 <w:rtl w:val="0"/>
               </w:rPr>
               <w:t xml:space="preserve">“Samples were </w:t>
@@ -19773,8 +19699,8 @@
                 <w:bCs w:val="1"/>
                 <w:strike w:val="1"/>
                 <w:color w:val="000000"/>
-                <w:sz w:val="18"/>
-                <w:szCs w:val="18"/>
+                <w:sz w:val="20"/>
+                <w:szCs w:val="20"/>
                 <w:rtl w:val="0"/>
               </w:rPr>
               <w:t xml:space="preserve">generally</w:t>
@@ -19787,8 +19713,8 @@
                 <w:i w:val="0"/>
                 <w:iCs w:val="0"/>
                 <w:color w:val="000000"/>
-                <w:sz w:val="18"/>
-                <w:szCs w:val="18"/>
+                <w:sz w:val="20"/>
+                <w:szCs w:val="20"/>
                 <w:rtl w:val="0"/>
               </w:rPr>
               <w:t xml:space="preserve"> (FP-Proc) stored at 4°C.”</w:t>
@@ -19796,8 +19722,8 @@
             <w:r>
               <w:rPr>
                 <w:rtl w:val="0"/>
-                <w:sz w:val="18"/>
-                <w:szCs w:val="18"/>
+                <w:sz w:val="20"/>
+                <w:szCs w:val="20"/>
                 <w:rFonts w:ascii="Georgia" w:hAnsi="Georgia"/>
               </w:rPr>
             </w:r>
@@ -19806,7 +19732,6 @@
       </w:tr>
       <w:tr>
         <w:trPr>
-          <w:cantSplit w:val="1"/>
           <w:tblHeader w:val="0"/>
         </w:trPr>
         <w:tc>
@@ -19825,8 +19750,8 @@
                 <w:i w:val="0"/>
                 <w:iCs w:val="0"/>
                 <w:color w:val="808080"/>
-                <w:sz w:val="18"/>
-                <w:szCs w:val="18"/>
+                <w:sz w:val="20"/>
+                <w:szCs w:val="20"/>
                 <w:rtl w:val="0"/>
               </w:rPr>
               <w:t xml:space="preserve">FP-Loc</w:t>
@@ -19834,8 +19759,8 @@
             <w:r>
               <w:rPr>
                 <w:rtl w:val="0"/>
-                <w:sz w:val="18"/>
-                <w:szCs w:val="18"/>
+                <w:sz w:val="20"/>
+                <w:szCs w:val="20"/>
                 <w:rFonts w:ascii="Georgia" w:hAnsi="Georgia"/>
               </w:rPr>
             </w:r>
@@ -19852,8 +19777,8 @@
             <w:r>
               <w:rPr>
                 <w:rFonts w:ascii="Georgia" w:cs="Georgia" w:eastAsia="Georgia" w:hAnsi="Georgia"/>
-                <w:sz w:val="18"/>
-                <w:szCs w:val="18"/>
+                <w:sz w:val="20"/>
+                <w:szCs w:val="20"/>
                 <w:rtl w:val="0"/>
               </w:rPr>
               <w:t xml:space="preserve">Location: indicates physical or textual location.</w:t>
@@ -19861,8 +19786,8 @@
             <w:r>
               <w:rPr>
                 <w:rtl w:val="0"/>
-                <w:sz w:val="18"/>
-                <w:szCs w:val="18"/>
+                <w:sz w:val="20"/>
+                <w:szCs w:val="20"/>
                 <w:rFonts w:ascii="Georgia" w:hAnsi="Georgia"/>
               </w:rPr>
             </w:r>
@@ -19884,8 +19809,8 @@
                 <w:i w:val="0"/>
                 <w:iCs w:val="0"/>
                 <w:color w:val="000000"/>
-                <w:sz w:val="18"/>
-                <w:szCs w:val="18"/>
+                <w:sz w:val="20"/>
+                <w:szCs w:val="20"/>
                 <w:rtl w:val="0"/>
               </w:rPr>
               <w:t xml:space="preserve">“The results </w:t>
@@ -19897,8 +19822,8 @@
                 <w:bCs w:val="1"/>
                 <w:strike w:val="1"/>
                 <w:color w:val="000000"/>
-                <w:sz w:val="18"/>
-                <w:szCs w:val="18"/>
+                <w:sz w:val="20"/>
+                <w:szCs w:val="20"/>
                 <w:rtl w:val="0"/>
               </w:rPr>
               <w:t xml:space="preserve">appear</w:t>
@@ -19911,8 +19836,8 @@
                 <w:i w:val="0"/>
                 <w:iCs w:val="0"/>
                 <w:color w:val="000000"/>
-                <w:sz w:val="18"/>
-                <w:szCs w:val="18"/>
+                <w:sz w:val="20"/>
+                <w:szCs w:val="20"/>
                 <w:rtl w:val="0"/>
               </w:rPr>
               <w:t xml:space="preserve"> (FP-Loc) in Table 1.”</w:t>
@@ -19920,8 +19845,8 @@
             <w:r>
               <w:rPr>
                 <w:rtl w:val="0"/>
-                <w:sz w:val="18"/>
-                <w:szCs w:val="18"/>
+                <w:sz w:val="20"/>
+                <w:szCs w:val="20"/>
                 <w:rFonts w:ascii="Georgia" w:hAnsi="Georgia"/>
               </w:rPr>
             </w:r>
@@ -19930,7 +19855,6 @@
       </w:tr>
       <w:tr>
         <w:trPr>
-          <w:cantSplit w:val="1"/>
           <w:tblHeader w:val="0"/>
         </w:trPr>
         <w:tc>
@@ -19949,8 +19873,8 @@
                 <w:i w:val="0"/>
                 <w:iCs w:val="0"/>
                 <w:color w:val="808080"/>
-                <w:sz w:val="18"/>
-                <w:szCs w:val="18"/>
+                <w:sz w:val="20"/>
+                <w:szCs w:val="20"/>
                 <w:rtl w:val="0"/>
               </w:rPr>
               <w:t xml:space="preserve">FP-Gen</w:t>
@@ -19958,8 +19882,8 @@
             <w:r>
               <w:rPr>
                 <w:rtl w:val="0"/>
-                <w:sz w:val="18"/>
-                <w:szCs w:val="18"/>
+                <w:sz w:val="20"/>
+                <w:szCs w:val="20"/>
                 <w:rFonts w:ascii="Georgia" w:hAnsi="Georgia"/>
               </w:rPr>
             </w:r>
@@ -19976,8 +19900,8 @@
             <w:r>
               <w:rPr>
                 <w:rFonts w:ascii="Georgia" w:cs="Georgia" w:eastAsia="Georgia" w:hAnsi="Georgia"/>
-                <w:sz w:val="18"/>
-                <w:szCs w:val="18"/>
+                <w:sz w:val="20"/>
+                <w:szCs w:val="20"/>
                 <w:rtl w:val="0"/>
               </w:rPr>
               <w:t xml:space="preserve">General exclusion: doesn’t fit the codes above. Use for expressions that look hedge-like but don’t express uncertainty (e.g., naming a research topic, pointing to evidence). Note the specific reason in Coder Notes.</w:t>
@@ -19985,8 +19909,8 @@
             <w:r>
               <w:rPr>
                 <w:rtl w:val="0"/>
-                <w:sz w:val="18"/>
-                <w:szCs w:val="18"/>
+                <w:sz w:val="20"/>
+                <w:szCs w:val="20"/>
                 <w:rFonts w:ascii="Georgia" w:hAnsi="Georgia"/>
               </w:rPr>
             </w:r>
@@ -20008,8 +19932,8 @@
                 <w:i w:val="0"/>
                 <w:iCs w:val="0"/>
                 <w:color w:val="000000"/>
-                <w:sz w:val="18"/>
-                <w:szCs w:val="18"/>
+                <w:sz w:val="20"/>
+                <w:szCs w:val="20"/>
                 <w:rtl w:val="0"/>
               </w:rPr>
               <w:t xml:space="preserve">“...demonstrated notable antioxidant activity, as </w:t>
@@ -20021,8 +19945,8 @@
                 <w:bCs w:val="1"/>
                 <w:strike w:val="1"/>
                 <w:color w:val="000000"/>
-                <w:sz w:val="18"/>
-                <w:szCs w:val="18"/>
+                <w:sz w:val="20"/>
+                <w:szCs w:val="20"/>
                 <w:rtl w:val="0"/>
               </w:rPr>
               <w:t xml:space="preserve">indicated</w:t>
@@ -20035,8 +19959,8 @@
                 <w:i w:val="0"/>
                 <w:iCs w:val="0"/>
                 <w:color w:val="000000"/>
-                <w:sz w:val="18"/>
-                <w:szCs w:val="18"/>
+                <w:sz w:val="20"/>
+                <w:szCs w:val="20"/>
                 <w:rtl w:val="0"/>
               </w:rPr>
               <w:t xml:space="preserve"> (FP-Gen) by the reduction of DPPH radicals.”</w:t>
@@ -20044,8 +19968,8 @@
             <w:r>
               <w:rPr>
                 <w:rtl w:val="0"/>
-                <w:sz w:val="18"/>
-                <w:szCs w:val="18"/>
+                <w:sz w:val="20"/>
+                <w:szCs w:val="20"/>
                 <w:rFonts w:ascii="Georgia" w:hAnsi="Georgia"/>
               </w:rPr>
             </w:r>
@@ -20056,7 +19980,7 @@
     <w:p>
       <w:pPr>
         <w:keepNext w:val="1"/>
-        <w:spacing w:before="240" w:after="0" w:line="480" w:lineRule="auto"/>
+        <w:spacing w:before="120" w:after="60" w:line="360" w:lineRule="auto"/>
         <w:jc w:val="both"/>
         <w:rPr/>
       </w:pPr>
@@ -20082,7 +20006,6 @@
     <w:p>
       <w:pPr>
         <w:keepNext w:val="1"/>
-        <w:keepLines w:val="1"/>
         <w:spacing w:before="0" w:after="0" w:line="360" w:lineRule="auto"/>
         <w:ind w:firstLine="720"/>
         <w:jc w:val="both"/>
@@ -20197,7 +20120,6 @@
       </w:tblGrid>
       <w:tr>
         <w:trPr>
-          <w:cantSplit w:val="1"/>
           <w:tblHeader w:val="1"/>
         </w:trPr>
         <w:tc>
@@ -20218,8 +20140,8 @@
                 <w:rFonts w:ascii="Georgia" w:cs="Georgia" w:eastAsia="Georgia" w:hAnsi="Georgia"/>
                 <w:b w:val="1"/>
                 <w:bCs w:val="1"/>
-                <w:sz w:val="18"/>
-                <w:szCs w:val="18"/>
+                <w:sz w:val="20"/>
+                <w:szCs w:val="20"/>
                 <w:rtl w:val="0"/>
               </w:rPr>
               <w:t xml:space="preserve">Color</w:t>
@@ -20227,8 +20149,8 @@
             <w:r>
               <w:rPr>
                 <w:rtl w:val="0"/>
-                <w:sz w:val="18"/>
-                <w:szCs w:val="18"/>
+                <w:sz w:val="20"/>
+                <w:szCs w:val="20"/>
                 <w:rFonts w:ascii="Georgia" w:hAnsi="Georgia"/>
               </w:rPr>
             </w:r>
@@ -20252,8 +20174,8 @@
                 <w:rFonts w:ascii="Georgia" w:cs="Georgia" w:eastAsia="Georgia" w:hAnsi="Georgia"/>
                 <w:b w:val="1"/>
                 <w:bCs w:val="1"/>
-                <w:sz w:val="18"/>
-                <w:szCs w:val="18"/>
+                <w:sz w:val="20"/>
+                <w:szCs w:val="20"/>
                 <w:rtl w:val="0"/>
               </w:rPr>
               <w:t xml:space="preserve">Subtype</w:t>
@@ -20261,8 +20183,8 @@
             <w:r>
               <w:rPr>
                 <w:rtl w:val="0"/>
-                <w:sz w:val="18"/>
-                <w:szCs w:val="18"/>
+                <w:sz w:val="20"/>
+                <w:szCs w:val="20"/>
                 <w:rFonts w:ascii="Georgia" w:hAnsi="Georgia"/>
               </w:rPr>
             </w:r>
@@ -20286,8 +20208,8 @@
                 <w:rFonts w:ascii="Georgia" w:cs="Georgia" w:eastAsia="Georgia" w:hAnsi="Georgia"/>
                 <w:b w:val="1"/>
                 <w:bCs w:val="1"/>
-                <w:sz w:val="18"/>
-                <w:szCs w:val="18"/>
+                <w:sz w:val="20"/>
+                <w:szCs w:val="20"/>
                 <w:rtl w:val="0"/>
               </w:rPr>
               <w:t xml:space="preserve">Definition</w:t>
@@ -20295,8 +20217,8 @@
             <w:r>
               <w:rPr>
                 <w:rtl w:val="0"/>
-                <w:sz w:val="18"/>
-                <w:szCs w:val="18"/>
+                <w:sz w:val="20"/>
+                <w:szCs w:val="20"/>
                 <w:rFonts w:ascii="Georgia" w:hAnsi="Georgia"/>
               </w:rPr>
             </w:r>
@@ -20320,8 +20242,8 @@
                 <w:rFonts w:ascii="Georgia" w:cs="Georgia" w:eastAsia="Georgia" w:hAnsi="Georgia"/>
                 <w:b w:val="1"/>
                 <w:bCs w:val="1"/>
-                <w:sz w:val="18"/>
-                <w:szCs w:val="18"/>
+                <w:sz w:val="20"/>
+                <w:szCs w:val="20"/>
                 <w:rtl w:val="0"/>
               </w:rPr>
               <w:t xml:space="preserve">Highlighted Example</w:t>
@@ -20329,8 +20251,8 @@
             <w:r>
               <w:rPr>
                 <w:rtl w:val="0"/>
-                <w:sz w:val="18"/>
-                <w:szCs w:val="18"/>
+                <w:sz w:val="20"/>
+                <w:szCs w:val="20"/>
                 <w:rFonts w:ascii="Georgia" w:hAnsi="Georgia"/>
               </w:rPr>
             </w:r>
@@ -20339,7 +20261,6 @@
       </w:tr>
       <w:tr>
         <w:trPr>
-          <w:cantSplit w:val="1"/>
           <w:tblHeader w:val="0"/>
         </w:trPr>
         <w:tc>
@@ -20355,8 +20276,8 @@
             <w:r>
               <w:rPr>
                 <w:rFonts w:ascii="Georgia" w:cs="Georgia" w:eastAsia="Georgia" w:hAnsi="Georgia"/>
-                <w:sz w:val="18"/>
-                <w:szCs w:val="18"/>
+                <w:sz w:val="20"/>
+                <w:szCs w:val="20"/>
                 <w:shd w:fill="bfbfbf" w:val="clear"/>
                 <w:rtl w:val="0"/>
               </w:rPr>
@@ -20365,8 +20286,8 @@
             <w:r>
               <w:rPr>
                 <w:rtl w:val="0"/>
-                <w:sz w:val="18"/>
-                <w:szCs w:val="18"/>
+                <w:sz w:val="20"/>
+                <w:szCs w:val="20"/>
                 <w:rFonts w:ascii="Georgia" w:hAnsi="Georgia"/>
               </w:rPr>
             </w:r>
@@ -20383,8 +20304,8 @@
             <w:r>
               <w:rPr>
                 <w:rFonts w:ascii="Georgia" w:cs="Georgia" w:eastAsia="Georgia" w:hAnsi="Georgia"/>
-                <w:sz w:val="18"/>
-                <w:szCs w:val="18"/>
+                <w:sz w:val="20"/>
+                <w:szCs w:val="20"/>
                 <w:rtl w:val="0"/>
               </w:rPr>
               <w:t xml:space="preserve">Result Claim [R]</w:t>
@@ -20392,8 +20313,8 @@
             <w:r>
               <w:rPr>
                 <w:rtl w:val="0"/>
-                <w:sz w:val="18"/>
-                <w:szCs w:val="18"/>
+                <w:sz w:val="20"/>
+                <w:szCs w:val="20"/>
                 <w:rFonts w:ascii="Georgia" w:hAnsi="Georgia"/>
               </w:rPr>
             </w:r>
@@ -20410,8 +20331,8 @@
             <w:r>
               <w:rPr>
                 <w:rFonts w:ascii="Georgia" w:cs="Georgia" w:eastAsia="Georgia" w:hAnsi="Georgia"/>
-                <w:sz w:val="18"/>
-                <w:szCs w:val="18"/>
+                <w:sz w:val="20"/>
+                <w:szCs w:val="20"/>
                 <w:rtl w:val="0"/>
               </w:rPr>
               <w:t xml:space="preserve">A finding stated as settled fact.</w:t>
@@ -20419,8 +20340,8 @@
             <w:r>
               <w:rPr>
                 <w:rtl w:val="0"/>
-                <w:sz w:val="18"/>
-                <w:szCs w:val="18"/>
+                <w:sz w:val="20"/>
+                <w:szCs w:val="20"/>
                 <w:rFonts w:ascii="Georgia" w:hAnsi="Georgia"/>
               </w:rPr>
             </w:r>
@@ -20442,8 +20363,8 @@
                 <w:i w:val="0"/>
                 <w:iCs w:val="0"/>
                 <w:color w:val="000000"/>
-                <w:sz w:val="18"/>
-                <w:szCs w:val="18"/>
+                <w:sz w:val="20"/>
+                <w:szCs w:val="20"/>
                 <w:rtl w:val="0"/>
               </w:rPr>
               <w:t xml:space="preserve">“</w:t>
@@ -20455,8 +20376,8 @@
                 <w:bCs w:val="1"/>
                 <w:strike w:val="0"/>
                 <w:color w:val="000000"/>
-                <w:sz w:val="18"/>
-                <w:szCs w:val="18"/>
+                <w:sz w:val="20"/>
+                <w:szCs w:val="20"/>
                 <w:shd w:fill="bfbfbf" w:val="clear"/>
                 <w:rtl w:val="0"/>
               </w:rPr>
@@ -20470,8 +20391,8 @@
                 <w:i w:val="0"/>
                 <w:iCs w:val="0"/>
                 <w:color w:val="000000"/>
-                <w:sz w:val="18"/>
-                <w:szCs w:val="18"/>
+                <w:sz w:val="20"/>
+                <w:szCs w:val="20"/>
                 <w:rtl w:val="0"/>
               </w:rPr>
               <w:t xml:space="preserve"> that all shrimp farms were free of the disease.”</w:t>
@@ -20479,8 +20400,8 @@
             <w:r>
               <w:rPr>
                 <w:rtl w:val="0"/>
-                <w:sz w:val="18"/>
-                <w:szCs w:val="18"/>
+                <w:sz w:val="20"/>
+                <w:szCs w:val="20"/>
                 <w:rFonts w:ascii="Georgia" w:hAnsi="Georgia"/>
               </w:rPr>
             </w:r>
@@ -20489,7 +20410,6 @@
       </w:tr>
       <w:tr>
         <w:trPr>
-          <w:cantSplit w:val="1"/>
           <w:tblHeader w:val="0"/>
         </w:trPr>
         <w:tc>
@@ -20505,8 +20425,8 @@
             <w:r>
               <w:rPr>
                 <w:rFonts w:ascii="Georgia" w:cs="Georgia" w:eastAsia="Georgia" w:hAnsi="Georgia"/>
-                <w:sz w:val="18"/>
-                <w:szCs w:val="18"/>
+                <w:sz w:val="20"/>
+                <w:szCs w:val="20"/>
                 <w:shd w:fill="bfbfbf" w:val="clear"/>
                 <w:rtl w:val="0"/>
               </w:rPr>
@@ -20515,8 +20435,8 @@
             <w:r>
               <w:rPr>
                 <w:rtl w:val="0"/>
-                <w:sz w:val="18"/>
-                <w:szCs w:val="18"/>
+                <w:sz w:val="20"/>
+                <w:szCs w:val="20"/>
                 <w:rFonts w:ascii="Georgia" w:hAnsi="Georgia"/>
               </w:rPr>
             </w:r>
@@ -20533,8 +20453,8 @@
             <w:r>
               <w:rPr>
                 <w:rFonts w:ascii="Georgia" w:cs="Georgia" w:eastAsia="Georgia" w:hAnsi="Georgia"/>
-                <w:sz w:val="18"/>
-                <w:szCs w:val="18"/>
+                <w:sz w:val="20"/>
+                <w:szCs w:val="20"/>
                 <w:rtl w:val="0"/>
               </w:rPr>
               <w:t xml:space="preserve">Generalization [G]</w:t>
@@ -20542,8 +20462,8 @@
             <w:r>
               <w:rPr>
                 <w:rtl w:val="0"/>
-                <w:sz w:val="18"/>
-                <w:szCs w:val="18"/>
+                <w:sz w:val="20"/>
+                <w:szCs w:val="20"/>
                 <w:rFonts w:ascii="Georgia" w:hAnsi="Georgia"/>
               </w:rPr>
             </w:r>
@@ -20560,8 +20480,8 @@
             <w:r>
               <w:rPr>
                 <w:rFonts w:ascii="Georgia" w:cs="Georgia" w:eastAsia="Georgia" w:hAnsi="Georgia"/>
-                <w:sz w:val="18"/>
-                <w:szCs w:val="18"/>
+                <w:sz w:val="20"/>
+                <w:szCs w:val="20"/>
                 <w:rtl w:val="0"/>
               </w:rPr>
               <w:t xml:space="preserve">A broader inference beyond the data.</w:t>
@@ -20569,8 +20489,8 @@
             <w:r>
               <w:rPr>
                 <w:rtl w:val="0"/>
-                <w:sz w:val="18"/>
-                <w:szCs w:val="18"/>
+                <w:sz w:val="20"/>
+                <w:szCs w:val="20"/>
                 <w:rFonts w:ascii="Georgia" w:hAnsi="Georgia"/>
               </w:rPr>
             </w:r>
@@ -20592,8 +20512,8 @@
                 <w:i w:val="0"/>
                 <w:iCs w:val="0"/>
                 <w:color w:val="000000"/>
-                <w:sz w:val="18"/>
-                <w:szCs w:val="18"/>
+                <w:sz w:val="20"/>
+                <w:szCs w:val="20"/>
                 <w:rtl w:val="0"/>
               </w:rPr>
               <w:t xml:space="preserve">“This led to the </w:t>
@@ -20605,8 +20525,8 @@
                 <w:bCs w:val="1"/>
                 <w:strike w:val="0"/>
                 <w:color w:val="000000"/>
-                <w:sz w:val="18"/>
-                <w:szCs w:val="18"/>
+                <w:sz w:val="20"/>
+                <w:szCs w:val="20"/>
                 <w:shd w:fill="bfbfbf" w:val="clear"/>
                 <w:rtl w:val="0"/>
               </w:rPr>
@@ -20620,8 +20540,8 @@
                 <w:i w:val="0"/>
                 <w:iCs w:val="0"/>
                 <w:color w:val="000000"/>
-                <w:sz w:val="18"/>
-                <w:szCs w:val="18"/>
+                <w:sz w:val="20"/>
+                <w:szCs w:val="20"/>
                 <w:rtl w:val="0"/>
               </w:rPr>
               <w:t xml:space="preserve"> all farms were free of it.”</w:t>
@@ -20629,8 +20549,8 @@
             <w:r>
               <w:rPr>
                 <w:rtl w:val="0"/>
-                <w:sz w:val="18"/>
-                <w:szCs w:val="18"/>
+                <w:sz w:val="20"/>
+                <w:szCs w:val="20"/>
                 <w:rFonts w:ascii="Georgia" w:hAnsi="Georgia"/>
               </w:rPr>
             </w:r>
@@ -20639,7 +20559,6 @@
       </w:tr>
       <w:tr>
         <w:trPr>
-          <w:cantSplit w:val="1"/>
           <w:tblHeader w:val="0"/>
         </w:trPr>
         <w:tc>
@@ -20655,8 +20574,8 @@
             <w:r>
               <w:rPr>
                 <w:rFonts w:ascii="Georgia" w:cs="Georgia" w:eastAsia="Georgia" w:hAnsi="Georgia"/>
-                <w:sz w:val="18"/>
-                <w:szCs w:val="18"/>
+                <w:sz w:val="20"/>
+                <w:szCs w:val="20"/>
                 <w:shd w:fill="bfbfbf" w:val="clear"/>
                 <w:rtl w:val="0"/>
               </w:rPr>
@@ -20665,8 +20584,8 @@
             <w:r>
               <w:rPr>
                 <w:rtl w:val="0"/>
-                <w:sz w:val="18"/>
-                <w:szCs w:val="18"/>
+                <w:sz w:val="20"/>
+                <w:szCs w:val="20"/>
                 <w:rFonts w:ascii="Georgia" w:hAnsi="Georgia"/>
               </w:rPr>
             </w:r>
@@ -20683,8 +20602,8 @@
             <w:r>
               <w:rPr>
                 <w:rFonts w:ascii="Georgia" w:cs="Georgia" w:eastAsia="Georgia" w:hAnsi="Georgia"/>
-                <w:sz w:val="18"/>
-                <w:szCs w:val="18"/>
+                <w:sz w:val="20"/>
+                <w:szCs w:val="20"/>
                 <w:rtl w:val="0"/>
               </w:rPr>
               <w:t xml:space="preserve">Causal Claim [C]</w:t>
@@ -20692,8 +20611,8 @@
             <w:r>
               <w:rPr>
                 <w:rtl w:val="0"/>
-                <w:sz w:val="18"/>
-                <w:szCs w:val="18"/>
+                <w:sz w:val="20"/>
+                <w:szCs w:val="20"/>
                 <w:rFonts w:ascii="Georgia" w:hAnsi="Georgia"/>
               </w:rPr>
             </w:r>
@@ -20710,8 +20629,8 @@
             <w:r>
               <w:rPr>
                 <w:rFonts w:ascii="Georgia" w:cs="Georgia" w:eastAsia="Georgia" w:hAnsi="Georgia"/>
-                <w:sz w:val="18"/>
-                <w:szCs w:val="18"/>
+                <w:sz w:val="20"/>
+                <w:szCs w:val="20"/>
                 <w:rtl w:val="0"/>
               </w:rPr>
               <w:t xml:space="preserve">A cause and effect link stated as established.</w:t>
@@ -20719,8 +20638,8 @@
             <w:r>
               <w:rPr>
                 <w:rtl w:val="0"/>
-                <w:sz w:val="18"/>
-                <w:szCs w:val="18"/>
+                <w:sz w:val="20"/>
+                <w:szCs w:val="20"/>
                 <w:rFonts w:ascii="Georgia" w:hAnsi="Georgia"/>
               </w:rPr>
             </w:r>
@@ -20742,8 +20661,8 @@
                 <w:i w:val="0"/>
                 <w:iCs w:val="0"/>
                 <w:color w:val="000000"/>
-                <w:sz w:val="18"/>
-                <w:szCs w:val="18"/>
+                <w:sz w:val="20"/>
+                <w:szCs w:val="20"/>
                 <w:rtl w:val="0"/>
               </w:rPr>
               <w:t xml:space="preserve">“Extracts </w:t>
@@ -20755,8 +20674,8 @@
                 <w:bCs w:val="1"/>
                 <w:strike w:val="0"/>
                 <w:color w:val="000000"/>
-                <w:sz w:val="18"/>
-                <w:szCs w:val="18"/>
+                <w:sz w:val="20"/>
+                <w:szCs w:val="20"/>
                 <w:shd w:fill="bfbfbf" w:val="clear"/>
                 <w:rtl w:val="0"/>
               </w:rPr>
@@ -20770,8 +20689,8 @@
                 <w:i w:val="0"/>
                 <w:iCs w:val="0"/>
                 <w:color w:val="000000"/>
-                <w:sz w:val="18"/>
-                <w:szCs w:val="18"/>
+                <w:sz w:val="20"/>
+                <w:szCs w:val="20"/>
                 <w:rtl w:val="0"/>
               </w:rPr>
               <w:t xml:space="preserve"> comparable staining because they contain similar compounds.”</w:t>
@@ -20779,8 +20698,8 @@
             <w:r>
               <w:rPr>
                 <w:rtl w:val="0"/>
-                <w:sz w:val="18"/>
-                <w:szCs w:val="18"/>
+                <w:sz w:val="20"/>
+                <w:szCs w:val="20"/>
                 <w:rFonts w:ascii="Georgia" w:hAnsi="Georgia"/>
               </w:rPr>
             </w:r>
@@ -20791,7 +20710,6 @@
     <w:p>
       <w:pPr>
         <w:keepNext w:val="1"/>
-        <w:keepLines w:val="1"/>
         <w:spacing w:before="240" w:after="0" w:line="480" w:lineRule="auto"/>
         <w:jc w:val="left"/>
         <w:rPr/>
@@ -21617,7 +21535,6 @@
     <w:p>
       <w:pPr>
         <w:keepNext w:val="1"/>
-        <w:keepLines w:val="1"/>
         <w:spacing w:before="240" w:after="0" w:line="480" w:lineRule="auto"/>
         <w:jc w:val="left"/>
         <w:rPr/>
@@ -21693,7 +21610,6 @@
     <w:p>
       <w:pPr>
         <w:keepNext w:val="1"/>
-        <w:keepLines w:val="1"/>
         <w:spacing w:before="240" w:after="0" w:line="480" w:lineRule="auto"/>
         <w:jc w:val="both"/>
         <w:rPr/>
@@ -21912,7 +21828,6 @@
     <w:p>
       <w:pPr>
         <w:keepNext w:val="1"/>
-        <w:keepLines w:val="1"/>
         <w:spacing w:before="240" w:after="0" w:line="480" w:lineRule="auto"/>
         <w:jc w:val="both"/>
         <w:rPr/>
@@ -22131,7 +22046,6 @@
     <w:p>
       <w:pPr>
         <w:keepNext w:val="1"/>
-        <w:keepLines w:val="1"/>
         <w:spacing w:before="240" w:after="0" w:line="480" w:lineRule="auto"/>
         <w:jc w:val="both"/>
         <w:rPr/>
@@ -22226,7 +22140,6 @@
     <w:p>
       <w:pPr>
         <w:keepNext w:val="1"/>
-        <w:keepLines w:val="1"/>
         <w:spacing w:before="240" w:after="0" w:line="480" w:lineRule="auto"/>
         <w:jc w:val="both"/>
         <w:rPr/>
@@ -22528,7 +22441,6 @@
     <w:p>
       <w:pPr>
         <w:keepNext w:val="1"/>
-        <w:keepLines w:val="1"/>
         <w:spacing w:before="240" w:after="0" w:line="480" w:lineRule="auto"/>
         <w:jc w:val="both"/>
         <w:rPr/>
@@ -22705,7 +22617,6 @@
     <w:p>
       <w:pPr>
         <w:keepNext w:val="1"/>
-        <w:keepLines w:val="1"/>
         <w:spacing w:before="240" w:after="0" w:line="480" w:lineRule="auto"/>
         <w:jc w:val="both"/>
         <w:rPr/>
@@ -22964,7 +22875,6 @@
     <w:p>
       <w:pPr>
         <w:keepNext w:val="1"/>
-        <w:keepLines w:val="1"/>
         <w:spacing w:before="240" w:after="0" w:line="480" w:lineRule="auto"/>
         <w:jc w:val="both"/>
         <w:rPr/>
@@ -23261,7 +23171,6 @@
     <w:p>
       <w:pPr>
         <w:keepNext w:val="1"/>
-        <w:keepLines w:val="1"/>
         <w:spacing w:before="240" w:after="0" w:line="480" w:lineRule="auto"/>
         <w:jc w:val="both"/>
         <w:rPr/>
@@ -23439,7 +23348,6 @@
     <w:p>
       <w:pPr>
         <w:keepNext w:val="1"/>
-        <w:keepLines w:val="1"/>
         <w:spacing w:before="240" w:after="0" w:line="480" w:lineRule="auto"/>
         <w:jc w:val="both"/>
         <w:rPr/>
@@ -23617,7 +23525,6 @@
     <w:p>
       <w:pPr>
         <w:keepNext w:val="1"/>
-        <w:keepLines w:val="1"/>
         <w:spacing w:before="240" w:after="0" w:line="480" w:lineRule="auto"/>
         <w:jc w:val="both"/>
         <w:rPr/>
@@ -23811,7 +23718,6 @@
     <w:p>
       <w:pPr>
         <w:keepNext w:val="1"/>
-        <w:keepLines w:val="1"/>
         <w:spacing w:before="240" w:after="0" w:line="480" w:lineRule="auto"/>
         <w:jc w:val="both"/>
         <w:rPr/>
@@ -24058,7 +23964,6 @@
     <w:p>
       <w:pPr>
         <w:keepNext w:val="1"/>
-        <w:keepLines w:val="1"/>
         <w:spacing w:before="240" w:after="0" w:line="480" w:lineRule="auto"/>
         <w:jc w:val="both"/>
         <w:rPr/>
@@ -24264,7 +24169,6 @@
     <w:p>
       <w:pPr>
         <w:keepNext w:val="1"/>
-        <w:keepLines w:val="1"/>
         <w:spacing w:before="240" w:after="0" w:line="480" w:lineRule="auto"/>
         <w:jc w:val="both"/>
         <w:rPr/>
@@ -24358,7 +24262,6 @@
     <w:p>
       <w:pPr>
         <w:keepNext w:val="1"/>
-        <w:keepLines w:val="1"/>
         <w:spacing w:before="240" w:after="0" w:line="480" w:lineRule="auto"/>
         <w:jc w:val="both"/>
         <w:rPr/>
@@ -24660,7 +24563,6 @@
     <w:p>
       <w:pPr>
         <w:keepNext w:val="1"/>
-        <w:keepLines w:val="1"/>
         <w:spacing w:before="240" w:after="0" w:line="480" w:lineRule="auto"/>
         <w:jc w:val="both"/>
         <w:rPr/>
@@ -24754,7 +24656,6 @@
     <w:p>
       <w:pPr>
         <w:keepNext w:val="1"/>
-        <w:keepLines w:val="1"/>
         <w:spacing w:before="240" w:after="0" w:line="480" w:lineRule="auto"/>
         <w:jc w:val="both"/>
         <w:rPr/>
@@ -25106,7 +25007,6 @@
     <w:p>
       <w:pPr>
         <w:keepNext w:val="1"/>
-        <w:keepLines w:val="1"/>
         <w:spacing w:before="240" w:after="0" w:line="480" w:lineRule="auto"/>
         <w:jc w:val="both"/>
         <w:rPr/>
@@ -25407,7 +25307,6 @@
     <w:p>
       <w:pPr>
         <w:keepNext w:val="1"/>
-        <w:keepLines w:val="1"/>
         <w:spacing w:before="240" w:after="0" w:line="480" w:lineRule="auto"/>
         <w:jc w:val="both"/>
         <w:rPr/>
@@ -25502,7 +25401,6 @@
     <w:p>
       <w:pPr>
         <w:keepNext w:val="1"/>
-        <w:keepLines w:val="1"/>
         <w:spacing w:before="240" w:after="0" w:line="480" w:lineRule="auto"/>
         <w:jc w:val="both"/>
         <w:rPr/>
@@ -25735,7 +25633,6 @@
     <w:p>
       <w:pPr>
         <w:keepNext w:val="1"/>
-        <w:keepLines w:val="1"/>
         <w:spacing w:before="240" w:after="0" w:line="480" w:lineRule="auto"/>
         <w:jc w:val="both"/>
         <w:rPr/>
@@ -26034,7 +25931,6 @@
     <w:p>
       <w:pPr>
         <w:keepNext w:val="1"/>
-        <w:keepLines w:val="1"/>
         <w:spacing w:before="240" w:after="0" w:line="480" w:lineRule="auto"/>
         <w:jc w:val="both"/>
         <w:rPr/>
@@ -26171,7 +26067,6 @@
     <w:p>
       <w:pPr>
         <w:keepNext w:val="1"/>
-        <w:keepLines w:val="1"/>
         <w:spacing w:before="240" w:after="0" w:line="480" w:lineRule="auto"/>
         <w:jc w:val="both"/>
         <w:rPr/>
@@ -26350,7 +26245,6 @@
     <w:p>
       <w:pPr>
         <w:keepNext w:val="1"/>
-        <w:keepLines w:val="1"/>
         <w:spacing w:before="240" w:after="0" w:line="480" w:lineRule="auto"/>
         <w:jc w:val="both"/>
         <w:rPr/>
@@ -26486,7 +26380,6 @@
     <w:p>
       <w:pPr>
         <w:keepNext w:val="1"/>
-        <w:keepLines w:val="1"/>
         <w:spacing w:before="240" w:after="0" w:line="480" w:lineRule="auto"/>
         <w:jc w:val="both"/>
         <w:rPr/>
@@ -26622,7 +26515,6 @@
     <w:p>
       <w:pPr>
         <w:keepNext w:val="1"/>
-        <w:keepLines w:val="1"/>
         <w:spacing w:before="240" w:after="0" w:line="480" w:lineRule="auto"/>
         <w:jc w:val="both"/>
         <w:rPr/>
@@ -26758,7 +26650,6 @@
     <w:p>
       <w:pPr>
         <w:keepNext w:val="1"/>
-        <w:keepLines w:val="1"/>
         <w:spacing w:before="240" w:after="0" w:line="480" w:lineRule="auto"/>
         <w:jc w:val="both"/>
         <w:rPr/>
@@ -26853,7 +26744,6 @@
     <w:p>
       <w:pPr>
         <w:keepNext w:val="1"/>
-        <w:keepLines w:val="1"/>
         <w:spacing w:before="240" w:after="0" w:line="480" w:lineRule="auto"/>
         <w:jc w:val="both"/>
         <w:rPr/>
@@ -27058,7 +26948,6 @@
     <w:p>
       <w:pPr>
         <w:keepNext w:val="1"/>
-        <w:keepLines w:val="1"/>
         <w:spacing w:before="240" w:after="0" w:line="480" w:lineRule="auto"/>
         <w:jc w:val="both"/>
         <w:rPr/>
@@ -27153,7 +27042,6 @@
     <w:p>
       <w:pPr>
         <w:keepNext w:val="1"/>
-        <w:keepLines w:val="1"/>
         <w:spacing w:before="240" w:after="0" w:line="480" w:lineRule="auto"/>
         <w:jc w:val="both"/>
         <w:rPr/>
@@ -27358,7 +27246,6 @@
     <w:p>
       <w:pPr>
         <w:keepNext w:val="1"/>
-        <w:keepLines w:val="1"/>
         <w:spacing w:before="240" w:after="0" w:line="480" w:lineRule="auto"/>
         <w:jc w:val="both"/>
         <w:rPr/>
@@ -27495,7 +27382,6 @@
     <w:p>
       <w:pPr>
         <w:keepNext w:val="1"/>
-        <w:keepLines w:val="1"/>
         <w:spacing w:before="240" w:after="0" w:line="480" w:lineRule="auto"/>
         <w:jc w:val="both"/>
         <w:rPr/>
@@ -27589,7 +27475,6 @@
     <w:p>
       <w:pPr>
         <w:keepNext w:val="1"/>
-        <w:keepLines w:val="1"/>
         <w:spacing w:before="240" w:after="0" w:line="480" w:lineRule="auto"/>
         <w:jc w:val="both"/>
         <w:rPr/>
@@ -27753,7 +27638,6 @@
     <w:p>
       <w:pPr>
         <w:keepNext w:val="1"/>
-        <w:keepLines w:val="1"/>
         <w:spacing w:before="240" w:after="0" w:line="480" w:lineRule="auto"/>
         <w:jc w:val="both"/>
         <w:rPr/>
@@ -27845,7 +27729,6 @@
     <w:p>
       <w:pPr>
         <w:keepNext w:val="1"/>
-        <w:keepLines w:val="1"/>
         <w:spacing w:before="240" w:after="0" w:line="480" w:lineRule="auto"/>
         <w:jc w:val="both"/>
         <w:rPr/>
@@ -27936,7 +27819,6 @@
     <w:p>
       <w:pPr>
         <w:keepNext w:val="1"/>
-        <w:keepLines w:val="1"/>
         <w:spacing w:before="240" w:after="0" w:line="480" w:lineRule="auto"/>
         <w:jc w:val="both"/>
         <w:rPr/>
@@ -28072,7 +27954,6 @@
     <w:p>
       <w:pPr>
         <w:keepNext w:val="1"/>
-        <w:keepLines w:val="1"/>
         <w:spacing w:before="240" w:after="0" w:line="480" w:lineRule="auto"/>
         <w:jc w:val="both"/>
         <w:rPr/>
@@ -28209,7 +28090,6 @@
     <w:p>
       <w:pPr>
         <w:keepNext w:val="1"/>
-        <w:keepLines w:val="1"/>
         <w:spacing w:before="240" w:after="0" w:line="480" w:lineRule="auto"/>
         <w:jc w:val="both"/>
         <w:rPr/>
@@ -28301,7 +28181,6 @@
     <w:p>
       <w:pPr>
         <w:keepNext w:val="1"/>
-        <w:keepLines w:val="1"/>
         <w:spacing w:before="240" w:after="0" w:line="480" w:lineRule="auto"/>
         <w:jc w:val="both"/>
         <w:rPr/>
@@ -28479,7 +28358,6 @@
     <w:p>
       <w:pPr>
         <w:keepNext w:val="1"/>
-        <w:keepLines w:val="1"/>
         <w:spacing w:before="240" w:after="0" w:line="480" w:lineRule="auto"/>
         <w:jc w:val="both"/>
         <w:rPr/>
@@ -28532,7 +28410,6 @@
     <w:p>
       <w:pPr>
         <w:keepNext w:val="1"/>
-        <w:keepLines w:val="1"/>
         <w:spacing w:before="240" w:after="0" w:line="480" w:lineRule="auto"/>
         <w:jc w:val="both"/>
         <w:rPr/>
@@ -28735,7 +28612,6 @@
     <w:p>
       <w:pPr>
         <w:keepNext w:val="1"/>
-        <w:keepLines w:val="1"/>
         <w:spacing w:before="240" w:after="0" w:line="480" w:lineRule="auto"/>
         <w:jc w:val="both"/>
         <w:rPr/>
@@ -28871,7 +28747,6 @@
     <w:p>
       <w:pPr>
         <w:keepNext w:val="1"/>
-        <w:keepLines w:val="1"/>
         <w:spacing w:before="240" w:after="0" w:line="480" w:lineRule="auto"/>
         <w:jc w:val="both"/>
         <w:rPr/>
@@ -29301,7 +29176,6 @@
     <w:p>
       <w:pPr>
         <w:keepNext w:val="1"/>
-        <w:keepLines w:val="1"/>
         <w:spacing w:before="240" w:after="0" w:line="480" w:lineRule="auto"/>
         <w:jc w:val="both"/>
         <w:rPr/>
@@ -29507,7 +29381,6 @@
     <w:p>
       <w:pPr>
         <w:keepNext w:val="1"/>
-        <w:keepLines w:val="1"/>
         <w:spacing w:before="240" w:after="0" w:line="480" w:lineRule="auto"/>
         <w:jc w:val="both"/>
         <w:rPr/>
@@ -29629,7 +29502,6 @@
     <w:p>
       <w:pPr>
         <w:keepNext w:val="1"/>
-        <w:keepLines w:val="1"/>
         <w:spacing w:before="240" w:after="0" w:line="480" w:lineRule="auto"/>
         <w:jc w:val="both"/>
         <w:rPr/>
@@ -29766,7 +29638,6 @@
     <w:p>
       <w:pPr>
         <w:keepNext w:val="1"/>
-        <w:keepLines w:val="1"/>
         <w:spacing w:before="240" w:after="0" w:line="480" w:lineRule="auto"/>
         <w:jc w:val="both"/>
         <w:rPr/>
@@ -29922,7 +29793,6 @@
     <w:p>
       <w:pPr>
         <w:keepNext w:val="1"/>
-        <w:keepLines w:val="1"/>
         <w:spacing w:before="240" w:after="0" w:line="480" w:lineRule="auto"/>
         <w:jc w:val="both"/>
         <w:rPr/>
@@ -30017,7 +29887,6 @@
     <w:p>
       <w:pPr>
         <w:keepNext w:val="1"/>
-        <w:keepLines w:val="1"/>
         <w:spacing w:before="240" w:after="0" w:line="480" w:lineRule="auto"/>
         <w:jc w:val="both"/>
         <w:rPr/>
@@ -30195,7 +30064,6 @@
     <w:p>
       <w:pPr>
         <w:keepNext w:val="1"/>
-        <w:keepLines w:val="1"/>
         <w:spacing w:before="240" w:after="0" w:line="480" w:lineRule="auto"/>
         <w:jc w:val="both"/>
         <w:rPr/>
@@ -30332,7 +30200,6 @@
     <w:p>
       <w:pPr>
         <w:keepNext w:val="1"/>
-        <w:keepLines w:val="1"/>
         <w:spacing w:before="240" w:after="0" w:line="480" w:lineRule="auto"/>
         <w:jc w:val="both"/>
         <w:rPr/>
@@ -30522,7 +30389,6 @@
     <w:p>
       <w:pPr>
         <w:keepNext w:val="1"/>
-        <w:keepLines w:val="1"/>
         <w:spacing w:before="240" w:after="0" w:line="480" w:lineRule="auto"/>
         <w:jc w:val="both"/>
         <w:rPr/>
@@ -30659,7 +30525,6 @@
     <w:p>
       <w:pPr>
         <w:keepNext w:val="1"/>
-        <w:keepLines w:val="1"/>
         <w:spacing w:before="240" w:after="0" w:line="480" w:lineRule="auto"/>
         <w:jc w:val="both"/>
         <w:rPr/>
@@ -30796,7 +30661,6 @@
     <w:p>
       <w:pPr>
         <w:keepNext w:val="1"/>
-        <w:keepLines w:val="1"/>
         <w:spacing w:before="240" w:after="0" w:line="480" w:lineRule="auto"/>
         <w:jc w:val="both"/>
         <w:rPr/>
@@ -31002,7 +30866,6 @@
     <w:p>
       <w:pPr>
         <w:keepNext w:val="1"/>
-        <w:keepLines w:val="1"/>
         <w:spacing w:before="240" w:after="0" w:line="480" w:lineRule="auto"/>
         <w:jc w:val="both"/>
         <w:rPr/>
@@ -31097,7 +30960,6 @@
     <w:p>
       <w:pPr>
         <w:keepNext w:val="1"/>
-        <w:keepLines w:val="1"/>
         <w:spacing w:before="240" w:after="0" w:line="480" w:lineRule="auto"/>
         <w:jc w:val="both"/>
         <w:rPr/>
@@ -31274,7 +31136,6 @@
     <w:p>
       <w:pPr>
         <w:keepNext w:val="1"/>
-        <w:keepLines w:val="1"/>
         <w:spacing w:before="240" w:after="0" w:line="480" w:lineRule="auto"/>
         <w:jc w:val="both"/>
         <w:rPr/>
@@ -31411,7 +31272,6 @@
     <w:p>
       <w:pPr>
         <w:keepNext w:val="1"/>
-        <w:keepLines w:val="1"/>
         <w:spacing w:before="240" w:after="0" w:line="480" w:lineRule="auto"/>
         <w:jc w:val="both"/>
         <w:rPr/>
@@ -31618,7 +31478,6 @@
     <w:p>
       <w:pPr>
         <w:keepNext w:val="1"/>
-        <w:keepLines w:val="1"/>
         <w:spacing w:before="240" w:after="0" w:line="480" w:lineRule="auto"/>
         <w:jc w:val="both"/>
         <w:rPr/>
@@ -31794,7 +31653,6 @@
     <w:p>
       <w:pPr>
         <w:keepNext w:val="1"/>
-        <w:keepLines w:val="1"/>
         <w:spacing w:before="240" w:after="0" w:line="480" w:lineRule="auto"/>
         <w:jc w:val="both"/>
         <w:rPr/>
@@ -32000,7 +31858,6 @@
     <w:p>
       <w:pPr>
         <w:keepNext w:val="1"/>
-        <w:keepLines w:val="1"/>
         <w:spacing w:before="240" w:after="0" w:line="480" w:lineRule="auto"/>
         <w:jc w:val="both"/>
         <w:rPr/>

</xml_diff>

<commit_message>
Draft_053: densify Marking False Positives table to one page
</commit_message>
<xml_diff>
--- a/thesis/003_ThesisProposal_Draft_053.docx
+++ b/thesis/003_ThesisProposal_Draft_053.docx
@@ -19276,8 +19276,8 @@
                 <w:rFonts w:ascii="Georgia" w:cs="Georgia" w:eastAsia="Georgia" w:hAnsi="Georgia"/>
                 <w:b w:val="1"/>
                 <w:bCs w:val="1"/>
-                <w:sz w:val="20"/>
-                <w:szCs w:val="20"/>
+                <w:sz w:val="18"/>
+                <w:szCs w:val="18"/>
                 <w:rtl w:val="0"/>
               </w:rPr>
               <w:t xml:space="preserve">Code</w:t>
@@ -19285,8 +19285,8 @@
             <w:r>
               <w:rPr>
                 <w:rtl w:val="0"/>
-                <w:sz w:val="20"/>
-                <w:szCs w:val="20"/>
+                <w:sz w:val="18"/>
+                <w:szCs w:val="18"/>
                 <w:rFonts w:ascii="Georgia" w:hAnsi="Georgia"/>
               </w:rPr>
             </w:r>
@@ -19310,8 +19310,8 @@
                 <w:rFonts w:ascii="Georgia" w:cs="Georgia" w:eastAsia="Georgia" w:hAnsi="Georgia"/>
                 <w:b w:val="1"/>
                 <w:bCs w:val="1"/>
-                <w:sz w:val="20"/>
-                <w:szCs w:val="20"/>
+                <w:sz w:val="18"/>
+                <w:szCs w:val="18"/>
                 <w:rtl w:val="0"/>
               </w:rPr>
               <w:t xml:space="preserve">Reason</w:t>
@@ -19319,8 +19319,8 @@
             <w:r>
               <w:rPr>
                 <w:rtl w:val="0"/>
-                <w:sz w:val="20"/>
-                <w:szCs w:val="20"/>
+                <w:sz w:val="18"/>
+                <w:szCs w:val="18"/>
                 <w:rFonts w:ascii="Georgia" w:hAnsi="Georgia"/>
               </w:rPr>
             </w:r>
@@ -19344,8 +19344,8 @@
                 <w:rFonts w:ascii="Georgia" w:cs="Georgia" w:eastAsia="Georgia" w:hAnsi="Georgia"/>
                 <w:b w:val="1"/>
                 <w:bCs w:val="1"/>
-                <w:sz w:val="20"/>
-                <w:szCs w:val="20"/>
+                <w:sz w:val="18"/>
+                <w:szCs w:val="18"/>
                 <w:rtl w:val="0"/>
               </w:rPr>
               <w:t xml:space="preserve">Marked Example</w:t>
@@ -19353,8 +19353,8 @@
             <w:r>
               <w:rPr>
                 <w:rtl w:val="0"/>
-                <w:sz w:val="20"/>
-                <w:szCs w:val="20"/>
+                <w:sz w:val="18"/>
+                <w:szCs w:val="18"/>
                 <w:rFonts w:ascii="Georgia" w:hAnsi="Georgia"/>
               </w:rPr>
             </w:r>
@@ -19381,8 +19381,8 @@
                 <w:i w:val="0"/>
                 <w:iCs w:val="0"/>
                 <w:color w:val="808080"/>
-                <w:sz w:val="20"/>
-                <w:szCs w:val="20"/>
+                <w:sz w:val="18"/>
+                <w:szCs w:val="18"/>
                 <w:rtl w:val="0"/>
               </w:rPr>
               <w:t xml:space="preserve">FP-Cap</w:t>
@@ -19390,8 +19390,8 @@
             <w:r>
               <w:rPr>
                 <w:rtl w:val="0"/>
-                <w:sz w:val="20"/>
-                <w:szCs w:val="20"/>
+                <w:sz w:val="18"/>
+                <w:szCs w:val="18"/>
                 <w:rFonts w:ascii="Georgia" w:hAnsi="Georgia"/>
               </w:rPr>
             </w:r>
@@ -19408,8 +19408,8 @@
             <w:r>
               <w:rPr>
                 <w:rFonts w:ascii="Georgia" w:cs="Georgia" w:eastAsia="Georgia" w:hAnsi="Georgia"/>
-                <w:sz w:val="20"/>
-                <w:szCs w:val="20"/>
+                <w:sz w:val="18"/>
+                <w:szCs w:val="18"/>
                 <w:rtl w:val="0"/>
               </w:rPr>
               <w:t xml:space="preserve">Capability: describes what something is able to do, not uncertainty about whether it will happen. Distinct from inferential “can be concluded / derived / stated / attributed to / seen as,” which stays a hedge.</w:t>
@@ -19417,8 +19417,8 @@
             <w:r>
               <w:rPr>
                 <w:rtl w:val="0"/>
-                <w:sz w:val="20"/>
-                <w:szCs w:val="20"/>
+                <w:sz w:val="18"/>
+                <w:szCs w:val="18"/>
                 <w:rFonts w:ascii="Georgia" w:hAnsi="Georgia"/>
               </w:rPr>
             </w:r>
@@ -19440,8 +19440,8 @@
                 <w:i w:val="0"/>
                 <w:iCs w:val="0"/>
                 <w:color w:val="000000"/>
-                <w:sz w:val="20"/>
-                <w:szCs w:val="20"/>
+                <w:sz w:val="18"/>
+                <w:szCs w:val="18"/>
                 <w:rtl w:val="0"/>
               </w:rPr>
               <w:t xml:space="preserve">“PCR </w:t>
@@ -19453,8 +19453,8 @@
                 <w:bCs w:val="1"/>
                 <w:strike w:val="1"/>
                 <w:color w:val="000000"/>
-                <w:sz w:val="20"/>
-                <w:szCs w:val="20"/>
+                <w:sz w:val="18"/>
+                <w:szCs w:val="18"/>
                 <w:rtl w:val="0"/>
               </w:rPr>
               <w:t xml:space="preserve">can</w:t>
@@ -19467,8 +19467,8 @@
                 <w:i w:val="0"/>
                 <w:iCs w:val="0"/>
                 <w:color w:val="000000"/>
-                <w:sz w:val="20"/>
-                <w:szCs w:val="20"/>
+                <w:sz w:val="18"/>
+                <w:szCs w:val="18"/>
                 <w:rtl w:val="0"/>
               </w:rPr>
               <w:t xml:space="preserve"> (FP-Cap) detect low concentrations.”</w:t>
@@ -19476,8 +19476,8 @@
             <w:r>
               <w:rPr>
                 <w:rtl w:val="0"/>
-                <w:sz w:val="20"/>
-                <w:szCs w:val="20"/>
+                <w:sz w:val="18"/>
+                <w:szCs w:val="18"/>
                 <w:rFonts w:ascii="Georgia" w:hAnsi="Georgia"/>
               </w:rPr>
             </w:r>
@@ -19504,8 +19504,8 @@
                 <w:i w:val="0"/>
                 <w:iCs w:val="0"/>
                 <w:color w:val="808080"/>
-                <w:sz w:val="20"/>
-                <w:szCs w:val="20"/>
+                <w:sz w:val="18"/>
+                <w:szCs w:val="18"/>
                 <w:rtl w:val="0"/>
               </w:rPr>
               <w:t xml:space="preserve">FP-Rec</w:t>
@@ -19513,8 +19513,8 @@
             <w:r>
               <w:rPr>
                 <w:rtl w:val="0"/>
-                <w:sz w:val="20"/>
-                <w:szCs w:val="20"/>
+                <w:sz w:val="18"/>
+                <w:szCs w:val="18"/>
                 <w:rFonts w:ascii="Georgia" w:hAnsi="Georgia"/>
               </w:rPr>
             </w:r>
@@ -19531,8 +19531,8 @@
             <w:r>
               <w:rPr>
                 <w:rFonts w:ascii="Georgia" w:cs="Georgia" w:eastAsia="Georgia" w:hAnsi="Georgia"/>
-                <w:sz w:val="20"/>
-                <w:szCs w:val="20"/>
+                <w:sz w:val="18"/>
+                <w:szCs w:val="18"/>
                 <w:rtl w:val="0"/>
               </w:rPr>
               <w:t xml:space="preserve">Recommendation: expresses what should, needs to, or ought to be done, not uncertainty about a claim.</w:t>
@@ -19540,8 +19540,8 @@
             <w:r>
               <w:rPr>
                 <w:rtl w:val="0"/>
-                <w:sz w:val="20"/>
-                <w:szCs w:val="20"/>
+                <w:sz w:val="18"/>
+                <w:szCs w:val="18"/>
                 <w:rFonts w:ascii="Georgia" w:hAnsi="Georgia"/>
               </w:rPr>
             </w:r>
@@ -19563,8 +19563,8 @@
                 <w:i w:val="0"/>
                 <w:iCs w:val="0"/>
                 <w:color w:val="000000"/>
-                <w:sz w:val="20"/>
-                <w:szCs w:val="20"/>
+                <w:sz w:val="18"/>
+                <w:szCs w:val="18"/>
                 <w:rtl w:val="0"/>
               </w:rPr>
               <w:t xml:space="preserve">“We </w:t>
@@ -19576,8 +19576,8 @@
                 <w:bCs w:val="1"/>
                 <w:strike w:val="1"/>
                 <w:color w:val="000000"/>
-                <w:sz w:val="20"/>
-                <w:szCs w:val="20"/>
+                <w:sz w:val="18"/>
+                <w:szCs w:val="18"/>
                 <w:rtl w:val="0"/>
               </w:rPr>
               <w:t xml:space="preserve">suggest</w:t>
@@ -19590,8 +19590,8 @@
                 <w:i w:val="0"/>
                 <w:iCs w:val="0"/>
                 <w:color w:val="000000"/>
-                <w:sz w:val="20"/>
-                <w:szCs w:val="20"/>
+                <w:sz w:val="18"/>
+                <w:szCs w:val="18"/>
                 <w:rtl w:val="0"/>
               </w:rPr>
               <w:t xml:space="preserve"> (FP-Rec) further research.”</w:t>
@@ -19599,8 +19599,8 @@
             <w:r>
               <w:rPr>
                 <w:rtl w:val="0"/>
-                <w:sz w:val="20"/>
-                <w:szCs w:val="20"/>
+                <w:sz w:val="18"/>
+                <w:szCs w:val="18"/>
                 <w:rFonts w:ascii="Georgia" w:hAnsi="Georgia"/>
               </w:rPr>
             </w:r>
@@ -19627,8 +19627,8 @@
                 <w:i w:val="0"/>
                 <w:iCs w:val="0"/>
                 <w:color w:val="808080"/>
-                <w:sz w:val="20"/>
-                <w:szCs w:val="20"/>
+                <w:sz w:val="18"/>
+                <w:szCs w:val="18"/>
                 <w:rtl w:val="0"/>
               </w:rPr>
               <w:t xml:space="preserve">FP-Proc</w:t>
@@ -19636,8 +19636,8 @@
             <w:r>
               <w:rPr>
                 <w:rtl w:val="0"/>
-                <w:sz w:val="20"/>
-                <w:szCs w:val="20"/>
+                <w:sz w:val="18"/>
+                <w:szCs w:val="18"/>
                 <w:rFonts w:ascii="Georgia" w:hAnsi="Georgia"/>
               </w:rPr>
             </w:r>
@@ -19654,8 +19654,8 @@
             <w:r>
               <w:rPr>
                 <w:rFonts w:ascii="Georgia" w:cs="Georgia" w:eastAsia="Georgia" w:hAnsi="Georgia"/>
-                <w:sz w:val="20"/>
-                <w:szCs w:val="20"/>
+                <w:sz w:val="18"/>
+                <w:szCs w:val="18"/>
                 <w:rtl w:val="0"/>
               </w:rPr>
               <w:t xml:space="preserve">Procedural norm: describes a routine, standard, or established procedure rather than uncertainty about a claim.</w:t>
@@ -19663,8 +19663,8 @@
             <w:r>
               <w:rPr>
                 <w:rtl w:val="0"/>
-                <w:sz w:val="20"/>
-                <w:szCs w:val="20"/>
+                <w:sz w:val="18"/>
+                <w:szCs w:val="18"/>
                 <w:rFonts w:ascii="Georgia" w:hAnsi="Georgia"/>
               </w:rPr>
             </w:r>
@@ -19686,8 +19686,8 @@
                 <w:i w:val="0"/>
                 <w:iCs w:val="0"/>
                 <w:color w:val="000000"/>
-                <w:sz w:val="20"/>
-                <w:szCs w:val="20"/>
+                <w:sz w:val="18"/>
+                <w:szCs w:val="18"/>
                 <w:rtl w:val="0"/>
               </w:rPr>
               <w:t xml:space="preserve">“Samples were </w:t>
@@ -19699,8 +19699,8 @@
                 <w:bCs w:val="1"/>
                 <w:strike w:val="1"/>
                 <w:color w:val="000000"/>
-                <w:sz w:val="20"/>
-                <w:szCs w:val="20"/>
+                <w:sz w:val="18"/>
+                <w:szCs w:val="18"/>
                 <w:rtl w:val="0"/>
               </w:rPr>
               <w:t xml:space="preserve">generally</w:t>
@@ -19713,8 +19713,8 @@
                 <w:i w:val="0"/>
                 <w:iCs w:val="0"/>
                 <w:color w:val="000000"/>
-                <w:sz w:val="20"/>
-                <w:szCs w:val="20"/>
+                <w:sz w:val="18"/>
+                <w:szCs w:val="18"/>
                 <w:rtl w:val="0"/>
               </w:rPr>
               <w:t xml:space="preserve"> (FP-Proc) stored at 4°C.”</w:t>
@@ -19722,8 +19722,8 @@
             <w:r>
               <w:rPr>
                 <w:rtl w:val="0"/>
-                <w:sz w:val="20"/>
-                <w:szCs w:val="20"/>
+                <w:sz w:val="18"/>
+                <w:szCs w:val="18"/>
                 <w:rFonts w:ascii="Georgia" w:hAnsi="Georgia"/>
               </w:rPr>
             </w:r>
@@ -19750,8 +19750,8 @@
                 <w:i w:val="0"/>
                 <w:iCs w:val="0"/>
                 <w:color w:val="808080"/>
-                <w:sz w:val="20"/>
-                <w:szCs w:val="20"/>
+                <w:sz w:val="18"/>
+                <w:szCs w:val="18"/>
                 <w:rtl w:val="0"/>
               </w:rPr>
               <w:t xml:space="preserve">FP-Loc</w:t>
@@ -19759,8 +19759,8 @@
             <w:r>
               <w:rPr>
                 <w:rtl w:val="0"/>
-                <w:sz w:val="20"/>
-                <w:szCs w:val="20"/>
+                <w:sz w:val="18"/>
+                <w:szCs w:val="18"/>
                 <w:rFonts w:ascii="Georgia" w:hAnsi="Georgia"/>
               </w:rPr>
             </w:r>
@@ -19777,8 +19777,8 @@
             <w:r>
               <w:rPr>
                 <w:rFonts w:ascii="Georgia" w:cs="Georgia" w:eastAsia="Georgia" w:hAnsi="Georgia"/>
-                <w:sz w:val="20"/>
-                <w:szCs w:val="20"/>
+                <w:sz w:val="18"/>
+                <w:szCs w:val="18"/>
                 <w:rtl w:val="0"/>
               </w:rPr>
               <w:t xml:space="preserve">Location: indicates physical or textual location.</w:t>
@@ -19786,8 +19786,8 @@
             <w:r>
               <w:rPr>
                 <w:rtl w:val="0"/>
-                <w:sz w:val="20"/>
-                <w:szCs w:val="20"/>
+                <w:sz w:val="18"/>
+                <w:szCs w:val="18"/>
                 <w:rFonts w:ascii="Georgia" w:hAnsi="Georgia"/>
               </w:rPr>
             </w:r>
@@ -19809,8 +19809,8 @@
                 <w:i w:val="0"/>
                 <w:iCs w:val="0"/>
                 <w:color w:val="000000"/>
-                <w:sz w:val="20"/>
-                <w:szCs w:val="20"/>
+                <w:sz w:val="18"/>
+                <w:szCs w:val="18"/>
                 <w:rtl w:val="0"/>
               </w:rPr>
               <w:t xml:space="preserve">“The results </w:t>
@@ -19822,8 +19822,8 @@
                 <w:bCs w:val="1"/>
                 <w:strike w:val="1"/>
                 <w:color w:val="000000"/>
-                <w:sz w:val="20"/>
-                <w:szCs w:val="20"/>
+                <w:sz w:val="18"/>
+                <w:szCs w:val="18"/>
                 <w:rtl w:val="0"/>
               </w:rPr>
               <w:t xml:space="preserve">appear</w:t>
@@ -19836,8 +19836,8 @@
                 <w:i w:val="0"/>
                 <w:iCs w:val="0"/>
                 <w:color w:val="000000"/>
-                <w:sz w:val="20"/>
-                <w:szCs w:val="20"/>
+                <w:sz w:val="18"/>
+                <w:szCs w:val="18"/>
                 <w:rtl w:val="0"/>
               </w:rPr>
               <w:t xml:space="preserve"> (FP-Loc) in Table 1.”</w:t>
@@ -19845,8 +19845,8 @@
             <w:r>
               <w:rPr>
                 <w:rtl w:val="0"/>
-                <w:sz w:val="20"/>
-                <w:szCs w:val="20"/>
+                <w:sz w:val="18"/>
+                <w:szCs w:val="18"/>
                 <w:rFonts w:ascii="Georgia" w:hAnsi="Georgia"/>
               </w:rPr>
             </w:r>
@@ -19873,8 +19873,8 @@
                 <w:i w:val="0"/>
                 <w:iCs w:val="0"/>
                 <w:color w:val="808080"/>
-                <w:sz w:val="20"/>
-                <w:szCs w:val="20"/>
+                <w:sz w:val="18"/>
+                <w:szCs w:val="18"/>
                 <w:rtl w:val="0"/>
               </w:rPr>
               <w:t xml:space="preserve">FP-Gen</w:t>
@@ -19882,8 +19882,8 @@
             <w:r>
               <w:rPr>
                 <w:rtl w:val="0"/>
-                <w:sz w:val="20"/>
-                <w:szCs w:val="20"/>
+                <w:sz w:val="18"/>
+                <w:szCs w:val="18"/>
                 <w:rFonts w:ascii="Georgia" w:hAnsi="Georgia"/>
               </w:rPr>
             </w:r>
@@ -19900,8 +19900,8 @@
             <w:r>
               <w:rPr>
                 <w:rFonts w:ascii="Georgia" w:cs="Georgia" w:eastAsia="Georgia" w:hAnsi="Georgia"/>
-                <w:sz w:val="20"/>
-                <w:szCs w:val="20"/>
+                <w:sz w:val="18"/>
+                <w:szCs w:val="18"/>
                 <w:rtl w:val="0"/>
               </w:rPr>
               <w:t xml:space="preserve">General exclusion: doesn’t fit the codes above. Use for expressions that look hedge-like but don’t express uncertainty (e.g., naming a research topic, pointing to evidence). Note the specific reason in Coder Notes.</w:t>
@@ -19909,8 +19909,8 @@
             <w:r>
               <w:rPr>
                 <w:rtl w:val="0"/>
-                <w:sz w:val="20"/>
-                <w:szCs w:val="20"/>
+                <w:sz w:val="18"/>
+                <w:szCs w:val="18"/>
                 <w:rFonts w:ascii="Georgia" w:hAnsi="Georgia"/>
               </w:rPr>
             </w:r>
@@ -19932,8 +19932,8 @@
                 <w:i w:val="0"/>
                 <w:iCs w:val="0"/>
                 <w:color w:val="000000"/>
-                <w:sz w:val="20"/>
-                <w:szCs w:val="20"/>
+                <w:sz w:val="18"/>
+                <w:szCs w:val="18"/>
                 <w:rtl w:val="0"/>
               </w:rPr>
               <w:t xml:space="preserve">“...demonstrated notable antioxidant activity, as </w:t>
@@ -19945,8 +19945,8 @@
                 <w:bCs w:val="1"/>
                 <w:strike w:val="1"/>
                 <w:color w:val="000000"/>
-                <w:sz w:val="20"/>
-                <w:szCs w:val="20"/>
+                <w:sz w:val="18"/>
+                <w:szCs w:val="18"/>
                 <w:rtl w:val="0"/>
               </w:rPr>
               <w:t xml:space="preserve">indicated</w:t>
@@ -19959,8 +19959,8 @@
                 <w:i w:val="0"/>
                 <w:iCs w:val="0"/>
                 <w:color w:val="000000"/>
-                <w:sz w:val="20"/>
-                <w:szCs w:val="20"/>
+                <w:sz w:val="18"/>
+                <w:szCs w:val="18"/>
                 <w:rtl w:val="0"/>
               </w:rPr>
               <w:t xml:space="preserve"> (FP-Gen) by the reduction of DPPH radicals.”</w:t>
@@ -19968,8 +19968,8 @@
             <w:r>
               <w:rPr>
                 <w:rtl w:val="0"/>
-                <w:sz w:val="20"/>
-                <w:szCs w:val="20"/>
+                <w:sz w:val="18"/>
+                <w:szCs w:val="18"/>
                 <w:rFonts w:ascii="Georgia" w:hAnsi="Georgia"/>
               </w:rPr>
             </w:r>

</xml_diff>

<commit_message>
Draft_053: Appendix B new page; 1.8 spacing to avoid short spill before C
</commit_message>
<xml_diff>
--- a/thesis/003_ThesisProposal_Draft_053.docx
+++ b/thesis/003_ThesisProposal_Draft_053.docx
@@ -20709,8 +20709,16 @@
     </w:tbl>
     <w:p>
       <w:pPr>
+        <w:spacing w:line="240" w:lineRule="auto" w:before="0" w:after="0"/>
+      </w:pPr>
+      <w:r>
+        <w:br w:type="page"/>
+      </w:r>
+    </w:p>
+    <w:p>
+      <w:pPr>
         <w:keepNext w:val="1"/>
-        <w:spacing w:before="240" w:after="0" w:line="480" w:lineRule="auto"/>
+        <w:spacing w:before="120" w:after="0" w:line="432" w:lineRule="auto"/>
         <w:jc w:val="left"/>
         <w:rPr/>
       </w:pPr>
@@ -20735,7 +20743,7 @@
     </w:p>
     <w:p>
       <w:pPr>
-        <w:spacing w:before="0" w:after="0" w:line="480" w:lineRule="auto"/>
+        <w:spacing w:before="0" w:after="0" w:line="432" w:lineRule="auto"/>
         <w:ind w:firstLine="720"/>
         <w:jc w:val="both"/>
         <w:rPr/>
@@ -20759,7 +20767,7 @@
     </w:p>
     <w:p>
       <w:pPr>
-        <w:spacing w:before="0" w:after="0" w:line="480" w:lineRule="auto"/>
+        <w:spacing w:before="120" w:after="0" w:line="432" w:lineRule="auto"/>
         <w:jc w:val="left"/>
         <w:rPr/>
       </w:pPr>
@@ -20782,7 +20790,7 @@
     </w:p>
     <w:p>
       <w:pPr>
-        <w:spacing w:before="0" w:after="0" w:line="480" w:lineRule="auto"/>
+        <w:spacing w:before="0" w:after="0" w:line="432" w:lineRule="auto"/>
         <w:ind w:firstLine="720"/>
         <w:jc w:val="both"/>
         <w:rPr/>
@@ -20808,7 +20816,7 @@
     </w:p>
     <w:p>
       <w:pPr>
-        <w:spacing w:before="0" w:after="0" w:line="480" w:lineRule="auto"/>
+        <w:spacing w:before="0" w:after="0" w:line="432" w:lineRule="auto"/>
         <w:ind w:firstLine="720"/>
         <w:jc w:val="both"/>
         <w:rPr/>
@@ -20834,7 +20842,7 @@
     </w:p>
     <w:p>
       <w:pPr>
-        <w:spacing w:before="0" w:after="0" w:line="480" w:lineRule="auto"/>
+        <w:spacing w:before="0" w:after="0" w:line="432" w:lineRule="auto"/>
         <w:ind w:firstLine="720"/>
         <w:jc w:val="both"/>
         <w:rPr/>
@@ -20860,7 +20868,7 @@
     </w:p>
     <w:p>
       <w:pPr>
-        <w:spacing w:before="0" w:after="0" w:line="480" w:lineRule="auto"/>
+        <w:spacing w:before="0" w:after="0" w:line="432" w:lineRule="auto"/>
         <w:ind w:firstLine="720"/>
         <w:jc w:val="both"/>
         <w:rPr/>
@@ -20886,7 +20894,7 @@
     </w:p>
     <w:p>
       <w:pPr>
-        <w:spacing w:before="0" w:after="0" w:line="480" w:lineRule="auto"/>
+        <w:spacing w:before="0" w:after="0" w:line="432" w:lineRule="auto"/>
         <w:ind w:firstLine="720"/>
         <w:jc w:val="both"/>
         <w:rPr/>
@@ -20925,7 +20933,7 @@
     </w:p>
     <w:p>
       <w:pPr>
-        <w:spacing w:before="0" w:after="0" w:line="480" w:lineRule="auto"/>
+        <w:spacing w:before="120" w:after="0" w:line="432" w:lineRule="auto"/>
         <w:jc w:val="left"/>
         <w:rPr/>
       </w:pPr>
@@ -20950,7 +20958,7 @@
     </w:p>
     <w:p>
       <w:pPr>
-        <w:spacing w:before="0" w:after="0" w:line="480" w:lineRule="auto"/>
+        <w:spacing w:before="0" w:after="0" w:line="432" w:lineRule="auto"/>
         <w:ind w:firstLine="720"/>
         <w:jc w:val="both"/>
         <w:rPr/>
@@ -20976,7 +20984,7 @@
     </w:p>
     <w:p>
       <w:pPr>
-        <w:spacing w:before="0" w:after="0" w:line="480" w:lineRule="auto"/>
+        <w:spacing w:before="0" w:after="0" w:line="432" w:lineRule="auto"/>
         <w:ind w:firstLine="720"/>
         <w:jc w:val="both"/>
         <w:rPr/>
@@ -21002,7 +21010,7 @@
     </w:p>
     <w:p>
       <w:pPr>
-        <w:spacing w:before="0" w:after="0" w:line="480" w:lineRule="auto"/>
+        <w:spacing w:before="0" w:after="0" w:line="432" w:lineRule="auto"/>
         <w:ind w:firstLine="720"/>
         <w:jc w:val="both"/>
         <w:rPr/>
@@ -21028,7 +21036,7 @@
     </w:p>
     <w:p>
       <w:pPr>
-        <w:spacing w:before="0" w:after="0" w:line="480" w:lineRule="auto"/>
+        <w:spacing w:before="0" w:after="0" w:line="432" w:lineRule="auto"/>
         <w:ind w:firstLine="720"/>
         <w:jc w:val="both"/>
         <w:rPr/>
@@ -21054,7 +21062,7 @@
     </w:p>
     <w:p>
       <w:pPr>
-        <w:spacing w:before="0" w:after="0" w:line="480" w:lineRule="auto"/>
+        <w:spacing w:before="0" w:after="0" w:line="432" w:lineRule="auto"/>
         <w:jc w:val="both"/>
         <w:rPr/>
       </w:pPr>
@@ -21079,7 +21087,7 @@
     </w:p>
     <w:p>
       <w:pPr>
-        <w:spacing w:before="0" w:after="0" w:line="480" w:lineRule="auto"/>
+        <w:spacing w:before="0" w:after="0" w:line="432" w:lineRule="auto"/>
         <w:jc w:val="both"/>
         <w:rPr/>
       </w:pPr>
@@ -21104,7 +21112,7 @@
     </w:p>
     <w:p>
       <w:pPr>
-        <w:spacing w:before="0" w:after="0" w:line="480" w:lineRule="auto"/>
+        <w:spacing w:before="0" w:after="0" w:line="432" w:lineRule="auto"/>
         <w:ind w:firstLine="720"/>
         <w:jc w:val="both"/>
         <w:rPr/>
@@ -21143,7 +21151,7 @@
     </w:p>
     <w:p>
       <w:pPr>
-        <w:spacing w:before="0" w:after="0" w:line="480" w:lineRule="auto"/>
+        <w:spacing w:before="120" w:after="0" w:line="432" w:lineRule="auto"/>
         <w:jc w:val="left"/>
         <w:rPr/>
       </w:pPr>
@@ -21168,7 +21176,7 @@
     </w:p>
     <w:p>
       <w:pPr>
-        <w:spacing w:before="0" w:after="0" w:line="480" w:lineRule="auto"/>
+        <w:spacing w:before="0" w:after="0" w:line="432" w:lineRule="auto"/>
         <w:ind w:firstLine="720"/>
         <w:jc w:val="both"/>
         <w:rPr/>
@@ -21194,7 +21202,7 @@
     </w:p>
     <w:p>
       <w:pPr>
-        <w:spacing w:before="0" w:after="0" w:line="480" w:lineRule="auto"/>
+        <w:spacing w:before="0" w:after="0" w:line="432" w:lineRule="auto"/>
         <w:ind w:firstLine="720"/>
         <w:jc w:val="both"/>
         <w:rPr/>
@@ -21220,7 +21228,7 @@
     </w:p>
     <w:p>
       <w:pPr>
-        <w:spacing w:before="0" w:after="0" w:line="480" w:lineRule="auto"/>
+        <w:spacing w:before="0" w:after="0" w:line="432" w:lineRule="auto"/>
         <w:ind w:firstLine="720"/>
         <w:jc w:val="both"/>
         <w:rPr/>
@@ -21246,7 +21254,7 @@
     </w:p>
     <w:p>
       <w:pPr>
-        <w:spacing w:before="0" w:after="0" w:line="480" w:lineRule="auto"/>
+        <w:spacing w:before="0" w:after="0" w:line="432" w:lineRule="auto"/>
         <w:ind w:firstLine="720"/>
         <w:jc w:val="both"/>
         <w:rPr/>
@@ -21272,7 +21280,7 @@
     </w:p>
     <w:p>
       <w:pPr>
-        <w:spacing w:before="0" w:after="0" w:line="480" w:lineRule="auto"/>
+        <w:spacing w:before="0" w:after="0" w:line="432" w:lineRule="auto"/>
         <w:ind w:firstLine="720"/>
         <w:jc w:val="both"/>
         <w:rPr/>
@@ -21311,7 +21319,7 @@
     </w:p>
     <w:p>
       <w:pPr>
-        <w:spacing w:before="0" w:after="0" w:line="480" w:lineRule="auto"/>
+        <w:spacing w:before="120" w:after="0" w:line="432" w:lineRule="auto"/>
         <w:jc w:val="left"/>
         <w:rPr/>
       </w:pPr>
@@ -21336,7 +21344,7 @@
     </w:p>
     <w:p>
       <w:pPr>
-        <w:spacing w:before="0" w:after="0" w:line="480" w:lineRule="auto"/>
+        <w:spacing w:before="0" w:after="0" w:line="432" w:lineRule="auto"/>
         <w:ind w:firstLine="720"/>
         <w:jc w:val="both"/>
         <w:rPr/>
@@ -21362,7 +21370,7 @@
     </w:p>
     <w:p>
       <w:pPr>
-        <w:spacing w:before="0" w:after="0" w:line="480" w:lineRule="auto"/>
+        <w:spacing w:before="0" w:after="0" w:line="432" w:lineRule="auto"/>
         <w:ind w:firstLine="720"/>
         <w:jc w:val="both"/>
         <w:rPr/>
@@ -21388,7 +21396,7 @@
     </w:p>
     <w:p>
       <w:pPr>
-        <w:spacing w:before="0" w:after="0" w:line="480" w:lineRule="auto"/>
+        <w:spacing w:before="0" w:after="0" w:line="432" w:lineRule="auto"/>
         <w:ind w:firstLine="720"/>
         <w:jc w:val="both"/>
         <w:rPr/>
@@ -21414,7 +21422,7 @@
     </w:p>
     <w:p>
       <w:pPr>
-        <w:spacing w:before="0" w:after="0" w:line="480" w:lineRule="auto"/>
+        <w:spacing w:before="0" w:after="0" w:line="432" w:lineRule="auto"/>
         <w:ind w:firstLine="720"/>
         <w:jc w:val="both"/>
         <w:rPr/>
@@ -21440,7 +21448,7 @@
     </w:p>
     <w:p>
       <w:pPr>
-        <w:spacing w:before="0" w:after="0" w:line="480" w:lineRule="auto"/>
+        <w:spacing w:before="0" w:after="0" w:line="432" w:lineRule="auto"/>
         <w:ind w:firstLine="720"/>
         <w:jc w:val="both"/>
         <w:rPr/>
@@ -21479,7 +21487,7 @@
     </w:p>
     <w:p>
       <w:pPr>
-        <w:spacing w:before="0" w:after="0" w:line="480" w:lineRule="auto"/>
+        <w:spacing w:before="0" w:after="0" w:line="432" w:lineRule="auto"/>
         <w:jc w:val="left"/>
         <w:rPr/>
       </w:pPr>
@@ -21502,7 +21510,7 @@
     </w:p>
     <w:p>
       <w:pPr>
-        <w:spacing w:before="0" w:after="0" w:line="480" w:lineRule="auto"/>
+        <w:spacing w:before="0" w:after="0" w:line="432" w:lineRule="auto"/>
         <w:ind w:firstLine="720"/>
         <w:jc w:val="both"/>
         <w:rPr/>

</xml_diff>

<commit_message>
Draft_053: Appendix B new page; tighten spacing to avoid short page before C
</commit_message>
<xml_diff>
--- a/thesis/003_ThesisProposal_Draft_053.docx
+++ b/thesis/003_ThesisProposal_Draft_053.docx
@@ -20718,7 +20718,7 @@
     <w:p>
       <w:pPr>
         <w:keepNext w:val="1"/>
-        <w:spacing w:before="120" w:after="0" w:line="432" w:lineRule="auto"/>
+        <w:spacing w:before="120" w:after="0" w:line="400" w:lineRule="auto"/>
         <w:jc w:val="left"/>
         <w:rPr/>
       </w:pPr>
@@ -20743,7 +20743,7 @@
     </w:p>
     <w:p>
       <w:pPr>
-        <w:spacing w:before="0" w:after="0" w:line="432" w:lineRule="auto"/>
+        <w:spacing w:before="0" w:after="0" w:line="400" w:lineRule="auto"/>
         <w:ind w:firstLine="720"/>
         <w:jc w:val="both"/>
         <w:rPr/>
@@ -20767,7 +20767,7 @@
     </w:p>
     <w:p>
       <w:pPr>
-        <w:spacing w:before="120" w:after="0" w:line="432" w:lineRule="auto"/>
+        <w:spacing w:before="120" w:after="0" w:line="400" w:lineRule="auto"/>
         <w:jc w:val="left"/>
         <w:rPr/>
       </w:pPr>
@@ -20790,7 +20790,7 @@
     </w:p>
     <w:p>
       <w:pPr>
-        <w:spacing w:before="0" w:after="0" w:line="432" w:lineRule="auto"/>
+        <w:spacing w:before="0" w:after="0" w:line="400" w:lineRule="auto"/>
         <w:ind w:firstLine="720"/>
         <w:jc w:val="both"/>
         <w:rPr/>
@@ -20816,7 +20816,7 @@
     </w:p>
     <w:p>
       <w:pPr>
-        <w:spacing w:before="0" w:after="0" w:line="432" w:lineRule="auto"/>
+        <w:spacing w:before="0" w:after="0" w:line="400" w:lineRule="auto"/>
         <w:ind w:firstLine="720"/>
         <w:jc w:val="both"/>
         <w:rPr/>
@@ -20842,7 +20842,7 @@
     </w:p>
     <w:p>
       <w:pPr>
-        <w:spacing w:before="0" w:after="0" w:line="432" w:lineRule="auto"/>
+        <w:spacing w:before="0" w:after="0" w:line="400" w:lineRule="auto"/>
         <w:ind w:firstLine="720"/>
         <w:jc w:val="both"/>
         <w:rPr/>
@@ -20868,7 +20868,7 @@
     </w:p>
     <w:p>
       <w:pPr>
-        <w:spacing w:before="0" w:after="0" w:line="432" w:lineRule="auto"/>
+        <w:spacing w:before="0" w:after="0" w:line="400" w:lineRule="auto"/>
         <w:ind w:firstLine="720"/>
         <w:jc w:val="both"/>
         <w:rPr/>
@@ -20894,7 +20894,7 @@
     </w:p>
     <w:p>
       <w:pPr>
-        <w:spacing w:before="0" w:after="0" w:line="432" w:lineRule="auto"/>
+        <w:spacing w:before="0" w:after="0" w:line="400" w:lineRule="auto"/>
         <w:ind w:firstLine="720"/>
         <w:jc w:val="both"/>
         <w:rPr/>
@@ -20933,7 +20933,7 @@
     </w:p>
     <w:p>
       <w:pPr>
-        <w:spacing w:before="120" w:after="0" w:line="432" w:lineRule="auto"/>
+        <w:spacing w:before="120" w:after="0" w:line="400" w:lineRule="auto"/>
         <w:jc w:val="left"/>
         <w:rPr/>
       </w:pPr>
@@ -20958,7 +20958,7 @@
     </w:p>
     <w:p>
       <w:pPr>
-        <w:spacing w:before="0" w:after="0" w:line="432" w:lineRule="auto"/>
+        <w:spacing w:before="0" w:after="0" w:line="400" w:lineRule="auto"/>
         <w:ind w:firstLine="720"/>
         <w:jc w:val="both"/>
         <w:rPr/>
@@ -20984,7 +20984,7 @@
     </w:p>
     <w:p>
       <w:pPr>
-        <w:spacing w:before="0" w:after="0" w:line="432" w:lineRule="auto"/>
+        <w:spacing w:before="0" w:after="0" w:line="400" w:lineRule="auto"/>
         <w:ind w:firstLine="720"/>
         <w:jc w:val="both"/>
         <w:rPr/>
@@ -21010,7 +21010,7 @@
     </w:p>
     <w:p>
       <w:pPr>
-        <w:spacing w:before="0" w:after="0" w:line="432" w:lineRule="auto"/>
+        <w:spacing w:before="0" w:after="0" w:line="400" w:lineRule="auto"/>
         <w:ind w:firstLine="720"/>
         <w:jc w:val="both"/>
         <w:rPr/>
@@ -21036,7 +21036,7 @@
     </w:p>
     <w:p>
       <w:pPr>
-        <w:spacing w:before="0" w:after="0" w:line="432" w:lineRule="auto"/>
+        <w:spacing w:before="0" w:after="0" w:line="400" w:lineRule="auto"/>
         <w:ind w:firstLine="720"/>
         <w:jc w:val="both"/>
         <w:rPr/>
@@ -21062,7 +21062,7 @@
     </w:p>
     <w:p>
       <w:pPr>
-        <w:spacing w:before="0" w:after="0" w:line="432" w:lineRule="auto"/>
+        <w:spacing w:before="0" w:after="0" w:line="400" w:lineRule="auto"/>
         <w:jc w:val="both"/>
         <w:rPr/>
       </w:pPr>
@@ -21087,7 +21087,7 @@
     </w:p>
     <w:p>
       <w:pPr>
-        <w:spacing w:before="0" w:after="0" w:line="432" w:lineRule="auto"/>
+        <w:spacing w:before="0" w:after="0" w:line="400" w:lineRule="auto"/>
         <w:jc w:val="both"/>
         <w:rPr/>
       </w:pPr>
@@ -21112,7 +21112,7 @@
     </w:p>
     <w:p>
       <w:pPr>
-        <w:spacing w:before="0" w:after="0" w:line="432" w:lineRule="auto"/>
+        <w:spacing w:before="0" w:after="0" w:line="400" w:lineRule="auto"/>
         <w:ind w:firstLine="720"/>
         <w:jc w:val="both"/>
         <w:rPr/>
@@ -21151,7 +21151,7 @@
     </w:p>
     <w:p>
       <w:pPr>
-        <w:spacing w:before="120" w:after="0" w:line="432" w:lineRule="auto"/>
+        <w:spacing w:before="120" w:after="0" w:line="400" w:lineRule="auto"/>
         <w:jc w:val="left"/>
         <w:rPr/>
       </w:pPr>
@@ -21176,7 +21176,7 @@
     </w:p>
     <w:p>
       <w:pPr>
-        <w:spacing w:before="0" w:after="0" w:line="432" w:lineRule="auto"/>
+        <w:spacing w:before="0" w:after="0" w:line="400" w:lineRule="auto"/>
         <w:ind w:firstLine="720"/>
         <w:jc w:val="both"/>
         <w:rPr/>
@@ -21202,7 +21202,7 @@
     </w:p>
     <w:p>
       <w:pPr>
-        <w:spacing w:before="0" w:after="0" w:line="432" w:lineRule="auto"/>
+        <w:spacing w:before="0" w:after="0" w:line="400" w:lineRule="auto"/>
         <w:ind w:firstLine="720"/>
         <w:jc w:val="both"/>
         <w:rPr/>
@@ -21228,7 +21228,7 @@
     </w:p>
     <w:p>
       <w:pPr>
-        <w:spacing w:before="0" w:after="0" w:line="432" w:lineRule="auto"/>
+        <w:spacing w:before="0" w:after="0" w:line="400" w:lineRule="auto"/>
         <w:ind w:firstLine="720"/>
         <w:jc w:val="both"/>
         <w:rPr/>
@@ -21254,7 +21254,7 @@
     </w:p>
     <w:p>
       <w:pPr>
-        <w:spacing w:before="0" w:after="0" w:line="432" w:lineRule="auto"/>
+        <w:spacing w:before="0" w:after="0" w:line="400" w:lineRule="auto"/>
         <w:ind w:firstLine="720"/>
         <w:jc w:val="both"/>
         <w:rPr/>
@@ -21280,7 +21280,7 @@
     </w:p>
     <w:p>
       <w:pPr>
-        <w:spacing w:before="0" w:after="0" w:line="432" w:lineRule="auto"/>
+        <w:spacing w:before="0" w:after="0" w:line="400" w:lineRule="auto"/>
         <w:ind w:firstLine="720"/>
         <w:jc w:val="both"/>
         <w:rPr/>
@@ -21319,7 +21319,7 @@
     </w:p>
     <w:p>
       <w:pPr>
-        <w:spacing w:before="120" w:after="0" w:line="432" w:lineRule="auto"/>
+        <w:spacing w:before="120" w:after="0" w:line="400" w:lineRule="auto"/>
         <w:jc w:val="left"/>
         <w:rPr/>
       </w:pPr>
@@ -21344,7 +21344,7 @@
     </w:p>
     <w:p>
       <w:pPr>
-        <w:spacing w:before="0" w:after="0" w:line="432" w:lineRule="auto"/>
+        <w:spacing w:before="0" w:after="0" w:line="400" w:lineRule="auto"/>
         <w:ind w:firstLine="720"/>
         <w:jc w:val="both"/>
         <w:rPr/>
@@ -21370,7 +21370,7 @@
     </w:p>
     <w:p>
       <w:pPr>
-        <w:spacing w:before="0" w:after="0" w:line="432" w:lineRule="auto"/>
+        <w:spacing w:before="0" w:after="0" w:line="400" w:lineRule="auto"/>
         <w:ind w:firstLine="720"/>
         <w:jc w:val="both"/>
         <w:rPr/>
@@ -21396,7 +21396,7 @@
     </w:p>
     <w:p>
       <w:pPr>
-        <w:spacing w:before="0" w:after="0" w:line="432" w:lineRule="auto"/>
+        <w:spacing w:before="0" w:after="0" w:line="400" w:lineRule="auto"/>
         <w:ind w:firstLine="720"/>
         <w:jc w:val="both"/>
         <w:rPr/>
@@ -21422,7 +21422,7 @@
     </w:p>
     <w:p>
       <w:pPr>
-        <w:spacing w:before="0" w:after="0" w:line="432" w:lineRule="auto"/>
+        <w:spacing w:before="0" w:after="0" w:line="400" w:lineRule="auto"/>
         <w:ind w:firstLine="720"/>
         <w:jc w:val="both"/>
         <w:rPr/>
@@ -21448,7 +21448,7 @@
     </w:p>
     <w:p>
       <w:pPr>
-        <w:spacing w:before="0" w:after="0" w:line="432" w:lineRule="auto"/>
+        <w:spacing w:before="0" w:after="0" w:line="400" w:lineRule="auto"/>
         <w:ind w:firstLine="720"/>
         <w:jc w:val="both"/>
         <w:rPr/>
@@ -21487,7 +21487,7 @@
     </w:p>
     <w:p>
       <w:pPr>
-        <w:spacing w:before="0" w:after="0" w:line="432" w:lineRule="auto"/>
+        <w:spacing w:before="0" w:after="0" w:line="400" w:lineRule="auto"/>
         <w:jc w:val="left"/>
         <w:rPr/>
       </w:pPr>
@@ -21510,7 +21510,7 @@
     </w:p>
     <w:p>
       <w:pPr>
-        <w:spacing w:before="0" w:after="0" w:line="432" w:lineRule="auto"/>
+        <w:spacing w:before="0" w:after="0" w:line="400" w:lineRule="auto"/>
         <w:ind w:firstLine="720"/>
         <w:jc w:val="both"/>
         <w:rPr/>

</xml_diff>

<commit_message>
Draft_053: Appendix B spacing 1.6 to clear short last page
</commit_message>
<xml_diff>
--- a/thesis/003_ThesisProposal_Draft_053.docx
+++ b/thesis/003_ThesisProposal_Draft_053.docx
@@ -20718,7 +20718,7 @@
     <w:p>
       <w:pPr>
         <w:keepNext w:val="1"/>
-        <w:spacing w:before="120" w:after="0" w:line="400" w:lineRule="auto"/>
+        <w:spacing w:before="120" w:after="0" w:line="384" w:lineRule="auto"/>
         <w:jc w:val="left"/>
         <w:rPr/>
       </w:pPr>
@@ -20743,7 +20743,7 @@
     </w:p>
     <w:p>
       <w:pPr>
-        <w:spacing w:before="0" w:after="0" w:line="400" w:lineRule="auto"/>
+        <w:spacing w:before="0" w:after="0" w:line="384" w:lineRule="auto"/>
         <w:ind w:firstLine="720"/>
         <w:jc w:val="both"/>
         <w:rPr/>
@@ -20767,7 +20767,7 @@
     </w:p>
     <w:p>
       <w:pPr>
-        <w:spacing w:before="120" w:after="0" w:line="400" w:lineRule="auto"/>
+        <w:spacing w:before="120" w:after="0" w:line="384" w:lineRule="auto"/>
         <w:jc w:val="left"/>
         <w:rPr/>
       </w:pPr>
@@ -20790,7 +20790,7 @@
     </w:p>
     <w:p>
       <w:pPr>
-        <w:spacing w:before="0" w:after="0" w:line="400" w:lineRule="auto"/>
+        <w:spacing w:before="0" w:after="0" w:line="384" w:lineRule="auto"/>
         <w:ind w:firstLine="720"/>
         <w:jc w:val="both"/>
         <w:rPr/>
@@ -20816,7 +20816,7 @@
     </w:p>
     <w:p>
       <w:pPr>
-        <w:spacing w:before="0" w:after="0" w:line="400" w:lineRule="auto"/>
+        <w:spacing w:before="0" w:after="0" w:line="384" w:lineRule="auto"/>
         <w:ind w:firstLine="720"/>
         <w:jc w:val="both"/>
         <w:rPr/>
@@ -20842,7 +20842,7 @@
     </w:p>
     <w:p>
       <w:pPr>
-        <w:spacing w:before="0" w:after="0" w:line="400" w:lineRule="auto"/>
+        <w:spacing w:before="0" w:after="0" w:line="384" w:lineRule="auto"/>
         <w:ind w:firstLine="720"/>
         <w:jc w:val="both"/>
         <w:rPr/>
@@ -20868,7 +20868,7 @@
     </w:p>
     <w:p>
       <w:pPr>
-        <w:spacing w:before="0" w:after="0" w:line="400" w:lineRule="auto"/>
+        <w:spacing w:before="0" w:after="0" w:line="384" w:lineRule="auto"/>
         <w:ind w:firstLine="720"/>
         <w:jc w:val="both"/>
         <w:rPr/>
@@ -20894,7 +20894,7 @@
     </w:p>
     <w:p>
       <w:pPr>
-        <w:spacing w:before="0" w:after="0" w:line="400" w:lineRule="auto"/>
+        <w:spacing w:before="0" w:after="0" w:line="384" w:lineRule="auto"/>
         <w:ind w:firstLine="720"/>
         <w:jc w:val="both"/>
         <w:rPr/>
@@ -20933,7 +20933,7 @@
     </w:p>
     <w:p>
       <w:pPr>
-        <w:spacing w:before="120" w:after="0" w:line="400" w:lineRule="auto"/>
+        <w:spacing w:before="120" w:after="0" w:line="384" w:lineRule="auto"/>
         <w:jc w:val="left"/>
         <w:rPr/>
       </w:pPr>
@@ -20958,7 +20958,7 @@
     </w:p>
     <w:p>
       <w:pPr>
-        <w:spacing w:before="0" w:after="0" w:line="400" w:lineRule="auto"/>
+        <w:spacing w:before="0" w:after="0" w:line="384" w:lineRule="auto"/>
         <w:ind w:firstLine="720"/>
         <w:jc w:val="both"/>
         <w:rPr/>
@@ -20984,7 +20984,7 @@
     </w:p>
     <w:p>
       <w:pPr>
-        <w:spacing w:before="0" w:after="0" w:line="400" w:lineRule="auto"/>
+        <w:spacing w:before="0" w:after="0" w:line="384" w:lineRule="auto"/>
         <w:ind w:firstLine="720"/>
         <w:jc w:val="both"/>
         <w:rPr/>
@@ -21010,7 +21010,7 @@
     </w:p>
     <w:p>
       <w:pPr>
-        <w:spacing w:before="0" w:after="0" w:line="400" w:lineRule="auto"/>
+        <w:spacing w:before="0" w:after="0" w:line="384" w:lineRule="auto"/>
         <w:ind w:firstLine="720"/>
         <w:jc w:val="both"/>
         <w:rPr/>
@@ -21036,7 +21036,7 @@
     </w:p>
     <w:p>
       <w:pPr>
-        <w:spacing w:before="0" w:after="0" w:line="400" w:lineRule="auto"/>
+        <w:spacing w:before="0" w:after="0" w:line="384" w:lineRule="auto"/>
         <w:ind w:firstLine="720"/>
         <w:jc w:val="both"/>
         <w:rPr/>
@@ -21062,7 +21062,7 @@
     </w:p>
     <w:p>
       <w:pPr>
-        <w:spacing w:before="0" w:after="0" w:line="400" w:lineRule="auto"/>
+        <w:spacing w:before="0" w:after="0" w:line="384" w:lineRule="auto"/>
         <w:jc w:val="both"/>
         <w:rPr/>
       </w:pPr>
@@ -21087,7 +21087,7 @@
     </w:p>
     <w:p>
       <w:pPr>
-        <w:spacing w:before="0" w:after="0" w:line="400" w:lineRule="auto"/>
+        <w:spacing w:before="0" w:after="0" w:line="384" w:lineRule="auto"/>
         <w:jc w:val="both"/>
         <w:rPr/>
       </w:pPr>
@@ -21112,7 +21112,7 @@
     </w:p>
     <w:p>
       <w:pPr>
-        <w:spacing w:before="0" w:after="0" w:line="400" w:lineRule="auto"/>
+        <w:spacing w:before="0" w:after="0" w:line="384" w:lineRule="auto"/>
         <w:ind w:firstLine="720"/>
         <w:jc w:val="both"/>
         <w:rPr/>
@@ -21151,7 +21151,7 @@
     </w:p>
     <w:p>
       <w:pPr>
-        <w:spacing w:before="120" w:after="0" w:line="400" w:lineRule="auto"/>
+        <w:spacing w:before="120" w:after="0" w:line="384" w:lineRule="auto"/>
         <w:jc w:val="left"/>
         <w:rPr/>
       </w:pPr>
@@ -21176,7 +21176,7 @@
     </w:p>
     <w:p>
       <w:pPr>
-        <w:spacing w:before="0" w:after="0" w:line="400" w:lineRule="auto"/>
+        <w:spacing w:before="0" w:after="0" w:line="384" w:lineRule="auto"/>
         <w:ind w:firstLine="720"/>
         <w:jc w:val="both"/>
         <w:rPr/>
@@ -21202,7 +21202,7 @@
     </w:p>
     <w:p>
       <w:pPr>
-        <w:spacing w:before="0" w:after="0" w:line="400" w:lineRule="auto"/>
+        <w:spacing w:before="0" w:after="0" w:line="384" w:lineRule="auto"/>
         <w:ind w:firstLine="720"/>
         <w:jc w:val="both"/>
         <w:rPr/>
@@ -21228,7 +21228,7 @@
     </w:p>
     <w:p>
       <w:pPr>
-        <w:spacing w:before="0" w:after="0" w:line="400" w:lineRule="auto"/>
+        <w:spacing w:before="0" w:after="0" w:line="384" w:lineRule="auto"/>
         <w:ind w:firstLine="720"/>
         <w:jc w:val="both"/>
         <w:rPr/>
@@ -21254,7 +21254,7 @@
     </w:p>
     <w:p>
       <w:pPr>
-        <w:spacing w:before="0" w:after="0" w:line="400" w:lineRule="auto"/>
+        <w:spacing w:before="0" w:after="0" w:line="384" w:lineRule="auto"/>
         <w:ind w:firstLine="720"/>
         <w:jc w:val="both"/>
         <w:rPr/>
@@ -21280,7 +21280,7 @@
     </w:p>
     <w:p>
       <w:pPr>
-        <w:spacing w:before="0" w:after="0" w:line="400" w:lineRule="auto"/>
+        <w:spacing w:before="0" w:after="0" w:line="384" w:lineRule="auto"/>
         <w:ind w:firstLine="720"/>
         <w:jc w:val="both"/>
         <w:rPr/>
@@ -21319,7 +21319,7 @@
     </w:p>
     <w:p>
       <w:pPr>
-        <w:spacing w:before="120" w:after="0" w:line="400" w:lineRule="auto"/>
+        <w:spacing w:before="120" w:after="0" w:line="384" w:lineRule="auto"/>
         <w:jc w:val="left"/>
         <w:rPr/>
       </w:pPr>
@@ -21344,7 +21344,7 @@
     </w:p>
     <w:p>
       <w:pPr>
-        <w:spacing w:before="0" w:after="0" w:line="400" w:lineRule="auto"/>
+        <w:spacing w:before="0" w:after="0" w:line="384" w:lineRule="auto"/>
         <w:ind w:firstLine="720"/>
         <w:jc w:val="both"/>
         <w:rPr/>
@@ -21370,7 +21370,7 @@
     </w:p>
     <w:p>
       <w:pPr>
-        <w:spacing w:before="0" w:after="0" w:line="400" w:lineRule="auto"/>
+        <w:spacing w:before="0" w:after="0" w:line="384" w:lineRule="auto"/>
         <w:ind w:firstLine="720"/>
         <w:jc w:val="both"/>
         <w:rPr/>
@@ -21396,7 +21396,7 @@
     </w:p>
     <w:p>
       <w:pPr>
-        <w:spacing w:before="0" w:after="0" w:line="400" w:lineRule="auto"/>
+        <w:spacing w:before="0" w:after="0" w:line="384" w:lineRule="auto"/>
         <w:ind w:firstLine="720"/>
         <w:jc w:val="both"/>
         <w:rPr/>
@@ -21422,7 +21422,7 @@
     </w:p>
     <w:p>
       <w:pPr>
-        <w:spacing w:before="0" w:after="0" w:line="400" w:lineRule="auto"/>
+        <w:spacing w:before="0" w:after="0" w:line="384" w:lineRule="auto"/>
         <w:ind w:firstLine="720"/>
         <w:jc w:val="both"/>
         <w:rPr/>
@@ -21448,7 +21448,7 @@
     </w:p>
     <w:p>
       <w:pPr>
-        <w:spacing w:before="0" w:after="0" w:line="400" w:lineRule="auto"/>
+        <w:spacing w:before="0" w:after="0" w:line="384" w:lineRule="auto"/>
         <w:ind w:firstLine="720"/>
         <w:jc w:val="both"/>
         <w:rPr/>
@@ -21487,7 +21487,7 @@
     </w:p>
     <w:p>
       <w:pPr>
-        <w:spacing w:before="0" w:after="0" w:line="400" w:lineRule="auto"/>
+        <w:spacing w:before="0" w:after="0" w:line="384" w:lineRule="auto"/>
         <w:jc w:val="left"/>
         <w:rPr/>
       </w:pPr>
@@ -21510,7 +21510,7 @@
     </w:p>
     <w:p>
       <w:pPr>
-        <w:spacing w:before="0" w:after="0" w:line="400" w:lineRule="auto"/>
+        <w:spacing w:before="0" w:after="0" w:line="384" w:lineRule="auto"/>
         <w:ind w:firstLine="720"/>
         <w:jc w:val="both"/>
         <w:rPr/>

</xml_diff>

<commit_message>
Draft_053: Appendix B line spacing 2.0 and page breaks
Was 1.6. Forced double spacing. Page breaks before B and C.
No short spill before C.
</commit_message>
<xml_diff>
--- a/thesis/003_ThesisProposal_Draft_053.docx
+++ b/thesis/003_ThesisProposal_Draft_053.docx
@@ -20718,9 +20718,10 @@
     <w:p>
       <w:pPr>
         <w:keepNext w:val="1"/>
-        <w:spacing w:before="120" w:after="0" w:line="384" w:lineRule="auto"/>
+        <w:spacing w:before="120" w:after="0" w:line="480" w:lineRule="auto"/>
         <w:jc w:val="left"/>
         <w:rPr/>
+        <w:pageBreakBefore/>
       </w:pPr>
       <w:r>
         <w:rPr>
@@ -20743,7 +20744,7 @@
     </w:p>
     <w:p>
       <w:pPr>
-        <w:spacing w:before="0" w:after="0" w:line="384" w:lineRule="auto"/>
+        <w:spacing w:before="0" w:after="0" w:line="480" w:lineRule="auto"/>
         <w:ind w:firstLine="720"/>
         <w:jc w:val="both"/>
         <w:rPr/>
@@ -20767,7 +20768,7 @@
     </w:p>
     <w:p>
       <w:pPr>
-        <w:spacing w:before="120" w:after="0" w:line="384" w:lineRule="auto"/>
+        <w:spacing w:before="120" w:after="0" w:line="480" w:lineRule="auto"/>
         <w:jc w:val="left"/>
         <w:rPr/>
       </w:pPr>
@@ -20790,7 +20791,7 @@
     </w:p>
     <w:p>
       <w:pPr>
-        <w:spacing w:before="0" w:after="0" w:line="384" w:lineRule="auto"/>
+        <w:spacing w:before="0" w:after="0" w:line="480" w:lineRule="auto"/>
         <w:ind w:firstLine="720"/>
         <w:jc w:val="both"/>
         <w:rPr/>
@@ -20816,7 +20817,7 @@
     </w:p>
     <w:p>
       <w:pPr>
-        <w:spacing w:before="0" w:after="0" w:line="384" w:lineRule="auto"/>
+        <w:spacing w:before="0" w:after="0" w:line="480" w:lineRule="auto"/>
         <w:ind w:firstLine="720"/>
         <w:jc w:val="both"/>
         <w:rPr/>
@@ -20842,7 +20843,7 @@
     </w:p>
     <w:p>
       <w:pPr>
-        <w:spacing w:before="0" w:after="0" w:line="384" w:lineRule="auto"/>
+        <w:spacing w:before="0" w:after="0" w:line="480" w:lineRule="auto"/>
         <w:ind w:firstLine="720"/>
         <w:jc w:val="both"/>
         <w:rPr/>
@@ -20868,7 +20869,7 @@
     </w:p>
     <w:p>
       <w:pPr>
-        <w:spacing w:before="0" w:after="0" w:line="384" w:lineRule="auto"/>
+        <w:spacing w:before="0" w:after="0" w:line="480" w:lineRule="auto"/>
         <w:ind w:firstLine="720"/>
         <w:jc w:val="both"/>
         <w:rPr/>
@@ -20894,7 +20895,7 @@
     </w:p>
     <w:p>
       <w:pPr>
-        <w:spacing w:before="0" w:after="0" w:line="384" w:lineRule="auto"/>
+        <w:spacing w:before="0" w:after="0" w:line="480" w:lineRule="auto"/>
         <w:ind w:firstLine="720"/>
         <w:jc w:val="both"/>
         <w:rPr/>
@@ -20933,7 +20934,7 @@
     </w:p>
     <w:p>
       <w:pPr>
-        <w:spacing w:before="120" w:after="0" w:line="384" w:lineRule="auto"/>
+        <w:spacing w:before="120" w:after="0" w:line="480" w:lineRule="auto"/>
         <w:jc w:val="left"/>
         <w:rPr/>
       </w:pPr>
@@ -20958,7 +20959,7 @@
     </w:p>
     <w:p>
       <w:pPr>
-        <w:spacing w:before="0" w:after="0" w:line="384" w:lineRule="auto"/>
+        <w:spacing w:before="0" w:after="0" w:line="480" w:lineRule="auto"/>
         <w:ind w:firstLine="720"/>
         <w:jc w:val="both"/>
         <w:rPr/>
@@ -20984,7 +20985,7 @@
     </w:p>
     <w:p>
       <w:pPr>
-        <w:spacing w:before="0" w:after="0" w:line="384" w:lineRule="auto"/>
+        <w:spacing w:before="0" w:after="0" w:line="480" w:lineRule="auto"/>
         <w:ind w:firstLine="720"/>
         <w:jc w:val="both"/>
         <w:rPr/>
@@ -21010,7 +21011,7 @@
     </w:p>
     <w:p>
       <w:pPr>
-        <w:spacing w:before="0" w:after="0" w:line="384" w:lineRule="auto"/>
+        <w:spacing w:before="0" w:after="0" w:line="480" w:lineRule="auto"/>
         <w:ind w:firstLine="720"/>
         <w:jc w:val="both"/>
         <w:rPr/>
@@ -21036,7 +21037,7 @@
     </w:p>
     <w:p>
       <w:pPr>
-        <w:spacing w:before="0" w:after="0" w:line="384" w:lineRule="auto"/>
+        <w:spacing w:before="0" w:after="0" w:line="480" w:lineRule="auto"/>
         <w:ind w:firstLine="720"/>
         <w:jc w:val="both"/>
         <w:rPr/>
@@ -21062,7 +21063,7 @@
     </w:p>
     <w:p>
       <w:pPr>
-        <w:spacing w:before="0" w:after="0" w:line="384" w:lineRule="auto"/>
+        <w:spacing w:before="0" w:after="0" w:line="480" w:lineRule="auto"/>
         <w:jc w:val="both"/>
         <w:rPr/>
       </w:pPr>
@@ -21087,7 +21088,7 @@
     </w:p>
     <w:p>
       <w:pPr>
-        <w:spacing w:before="0" w:after="0" w:line="384" w:lineRule="auto"/>
+        <w:spacing w:before="0" w:after="0" w:line="480" w:lineRule="auto"/>
         <w:jc w:val="both"/>
         <w:rPr/>
       </w:pPr>
@@ -21112,7 +21113,7 @@
     </w:p>
     <w:p>
       <w:pPr>
-        <w:spacing w:before="0" w:after="0" w:line="384" w:lineRule="auto"/>
+        <w:spacing w:before="0" w:after="0" w:line="480" w:lineRule="auto"/>
         <w:ind w:firstLine="720"/>
         <w:jc w:val="both"/>
         <w:rPr/>
@@ -21151,7 +21152,7 @@
     </w:p>
     <w:p>
       <w:pPr>
-        <w:spacing w:before="120" w:after="0" w:line="384" w:lineRule="auto"/>
+        <w:spacing w:before="120" w:after="0" w:line="480" w:lineRule="auto"/>
         <w:jc w:val="left"/>
         <w:rPr/>
       </w:pPr>
@@ -21176,7 +21177,7 @@
     </w:p>
     <w:p>
       <w:pPr>
-        <w:spacing w:before="0" w:after="0" w:line="384" w:lineRule="auto"/>
+        <w:spacing w:before="0" w:after="0" w:line="480" w:lineRule="auto"/>
         <w:ind w:firstLine="720"/>
         <w:jc w:val="both"/>
         <w:rPr/>
@@ -21202,7 +21203,7 @@
     </w:p>
     <w:p>
       <w:pPr>
-        <w:spacing w:before="0" w:after="0" w:line="384" w:lineRule="auto"/>
+        <w:spacing w:before="0" w:after="0" w:line="480" w:lineRule="auto"/>
         <w:ind w:firstLine="720"/>
         <w:jc w:val="both"/>
         <w:rPr/>
@@ -21228,7 +21229,7 @@
     </w:p>
     <w:p>
       <w:pPr>
-        <w:spacing w:before="0" w:after="0" w:line="384" w:lineRule="auto"/>
+        <w:spacing w:before="0" w:after="0" w:line="480" w:lineRule="auto"/>
         <w:ind w:firstLine="720"/>
         <w:jc w:val="both"/>
         <w:rPr/>
@@ -21254,7 +21255,7 @@
     </w:p>
     <w:p>
       <w:pPr>
-        <w:spacing w:before="0" w:after="0" w:line="384" w:lineRule="auto"/>
+        <w:spacing w:before="0" w:after="0" w:line="480" w:lineRule="auto"/>
         <w:ind w:firstLine="720"/>
         <w:jc w:val="both"/>
         <w:rPr/>
@@ -21280,7 +21281,7 @@
     </w:p>
     <w:p>
       <w:pPr>
-        <w:spacing w:before="0" w:after="0" w:line="384" w:lineRule="auto"/>
+        <w:spacing w:before="0" w:after="0" w:line="480" w:lineRule="auto"/>
         <w:ind w:firstLine="720"/>
         <w:jc w:val="both"/>
         <w:rPr/>
@@ -21319,7 +21320,7 @@
     </w:p>
     <w:p>
       <w:pPr>
-        <w:spacing w:before="120" w:after="0" w:line="384" w:lineRule="auto"/>
+        <w:spacing w:before="120" w:after="0" w:line="480" w:lineRule="auto"/>
         <w:jc w:val="left"/>
         <w:rPr/>
       </w:pPr>
@@ -21344,7 +21345,7 @@
     </w:p>
     <w:p>
       <w:pPr>
-        <w:spacing w:before="0" w:after="0" w:line="384" w:lineRule="auto"/>
+        <w:spacing w:before="0" w:after="0" w:line="480" w:lineRule="auto"/>
         <w:ind w:firstLine="720"/>
         <w:jc w:val="both"/>
         <w:rPr/>
@@ -21370,7 +21371,7 @@
     </w:p>
     <w:p>
       <w:pPr>
-        <w:spacing w:before="0" w:after="0" w:line="384" w:lineRule="auto"/>
+        <w:spacing w:before="0" w:after="0" w:line="480" w:lineRule="auto"/>
         <w:ind w:firstLine="720"/>
         <w:jc w:val="both"/>
         <w:rPr/>
@@ -21396,7 +21397,7 @@
     </w:p>
     <w:p>
       <w:pPr>
-        <w:spacing w:before="0" w:after="0" w:line="384" w:lineRule="auto"/>
+        <w:spacing w:before="0" w:after="0" w:line="480" w:lineRule="auto"/>
         <w:ind w:firstLine="720"/>
         <w:jc w:val="both"/>
         <w:rPr/>
@@ -21422,7 +21423,7 @@
     </w:p>
     <w:p>
       <w:pPr>
-        <w:spacing w:before="0" w:after="0" w:line="384" w:lineRule="auto"/>
+        <w:spacing w:before="0" w:after="0" w:line="480" w:lineRule="auto"/>
         <w:ind w:firstLine="720"/>
         <w:jc w:val="both"/>
         <w:rPr/>
@@ -21448,7 +21449,7 @@
     </w:p>
     <w:p>
       <w:pPr>
-        <w:spacing w:before="0" w:after="0" w:line="384" w:lineRule="auto"/>
+        <w:spacing w:before="0" w:after="0" w:line="480" w:lineRule="auto"/>
         <w:ind w:firstLine="720"/>
         <w:jc w:val="both"/>
         <w:rPr/>
@@ -21487,7 +21488,7 @@
     </w:p>
     <w:p>
       <w:pPr>
-        <w:spacing w:before="0" w:after="0" w:line="384" w:lineRule="auto"/>
+        <w:spacing w:before="0" w:after="0" w:line="480" w:lineRule="auto"/>
         <w:jc w:val="left"/>
         <w:rPr/>
       </w:pPr>
@@ -21510,7 +21511,7 @@
     </w:p>
     <w:p>
       <w:pPr>
-        <w:spacing w:before="0" w:after="0" w:line="384" w:lineRule="auto"/>
+        <w:spacing w:before="0" w:after="0" w:line="480" w:lineRule="auto"/>
         <w:ind w:firstLine="720"/>
         <w:jc w:val="both"/>
         <w:rPr/>
@@ -21546,6 +21547,7 @@
         <w:spacing w:before="240" w:after="0" w:line="480" w:lineRule="auto"/>
         <w:jc w:val="left"/>
         <w:rPr/>
+        <w:pageBreakBefore/>
       </w:pPr>
       <w:r>
         <w:rPr>

</xml_diff>

<commit_message>
Draft_053: fix Epistemic Stance bold spill; normalize lead-clause bold
Significance, Definition of Terms, and Research Process use bold
labels only. Epistemic Stance entry was fully bold and is fixed.
</commit_message>
<xml_diff>
--- a/thesis/003_ThesisProposal_Draft_053.docx
+++ b/thesis/003_ThesisProposal_Draft_053.docx
@@ -1302,20 +1302,22 @@
       <w:r>
         <w:rPr>
           <w:rFonts w:ascii="Georgia" w:hAnsi="Georgia" w:cs="Georgia" w:eastAsia="Georgia"/>
-          <w:b w:val="1"/>
-          <w:bCs w:val="1"/>
-          <w:rtl w:val="0"/>
+          <w:sz w:val="22"/>
+          <w:rtl w:val="0"/>
+          <w:b/>
+          <w:bCs/>
         </w:rPr>
         <w:t xml:space="preserve">For writing instructors and thesis advisers at PSAU, </w:t>
       </w:r>
       <w:r>
         <w:rPr>
           <w:rFonts w:ascii="Georgia" w:hAnsi="Georgia" w:cs="Georgia" w:eastAsia="Georgia"/>
-          <w:b w:val="0"/>
-          <w:bCs w:val="0"/>
-          <w:rtl w:val="0"/>
-        </w:rPr>
-        <w:t xml:space="preserve">the study provides an empirical baseline of how uncertainty is managed in the ratified abstracts of three applied life sciences programs. That baseline can support more targeted feedback than generic advice to “be cautious.”</w:t>
+          <w:sz w:val="22"/>
+          <w:rtl w:val="0"/>
+          <w:b w:val="0"/>
+          <w:bCs w:val="0"/>
+        </w:rPr>
+        <w:t>the study provides an empirical baseline of how uncertainty is managed in the ratified abstracts of three applied life sciences programs. That baseline can support more targeted feedback than generic advice to “be cautious.”</w:t>
       </w:r>
     </w:p>
     <w:p>
@@ -1328,20 +1330,22 @@
       <w:r>
         <w:rPr>
           <w:rFonts w:ascii="Georgia" w:hAnsi="Georgia" w:cs="Georgia" w:eastAsia="Georgia"/>
-          <w:b w:val="1"/>
-          <w:bCs w:val="1"/>
-          <w:rtl w:val="0"/>
+          <w:sz w:val="22"/>
+          <w:rtl w:val="0"/>
+          <w:b/>
+          <w:bCs/>
         </w:rPr>
         <w:t xml:space="preserve">For academic writing researchers, </w:t>
       </w:r>
       <w:r>
         <w:rPr>
           <w:rFonts w:ascii="Georgia" w:hAnsi="Georgia" w:cs="Georgia" w:eastAsia="Georgia"/>
-          <w:b w:val="0"/>
-          <w:bCs w:val="0"/>
-          <w:rtl w:val="0"/>
-        </w:rPr>
-        <w:t xml:space="preserve">it adds Philippine applied-science abstract data to a body of work that has drawn mainly from other regional and disciplinary settings.</w:t>
+          <w:sz w:val="22"/>
+          <w:rtl w:val="0"/>
+          <w:b w:val="0"/>
+          <w:bCs w:val="0"/>
+        </w:rPr>
+        <w:t>it adds Philippine applied-science abstract data to a body of work that has drawn mainly from other regional and disciplinary settings.</w:t>
       </w:r>
     </w:p>
     <w:p>
@@ -1354,20 +1358,22 @@
       <w:r>
         <w:rPr>
           <w:rFonts w:ascii="Georgia" w:hAnsi="Georgia" w:cs="Georgia" w:eastAsia="Georgia"/>
-          <w:b w:val="1"/>
-          <w:bCs w:val="1"/>
-          <w:rtl w:val="0"/>
+          <w:sz w:val="22"/>
+          <w:rtl w:val="0"/>
+          <w:b/>
+          <w:bCs/>
         </w:rPr>
         <w:t xml:space="preserve">For the BAELS program, </w:t>
       </w:r>
       <w:r>
         <w:rPr>
           <w:rFonts w:ascii="Georgia" w:hAnsi="Georgia" w:cs="Georgia" w:eastAsia="Georgia"/>
-          <w:b w:val="0"/>
-          <w:bCs w:val="0"/>
-          <w:rtl w:val="0"/>
-        </w:rPr>
-        <w:t xml:space="preserve">it shows that corpus-assisted discourse analysis is a viable undergraduate thesis methodology and yields findings usable in local writing pedagogy.</w:t>
+          <w:sz w:val="22"/>
+          <w:rtl w:val="0"/>
+          <w:b w:val="0"/>
+          <w:bCs w:val="0"/>
+        </w:rPr>
+        <w:t>it shows that corpus-assisted discourse analysis is a viable undergraduate thesis methodology and yields findings usable in local writing pedagogy.</w:t>
       </w:r>
     </w:p>
     <w:p>
@@ -1380,20 +1386,22 @@
       <w:r>
         <w:rPr>
           <w:rFonts w:ascii="Georgia" w:hAnsi="Georgia" w:cs="Georgia" w:eastAsia="Georgia"/>
-          <w:b w:val="1"/>
-          <w:bCs w:val="1"/>
-          <w:rtl w:val="0"/>
+          <w:sz w:val="22"/>
+          <w:rtl w:val="0"/>
+          <w:b/>
+          <w:bCs/>
         </w:rPr>
         <w:t xml:space="preserve">For future researchers, </w:t>
       </w:r>
       <w:r>
         <w:rPr>
           <w:rFonts w:ascii="Georgia" w:hAnsi="Georgia" w:cs="Georgia" w:eastAsia="Georgia"/>
-          <w:b w:val="0"/>
-          <w:bCs w:val="0"/>
-          <w:rtl w:val="0"/>
-        </w:rPr>
-        <w:t xml:space="preserve">the sampling design, coding decision rules, and false-positive log offer a replicable protocol for similar corpus studies.</w:t>
+          <w:sz w:val="22"/>
+          <w:rtl w:val="0"/>
+          <w:b w:val="0"/>
+          <w:bCs w:val="0"/>
+        </w:rPr>
+        <w:t>the sampling design, coding decision rules, and false-positive log offer a replicable protocol for similar corpus studies.</w:t>
       </w:r>
     </w:p>
     <w:p>
@@ -1643,29 +1651,29 @@
       </w:pPr>
       <w:r>
         <w:rPr>
-          <w:rFonts w:ascii="Georgia" w:cs="Georgia" w:eastAsia="Georgia" w:hAnsi="Georgia"/>
-          <w:b w:val="1"/>
-          <w:bCs w:val="1"/>
-          <w:i w:val="0"/>
-          <w:iCs w:val="0"/>
-          <w:sz w:val="22"/>
-          <w:szCs w:val="22"/>
-          <w:rtl w:val="0"/>
+          <w:rFonts w:ascii="Georgia" w:hAnsi="Georgia" w:cs="Georgia" w:eastAsia="Georgia"/>
+          <w:i w:val="0"/>
+          <w:iCs w:val="0"/>
+          <w:sz w:val="22"/>
+          <w:szCs w:val="22"/>
+          <w:rtl w:val="0"/>
+          <w:b/>
+          <w:bCs/>
         </w:rPr>
         <w:t xml:space="preserve">Abstract, </w:t>
       </w:r>
       <w:r>
         <w:rPr>
-          <w:rFonts w:ascii="Georgia" w:cs="Georgia" w:eastAsia="Georgia" w:hAnsi="Georgia"/>
-          <w:b w:val="0"/>
-          <w:bCs w:val="0"/>
-          <w:i w:val="0"/>
-          <w:iCs w:val="0"/>
-          <w:sz w:val="22"/>
-          <w:szCs w:val="22"/>
-          <w:rtl w:val="0"/>
-        </w:rPr>
-        <w:t xml:space="preserve">conceptually, an abstract is a concise, self-contained summary of a research work. Operationally, this refers to the complete English-language summary section of undergraduate theses archived in the PSAU institutional repository from 2023 to 2025. It contains research objectives, methods, results, and conclusions.</w:t>
+          <w:rFonts w:ascii="Georgia" w:hAnsi="Georgia" w:cs="Georgia" w:eastAsia="Georgia"/>
+          <w:i w:val="0"/>
+          <w:iCs w:val="0"/>
+          <w:sz w:val="22"/>
+          <w:szCs w:val="22"/>
+          <w:rtl w:val="0"/>
+          <w:b w:val="0"/>
+          <w:bCs w:val="0"/>
+        </w:rPr>
+        <w:t>conceptually, an abstract is a concise, self-contained summary of a research work. Operationally, this refers to the complete English-language summary section of undergraduate theses archived in the PSAU institutional repository from 2023 to 2025. It contains research objectives, methods, results, and conclusions.</w:t>
       </w:r>
       <w:r>
         <w:rPr>
@@ -1682,29 +1690,29 @@
       </w:pPr>
       <w:r>
         <w:rPr>
-          <w:rFonts w:ascii="Georgia" w:cs="Georgia" w:eastAsia="Georgia" w:hAnsi="Georgia"/>
-          <w:b w:val="1"/>
-          <w:bCs w:val="1"/>
-          <w:i w:val="0"/>
-          <w:iCs w:val="0"/>
-          <w:sz w:val="22"/>
-          <w:szCs w:val="22"/>
-          <w:rtl w:val="0"/>
+          <w:rFonts w:ascii="Georgia" w:hAnsi="Georgia" w:cs="Georgia" w:eastAsia="Georgia"/>
+          <w:i w:val="0"/>
+          <w:iCs w:val="0"/>
+          <w:sz w:val="22"/>
+          <w:szCs w:val="22"/>
+          <w:rtl w:val="0"/>
+          <w:b/>
+          <w:bCs/>
         </w:rPr>
         <w:t xml:space="preserve">Adverbial Hedges, </w:t>
       </w:r>
       <w:r>
         <w:rPr>
-          <w:rFonts w:ascii="Georgia" w:cs="Georgia" w:eastAsia="Georgia" w:hAnsi="Georgia"/>
-          <w:b w:val="0"/>
-          <w:bCs w:val="0"/>
-          <w:i w:val="0"/>
-          <w:iCs w:val="0"/>
-          <w:sz w:val="22"/>
-          <w:szCs w:val="22"/>
-          <w:rtl w:val="0"/>
-        </w:rPr>
-        <w:t xml:space="preserve">conceptually, adverbial hedges are adverbs or adverbial expressions that qualify the scope, frequency, or certainty of a proposition. Operationally, these include generally, typically, possibly, probably, relatively, and essentially. These are coded in this study when they restrict the generalizability of a claim rather than describe a procedural norm.</w:t>
+          <w:rFonts w:ascii="Georgia" w:hAnsi="Georgia" w:cs="Georgia" w:eastAsia="Georgia"/>
+          <w:i w:val="0"/>
+          <w:iCs w:val="0"/>
+          <w:sz w:val="22"/>
+          <w:szCs w:val="22"/>
+          <w:rtl w:val="0"/>
+          <w:b w:val="0"/>
+          <w:bCs w:val="0"/>
+        </w:rPr>
+        <w:t>conceptually, adverbial hedges are adverbs or adverbial expressions that qualify the scope, frequency, or certainty of a proposition. Operationally, these include generally, typically, possibly, probably, relatively, and essentially. These are coded in this study when they restrict the generalizability of a claim rather than describe a procedural norm.</w:t>
       </w:r>
       <w:r>
         <w:rPr>
@@ -1721,29 +1729,29 @@
       </w:pPr>
       <w:r>
         <w:rPr>
-          <w:rFonts w:ascii="Georgia" w:cs="Georgia" w:eastAsia="Georgia" w:hAnsi="Georgia"/>
-          <w:b w:val="1"/>
-          <w:bCs w:val="1"/>
-          <w:i w:val="0"/>
-          <w:iCs w:val="0"/>
-          <w:sz w:val="22"/>
-          <w:szCs w:val="22"/>
-          <w:rtl w:val="0"/>
+          <w:rFonts w:ascii="Georgia" w:hAnsi="Georgia" w:cs="Georgia" w:eastAsia="Georgia"/>
+          <w:i w:val="0"/>
+          <w:iCs w:val="0"/>
+          <w:sz w:val="22"/>
+          <w:szCs w:val="22"/>
+          <w:rtl w:val="0"/>
+          <w:b/>
+          <w:bCs/>
         </w:rPr>
         <w:t xml:space="preserve">Applied Life Sciences, </w:t>
       </w:r>
       <w:r>
         <w:rPr>
-          <w:rFonts w:ascii="Georgia" w:cs="Georgia" w:eastAsia="Georgia" w:hAnsi="Georgia"/>
-          <w:b w:val="0"/>
-          <w:bCs w:val="0"/>
-          <w:i w:val="0"/>
-          <w:iCs w:val="0"/>
-          <w:sz w:val="22"/>
-          <w:szCs w:val="22"/>
-          <w:rtl w:val="0"/>
-        </w:rPr>
-        <w:t xml:space="preserve">conceptually, applied life sciences refer to disciplines that apply scientific knowledge to the study and management of living organisms and biological systems. Operationally, this refers to the three specific undergraduate programs at PSAU included in the study: Agriculture, Biology, and Veterinary Medicine.</w:t>
+          <w:rFonts w:ascii="Georgia" w:hAnsi="Georgia" w:cs="Georgia" w:eastAsia="Georgia"/>
+          <w:i w:val="0"/>
+          <w:iCs w:val="0"/>
+          <w:sz w:val="22"/>
+          <w:szCs w:val="22"/>
+          <w:rtl w:val="0"/>
+          <w:b w:val="0"/>
+          <w:bCs w:val="0"/>
+        </w:rPr>
+        <w:t>conceptually, applied life sciences refer to disciplines that apply scientific knowledge to the study and management of living organisms and biological systems. Operationally, this refers to the three specific undergraduate programs at PSAU included in the study: Agriculture, Biology, and Veterinary Medicine.</w:t>
       </w:r>
       <w:r>
         <w:rPr>
@@ -1760,29 +1768,29 @@
       </w:pPr>
       <w:r>
         <w:rPr>
-          <w:rFonts w:ascii="Georgia" w:cs="Georgia" w:eastAsia="Georgia" w:hAnsi="Georgia"/>
-          <w:b w:val="1"/>
-          <w:bCs w:val="1"/>
-          <w:i w:val="0"/>
-          <w:iCs w:val="0"/>
-          <w:sz w:val="22"/>
-          <w:szCs w:val="22"/>
-          <w:rtl w:val="0"/>
+          <w:rFonts w:ascii="Georgia" w:hAnsi="Georgia" w:cs="Georgia" w:eastAsia="Georgia"/>
+          <w:i w:val="0"/>
+          <w:iCs w:val="0"/>
+          <w:sz w:val="22"/>
+          <w:szCs w:val="22"/>
+          <w:rtl w:val="0"/>
+          <w:b/>
+          <w:bCs/>
         </w:rPr>
         <w:t xml:space="preserve">Claim Responsibility, </w:t>
       </w:r>
       <w:r>
         <w:rPr>
-          <w:rFonts w:ascii="Georgia" w:cs="Georgia" w:eastAsia="Georgia" w:hAnsi="Georgia"/>
-          <w:b w:val="0"/>
-          <w:bCs w:val="0"/>
-          <w:i w:val="0"/>
-          <w:iCs w:val="0"/>
-          <w:sz w:val="22"/>
-          <w:szCs w:val="22"/>
-          <w:rtl w:val="0"/>
-        </w:rPr>
-        <w:t xml:space="preserve">conceptually, claim responsibility refers to the epistemic obligation a writer accepts for the accuracy, truth, or limitations of a statement (Salager-Meyer, 1994). Writers use hedges to distribute this responsibility between themselves, their data, or external factors. Operationally, this serves as the interpretive lens for analyzing why specific hedges were chosen in the abstracts.</w:t>
+          <w:rFonts w:ascii="Georgia" w:hAnsi="Georgia" w:cs="Georgia" w:eastAsia="Georgia"/>
+          <w:i w:val="0"/>
+          <w:iCs w:val="0"/>
+          <w:sz w:val="22"/>
+          <w:szCs w:val="22"/>
+          <w:rtl w:val="0"/>
+          <w:b w:val="0"/>
+          <w:bCs w:val="0"/>
+        </w:rPr>
+        <w:t>conceptually, claim responsibility refers to the epistemic obligation a writer accepts for the accuracy, truth, or limitations of a statement (Salager-Meyer, 1994). Writers use hedges to distribute this responsibility between themselves, their data, or external factors. Operationally, this serves as the interpretive lens for analyzing why specific hedges were chosen in the abstracts.</w:t>
       </w:r>
       <w:r>
         <w:rPr>
@@ -1799,29 +1807,29 @@
       </w:pPr>
       <w:r>
         <w:rPr>
-          <w:rFonts w:ascii="Georgia" w:cs="Georgia" w:eastAsia="Georgia" w:hAnsi="Georgia"/>
-          <w:b w:val="1"/>
-          <w:bCs w:val="1"/>
-          <w:i w:val="0"/>
-          <w:iCs w:val="0"/>
-          <w:sz w:val="22"/>
-          <w:szCs w:val="22"/>
-          <w:rtl w:val="0"/>
+          <w:rFonts w:ascii="Georgia" w:hAnsi="Georgia" w:cs="Georgia" w:eastAsia="Georgia"/>
+          <w:i w:val="0"/>
+          <w:iCs w:val="0"/>
+          <w:sz w:val="22"/>
+          <w:szCs w:val="22"/>
+          <w:rtl w:val="0"/>
+          <w:b/>
+          <w:bCs/>
         </w:rPr>
         <w:t xml:space="preserve">Chi-Square Test of Independence, </w:t>
       </w:r>
       <w:r>
         <w:rPr>
-          <w:rFonts w:ascii="Georgia" w:cs="Georgia" w:eastAsia="Georgia" w:hAnsi="Georgia"/>
-          <w:b w:val="0"/>
-          <w:bCs w:val="0"/>
-          <w:i w:val="0"/>
-          <w:iCs w:val="0"/>
-          <w:sz w:val="22"/>
-          <w:szCs w:val="22"/>
-          <w:rtl w:val="0"/>
-        </w:rPr>
-        <w:t xml:space="preserve">conceptually, a chi-square test of independence evaluates whether two categorical variables are associated. Operationally, this study used it to test the association between discipline and zero-hedge status (zero vs. nonzero). The test statistic is χ² = Σ [(Oᵢ − Eᵢ)² / Eᵢ], where Oᵢ is the observed frequency in cell i and Eᵢ is the expected frequency under independence. Degrees of freedom = (rows − 1) × (columns − 1). The reported result was χ² = 5.07, df = 2, p = .079.</w:t>
+          <w:rFonts w:ascii="Georgia" w:hAnsi="Georgia" w:cs="Georgia" w:eastAsia="Georgia"/>
+          <w:i w:val="0"/>
+          <w:iCs w:val="0"/>
+          <w:sz w:val="22"/>
+          <w:szCs w:val="22"/>
+          <w:rtl w:val="0"/>
+          <w:b w:val="0"/>
+          <w:bCs w:val="0"/>
+        </w:rPr>
+        <w:t>conceptually, a chi-square test of independence evaluates whether two categorical variables are associated. Operationally, this study used it to test the association between discipline and zero-hedge status (zero vs. nonzero). The test statistic is χ² = Σ [(Oᵢ − Eᵢ)² / Eᵢ], where Oᵢ is the observed frequency in cell i and Eᵢ is the expected frequency under independence. Degrees of freedom = (rows − 1) × (columns − 1). The reported result was χ² = 5.07, df = 2, p = .079.</w:t>
       </w:r>
       <w:r>
         <w:rPr>
@@ -1838,29 +1846,29 @@
       </w:pPr>
       <w:r>
         <w:rPr>
-          <w:rFonts w:ascii="Georgia" w:cs="Georgia" w:eastAsia="Georgia" w:hAnsi="Georgia"/>
-          <w:b w:val="1"/>
-          <w:bCs w:val="1"/>
-          <w:i w:val="0"/>
-          <w:iCs w:val="0"/>
-          <w:sz w:val="22"/>
-          <w:szCs w:val="22"/>
-          <w:rtl w:val="0"/>
+          <w:rFonts w:ascii="Georgia" w:hAnsi="Georgia" w:cs="Georgia" w:eastAsia="Georgia"/>
+          <w:i w:val="0"/>
+          <w:iCs w:val="0"/>
+          <w:sz w:val="22"/>
+          <w:szCs w:val="22"/>
+          <w:rtl w:val="0"/>
+          <w:b/>
+          <w:bCs/>
         </w:rPr>
         <w:t xml:space="preserve">Clause-Level Hedges, </w:t>
       </w:r>
       <w:r>
         <w:rPr>
-          <w:rFonts w:ascii="Georgia" w:cs="Georgia" w:eastAsia="Georgia" w:hAnsi="Georgia"/>
-          <w:b w:val="0"/>
-          <w:bCs w:val="0"/>
-          <w:i w:val="0"/>
-          <w:iCs w:val="0"/>
-          <w:sz w:val="22"/>
-          <w:szCs w:val="22"/>
-          <w:rtl w:val="0"/>
-        </w:rPr>
-        <w:t xml:space="preserve">conceptually, clause-level hedges are syntactic structures that frame a proposition as tentative, approximate, or subject to qualification. Operationally, these include expressions such as it seems that, it is possible that, to some extent, and in our view. These are coded in this study when the entire clause functions to express the writer’s epistemic reservation about the following or embedded proposition.</w:t>
+          <w:rFonts w:ascii="Georgia" w:hAnsi="Georgia" w:cs="Georgia" w:eastAsia="Georgia"/>
+          <w:i w:val="0"/>
+          <w:iCs w:val="0"/>
+          <w:sz w:val="22"/>
+          <w:szCs w:val="22"/>
+          <w:rtl w:val="0"/>
+          <w:b w:val="0"/>
+          <w:bCs w:val="0"/>
+        </w:rPr>
+        <w:t>conceptually, clause-level hedges are syntactic structures that frame a proposition as tentative, approximate, or subject to qualification. Operationally, these include expressions such as it seems that, it is possible that, to some extent, and in our view. These are coded in this study when the entire clause functions to express the writer’s epistemic reservation about the following or embedded proposition.</w:t>
       </w:r>
       <w:r>
         <w:rPr>
@@ -1877,29 +1885,29 @@
       </w:pPr>
       <w:r>
         <w:rPr>
-          <w:rFonts w:ascii="Georgia" w:cs="Georgia" w:eastAsia="Georgia" w:hAnsi="Georgia"/>
-          <w:b w:val="1"/>
-          <w:bCs w:val="1"/>
-          <w:i w:val="0"/>
-          <w:iCs w:val="0"/>
-          <w:sz w:val="22"/>
-          <w:szCs w:val="22"/>
-          <w:rtl w:val="0"/>
+          <w:rFonts w:ascii="Georgia" w:hAnsi="Georgia" w:cs="Georgia" w:eastAsia="Georgia"/>
+          <w:i w:val="0"/>
+          <w:iCs w:val="0"/>
+          <w:sz w:val="22"/>
+          <w:szCs w:val="22"/>
+          <w:rtl w:val="0"/>
+          <w:b/>
+          <w:bCs/>
         </w:rPr>
         <w:t xml:space="preserve">Cohen’s Kappa (κ), </w:t>
       </w:r>
       <w:r>
         <w:rPr>
-          <w:rFonts w:ascii="Georgia" w:cs="Georgia" w:eastAsia="Georgia" w:hAnsi="Georgia"/>
-          <w:b w:val="0"/>
-          <w:bCs w:val="0"/>
-          <w:i w:val="0"/>
-          <w:iCs w:val="0"/>
-          <w:sz w:val="22"/>
-          <w:szCs w:val="22"/>
-          <w:rtl w:val="0"/>
-        </w:rPr>
-        <w:t xml:space="preserve">conceptually, Cohen’s kappa measures inter- or intra-rater agreement for categorical coding beyond chance. Operationally, this study used it for intra-rater reliability on a second pass of six abstracts. The formula is κ = (Pₒ − Pₑ) / (1 − Pₑ), where Pₒ is the observed proportion of agreement and Pₑ is the expected agreement by chance. Landis and Koch (1977) interpret κ values as: &lt;0.00 poor, 0.00–0.20 slight, 0.21–0.40 fair, 0.41–0.60 moderate, 0.61–0.80 substantial, 0.81–1.00 almost perfect. The intra-rater result was κ = 0.89.</w:t>
+          <w:rFonts w:ascii="Georgia" w:hAnsi="Georgia" w:cs="Georgia" w:eastAsia="Georgia"/>
+          <w:i w:val="0"/>
+          <w:iCs w:val="0"/>
+          <w:sz w:val="22"/>
+          <w:szCs w:val="22"/>
+          <w:rtl w:val="0"/>
+          <w:b w:val="0"/>
+          <w:bCs w:val="0"/>
+        </w:rPr>
+        <w:t>conceptually, Cohen’s kappa measures inter- or intra-rater agreement for categorical coding beyond chance. Operationally, this study used it for intra-rater reliability on a second pass of six abstracts. The formula is κ = (Pₒ − Pₑ) / (1 − Pₑ), where Pₒ is the observed proportion of agreement and Pₑ is the expected agreement by chance. Landis and Koch (1977) interpret κ values as: &lt;0.00 poor, 0.00–0.20 slight, 0.21–0.40 fair, 0.41–0.60 moderate, 0.61–0.80 substantial, 0.81–1.00 almost perfect. The intra-rater result was κ = 0.89.</w:t>
       </w:r>
       <w:r>
         <w:rPr>
@@ -1916,29 +1924,29 @@
       </w:pPr>
       <w:r>
         <w:rPr>
-          <w:rFonts w:ascii="Georgia" w:cs="Georgia" w:eastAsia="Georgia" w:hAnsi="Georgia"/>
-          <w:b w:val="1"/>
-          <w:bCs w:val="1"/>
-          <w:i w:val="0"/>
-          <w:iCs w:val="0"/>
-          <w:sz w:val="22"/>
-          <w:szCs w:val="22"/>
-          <w:rtl w:val="0"/>
+          <w:rFonts w:ascii="Georgia" w:hAnsi="Georgia" w:cs="Georgia" w:eastAsia="Georgia"/>
+          <w:i w:val="0"/>
+          <w:iCs w:val="0"/>
+          <w:sz w:val="22"/>
+          <w:szCs w:val="22"/>
+          <w:rtl w:val="0"/>
+          <w:b/>
+          <w:bCs/>
         </w:rPr>
         <w:t xml:space="preserve">Corpus-Assisted Discourse Analysis, </w:t>
       </w:r>
       <w:r>
         <w:rPr>
-          <w:rFonts w:ascii="Georgia" w:cs="Georgia" w:eastAsia="Georgia" w:hAnsi="Georgia"/>
-          <w:b w:val="0"/>
-          <w:bCs w:val="0"/>
-          <w:i w:val="0"/>
-          <w:iCs w:val="0"/>
-          <w:sz w:val="22"/>
-          <w:szCs w:val="22"/>
-          <w:rtl w:val="0"/>
-        </w:rPr>
-        <w:t xml:space="preserve">conceptually, corpus-assisted discourse analysis uses systematic text collections to identify linguistic patterns, combining quantitative frequency measures with qualitative functional interpretation. Operationally, this refers to the manual frequency counting, functional coding, and cross-disciplinary comparison of hedging devices across 60 PSAU thesis abstracts using a Google Sheets coding template.</w:t>
+          <w:rFonts w:ascii="Georgia" w:hAnsi="Georgia" w:cs="Georgia" w:eastAsia="Georgia"/>
+          <w:i w:val="0"/>
+          <w:iCs w:val="0"/>
+          <w:sz w:val="22"/>
+          <w:szCs w:val="22"/>
+          <w:rtl w:val="0"/>
+          <w:b w:val="0"/>
+          <w:bCs w:val="0"/>
+        </w:rPr>
+        <w:t>conceptually, corpus-assisted discourse analysis uses systematic text collections to identify linguistic patterns, combining quantitative frequency measures with qualitative functional interpretation. Operationally, this refers to the manual frequency counting, functional coding, and cross-disciplinary comparison of hedging devices across 60 PSAU thesis abstracts using a Google Sheets coding template.</w:t>
       </w:r>
       <w:r>
         <w:rPr>
@@ -1955,29 +1963,29 @@
       </w:pPr>
       <w:r>
         <w:rPr>
-          <w:rFonts w:ascii="Georgia" w:cs="Georgia" w:eastAsia="Georgia" w:hAnsi="Georgia"/>
-          <w:b w:val="1"/>
-          <w:bCs w:val="1"/>
-          <w:i w:val="0"/>
-          <w:iCs w:val="0"/>
-          <w:sz w:val="22"/>
-          <w:szCs w:val="22"/>
-          <w:rtl w:val="0"/>
+          <w:rFonts w:ascii="Georgia" w:hAnsi="Georgia" w:cs="Georgia" w:eastAsia="Georgia"/>
+          <w:i w:val="0"/>
+          <w:iCs w:val="0"/>
+          <w:sz w:val="22"/>
+          <w:szCs w:val="22"/>
+          <w:rtl w:val="0"/>
+          <w:b/>
+          <w:bCs/>
         </w:rPr>
         <w:t xml:space="preserve">Disciplinary Variation, </w:t>
       </w:r>
       <w:r>
         <w:rPr>
-          <w:rFonts w:ascii="Georgia" w:cs="Georgia" w:eastAsia="Georgia" w:hAnsi="Georgia"/>
-          <w:b w:val="0"/>
-          <w:bCs w:val="0"/>
-          <w:i w:val="0"/>
-          <w:iCs w:val="0"/>
-          <w:sz w:val="22"/>
-          <w:szCs w:val="22"/>
-          <w:rtl w:val="0"/>
-        </w:rPr>
-        <w:t xml:space="preserve">conceptually, disciplinary variation refers to systematic differences in language use across academic fields arising from different epistemic norms, evidence types, and rhetorical conventions. Operationally, this refers to observable differences in hedging frequency, type, and function across Agriculture, Veterinary Medicine, and Biology abstracts in this corpus.</w:t>
+          <w:rFonts w:ascii="Georgia" w:hAnsi="Georgia" w:cs="Georgia" w:eastAsia="Georgia"/>
+          <w:i w:val="0"/>
+          <w:iCs w:val="0"/>
+          <w:sz w:val="22"/>
+          <w:szCs w:val="22"/>
+          <w:rtl w:val="0"/>
+          <w:b w:val="0"/>
+          <w:bCs w:val="0"/>
+        </w:rPr>
+        <w:t>conceptually, disciplinary variation refers to systematic differences in language use across academic fields arising from different epistemic norms, evidence types, and rhetorical conventions. Operationally, this refers to observable differences in hedging frequency, type, and function across Agriculture, Veterinary Medicine, and Biology abstracts in this corpus.</w:t>
       </w:r>
       <w:r>
         <w:rPr>
@@ -1994,29 +2002,29 @@
       </w:pPr>
       <w:r>
         <w:rPr>
-          <w:rFonts w:ascii="Georgia" w:cs="Georgia" w:eastAsia="Georgia" w:hAnsi="Georgia"/>
-          <w:b w:val="1"/>
-          <w:bCs w:val="1"/>
-          <w:i w:val="0"/>
-          <w:iCs w:val="0"/>
-          <w:sz w:val="22"/>
-          <w:szCs w:val="22"/>
-          <w:rtl w:val="0"/>
-        </w:rPr>
-        <w:t xml:space="preserve">Epistemic Stance, conceptually, epistemic stance refers to the linguistic expression of a writer’s degree of commitment to the truth, certainty, or reliability of a proposition. It signals the writer’s judgment about the status of the knowledge they are presenting. Operationally, this refers to the aggregate pattern of hedging devices used in an abstract. A high frequency of hedges indicates a cautious or tentative stance, while a low frequency or absence of hedges records fewer overt markers of caution. It does not by itself establish absolute commitment, especially where findings are binary or measured.</w:t>
-      </w:r>
-      <w:r>
-        <w:rPr>
-          <w:rFonts w:ascii="Georgia" w:cs="Georgia" w:eastAsia="Georgia" w:hAnsi="Georgia"/>
-          <w:b w:val="0"/>
-          <w:bCs w:val="0"/>
-          <w:i w:val="0"/>
-          <w:iCs w:val="0"/>
-          <w:sz w:val="22"/>
-          <w:szCs w:val="22"/>
-          <w:rtl w:val="0"/>
-        </w:rPr>
-        <w:t xml:space="preserve"/>
+          <w:rFonts w:ascii="Georgia" w:hAnsi="Georgia" w:cs="Georgia" w:eastAsia="Georgia"/>
+          <w:i w:val="0"/>
+          <w:iCs w:val="0"/>
+          <w:sz w:val="22"/>
+          <w:szCs w:val="22"/>
+          <w:rtl w:val="0"/>
+          <w:b/>
+          <w:bCs/>
+        </w:rPr>
+        <w:t xml:space="preserve">Epistemic Stance, </w:t>
+      </w:r>
+      <w:r>
+        <w:rPr>
+          <w:rFonts w:ascii="Georgia" w:hAnsi="Georgia" w:cs="Georgia" w:eastAsia="Georgia"/>
+          <w:i w:val="0"/>
+          <w:iCs w:val="0"/>
+          <w:sz w:val="22"/>
+          <w:szCs w:val="22"/>
+          <w:rtl w:val="0"/>
+          <w:b w:val="0"/>
+          <w:bCs w:val="0"/>
+        </w:rPr>
+        <w:t>conceptually, epistemic stance refers to the linguistic expression of a writer’s degree of commitment to the truth, certainty, or reliability of a proposition. It signals the writer’s judgment about the status of the knowledge they are presenting. Operationally, this refers to the aggregate pattern of hedging devices used in an abstract. A high frequency of hedges indicates a cautious or tentative stance, while a low frequency or absence of hedges records fewer overt markers of caution. It does not by itself establish absolute commitment, especially where findings are binary or measured.</w:t>
       </w:r>
       <w:r>
         <w:rPr>
@@ -2033,29 +2041,29 @@
       </w:pPr>
       <w:r>
         <w:rPr>
-          <w:rFonts w:ascii="Georgia" w:cs="Georgia" w:eastAsia="Georgia" w:hAnsi="Georgia"/>
-          <w:b w:val="1"/>
-          <w:bCs w:val="1"/>
-          <w:i w:val="0"/>
-          <w:iCs w:val="0"/>
-          <w:sz w:val="22"/>
-          <w:szCs w:val="22"/>
-          <w:rtl w:val="0"/>
+          <w:rFonts w:ascii="Georgia" w:hAnsi="Georgia" w:cs="Georgia" w:eastAsia="Georgia"/>
+          <w:i w:val="0"/>
+          <w:iCs w:val="0"/>
+          <w:sz w:val="22"/>
+          <w:szCs w:val="22"/>
+          <w:rtl w:val="0"/>
+          <w:b/>
+          <w:bCs/>
         </w:rPr>
         <w:t xml:space="preserve">Epistemic Weight, </w:t>
       </w:r>
       <w:r>
         <w:rPr>
-          <w:rFonts w:ascii="Georgia" w:cs="Georgia" w:eastAsia="Georgia" w:hAnsi="Georgia"/>
-          <w:b w:val="0"/>
-          <w:bCs w:val="0"/>
-          <w:i w:val="0"/>
-          <w:iCs w:val="0"/>
-          <w:sz w:val="22"/>
-          <w:szCs w:val="22"/>
-          <w:rtl w:val="0"/>
-        </w:rPr>
-        <w:t xml:space="preserve">conceptually, epistemic weight is the strength of the writer’s commitment to the truth of a proposition (how certain or tentative the claim is). Operationally, a change in epistemic weight supports an EC function label at Stage 2; Stage 1 retention uses the broader force / directness test on knowledge claims (imposition only as interpersonal softening of a claim, not as a directive).</w:t>
+          <w:rFonts w:ascii="Georgia" w:hAnsi="Georgia" w:cs="Georgia" w:eastAsia="Georgia"/>
+          <w:i w:val="0"/>
+          <w:iCs w:val="0"/>
+          <w:sz w:val="22"/>
+          <w:szCs w:val="22"/>
+          <w:rtl w:val="0"/>
+          <w:b w:val="0"/>
+          <w:bCs w:val="0"/>
+        </w:rPr>
+        <w:t>conceptually, epistemic weight is the strength of the writer’s commitment to the truth of a proposition (how certain or tentative the claim is). Operationally, a change in epistemic weight supports an EC function label at Stage 2; Stage 1 retention uses the broader force / directness test on knowledge claims (imposition only as interpersonal softening of a claim, not as a directive).</w:t>
       </w:r>
       <w:r>
         <w:rPr>
@@ -2072,29 +2080,29 @@
       </w:pPr>
       <w:r>
         <w:rPr>
-          <w:rFonts w:ascii="Georgia" w:cs="Georgia" w:eastAsia="Georgia" w:hAnsi="Georgia"/>
-          <w:b w:val="1"/>
-          <w:bCs w:val="1"/>
-          <w:i w:val="0"/>
-          <w:iCs w:val="0"/>
-          <w:sz w:val="22"/>
-          <w:szCs w:val="22"/>
-          <w:rtl w:val="0"/>
+          <w:rFonts w:ascii="Georgia" w:hAnsi="Georgia" w:cs="Georgia" w:eastAsia="Georgia"/>
+          <w:i w:val="0"/>
+          <w:iCs w:val="0"/>
+          <w:sz w:val="22"/>
+          <w:szCs w:val="22"/>
+          <w:rtl w:val="0"/>
+          <w:b/>
+          <w:bCs/>
         </w:rPr>
         <w:t xml:space="preserve">Hedge Function, </w:t>
       </w:r>
       <w:r>
         <w:rPr>
-          <w:rFonts w:ascii="Georgia" w:cs="Georgia" w:eastAsia="Georgia" w:hAnsi="Georgia"/>
-          <w:b w:val="0"/>
-          <w:bCs w:val="0"/>
-          <w:i w:val="0"/>
-          <w:iCs w:val="0"/>
-          <w:sz w:val="22"/>
-          <w:szCs w:val="22"/>
-          <w:rtl w:val="0"/>
-        </w:rPr>
-        <w:t xml:space="preserve">conceptually, hedge function refers to the rhetorical purpose a hedging device serves in its discourse context. Operationally, this refers to three categories adapted for this study from Hyland’s (1998) discussion of hedging functions (not a fixed published taxonomy). These are epistemic caution, which expresses uncertainty about a claim’s truth or accuracy, politeness, which shows deference to readers or prior research, and discourse organization, which structures text or manages reader expectations.</w:t>
+          <w:rFonts w:ascii="Georgia" w:hAnsi="Georgia" w:cs="Georgia" w:eastAsia="Georgia"/>
+          <w:i w:val="0"/>
+          <w:iCs w:val="0"/>
+          <w:sz w:val="22"/>
+          <w:szCs w:val="22"/>
+          <w:rtl w:val="0"/>
+          <w:b w:val="0"/>
+          <w:bCs w:val="0"/>
+        </w:rPr>
+        <w:t>conceptually, hedge function refers to the rhetorical purpose a hedging device serves in its discourse context. Operationally, this refers to three categories adapted for this study from Hyland’s (1998) discussion of hedging functions (not a fixed published taxonomy). These are epistemic caution, which expresses uncertainty about a claim’s truth or accuracy, politeness, which shows deference to readers or prior research, and discourse organization, which structures text or manages reader expectations.</w:t>
       </w:r>
       <w:r>
         <w:rPr>
@@ -2111,29 +2119,29 @@
       </w:pPr>
       <w:r>
         <w:rPr>
-          <w:rFonts w:ascii="Georgia" w:cs="Georgia" w:eastAsia="Georgia" w:hAnsi="Georgia"/>
-          <w:b w:val="1"/>
-          <w:bCs w:val="1"/>
-          <w:i w:val="0"/>
-          <w:iCs w:val="0"/>
-          <w:sz w:val="22"/>
-          <w:szCs w:val="22"/>
-          <w:rtl w:val="0"/>
+          <w:rFonts w:ascii="Georgia" w:hAnsi="Georgia" w:cs="Georgia" w:eastAsia="Georgia"/>
+          <w:i w:val="0"/>
+          <w:iCs w:val="0"/>
+          <w:sz w:val="22"/>
+          <w:szCs w:val="22"/>
+          <w:rtl w:val="0"/>
+          <w:b/>
+          <w:bCs/>
         </w:rPr>
         <w:t xml:space="preserve">Hedging, </w:t>
       </w:r>
       <w:r>
         <w:rPr>
-          <w:rFonts w:ascii="Georgia" w:cs="Georgia" w:eastAsia="Georgia" w:hAnsi="Georgia"/>
-          <w:b w:val="0"/>
-          <w:bCs w:val="0"/>
-          <w:i w:val="0"/>
-          <w:iCs w:val="0"/>
-          <w:sz w:val="22"/>
-          <w:szCs w:val="22"/>
-          <w:rtl w:val="0"/>
-        </w:rPr>
-        <w:t xml:space="preserve">conceptually, hedging is the use of linguistic devices to express caution or tentativeness in academic writing, serving as a mechanism for managing claim responsibility (Salager-Meyer, 1994). Operationally, this refers to four device categories identified in the corpus following Hyland’s (1998) taxonomy. These categories are lexical hedges, modal verbs, adverbial hedges, and clause-level hedges.</w:t>
+          <w:rFonts w:ascii="Georgia" w:hAnsi="Georgia" w:cs="Georgia" w:eastAsia="Georgia"/>
+          <w:i w:val="0"/>
+          <w:iCs w:val="0"/>
+          <w:sz w:val="22"/>
+          <w:szCs w:val="22"/>
+          <w:rtl w:val="0"/>
+          <w:b w:val="0"/>
+          <w:bCs w:val="0"/>
+        </w:rPr>
+        <w:t>conceptually, hedging is the use of linguistic devices to express caution or tentativeness in academic writing, serving as a mechanism for managing claim responsibility (Salager-Meyer, 1994). Operationally, this refers to four device categories identified in the corpus following Hyland’s (1998) taxonomy. These categories are lexical hedges, modal verbs, adverbial hedges, and clause-level hedges.</w:t>
       </w:r>
       <w:r>
         <w:rPr>
@@ -2150,29 +2158,29 @@
       </w:pPr>
       <w:r>
         <w:rPr>
-          <w:rFonts w:ascii="Georgia" w:cs="Georgia" w:eastAsia="Georgia" w:hAnsi="Georgia"/>
-          <w:b w:val="1"/>
-          <w:bCs w:val="1"/>
-          <w:i w:val="0"/>
-          <w:iCs w:val="0"/>
-          <w:sz w:val="22"/>
-          <w:szCs w:val="22"/>
-          <w:rtl w:val="0"/>
+          <w:rFonts w:ascii="Georgia" w:hAnsi="Georgia" w:cs="Georgia" w:eastAsia="Georgia"/>
+          <w:i w:val="0"/>
+          <w:iCs w:val="0"/>
+          <w:sz w:val="22"/>
+          <w:szCs w:val="22"/>
+          <w:rtl w:val="0"/>
+          <w:b/>
+          <w:bCs/>
         </w:rPr>
         <w:t xml:space="preserve">Kruskal-Wallis Test, </w:t>
       </w:r>
       <w:r>
         <w:rPr>
-          <w:rFonts w:ascii="Georgia" w:cs="Georgia" w:eastAsia="Georgia" w:hAnsi="Georgia"/>
-          <w:b w:val="0"/>
-          <w:bCs w:val="0"/>
-          <w:i w:val="0"/>
-          <w:iCs w:val="0"/>
-          <w:sz w:val="22"/>
-          <w:szCs w:val="22"/>
-          <w:rtl w:val="0"/>
-        </w:rPr>
-        <w:t xml:space="preserve">conceptually, the Kruskal-Wallis test is a non-parametric rank-based alternative to one-way ANOVA for comparing distributions across three or more independent groups. Operationally, this study applied it to per-abstract hedge rates (hedges per 100 words) across the three disciplines. The test statistic is H = [12 / (N(N+1))] × Σ (Rⱼ² / nⱼ) − 3(N+1), where N is the total number of observations, nⱼ is the size of group j, and Rⱼ is the sum of ranks for group j. The reported result was H ≈ 7.39, p = .025.</w:t>
+          <w:rFonts w:ascii="Georgia" w:hAnsi="Georgia" w:cs="Georgia" w:eastAsia="Georgia"/>
+          <w:i w:val="0"/>
+          <w:iCs w:val="0"/>
+          <w:sz w:val="22"/>
+          <w:szCs w:val="22"/>
+          <w:rtl w:val="0"/>
+          <w:b w:val="0"/>
+          <w:bCs w:val="0"/>
+        </w:rPr>
+        <w:t>conceptually, the Kruskal-Wallis test is a non-parametric rank-based alternative to one-way ANOVA for comparing distributions across three or more independent groups. Operationally, this study applied it to per-abstract hedge rates (hedges per 100 words) across the three disciplines. The test statistic is H = [12 / (N(N+1))] × Σ (Rⱼ² / nⱼ) − 3(N+1), where N is the total number of observations, nⱼ is the size of group j, and Rⱼ is the sum of ranks for group j. The reported result was H ≈ 7.39, p = .025.</w:t>
       </w:r>
       <w:r>
         <w:rPr>
@@ -2189,29 +2197,29 @@
       </w:pPr>
       <w:r>
         <w:rPr>
-          <w:rFonts w:ascii="Georgia" w:cs="Georgia" w:eastAsia="Georgia" w:hAnsi="Georgia"/>
-          <w:b w:val="1"/>
-          <w:bCs w:val="1"/>
-          <w:i w:val="0"/>
-          <w:iCs w:val="0"/>
-          <w:sz w:val="22"/>
-          <w:szCs w:val="22"/>
-          <w:rtl w:val="0"/>
+          <w:rFonts w:ascii="Georgia" w:hAnsi="Georgia" w:cs="Georgia" w:eastAsia="Georgia"/>
+          <w:i w:val="0"/>
+          <w:iCs w:val="0"/>
+          <w:sz w:val="22"/>
+          <w:szCs w:val="22"/>
+          <w:rtl w:val="0"/>
+          <w:b/>
+          <w:bCs/>
         </w:rPr>
         <w:t xml:space="preserve">Lexical Hedges, </w:t>
       </w:r>
       <w:r>
         <w:rPr>
-          <w:rFonts w:ascii="Georgia" w:cs="Georgia" w:eastAsia="Georgia" w:hAnsi="Georgia"/>
-          <w:b w:val="0"/>
-          <w:bCs w:val="0"/>
-          <w:i w:val="0"/>
-          <w:iCs w:val="0"/>
-          <w:sz w:val="22"/>
-          <w:szCs w:val="22"/>
-          <w:rtl w:val="0"/>
-        </w:rPr>
-        <w:t xml:space="preserve">conceptually, lexical hedges are verbs, adjectives, or nouns that introduce uncertainty or tentativeness at the propositional level. Operationally, these include verbs such as suggest, indicate, appear, and seem. They also include adjectives such as possible, probable, and likely, and nouns such as possibility and assumption. These are coded in this study when they express epistemic qualification of a claim rather than description or recommendation.</w:t>
+          <w:rFonts w:ascii="Georgia" w:hAnsi="Georgia" w:cs="Georgia" w:eastAsia="Georgia"/>
+          <w:i w:val="0"/>
+          <w:iCs w:val="0"/>
+          <w:sz w:val="22"/>
+          <w:szCs w:val="22"/>
+          <w:rtl w:val="0"/>
+          <w:b w:val="0"/>
+          <w:bCs w:val="0"/>
+        </w:rPr>
+        <w:t>conceptually, lexical hedges are verbs, adjectives, or nouns that introduce uncertainty or tentativeness at the propositional level. Operationally, these include verbs such as suggest, indicate, appear, and seem. They also include adjectives such as possible, probable, and likely, and nouns such as possibility and assumption. These are coded in this study when they express epistemic qualification of a claim rather than description or recommendation.</w:t>
       </w:r>
       <w:r>
         <w:rPr>
@@ -2241,8 +2249,10 @@
           <w:rFonts w:ascii="Georgia" w:hAnsi="Georgia" w:cs="Georgia" w:eastAsia="Georgia"/>
           <w:sz w:val="22"/>
           <w:szCs w:val="22"/>
-        </w:rPr>
-        <w:t xml:space="preserve">conceptually, the Mann-Whitney U test (also called the Wilcoxon rank-sum test) is a non-parametric test that compares the distributions of a continuous or ordinal variable between two independent groups. Operationally, this study used it as an exploratory post hoc follow-up after the Kruskal-Wallis test, comparing per-abstract hedge rates (hedges per 100 words) for each pair of disciplines. The test statistic is U = n₁n₂ + [n₁(n₁+1)]/2 − R₁, where n₁ and n₂ are the sample sizes of the two groups and R₁ is the sum of ranks for group 1. A Bonferroni correction for three pairwise tests set α = .017. The reported results were Veterinary Medicine versus Biology p = .011, Veterinary Medicine versus Agriculture p = .034, and Agriculture versus Biology p = .72. Only the Biology–Veterinary Medicine contrast remained significant after correction.</w:t>
+          <w:b w:val="0"/>
+          <w:bCs w:val="0"/>
+        </w:rPr>
+        <w:t>conceptually, the Mann-Whitney U test (also called the Wilcoxon rank-sum test) is a non-parametric test that compares the distributions of a continuous or ordinal variable between two independent groups. Operationally, this study used it as an exploratory post hoc follow-up after the Kruskal-Wallis test, comparing per-abstract hedge rates (hedges per 100 words) for each pair of disciplines. The test statistic is U = n₁n₂ + [n₁(n₁+1)]/2 − R₁, where n₁ and n₂ are the sample sizes of the two groups and R₁ is the sum of ranks for group 1. A Bonferroni correction for three pairwise tests set α = .017. The reported results were Veterinary Medicine versus Biology p = .011, Veterinary Medicine versus Agriculture p = .034, and Agriculture versus Biology p = .72. Only the Biology–Veterinary Medicine contrast remained significant after correction.</w:t>
       </w:r>
     </w:p>
     <w:p>
@@ -2254,29 +2264,29 @@
       </w:pPr>
       <w:r>
         <w:rPr>
-          <w:rFonts w:ascii="Georgia" w:cs="Georgia" w:eastAsia="Georgia" w:hAnsi="Georgia"/>
-          <w:b w:val="1"/>
-          <w:bCs w:val="1"/>
-          <w:i w:val="0"/>
-          <w:iCs w:val="0"/>
-          <w:sz w:val="22"/>
-          <w:szCs w:val="22"/>
-          <w:rtl w:val="0"/>
+          <w:rFonts w:ascii="Georgia" w:hAnsi="Georgia" w:cs="Georgia" w:eastAsia="Georgia"/>
+          <w:i w:val="0"/>
+          <w:iCs w:val="0"/>
+          <w:sz w:val="22"/>
+          <w:szCs w:val="22"/>
+          <w:rtl w:val="0"/>
+          <w:b/>
+          <w:bCs/>
         </w:rPr>
         <w:t xml:space="preserve">Modal Verbs, </w:t>
       </w:r>
       <w:r>
         <w:rPr>
-          <w:rFonts w:ascii="Georgia" w:cs="Georgia" w:eastAsia="Georgia" w:hAnsi="Georgia"/>
-          <w:b w:val="0"/>
-          <w:bCs w:val="0"/>
-          <w:i w:val="0"/>
-          <w:iCs w:val="0"/>
-          <w:sz w:val="22"/>
-          <w:szCs w:val="22"/>
-          <w:rtl w:val="0"/>
-        </w:rPr>
-        <w:t xml:space="preserve">conceptually, modal verbs are auxiliary verbs that express degrees of possibility, probability, or conditionality. Operationally, these include may, might, could, would, should, and can. These are coded in this study when they signal epistemic uncertainty about a claim rather than capability, obligation, or future procedure.</w:t>
+          <w:rFonts w:ascii="Georgia" w:hAnsi="Georgia" w:cs="Georgia" w:eastAsia="Georgia"/>
+          <w:i w:val="0"/>
+          <w:iCs w:val="0"/>
+          <w:sz w:val="22"/>
+          <w:szCs w:val="22"/>
+          <w:rtl w:val="0"/>
+          <w:b w:val="0"/>
+          <w:bCs w:val="0"/>
+        </w:rPr>
+        <w:t>conceptually, modal verbs are auxiliary verbs that express degrees of possibility, probability, or conditionality. Operationally, these include may, might, could, would, should, and can. These are coded in this study when they signal epistemic uncertainty about a claim rather than capability, obligation, or future procedure.</w:t>
       </w:r>
       <w:r>
         <w:rPr>
@@ -2293,29 +2303,29 @@
       </w:pPr>
       <w:r>
         <w:rPr>
-          <w:rFonts w:ascii="Georgia" w:cs="Georgia" w:eastAsia="Georgia" w:hAnsi="Georgia"/>
-          <w:b w:val="1"/>
-          <w:bCs w:val="1"/>
-          <w:i w:val="0"/>
-          <w:iCs w:val="0"/>
-          <w:sz w:val="22"/>
-          <w:szCs w:val="22"/>
-          <w:rtl w:val="0"/>
+          <w:rFonts w:ascii="Georgia" w:hAnsi="Georgia" w:cs="Georgia" w:eastAsia="Georgia"/>
+          <w:i w:val="0"/>
+          <w:iCs w:val="0"/>
+          <w:sz w:val="22"/>
+          <w:szCs w:val="22"/>
+          <w:rtl w:val="0"/>
+          <w:b/>
+          <w:bCs/>
         </w:rPr>
         <w:t xml:space="preserve">Normalized Frequency, </w:t>
       </w:r>
       <w:r>
         <w:rPr>
-          <w:rFonts w:ascii="Georgia" w:cs="Georgia" w:eastAsia="Georgia" w:hAnsi="Georgia"/>
-          <w:b w:val="0"/>
-          <w:bCs w:val="0"/>
-          <w:i w:val="0"/>
-          <w:iCs w:val="0"/>
-          <w:sz w:val="22"/>
-          <w:szCs w:val="22"/>
-          <w:rtl w:val="0"/>
-        </w:rPr>
-        <w:t xml:space="preserve">conceptually, normalized frequency is a statistical method used to compare linguistic features across texts of different lengths by standardizing the count to a base unit. Operationally, this refers to the formula used in this study to compare hedge usage: Normalized Frequency = (Total Hedges / Total Word Count) x 100. For example, if an abstract contains 3 hedges and 258 words, the normalized frequency is (3/258) x 100 = 1.16 hedges per 100 words.</w:t>
+          <w:rFonts w:ascii="Georgia" w:hAnsi="Georgia" w:cs="Georgia" w:eastAsia="Georgia"/>
+          <w:i w:val="0"/>
+          <w:iCs w:val="0"/>
+          <w:sz w:val="22"/>
+          <w:szCs w:val="22"/>
+          <w:rtl w:val="0"/>
+          <w:b w:val="0"/>
+          <w:bCs w:val="0"/>
+        </w:rPr>
+        <w:t>conceptually, normalized frequency is a statistical method used to compare linguistic features across texts of different lengths by standardizing the count to a base unit. Operationally, this refers to the formula used in this study to compare hedge usage: Normalized Frequency = (Total Hedges / Total Word Count) x 100. For example, if an abstract contains 3 hedges and 258 words, the normalized frequency is (3/258) x 100 = 1.16 hedges per 100 words.</w:t>
       </w:r>
       <w:r>
         <w:rPr>
@@ -2332,29 +2342,29 @@
       </w:pPr>
       <w:r>
         <w:rPr>
-          <w:rFonts w:ascii="Georgia" w:cs="Georgia" w:eastAsia="Georgia" w:hAnsi="Georgia"/>
-          <w:b w:val="1"/>
-          <w:bCs w:val="1"/>
-          <w:i w:val="0"/>
-          <w:iCs w:val="0"/>
-          <w:sz w:val="22"/>
-          <w:szCs w:val="22"/>
-          <w:rtl w:val="0"/>
+          <w:rFonts w:ascii="Georgia" w:hAnsi="Georgia" w:cs="Georgia" w:eastAsia="Georgia"/>
+          <w:i w:val="0"/>
+          <w:iCs w:val="0"/>
+          <w:sz w:val="22"/>
+          <w:szCs w:val="22"/>
+          <w:rtl w:val="0"/>
+          <w:b/>
+          <w:bCs/>
         </w:rPr>
         <w:t xml:space="preserve">Rescue-Hedging (Rescue Framing), </w:t>
       </w:r>
       <w:r>
         <w:rPr>
-          <w:rFonts w:ascii="Georgia" w:cs="Georgia" w:eastAsia="Georgia" w:hAnsi="Georgia"/>
-          <w:b w:val="0"/>
-          <w:bCs w:val="0"/>
-          <w:i w:val="0"/>
-          <w:iCs w:val="0"/>
-          <w:sz w:val="22"/>
-          <w:szCs w:val="22"/>
-          <w:rtl w:val="0"/>
-        </w:rPr>
-        <w:t xml:space="preserve">conceptually, the use of hedges after an explicit non-significant result so that a treatment or finding is still presented as potentially beneficial. Operationally, the term is used in this study as a descriptive label for that pattern.</w:t>
+          <w:rFonts w:ascii="Georgia" w:hAnsi="Georgia" w:cs="Georgia" w:eastAsia="Georgia"/>
+          <w:i w:val="0"/>
+          <w:iCs w:val="0"/>
+          <w:sz w:val="22"/>
+          <w:szCs w:val="22"/>
+          <w:rtl w:val="0"/>
+          <w:b w:val="0"/>
+          <w:bCs w:val="0"/>
+        </w:rPr>
+        <w:t>conceptually, the use of hedges after an explicit non-significant result so that a treatment or finding is still presented as potentially beneficial. Operationally, the term is used in this study as a descriptive label for that pattern.</w:t>
       </w:r>
       <w:r>
         <w:rPr>
@@ -2371,29 +2381,29 @@
       </w:pPr>
       <w:r>
         <w:rPr>
-          <w:rFonts w:ascii="Georgia" w:cs="Georgia" w:eastAsia="Georgia" w:hAnsi="Georgia"/>
-          <w:b w:val="1"/>
-          <w:bCs w:val="1"/>
-          <w:i w:val="0"/>
-          <w:iCs w:val="0"/>
-          <w:sz w:val="22"/>
-          <w:szCs w:val="22"/>
-          <w:rtl w:val="0"/>
+          <w:rFonts w:ascii="Georgia" w:hAnsi="Georgia" w:cs="Georgia" w:eastAsia="Georgia"/>
+          <w:i w:val="0"/>
+          <w:iCs w:val="0"/>
+          <w:sz w:val="22"/>
+          <w:szCs w:val="22"/>
+          <w:rtl w:val="0"/>
+          <w:b/>
+          <w:bCs/>
         </w:rPr>
         <w:t xml:space="preserve">Softening, </w:t>
       </w:r>
       <w:r>
         <w:rPr>
-          <w:rFonts w:ascii="Georgia" w:cs="Georgia" w:eastAsia="Georgia" w:hAnsi="Georgia"/>
-          <w:b w:val="0"/>
-          <w:bCs w:val="0"/>
-          <w:i w:val="0"/>
-          <w:iCs w:val="0"/>
-          <w:sz w:val="22"/>
-          <w:szCs w:val="22"/>
-          <w:rtl w:val="0"/>
-        </w:rPr>
-        <w:t xml:space="preserve">conceptually, softening is the reduction of force, directness, imposition, or interpersonal impact in a statement. Operationally, Stage 1 retention tracks softening of force or directness on knowledge claims (and interpersonal imposition on how claims are put forward); Stage 2 sorts epistemic (EC), interpersonal (P), and discourse-managing (DO) uses. Directives remain excluded.</w:t>
+          <w:rFonts w:ascii="Georgia" w:hAnsi="Georgia" w:cs="Georgia" w:eastAsia="Georgia"/>
+          <w:i w:val="0"/>
+          <w:iCs w:val="0"/>
+          <w:sz w:val="22"/>
+          <w:szCs w:val="22"/>
+          <w:rtl w:val="0"/>
+          <w:b w:val="0"/>
+          <w:bCs w:val="0"/>
+        </w:rPr>
+        <w:t>conceptually, softening is the reduction of force, directness, imposition, or interpersonal impact in a statement. Operationally, Stage 1 retention tracks softening of force or directness on knowledge claims (and interpersonal imposition on how claims are put forward); Stage 2 sorts epistemic (EC), interpersonal (P), and discourse-managing (DO) uses. Directives remain excluded.</w:t>
       </w:r>
       <w:r>
         <w:rPr>
@@ -2871,6 +2881,12 @@
         <w:rPr/>
       </w:pPr>
       <w:r>
+        <w:rPr>
+          <w:rFonts w:ascii="Georgia" w:hAnsi="Georgia" w:cs="Georgia" w:eastAsia="Georgia"/>
+          <w:b/>
+          <w:bCs/>
+          <w:sz w:val="22"/>
+        </w:rPr>
         <w:t xml:space="preserve">e. Data Analysis. </w:t>
       </w:r>
       <w:r>
@@ -2884,7 +2900,7 @@
           <w:b w:val="0"/>
           <w:bCs w:val="0"/>
         </w:rPr>
-        <w:t xml:space="preserve">Hedge identification, type classification, and functional coding were all conducted manually using a Google Sheets coding template. Each abstract was read in full before coding began to ensure hedges were interpreted in context rather than flagged as isolated tokens. Ambiguous cases were resolved using the predefined decision tree in Appendix A. Frequency counts were normalized per 100 words to enable comparison across abstracts of varying length. In a separate pass, each abstract was also coded for outcome type from its results language (Binary, Continuous, Mixed, Null/NS, Other), so that density patterns could be read against the kind of finding reported. Those codes are recorded in the coding spreadsheet and discussed in Part IV. While the quantitative analysis identified what hedges were used, the qualitative interpretation applied Salager-Meyer’s (1994) claim-responsibility framework and Hyland’s (2005) stance model to explain why these patterns occurred. Given the corpus size, findings were interpreted as indicative patterns within the PSAU context, supplemented by exploratory inferential analyses (chi-square, Kruskal-Wallis) whose results are reported transparently but should not be treated as confirmatory given the small, zero-inflated sample.</w:t>
+        <w:t>Hedge identification, type classification, and functional coding were all conducted manually using a Google Sheets coding template. Each abstract was read in full before coding began to ensure hedges were interpreted in context rather than flagged as isolated tokens. Ambiguous cases were resolved using the predefined decision tree in Appendix A. Frequency counts were normalized per 100 words to enable comparison across abstracts of varying length. In a separate pass, each abstract was also coded for outcome type from its results language (Binary, Continuous, Mixed, Null/NS, Other), so that density patterns could be read against the kind of finding reported. Those codes are recorded in the coding spreadsheet and discussed in Part IV. While the quantitative analysis identified what hedges were used, the qualitative interpretation applied Salager-Meyer’s (1994) claim-responsibility framework and Hyland’s (2005) stance model to explain why these patterns occurred. Given the corpus size, findings were interpreted as indicative patterns within the PSAU context, supplemented by exploratory inferential analyses (chi-square, Kruskal-Wallis) whose results are reported transparently but should not be treated as confirmatory given the small, zero-inflated sample.</w:t>
       </w:r>
     </w:p>
     <w:p>
@@ -2896,29 +2912,29 @@
       </w:pPr>
       <w:r>
         <w:rPr>
-          <w:rFonts w:ascii="Georgia" w:cs="Georgia" w:eastAsia="Georgia" w:hAnsi="Georgia"/>
-          <w:b w:val="1"/>
-          <w:bCs w:val="1"/>
-          <w:i w:val="0"/>
-          <w:iCs w:val="0"/>
-          <w:sz w:val="22"/>
-          <w:szCs w:val="22"/>
-          <w:rtl w:val="0"/>
+          <w:rFonts w:ascii="Georgia" w:hAnsi="Georgia" w:cs="Georgia" w:eastAsia="Georgia"/>
+          <w:i w:val="0"/>
+          <w:iCs w:val="0"/>
+          <w:sz w:val="22"/>
+          <w:szCs w:val="22"/>
+          <w:rtl w:val="0"/>
+          <w:b/>
+          <w:bCs/>
         </w:rPr>
         <w:t xml:space="preserve">f. Timeline. </w:t>
       </w:r>
       <w:r>
         <w:rPr>
-          <w:rFonts w:ascii="Georgia" w:cs="Georgia" w:eastAsia="Georgia" w:hAnsi="Georgia"/>
-          <w:b w:val="0"/>
-          <w:bCs w:val="0"/>
-          <w:i w:val="0"/>
-          <w:iCs w:val="0"/>
-          <w:sz w:val="22"/>
-          <w:szCs w:val="22"/>
-          <w:rtl w:val="0"/>
-        </w:rPr>
-        <w:t xml:space="preserve">Permission and library access: 1 week. Corpus construction and on-site photography: 3 weeks. OCR verification and text preparation: 2 weeks. Pilot testing and coding finalization: 2 weeks. Full coding and frequency analysis: 8 weeks (approximately 10 hours per week). Writing and revision: 8 weeks. Total timeframe: approximately 5.5 months (24 weeks).</w:t>
+          <w:rFonts w:ascii="Georgia" w:hAnsi="Georgia" w:cs="Georgia" w:eastAsia="Georgia"/>
+          <w:i w:val="0"/>
+          <w:iCs w:val="0"/>
+          <w:sz w:val="22"/>
+          <w:szCs w:val="22"/>
+          <w:rtl w:val="0"/>
+          <w:b w:val="0"/>
+          <w:bCs w:val="0"/>
+        </w:rPr>
+        <w:t>Permission and library access: 1 week. Corpus construction and on-site photography: 3 weeks. OCR verification and text preparation: 2 weeks. Pilot testing and coding finalization: 2 weeks. Full coding and frequency analysis: 8 weeks (approximately 10 hours per week). Writing and revision: 8 weeks. Total timeframe: approximately 5.5 months (24 weeks).</w:t>
       </w:r>
       <w:r>
         <w:rPr>

</xml_diff>

<commit_message>
Draft_053: clarify Stage 1 without not-directives parenthetical
Plain language: knowledge claims vs soft recommendations/obligations.
</commit_message>
<xml_diff>
--- a/thesis/003_ThesisProposal_Draft_053.docx
+++ b/thesis/003_ThesisProposal_Draft_053.docx
@@ -13289,14 +13289,14 @@
       </w:pPr>
       <w:r>
         <w:rPr>
-          <w:rFonts w:ascii="Georgia" w:cs="Georgia" w:eastAsia="Georgia" w:hAnsi="Georgia"/>
-          <w:b w:val="0"/>
-          <w:bCs w:val="0"/>
-          <w:sz w:val="22"/>
-          <w:szCs w:val="22"/>
-          <w:rtl w:val="0"/>
-        </w:rPr>
-        <w:t xml:space="preserve">Ability, future procedure, and necessity (must / should in procedural contexts) are never hedges. Stage 1: retain if removing the device makes a knowledge claim more categorical or more direct, or reduces imposition in how that claim is put forward (not directives). Working Test: used at Stage 2 to support EC when commitment to the proposition changes. Worked examples appear under Working Examples in the full codebook below.</w:t>
+          <w:rFonts w:ascii="Georgia" w:hAnsi="Georgia" w:cs="Georgia" w:eastAsia="Georgia"/>
+          <w:b w:val="0"/>
+          <w:bCs w:val="0"/>
+          <w:sz w:val="22"/>
+          <w:szCs w:val="22"/>
+          <w:rtl w:val="0"/>
+        </w:rPr>
+        <w:t>Ability, future procedure, and necessity (must / should in procedural contexts) are never hedges. Stage 1: retain the device if removing it makes a knowledge claim more categorical or more direct. A knowledge claim is a statement about what is true, likely, possible, or found. Stage 1 does not apply to soft recommendations or obligations that tell the reader or a practitioner what to do (for example, farmers should apply the extract, or further research must be conducted). Those wordings can sound mild, but they manage advice or duty rather than how certain a finding is, and they are handled under exclusion codes such as FP-Rec. Working Test: used at Stage 2 to support EC when commitment to the proposition changes. Worked examples appear under Working Examples in the full codebook below.</w:t>
       </w:r>
       <w:r>
         <w:rPr>
@@ -16156,16 +16156,16 @@
       </w:pPr>
       <w:r>
         <w:rPr>
-          <w:rFonts w:ascii="Georgia" w:cs="Georgia" w:eastAsia="Georgia" w:hAnsi="Georgia"/>
-          <w:b w:val="0"/>
-          <w:bCs w:val="0"/>
-          <w:i w:val="0"/>
-          <w:iCs w:val="0"/>
-          <w:sz w:val="22"/>
-          <w:szCs w:val="22"/>
-          <w:rtl w:val="0"/>
-        </w:rPr>
-        <w:t xml:space="preserve">Function labels (EC, P, DO) are applied after Stage 1 retention. Stage 1 asks whether removing the expression makes a knowledge claim more categorical or more direct, or softens imposition on that claim (not a directive). The Working Test asks whether commitment to the proposition’s truth changes; it supports EC labeling and does not by itself bar P or DO. The examples below separate retention from function.</w:t>
+          <w:rFonts w:ascii="Georgia" w:hAnsi="Georgia" w:cs="Georgia" w:eastAsia="Georgia"/>
+          <w:b w:val="0"/>
+          <w:bCs w:val="0"/>
+          <w:i w:val="0"/>
+          <w:iCs w:val="0"/>
+          <w:sz w:val="22"/>
+          <w:szCs w:val="22"/>
+          <w:rtl w:val="0"/>
+        </w:rPr>
+        <w:t>Function labels (EC, P, DO) are applied after Stage 1 retention. Stage 1 asks whether removing the expression makes a knowledge claim more categorical or more direct. It targets how a finding or interpretation is stated, not soft commands, advice, or recommendations that tell someone what should be done. The Working Test asks whether commitment to the proposition’s truth changes. It supports EC labeling and does not by itself bar P or DO. The examples below separate retention from function.</w:t>
       </w:r>
       <w:r>
         <w:rPr>

</xml_diff>

<commit_message>
Draft_053: tighten Full Codebook prose, keep table-based rules
Shorter Stage 1, examples, extensions, Layer 3. Tables carry detail.
</commit_message>
<xml_diff>
--- a/thesis/003_ThesisProposal_Draft_053.docx
+++ b/thesis/003_ThesisProposal_Draft_053.docx
@@ -12818,10 +12818,11 @@
       <w:r>
         <w:rPr>
           <w:rFonts w:ascii="Georgia" w:hAnsi="Georgia" w:cs="Georgia" w:eastAsia="Georgia"/>
-          <w:sz w:val="22"/>
-          <w:szCs w:val="22"/>
-        </w:rPr>
-        <w:t xml:space="preserve">This appendix is the full coding protocol used for the study. It opens with a one-page quick-reference, then a one-page legend and coding-sheet section, then the operational layers, decision rules, false-positive categories, and recording conventions.</w:t>
+          <w:b w:val="0"/>
+          <w:sz w:val="22"/>
+          <w:szCs w:val="22"/>
+        </w:rPr>
+        <w:t>Full coding protocol. Quick-reference first, then legend, layers, decision rules, and false-positive codes. Tables carry the operational detail.</w:t>
       </w:r>
     </w:p>
     <w:p>
@@ -13296,7 +13297,7 @@
           <w:szCs w:val="22"/>
           <w:rtl w:val="0"/>
         </w:rPr>
-        <w:t>Ability, future procedure, and necessity (must / should in procedural contexts) are never hedges. Stage 1: retain the device if removing it makes a knowledge claim more categorical or more direct. A knowledge claim is a statement about what is true, likely, possible, or found. Stage 1 does not apply to soft recommendations or obligations that tell the reader or a practitioner what to do (for example, farmers should apply the extract, or further research must be conducted). Those wordings can sound mild, but they manage advice or duty rather than how certain a finding is, and they are handled under exclusion codes such as FP-Rec. Working Test: used at Stage 2 to support EC when commitment to the proposition changes. Worked examples appear under Working Examples in the full codebook below.</w:t>
+        <w:t>Ability, future procedure, and must/should in procedural steps are never hedges. Stage 1: retain if removing the device makes a knowledge claim (what is true, likely, possible, or found) more categorical or more direct. Do not retain soft recommendations or obligations that only tell someone what to do (code FP-Rec). Stage 2 Working Test: supports EC when commitment to the proposition changes. Worked examples follow in the tables and examples below.</w:t>
       </w:r>
       <w:r>
         <w:rPr>
@@ -16165,7 +16166,7 @@
           <w:szCs w:val="22"/>
           <w:rtl w:val="0"/>
         </w:rPr>
-        <w:t>Function labels (EC, P, DO) are applied after Stage 1 retention. Stage 1 asks whether removing the expression makes a knowledge claim more categorical or more direct. It targets how a finding or interpretation is stated, not soft commands, advice, or recommendations that tell someone what should be done. The Working Test asks whether commitment to the proposition’s truth changes. It supports EC labeling and does not by itself bar P or DO. The examples below separate retention from function.</w:t>
+        <w:t>Function labels (EC, P, DO) come after Stage 1 retention. Stage 1 targets how a finding is stated, not advice or recommendations. The Working Test supports EC when certainty about the claim changes. It does not block P or DO.</w:t>
       </w:r>
       <w:r>
         <w:rPr>
@@ -16182,16 +16183,16 @@
       </w:pPr>
       <w:r>
         <w:rPr>
-          <w:rFonts w:ascii="Georgia" w:cs="Georgia" w:eastAsia="Georgia" w:hAnsi="Georgia"/>
-          <w:b w:val="0"/>
-          <w:bCs w:val="0"/>
-          <w:i w:val="0"/>
-          <w:iCs w:val="0"/>
-          <w:sz w:val="22"/>
-          <w:szCs w:val="22"/>
-          <w:rtl w:val="0"/>
-        </w:rPr>
-        <w:t xml:space="preserve">Epistemic Caution (EC) as hedge. “The treatment may reduce infection rates.” Removing may raises certainty about the finding. Working Test: pass. Code as hedge; function EC.</w:t>
+          <w:rFonts w:ascii="Georgia" w:hAnsi="Georgia" w:cs="Georgia" w:eastAsia="Georgia"/>
+          <w:b w:val="0"/>
+          <w:bCs w:val="0"/>
+          <w:i w:val="0"/>
+          <w:iCs w:val="0"/>
+          <w:sz w:val="22"/>
+          <w:szCs w:val="22"/>
+          <w:rtl w:val="0"/>
+        </w:rPr>
+        <w:t>EC (hedge): “The treatment may reduce infection rates.” Removing may raises certainty. Working Test pass. Function EC.</w:t>
       </w:r>
       <w:r>
         <w:rPr>
@@ -16208,16 +16209,16 @@
       </w:pPr>
       <w:r>
         <w:rPr>
-          <w:rFonts w:ascii="Georgia" w:cs="Georgia" w:eastAsia="Georgia" w:hAnsi="Georgia"/>
-          <w:b w:val="0"/>
-          <w:bCs w:val="0"/>
-          <w:i w:val="0"/>
-          <w:iCs w:val="0"/>
-          <w:sz w:val="22"/>
-          <w:szCs w:val="22"/>
-          <w:rtl w:val="0"/>
-        </w:rPr>
-        <w:t xml:space="preserve">Not a hedge (capability / false positive). “PCR can detect low concentrations.” Removing can does not change commitment to a research claim; can marks capability. Working Test: fail. Code FP-Cap, not a hedge.</w:t>
+          <w:rFonts w:ascii="Georgia" w:hAnsi="Georgia" w:cs="Georgia" w:eastAsia="Georgia"/>
+          <w:b w:val="0"/>
+          <w:bCs w:val="0"/>
+          <w:i w:val="0"/>
+          <w:iCs w:val="0"/>
+          <w:sz w:val="22"/>
+          <w:szCs w:val="22"/>
+          <w:rtl w:val="0"/>
+        </w:rPr>
+        <w:t>Not a hedge (FP-Cap): “PCR can detect low concentrations.” can marks capability, not uncertainty about a finding.</w:t>
       </w:r>
       <w:r>
         <w:rPr>
@@ -16234,16 +16235,16 @@
       </w:pPr>
       <w:r>
         <w:rPr>
-          <w:rFonts w:ascii="Georgia" w:cs="Georgia" w:eastAsia="Georgia" w:hAnsi="Georgia"/>
-          <w:b w:val="0"/>
-          <w:bCs w:val="0"/>
-          <w:i w:val="0"/>
-          <w:iCs w:val="0"/>
-          <w:sz w:val="22"/>
-          <w:szCs w:val="22"/>
-          <w:rtl w:val="0"/>
-        </w:rPr>
-        <w:t xml:space="preserve">Politeness / Deference (P), Stage 1 pass possible. “As suggested by previous researchers, the treatment is effective.” Removing As suggested by previous researchers makes the claim more direct and less deferential. Stage 1: pass (reduced imposition). Working Test for EC: fail (certainty unchanged). Stage 2: P, not EC. Count as a hedge/mitigation device with function P.</w:t>
+          <w:rFonts w:ascii="Georgia" w:hAnsi="Georgia" w:cs="Georgia" w:eastAsia="Georgia"/>
+          <w:b w:val="0"/>
+          <w:bCs w:val="0"/>
+          <w:i w:val="0"/>
+          <w:iCs w:val="0"/>
+          <w:sz w:val="22"/>
+          <w:szCs w:val="22"/>
+          <w:rtl w:val="0"/>
+        </w:rPr>
+        <w:t>P possible: “As suggested by previous researchers, the treatment is effective.” Stage 1 may pass (less direct). Working Test for EC fails if certainty is unchanged. Function P.</w:t>
       </w:r>
       <w:r>
         <w:rPr>
@@ -16260,16 +16261,16 @@
       </w:pPr>
       <w:r>
         <w:rPr>
-          <w:rFonts w:ascii="Georgia" w:cs="Georgia" w:eastAsia="Georgia" w:hAnsi="Georgia"/>
-          <w:b w:val="0"/>
-          <w:bCs w:val="0"/>
-          <w:i w:val="0"/>
-          <w:iCs w:val="0"/>
-          <w:sz w:val="22"/>
-          <w:szCs w:val="22"/>
-          <w:rtl w:val="0"/>
-        </w:rPr>
-        <w:t xml:space="preserve">Both P and EC (Stage 1 pass; Stage 2 EC with P co-occurring). “We would suggest that the treatment may be less effective than earlier reports claimed.” Removing would suggest / may makes the criticism more categorical and more imposing. Stage 1: pass. Working Test for EC: pass. Stage 2: EC primary, P co-occurring (deference and softened disagreement).</w:t>
+          <w:rFonts w:ascii="Georgia" w:hAnsi="Georgia" w:cs="Georgia" w:eastAsia="Georgia"/>
+          <w:b w:val="0"/>
+          <w:bCs w:val="0"/>
+          <w:i w:val="0"/>
+          <w:iCs w:val="0"/>
+          <w:sz w:val="22"/>
+          <w:szCs w:val="22"/>
+          <w:rtl w:val="0"/>
+        </w:rPr>
+        <w:t>Both P and EC: Stage 1 pass and Working Test pass. Label the dominant function from context, or note dual coding in Coder Notes.</w:t>
       </w:r>
       <w:r>
         <w:rPr>
@@ -16286,16 +16287,16 @@
       </w:pPr>
       <w:r>
         <w:rPr>
-          <w:rFonts w:ascii="Georgia" w:cs="Georgia" w:eastAsia="Georgia" w:hAnsi="Georgia"/>
-          <w:b w:val="0"/>
-          <w:bCs w:val="0"/>
-          <w:i w:val="0"/>
-          <w:iCs w:val="0"/>
-          <w:sz w:val="22"/>
-          <w:szCs w:val="22"/>
-          <w:rtl w:val="0"/>
-        </w:rPr>
-        <w:t xml:space="preserve">Discourse Organization (DO), Stage 1 pass when framing uptake. “It should be noted that the treatment increased plant height.” Removing It should be noted that removes reader guidance and can make the point land more bluntly. Stage 1: pass if the phrase frames how the claim is taken. Working Test for EC: fail. Stage 2: DO. Pure sequence markers (Thus, Therefore, Hence, In conclusion) that only order moves still fail Stage 1 and are not counted.</w:t>
+          <w:rFonts w:ascii="Georgia" w:hAnsi="Georgia" w:cs="Georgia" w:eastAsia="Georgia"/>
+          <w:b w:val="0"/>
+          <w:bCs w:val="0"/>
+          <w:i w:val="0"/>
+          <w:iCs w:val="0"/>
+          <w:sz w:val="22"/>
+          <w:szCs w:val="22"/>
+          <w:rtl w:val="0"/>
+        </w:rPr>
+        <w:t>DO possible: “It should be noted that the treatment increased plant height.” Removing the frame removes reader guidance, not certainty about the finding. Function DO if Stage 1 passes on framing only.</w:t>
       </w:r>
       <w:r>
         <w:rPr>
@@ -17187,7 +17188,7 @@
       </w:pPr>
       <w:r>
         <w:rPr>
-          <w:rFonts w:ascii="Georgia" w:cs="Georgia" w:eastAsia="Georgia" w:hAnsi="Georgia"/>
+          <w:rFonts w:ascii="Georgia" w:hAnsi="Georgia" w:cs="Georgia" w:eastAsia="Georgia"/>
           <w:b w:val="0"/>
           <w:bCs w:val="0"/>
           <w:i w:val="1"/>
@@ -17197,7 +17198,7 @@
           <w:szCs w:val="22"/>
           <w:rtl w:val="0"/>
         </w:rPr>
-        <w:t xml:space="preserve">Exclusions (capability, recommendation, procedural norm, location) are covered under </w:t>
+        <w:t>Exclusions (capability, recommendation, procedural norm, location) are in the Decision Rules table.</w:t>
       </w:r>
       <w:r>
         <w:rPr>
@@ -17211,7 +17212,6 @@
           <w:szCs w:val="22"/>
           <w:rtl w:val="0"/>
         </w:rPr>
-        <w:t xml:space="preserve">Decision Rules</w:t>
       </w:r>
       <w:r>
         <w:rPr>
@@ -17225,7 +17225,6 @@
           <w:szCs w:val="22"/>
           <w:rtl w:val="0"/>
         </w:rPr>
-        <w:t xml:space="preserve">.</w:t>
       </w:r>
       <w:r>
         <w:rPr>
@@ -17243,14 +17242,15 @@
       </w:pPr>
       <w:r>
         <w:rPr>
-          <w:rFonts w:ascii="Georgia" w:cs="Georgia" w:eastAsia="Georgia" w:hAnsi="Georgia"/>
-          <w:i w:val="0"/>
-          <w:iCs w:val="0"/>
-          <w:sz w:val="22"/>
-          <w:szCs w:val="22"/>
-          <w:rtl w:val="0"/>
-        </w:rPr>
-        <w:t xml:space="preserve">Extensions: “imply/implies/implying” functions as suggest. “Can be concluded / derived / stated / attributed to / seen as” is an inferential hedge, distinct from capability “can” (see Decision Rules). “Potentially” is an adverbial hedge. “Potential” naming the research object itself (e.g., “assessed the potential of X”) is not markable, it names a topic rather than qualifying a claim. Rule for “potential + noun” constructions: structural position is primary. If the phrase sits in an aim, methods, or pure topic-naming frame (naming the research object, e.g., “assessed the potential of X”), treat as topic-naming (FP-Gen). If it sits in a results or conclusion sentence qualifying a finding-claim, treat as a Lexical hedge (EC). The Working Test is applied as a secondary check: when removing the token clearly changes commitment to a proposition (e.g., "presence of potential mycobacterial infections" becomes "presence of mycobacterial infections"), the token is coded Lexical EC even in an aim or rationale sentence. Pure topic-naming aims leave a research-object name when the token is removed and remain FP-Gen. </w:t>
+          <w:rFonts w:ascii="Georgia" w:hAnsi="Georgia" w:cs="Georgia" w:eastAsia="Georgia"/>
+          <w:b w:val="0"/>
+          <w:i w:val="0"/>
+          <w:iCs w:val="0"/>
+          <w:sz w:val="22"/>
+          <w:szCs w:val="22"/>
+          <w:rtl w:val="0"/>
+        </w:rPr>
+        <w:t>Token extensions (see Decision Rules table for detail). imply / implies / implying counts as suggest. can be concluded / derived / stated is inferential (hedge), not capability can (FP-Cap). potentially is adverbial. potential + noun: topic-naming in aim or methods frames is FP-Gen. In results or conclusion frames that qualify a finding, code Lexical EC. If removing potential clearly changes commitment to a proposition, code Lexical EC even in an aim sentence.</w:t>
       </w:r>
       <w:r>
         <w:rPr>
@@ -17262,19 +17262,17 @@
           <w:szCs w:val="22"/>
           <w:rtl w:val="0"/>
         </w:rPr>
-        <w:t xml:space="preserve"/>
-      </w:r>
-      <w:r>
-        <w:rPr>
-          <w:rFonts w:ascii="Georgia" w:cs="Georgia" w:eastAsia="Georgia" w:hAnsi="Georgia"/>
-          <w:i w:val="0"/>
-          <w:iCs w:val="0"/>
-          <w:color w:val="000000"/>
-          <w:sz w:val="22"/>
-          <w:szCs w:val="22"/>
-          <w:rtl w:val="0"/>
-        </w:rPr>
-        <w:t xml:space="preserve"/>
+      </w:r>
+      <w:r>
+        <w:rPr>
+          <w:rFonts w:ascii="Georgia" w:cs="Georgia" w:eastAsia="Georgia" w:hAnsi="Georgia"/>
+          <w:i w:val="0"/>
+          <w:iCs w:val="0"/>
+          <w:color w:val="000000"/>
+          <w:sz w:val="22"/>
+          <w:szCs w:val="22"/>
+          <w:rtl w:val="0"/>
+        </w:rPr>
       </w:r>
       <w:r>
         <w:rPr>
@@ -17286,19 +17284,17 @@
           <w:szCs w:val="22"/>
           <w:rtl w:val="0"/>
         </w:rPr>
-        <w:t xml:space="preserve"/>
-      </w:r>
-      <w:r>
-        <w:rPr>
-          <w:rFonts w:ascii="Georgia" w:cs="Georgia" w:eastAsia="Georgia" w:hAnsi="Georgia"/>
-          <w:i w:val="0"/>
-          <w:iCs w:val="0"/>
-          <w:color w:val="000000"/>
-          <w:sz w:val="22"/>
-          <w:szCs w:val="22"/>
-          <w:rtl w:val="0"/>
-        </w:rPr>
-        <w:t xml:space="preserve"/>
+      </w:r>
+      <w:r>
+        <w:rPr>
+          <w:rFonts w:ascii="Georgia" w:cs="Georgia" w:eastAsia="Georgia" w:hAnsi="Georgia"/>
+          <w:i w:val="0"/>
+          <w:iCs w:val="0"/>
+          <w:color w:val="000000"/>
+          <w:sz w:val="22"/>
+          <w:szCs w:val="22"/>
+          <w:rtl w:val="0"/>
+        </w:rPr>
       </w:r>
       <w:r>
         <w:rPr>
@@ -17310,19 +17306,17 @@
           <w:szCs w:val="22"/>
           <w:rtl w:val="0"/>
         </w:rPr>
-        <w:t xml:space="preserve"/>
-      </w:r>
-      <w:r>
-        <w:rPr>
-          <w:rFonts w:ascii="Georgia" w:cs="Georgia" w:eastAsia="Georgia" w:hAnsi="Georgia"/>
-          <w:i w:val="0"/>
-          <w:iCs w:val="0"/>
-          <w:color w:val="000000"/>
-          <w:sz w:val="22"/>
-          <w:szCs w:val="22"/>
-          <w:rtl w:val="0"/>
-        </w:rPr>
-        <w:t xml:space="preserve"/>
+      </w:r>
+      <w:r>
+        <w:rPr>
+          <w:rFonts w:ascii="Georgia" w:cs="Georgia" w:eastAsia="Georgia" w:hAnsi="Georgia"/>
+          <w:i w:val="0"/>
+          <w:iCs w:val="0"/>
+          <w:color w:val="000000"/>
+          <w:sz w:val="22"/>
+          <w:szCs w:val="22"/>
+          <w:rtl w:val="0"/>
+        </w:rPr>
       </w:r>
       <w:r>
         <w:rPr>
@@ -17334,19 +17328,17 @@
           <w:szCs w:val="22"/>
           <w:rtl w:val="0"/>
         </w:rPr>
-        <w:t xml:space="preserve"/>
-      </w:r>
-      <w:r>
-        <w:rPr>
-          <w:rFonts w:ascii="Georgia" w:cs="Georgia" w:eastAsia="Georgia" w:hAnsi="Georgia"/>
-          <w:i w:val="0"/>
-          <w:iCs w:val="0"/>
-          <w:color w:val="000000"/>
-          <w:sz w:val="22"/>
-          <w:szCs w:val="22"/>
-          <w:rtl w:val="0"/>
-        </w:rPr>
-        <w:t xml:space="preserve"/>
+      </w:r>
+      <w:r>
+        <w:rPr>
+          <w:rFonts w:ascii="Georgia" w:cs="Georgia" w:eastAsia="Georgia" w:hAnsi="Georgia"/>
+          <w:i w:val="0"/>
+          <w:iCs w:val="0"/>
+          <w:color w:val="000000"/>
+          <w:sz w:val="22"/>
+          <w:szCs w:val="22"/>
+          <w:rtl w:val="0"/>
+        </w:rPr>
       </w:r>
       <w:r>
         <w:rPr>
@@ -17358,19 +17350,17 @@
           <w:szCs w:val="22"/>
           <w:rtl w:val="0"/>
         </w:rPr>
-        <w:t xml:space="preserve"/>
-      </w:r>
-      <w:r>
-        <w:rPr>
-          <w:rFonts w:ascii="Georgia" w:cs="Georgia" w:eastAsia="Georgia" w:hAnsi="Georgia"/>
-          <w:i w:val="0"/>
-          <w:iCs w:val="0"/>
-          <w:color w:val="000000"/>
-          <w:sz w:val="22"/>
-          <w:szCs w:val="22"/>
-          <w:rtl w:val="0"/>
-        </w:rPr>
-        <w:t xml:space="preserve"/>
+      </w:r>
+      <w:r>
+        <w:rPr>
+          <w:rFonts w:ascii="Georgia" w:cs="Georgia" w:eastAsia="Georgia" w:hAnsi="Georgia"/>
+          <w:i w:val="0"/>
+          <w:iCs w:val="0"/>
+          <w:color w:val="000000"/>
+          <w:sz w:val="22"/>
+          <w:szCs w:val="22"/>
+          <w:rtl w:val="0"/>
+        </w:rPr>
       </w:r>
       <w:r>
         <w:rPr>
@@ -17382,19 +17372,17 @@
           <w:szCs w:val="22"/>
           <w:rtl w:val="0"/>
         </w:rPr>
-        <w:t xml:space="preserve"/>
-      </w:r>
-      <w:r>
-        <w:rPr>
-          <w:rFonts w:ascii="Georgia" w:cs="Georgia" w:eastAsia="Georgia" w:hAnsi="Georgia"/>
-          <w:i w:val="0"/>
-          <w:iCs w:val="0"/>
-          <w:color w:val="000000"/>
-          <w:sz w:val="22"/>
-          <w:szCs w:val="22"/>
-          <w:rtl w:val="0"/>
-        </w:rPr>
-        <w:t xml:space="preserve"/>
+      </w:r>
+      <w:r>
+        <w:rPr>
+          <w:rFonts w:ascii="Georgia" w:cs="Georgia" w:eastAsia="Georgia" w:hAnsi="Georgia"/>
+          <w:i w:val="0"/>
+          <w:iCs w:val="0"/>
+          <w:color w:val="000000"/>
+          <w:sz w:val="22"/>
+          <w:szCs w:val="22"/>
+          <w:rtl w:val="0"/>
+        </w:rPr>
       </w:r>
       <w:r>
         <w:rPr>
@@ -17406,19 +17394,17 @@
           <w:szCs w:val="22"/>
           <w:rtl w:val="0"/>
         </w:rPr>
-        <w:t xml:space="preserve"/>
-      </w:r>
-      <w:r>
-        <w:rPr>
-          <w:rFonts w:ascii="Georgia" w:cs="Georgia" w:eastAsia="Georgia" w:hAnsi="Georgia"/>
-          <w:i w:val="0"/>
-          <w:iCs w:val="0"/>
-          <w:color w:val="000000"/>
-          <w:sz w:val="22"/>
-          <w:szCs w:val="22"/>
-          <w:rtl w:val="0"/>
-        </w:rPr>
-        <w:t xml:space="preserve"/>
+      </w:r>
+      <w:r>
+        <w:rPr>
+          <w:rFonts w:ascii="Georgia" w:cs="Georgia" w:eastAsia="Georgia" w:hAnsi="Georgia"/>
+          <w:i w:val="0"/>
+          <w:iCs w:val="0"/>
+          <w:color w:val="000000"/>
+          <w:sz w:val="22"/>
+          <w:szCs w:val="22"/>
+          <w:rtl w:val="0"/>
+        </w:rPr>
       </w:r>
       <w:r>
         <w:rPr>
@@ -17430,7 +17416,6 @@
           <w:szCs w:val="22"/>
           <w:rtl w:val="0"/>
         </w:rPr>
-        <w:t xml:space="preserve"/>
       </w:r>
       <w:r>
         <w:rPr>
@@ -20029,17 +20014,17 @@
       </w:pPr>
       <w:r>
         <w:rPr>
-          <w:rFonts w:ascii="Georgia" w:cs="Georgia" w:eastAsia="Georgia" w:hAnsi="Georgia"/>
-          <w:b w:val="0"/>
-          <w:bCs w:val="0"/>
-          <w:i w:val="0"/>
-          <w:iCs w:val="0"/>
-          <w:color w:val="000000"/>
-          <w:sz w:val="22"/>
-          <w:szCs w:val="22"/>
-          <w:rtl w:val="0"/>
-        </w:rPr>
-        <w:t xml:space="preserve">Marks claim-bearing clauses stated directly and confidently without a hedge. Reverse test: if a hedge could be inserted without changing the facts, the clause is markable. Procedural statements are never markable. Example: </w:t>
+          <w:rFonts w:ascii="Georgia" w:hAnsi="Georgia" w:cs="Georgia" w:eastAsia="Georgia"/>
+          <w:b w:val="0"/>
+          <w:bCs w:val="0"/>
+          <w:i w:val="0"/>
+          <w:iCs w:val="0"/>
+          <w:color w:val="000000"/>
+          <w:sz w:val="22"/>
+          <w:szCs w:val="22"/>
+          <w:rtl w:val="0"/>
+        </w:rPr>
+        <w:t>Marks claim-bearing clauses stated without a hedge. Reverse test: a hedge could be inserted without changing the facts. Procedural statements are never markable. Example: “Results showed X” could become “Results suggested X.”</w:t>
       </w:r>
       <w:r>
         <w:rPr>
@@ -20053,21 +20038,19 @@
           <w:szCs w:val="22"/>
           <w:rtl w:val="0"/>
         </w:rPr>
-        <w:t xml:space="preserve">“Results showed X”</w:t>
-      </w:r>
-      <w:r>
-        <w:rPr>
-          <w:rFonts w:ascii="Georgia" w:cs="Georgia" w:eastAsia="Georgia" w:hAnsi="Georgia"/>
-          <w:b w:val="0"/>
-          <w:bCs w:val="0"/>
-          <w:i w:val="0"/>
-          <w:iCs w:val="0"/>
-          <w:color w:val="000000"/>
-          <w:sz w:val="22"/>
-          <w:szCs w:val="22"/>
-          <w:rtl w:val="0"/>
-        </w:rPr>
-        <w:t xml:space="preserve"> could take a hedge (</w:t>
+      </w:r>
+      <w:r>
+        <w:rPr>
+          <w:rFonts w:ascii="Georgia" w:cs="Georgia" w:eastAsia="Georgia" w:hAnsi="Georgia"/>
+          <w:b w:val="0"/>
+          <w:bCs w:val="0"/>
+          <w:i w:val="0"/>
+          <w:iCs w:val="0"/>
+          <w:color w:val="000000"/>
+          <w:sz w:val="22"/>
+          <w:szCs w:val="22"/>
+          <w:rtl w:val="0"/>
+        </w:rPr>
       </w:r>
       <w:r>
         <w:rPr>
@@ -20081,21 +20064,19 @@
           <w:szCs w:val="22"/>
           <w:rtl w:val="0"/>
         </w:rPr>
-        <w:t xml:space="preserve">“Results suggested X”</w:t>
-      </w:r>
-      <w:r>
-        <w:rPr>
-          <w:rFonts w:ascii="Georgia" w:cs="Georgia" w:eastAsia="Georgia" w:hAnsi="Georgia"/>
-          <w:b w:val="0"/>
-          <w:bCs w:val="0"/>
-          <w:i w:val="0"/>
-          <w:iCs w:val="0"/>
-          <w:color w:val="000000"/>
-          <w:sz w:val="22"/>
-          <w:szCs w:val="22"/>
-          <w:rtl w:val="0"/>
-        </w:rPr>
-        <w:t xml:space="preserve">) without changing the underlying finding, so it is markable.</w:t>
+      </w:r>
+      <w:r>
+        <w:rPr>
+          <w:rFonts w:ascii="Georgia" w:cs="Georgia" w:eastAsia="Georgia" w:hAnsi="Georgia"/>
+          <w:b w:val="0"/>
+          <w:bCs w:val="0"/>
+          <w:i w:val="0"/>
+          <w:iCs w:val="0"/>
+          <w:color w:val="000000"/>
+          <w:sz w:val="22"/>
+          <w:szCs w:val="22"/>
+          <w:rtl w:val="0"/>
+        </w:rPr>
       </w:r>
       <w:r>
         <w:rPr>

</xml_diff>

<commit_message>
Draft_053: Full Codebook rules as bullets, not dense paragraphs
Stage 1/2, Working Test, examples, extensions, Layer 3 in bullet form.
Tables remain the operational core.
</commit_message>
<xml_diff>
--- a/thesis/003_ThesisProposal_Draft_053.docx
+++ b/thesis/003_ThesisProposal_Draft_053.docx
@@ -12822,7 +12822,7 @@
           <w:sz w:val="22"/>
           <w:szCs w:val="22"/>
         </w:rPr>
-        <w:t>Full coding protocol. Quick-reference first, then legend, layers, decision rules, and false-positive codes. Tables carry the operational detail.</w:t>
+        <w:t>• Full protocol: quick-reference → legend → stages → examples → type/function tables → decision rules → false positives → Layer 3.</w:t>
       </w:r>
     </w:p>
     <w:p>
@@ -13287,6 +13287,7 @@
         <w:spacing w:before="0" w:after="0" w:line="264" w:lineRule="auto"/>
         <w:jc w:val="both"/>
         <w:rPr/>
+        <w:ind w:left="360" w:hanging="360"/>
       </w:pPr>
       <w:r>
         <w:rPr>
@@ -13297,7 +13298,7 @@
           <w:szCs w:val="22"/>
           <w:rtl w:val="0"/>
         </w:rPr>
-        <w:t>Ability, future procedure, and must/should in procedural steps are never hedges. Stage 1: retain if removing the device makes a knowledge claim (what is true, likely, possible, or found) more categorical or more direct. Do not retain soft recommendations or obligations that only tell someone what to do (code FP-Rec). Stage 2 Working Test: supports EC when commitment to the proposition changes. Worked examples follow in the tables and examples below.</w:t>
+        <w:t>• Never hedges: ability, future procedure, must/should in procedural steps. Stage 1: retain if removing the device makes a knowledge claim (true, likely, possible, or found) more categorical or more direct. Not Stage 1: soft recommendations or obligations that only tell someone what to do (FP-Rec). Working Test (Stage 2): supports EC when commitment to the proposition changes.</w:t>
       </w:r>
       <w:r>
         <w:rPr>
@@ -15858,7 +15859,7 @@
     <w:p>
       <w:pPr>
         <w:spacing w:before="0" w:after="0" w:line="360" w:lineRule="auto"/>
-        <w:ind w:firstLine="720"/>
+        <w:ind w:left="360" w:hanging="360"/>
         <w:jc w:val="both"/>
         <w:rPr/>
       </w:pPr>
@@ -15871,7 +15872,7 @@
           <w:szCs w:val="22"/>
           <w:rtl w:val="0"/>
         </w:rPr>
-        <w:t xml:space="preserve">This codebook turns Hyland’s (1998) framework into a practical coding scheme for the PSAU undergraduate thesis abstract corpus. </w:t>
+        <w:t>• Practical coding scheme for the PSAU undergraduate thesis abstract corpus, adapted from Hyland (1998).</w:t>
       </w:r>
       <w:r>
         <w:rPr>
@@ -15908,7 +15909,7 @@
     <w:p>
       <w:pPr>
         <w:spacing w:before="0" w:after="0" w:line="360" w:lineRule="auto"/>
-        <w:ind w:firstLine="720"/>
+        <w:ind w:left="360" w:hanging="360"/>
         <w:jc w:val="both"/>
         <w:rPr/>
       </w:pPr>
@@ -15924,7 +15925,7 @@
           <w:szCs w:val="22"/>
           <w:rtl w:val="0"/>
         </w:rPr>
-        <w:t xml:space="preserve">Stage 1 (retention). Retain an expression if removing it makes a knowledge claim about findings more categorical or more direct in context, or reduces interpersonal imposition in how that claim is put forward. The gate is inclusive of epistemic, politeness, and discourse-managing mitigation of claims. It does not admit deontic directives (recommendations, obligations), capability statements, pure procedure, pure move sequencing, or topic-naming without force reduction on a claim. Stage 2 (function). Label each retained item EC, P, and/or DO by dominant function. Co-occurrence is allowed. Working Test (EC diagnostic). For distinguishing epistemic effect, ask whether removing the device changes commitment to the truth of the proposition. Use this to support an EC label, not as the only Stage 1 membership test. Phrases that only point to evidence for a claim already asserted elsewhere (e.g., "as indicated by X") still fail Stage 1 when they do not reduce force, directness, or imposition.</w:t>
+        <w:t>• Stage 1 (retention). Keep if removing the expression makes a knowledge claim more categorical or more direct, or softens how that claim is put forward.</w:t>
       </w:r>
       <w:r>
         <w:rPr>
@@ -15938,21 +15939,176 @@
           <w:szCs w:val="22"/>
           <w:rtl w:val="0"/>
         </w:rPr>
-        <w:t xml:space="preserve"/>
-      </w:r>
-      <w:r>
-        <w:rPr>
-          <w:rFonts w:ascii="Georgia" w:cs="Georgia" w:eastAsia="Georgia" w:hAnsi="Georgia"/>
-          <w:b w:val="0"/>
-          <w:bCs w:val="0"/>
-          <w:i w:val="0"/>
-          <w:iCs w:val="0"/>
-          <w:color w:val="000000"/>
-          <w:sz w:val="22"/>
-          <w:szCs w:val="22"/>
-          <w:rtl w:val="0"/>
-        </w:rPr>
-        <w:t xml:space="preserve"/>
+      </w:r>
+      <w:r>
+        <w:rPr>
+          <w:rFonts w:ascii="Georgia" w:cs="Georgia" w:eastAsia="Georgia" w:hAnsi="Georgia"/>
+          <w:b w:val="0"/>
+          <w:bCs w:val="0"/>
+          <w:i w:val="0"/>
+          <w:iCs w:val="0"/>
+          <w:color w:val="000000"/>
+          <w:sz w:val="22"/>
+          <w:szCs w:val="22"/>
+          <w:rtl w:val="0"/>
+        </w:rPr>
+      </w:r>
+      <w:r>
+        <w:rPr>
+          <w:rtl w:val="0"/>
+        </w:rPr>
+      </w:r>
+    </w:p>
+    <w:p>
+      <w:pPr>
+        <w:spacing w:before="120" w:after="60" w:line="360" w:lineRule="auto"/>
+        <w:ind w:left="360" w:hanging="360"/>
+        <w:jc w:val="both"/>
+        <w:rPr/>
+      </w:pPr>
+      <w:r>
+        <w:rPr>
+          <w:rFonts w:ascii="Georgia" w:cs="Georgia" w:eastAsia="Georgia" w:hAnsi="Georgia"/>
+          <w:b w:val="0"/>
+          <w:bCs w:val="0"/>
+          <w:i w:val="0"/>
+          <w:iCs w:val="0"/>
+          <w:sz w:val="22"/>
+          <w:szCs w:val="22"/>
+          <w:rtl w:val="0"/>
+        </w:rPr>
+        <w:t>• Stage 1 excludes. Recommendations or obligations, capability, pure procedure, pure move sequencing, topic-naming with no force reduction on a claim.</w:t>
+      </w:r>
+      <w:r>
+        <w:rPr>
+          <w:rtl w:val="0"/>
+        </w:rPr>
+      </w:r>
+    </w:p>
+    <w:p>
+      <w:pPr>
+        <w:spacing w:before="120" w:after="60" w:line="360" w:lineRule="auto"/>
+        <w:ind w:left="360" w:hanging="360"/>
+        <w:jc w:val="both"/>
+        <w:rPr/>
+      </w:pPr>
+      <w:r>
+        <w:rPr>
+          <w:rFonts w:ascii="Georgia" w:cs="Georgia" w:eastAsia="Georgia" w:hAnsi="Georgia"/>
+          <w:b w:val="0"/>
+          <w:bCs w:val="0"/>
+          <w:i w:val="0"/>
+          <w:iCs w:val="0"/>
+          <w:sz w:val="22"/>
+          <w:szCs w:val="22"/>
+          <w:rtl w:val="0"/>
+        </w:rPr>
+        <w:t>• Stage 2 (function). Label retained items EC, P, and/or DO. Co-occurrence allowed.</w:t>
+      </w:r>
+      <w:r>
+        <w:rPr>
+          <w:rtl w:val="0"/>
+        </w:rPr>
+      </w:r>
+    </w:p>
+    <w:p>
+      <w:pPr>
+        <w:spacing w:before="0" w:after="0" w:line="360" w:lineRule="auto"/>
+        <w:ind w:left="360" w:hanging="360"/>
+        <w:jc w:val="both"/>
+        <w:rPr/>
+      </w:pPr>
+      <w:r>
+        <w:rPr>
+          <w:rFonts w:ascii="Georgia" w:cs="Georgia" w:eastAsia="Georgia" w:hAnsi="Georgia"/>
+          <w:b w:val="0"/>
+          <w:bCs w:val="0"/>
+          <w:i w:val="0"/>
+          <w:iCs w:val="0"/>
+          <w:color w:val="000000"/>
+          <w:sz w:val="22"/>
+          <w:szCs w:val="22"/>
+          <w:rtl w:val="0"/>
+        </w:rPr>
+        <w:t>• Working Test (EC only). Does removing the device change commitment to the truth of the proposition? Supports EC. Not the only Stage 1 gate.</w:t>
+      </w:r>
+      <w:r>
+        <w:rPr>
+          <w:rFonts w:ascii="Georgia" w:cs="Georgia" w:eastAsia="Georgia" w:hAnsi="Georgia"/>
+          <w:b w:val="0"/>
+          <w:bCs w:val="0"/>
+          <w:i w:val="1"/>
+          <w:iCs w:val="1"/>
+          <w:color w:val="000000"/>
+          <w:sz w:val="22"/>
+          <w:szCs w:val="22"/>
+          <w:rtl w:val="0"/>
+        </w:rPr>
+      </w:r>
+      <w:r>
+        <w:rPr>
+          <w:rFonts w:ascii="Georgia" w:cs="Georgia" w:eastAsia="Georgia" w:hAnsi="Georgia"/>
+          <w:b w:val="0"/>
+          <w:bCs w:val="0"/>
+          <w:i w:val="0"/>
+          <w:iCs w:val="0"/>
+          <w:color w:val="000000"/>
+          <w:sz w:val="22"/>
+          <w:szCs w:val="22"/>
+          <w:rtl w:val="0"/>
+        </w:rPr>
+      </w:r>
+      <w:r>
+        <w:rPr>
+          <w:rFonts w:ascii="Georgia" w:cs="Georgia" w:eastAsia="Georgia" w:hAnsi="Georgia"/>
+          <w:b w:val="0"/>
+          <w:bCs w:val="0"/>
+          <w:i w:val="1"/>
+          <w:iCs w:val="1"/>
+          <w:color w:val="000000"/>
+          <w:sz w:val="22"/>
+          <w:szCs w:val="22"/>
+          <w:rtl w:val="0"/>
+        </w:rPr>
+      </w:r>
+      <w:r>
+        <w:rPr>
+          <w:rFonts w:ascii="Georgia" w:cs="Georgia" w:eastAsia="Georgia" w:hAnsi="Georgia"/>
+          <w:b w:val="0"/>
+          <w:bCs w:val="0"/>
+          <w:i w:val="0"/>
+          <w:iCs w:val="0"/>
+          <w:color w:val="000000"/>
+          <w:sz w:val="22"/>
+          <w:szCs w:val="22"/>
+          <w:rtl w:val="0"/>
+        </w:rPr>
+      </w:r>
+      <w:r>
+        <w:rPr>
+          <w:rtl w:val="0"/>
+        </w:rPr>
+      </w:r>
+    </w:p>
+    <w:p>
+      <w:pPr>
+        <w:spacing w:before="120" w:after="60" w:line="360" w:lineRule="auto"/>
+        <w:ind w:left="360" w:hanging="360"/>
+        <w:jc w:val="both"/>
+        <w:rPr/>
+      </w:pPr>
+      <w:r>
+        <w:rPr>
+          <w:rFonts w:ascii="Georgia" w:cs="Georgia" w:eastAsia="Georgia" w:hAnsi="Georgia"/>
+          <w:b w:val="0"/>
+          <w:bCs w:val="0"/>
+          <w:i w:val="0"/>
+          <w:iCs w:val="0"/>
+          <w:sz w:val="22"/>
+          <w:szCs w:val="22"/>
+          <w:rtl w:val="0"/>
+        </w:rPr>
+        <w:t>• Softening / deontic / order. Softening includes P and DO at Stage 1 when force or uptake is reduced. Deontic advice is never retained (FP-Rec). Coding order: full sentence → Stage 1 → Decision Rules → Stage 2 → Working Test for EC → Coder Notes.</w:t>
       </w:r>
       <w:r>
         <w:rPr>
@@ -15970,15 +16126,42 @@
       <w:r>
         <w:rPr>
           <w:rFonts w:ascii="Georgia" w:cs="Georgia" w:eastAsia="Georgia" w:hAnsi="Georgia"/>
-          <w:b w:val="0"/>
-          <w:bCs w:val="0"/>
-          <w:i w:val="0"/>
-          <w:iCs w:val="0"/>
-          <w:sz w:val="22"/>
-          <w:szCs w:val="22"/>
-          <w:rtl w:val="0"/>
-        </w:rPr>
-        <w:t xml:space="preserve">Softening is broader than epistemic qualification. Stage 1 admits softening of force, directness, or imposition, including interpersonal and discourse-managing uses. The Working Test then helps decide whether a retained item is EC (commitment to the proposition changes) as opposed to primarily P or DO. P-only or DO-only items can be retained at Stage 1 when they reduce imposition or frame uptake, even if certainty is unchanged.</w:t>
+          <w:b w:val="1"/>
+          <w:bCs w:val="0"/>
+          <w:i w:val="0"/>
+          <w:iCs w:val="0"/>
+          <w:sz w:val="22"/>
+          <w:szCs w:val="22"/>
+          <w:rtl w:val="0"/>
+        </w:rPr>
+        <w:t xml:space="preserve">WORKING EXAMPLES: STAGE 1 RETENTION AND STAGE 2 FUNCTION (EC, P, DO)</w:t>
+      </w:r>
+      <w:r>
+        <w:rPr>
+          <w:rtl w:val="0"/>
+          <w:b w:val="1"/>
+        </w:rPr>
+      </w:r>
+    </w:p>
+    <w:p>
+      <w:pPr>
+        <w:spacing w:before="0" w:after="0" w:line="360" w:lineRule="auto"/>
+        <w:ind w:left="360" w:hanging="360"/>
+        <w:jc w:val="both"/>
+        <w:rPr/>
+      </w:pPr>
+      <w:r>
+        <w:rPr>
+          <w:rFonts w:ascii="Georgia" w:hAnsi="Georgia" w:cs="Georgia" w:eastAsia="Georgia"/>
+          <w:b w:val="0"/>
+          <w:bCs w:val="0"/>
+          <w:i w:val="0"/>
+          <w:iCs w:val="0"/>
+          <w:sz w:val="22"/>
+          <w:szCs w:val="22"/>
+          <w:rtl w:val="0"/>
+        </w:rPr>
+        <w:t>• Function labels apply after Stage 1. Stage 1 = how a finding is stated, not advice. Working Test supports EC when certainty changes.</w:t>
       </w:r>
       <w:r>
         <w:rPr>
@@ -15989,22 +16172,126 @@
     <w:p>
       <w:pPr>
         <w:spacing w:before="120" w:after="60" w:line="360" w:lineRule="auto"/>
-        <w:ind w:firstLine="720"/>
+        <w:ind w:left="360" w:hanging="360"/>
         <w:jc w:val="both"/>
         <w:rPr/>
       </w:pPr>
       <w:r>
         <w:rPr>
-          <w:rFonts w:ascii="Georgia" w:cs="Georgia" w:eastAsia="Georgia" w:hAnsi="Georgia"/>
-          <w:b w:val="0"/>
-          <w:bCs w:val="0"/>
-          <w:i w:val="0"/>
-          <w:iCs w:val="0"/>
-          <w:sz w:val="22"/>
-          <w:szCs w:val="22"/>
-          <w:rtl w:val="0"/>
-        </w:rPr>
-        <w:t xml:space="preserve">Epistemic vs. deontic: epistemic language concerns how certain a claim is (what may or might be true). Deontic language concerns what should or needs to be done. Deontic language (obligation/recommendation) is never retained at Stage 1, whatever verb carries it. Example: “We suggest further research” is FP-Rec even though “suggest” is on the hedge list.</w:t>
+          <w:rFonts w:ascii="Georgia" w:hAnsi="Georgia" w:cs="Georgia" w:eastAsia="Georgia"/>
+          <w:b w:val="0"/>
+          <w:bCs w:val="0"/>
+          <w:i w:val="0"/>
+          <w:iCs w:val="0"/>
+          <w:sz w:val="22"/>
+          <w:szCs w:val="22"/>
+          <w:rtl w:val="0"/>
+        </w:rPr>
+        <w:t>• EC: “The treatment may reduce infection rates.” Removing may raises certainty → hedge, EC.</w:t>
+      </w:r>
+      <w:r>
+        <w:rPr>
+          <w:rtl w:val="0"/>
+        </w:rPr>
+      </w:r>
+    </w:p>
+    <w:p>
+      <w:pPr>
+        <w:spacing w:before="120" w:after="60" w:line="360" w:lineRule="auto"/>
+        <w:ind w:left="360" w:hanging="360"/>
+        <w:jc w:val="both"/>
+        <w:rPr/>
+      </w:pPr>
+      <w:r>
+        <w:rPr>
+          <w:rFonts w:ascii="Georgia" w:hAnsi="Georgia" w:cs="Georgia" w:eastAsia="Georgia"/>
+          <w:b w:val="0"/>
+          <w:bCs w:val="0"/>
+          <w:i w:val="0"/>
+          <w:iCs w:val="0"/>
+          <w:sz w:val="22"/>
+          <w:szCs w:val="22"/>
+          <w:rtl w:val="0"/>
+        </w:rPr>
+        <w:t>• FP-Cap: “PCR can detect low concentrations.” can = capability, not uncertainty about a finding.</w:t>
+      </w:r>
+      <w:r>
+        <w:rPr>
+          <w:rtl w:val="0"/>
+        </w:rPr>
+      </w:r>
+    </w:p>
+    <w:p>
+      <w:pPr>
+        <w:spacing w:before="120" w:after="60" w:line="360" w:lineRule="auto"/>
+        <w:ind w:left="360" w:hanging="360"/>
+        <w:jc w:val="both"/>
+        <w:rPr/>
+      </w:pPr>
+      <w:r>
+        <w:rPr>
+          <w:rFonts w:ascii="Georgia" w:hAnsi="Georgia" w:cs="Georgia" w:eastAsia="Georgia"/>
+          <w:b w:val="0"/>
+          <w:bCs w:val="0"/>
+          <w:i w:val="0"/>
+          <w:iCs w:val="0"/>
+          <w:sz w:val="22"/>
+          <w:szCs w:val="22"/>
+          <w:rtl w:val="0"/>
+        </w:rPr>
+        <w:t>• P: “As suggested by previous researchers, the treatment is effective.” Stage 1 may pass. EC Working Test fails if certainty is unchanged → function P.</w:t>
+      </w:r>
+      <w:r>
+        <w:rPr>
+          <w:rtl w:val="0"/>
+        </w:rPr>
+      </w:r>
+    </w:p>
+    <w:p>
+      <w:pPr>
+        <w:spacing w:before="120" w:after="60" w:line="360" w:lineRule="auto"/>
+        <w:ind w:left="360" w:hanging="360"/>
+        <w:jc w:val="both"/>
+        <w:rPr/>
+      </w:pPr>
+      <w:r>
+        <w:rPr>
+          <w:rFonts w:ascii="Georgia" w:hAnsi="Georgia" w:cs="Georgia" w:eastAsia="Georgia"/>
+          <w:b w:val="0"/>
+          <w:bCs w:val="0"/>
+          <w:i w:val="0"/>
+          <w:iCs w:val="0"/>
+          <w:sz w:val="22"/>
+          <w:szCs w:val="22"/>
+          <w:rtl w:val="0"/>
+        </w:rPr>
+        <w:t>• P + EC: Stage 1 and Working Test both pass → dominant function from context (or dual note in Coder Notes).</w:t>
+      </w:r>
+      <w:r>
+        <w:rPr>
+          <w:rtl w:val="0"/>
+        </w:rPr>
+      </w:r>
+    </w:p>
+    <w:p>
+      <w:pPr>
+        <w:spacing w:before="120" w:after="60" w:line="360" w:lineRule="auto"/>
+        <w:ind w:left="360" w:hanging="360"/>
+        <w:jc w:val="both"/>
+        <w:rPr/>
+      </w:pPr>
+      <w:r>
+        <w:rPr>
+          <w:rFonts w:ascii="Georgia" w:hAnsi="Georgia" w:cs="Georgia" w:eastAsia="Georgia"/>
+          <w:b w:val="0"/>
+          <w:bCs w:val="0"/>
+          <w:i w:val="0"/>
+          <w:iCs w:val="0"/>
+          <w:sz w:val="22"/>
+          <w:szCs w:val="22"/>
+          <w:rtl w:val="0"/>
+        </w:rPr>
+        <w:t>• DO: “It should be noted that the treatment increased plant height.” Frame guides the reader, not certainty → DO if Stage 1 passes on framing only.</w:t>
       </w:r>
       <w:r>
         <w:rPr>
@@ -16015,7 +16302,7 @@
     <w:p>
       <w:pPr>
         <w:spacing w:before="0" w:after="0" w:line="360" w:lineRule="auto"/>
-        <w:ind w:firstLine="720"/>
+        <w:ind w:left="360" w:hanging="360"/>
         <w:jc w:val="both"/>
         <w:rPr/>
       </w:pPr>
@@ -16026,68 +16313,11 @@
           <w:bCs w:val="0"/>
           <w:i w:val="0"/>
           <w:iCs w:val="0"/>
-          <w:color w:val="000000"/>
-          <w:sz w:val="22"/>
-          <w:szCs w:val="22"/>
-          <w:rtl w:val="0"/>
-        </w:rPr>
-        <w:t xml:space="preserve">Do not code a word as a hedge just because it appears in the hedge list. Evaluate its function in the sentence: “can” is a hedge only for possibility, not capability. “suggest” is a hedge only for a finding, not a recommendation.</w:t>
-      </w:r>
-      <w:r>
-        <w:rPr>
-          <w:rFonts w:ascii="Georgia" w:cs="Georgia" w:eastAsia="Georgia" w:hAnsi="Georgia"/>
-          <w:b w:val="0"/>
-          <w:bCs w:val="0"/>
-          <w:i w:val="1"/>
-          <w:iCs w:val="1"/>
-          <w:color w:val="000000"/>
-          <w:sz w:val="22"/>
-          <w:szCs w:val="22"/>
-          <w:rtl w:val="0"/>
-        </w:rPr>
-        <w:t xml:space="preserve"/>
-      </w:r>
-      <w:r>
-        <w:rPr>
-          <w:rFonts w:ascii="Georgia" w:cs="Georgia" w:eastAsia="Georgia" w:hAnsi="Georgia"/>
-          <w:b w:val="0"/>
-          <w:bCs w:val="0"/>
-          <w:i w:val="0"/>
-          <w:iCs w:val="0"/>
-          <w:color w:val="000000"/>
-          <w:sz w:val="22"/>
-          <w:szCs w:val="22"/>
-          <w:rtl w:val="0"/>
-        </w:rPr>
-        <w:t xml:space="preserve"/>
-      </w:r>
-      <w:r>
-        <w:rPr>
-          <w:rFonts w:ascii="Georgia" w:cs="Georgia" w:eastAsia="Georgia" w:hAnsi="Georgia"/>
-          <w:b w:val="0"/>
-          <w:bCs w:val="0"/>
-          <w:i w:val="1"/>
-          <w:iCs w:val="1"/>
-          <w:color w:val="000000"/>
-          <w:sz w:val="22"/>
-          <w:szCs w:val="22"/>
-          <w:rtl w:val="0"/>
-        </w:rPr>
-        <w:t xml:space="preserve"/>
-      </w:r>
-      <w:r>
-        <w:rPr>
-          <w:rFonts w:ascii="Georgia" w:cs="Georgia" w:eastAsia="Georgia" w:hAnsi="Georgia"/>
-          <w:b w:val="0"/>
-          <w:bCs w:val="0"/>
-          <w:i w:val="0"/>
-          <w:iCs w:val="0"/>
-          <w:color w:val="000000"/>
-          <w:sz w:val="22"/>
-          <w:szCs w:val="22"/>
-          <w:rtl w:val="0"/>
-        </w:rPr>
-        <w:t xml:space="preserve"/>
+          <w:sz w:val="22"/>
+          <w:szCs w:val="22"/>
+          <w:rtl w:val="0"/>
+        </w:rPr>
+        <w:t>• DO frame + separate hedge: “It should be noted that the results may indicate growth.” Code may as hedge (EC). Frame alone is not the hedge count.</w:t>
       </w:r>
       <w:r>
         <w:rPr>
@@ -16098,7 +16328,7 @@
     <w:p>
       <w:pPr>
         <w:spacing w:before="120" w:after="60" w:line="360" w:lineRule="auto"/>
-        <w:ind w:firstLine="720"/>
+        <w:ind w:left="360" w:hanging="360"/>
         <w:jc w:val="both"/>
         <w:rPr/>
       </w:pPr>
@@ -16113,242 +16343,7 @@
           <w:szCs w:val="22"/>
           <w:rtl w:val="0"/>
         </w:rPr>
-        <w:t xml:space="preserve">Coding order: read the sentence in full, apply Stage 1 (force / directness / imposition), check Decision Rules and false-positive exclusions, assign Stage 2 function (EC, P, and/or DO), use the Working Test when deciding whether EC applies, and log unresolved cases in Coder Notes rather than guessing.</w:t>
-      </w:r>
-      <w:r>
-        <w:rPr>
-          <w:rtl w:val="0"/>
-        </w:rPr>
-      </w:r>
-    </w:p>
-    <w:p>
-      <w:pPr>
-        <w:spacing w:before="120" w:after="60" w:line="360" w:lineRule="auto"/>
-        <w:ind w:firstLine="720"/>
-        <w:jc w:val="both"/>
-        <w:rPr/>
-      </w:pPr>
-      <w:r>
-        <w:rPr>
-          <w:rFonts w:ascii="Georgia" w:cs="Georgia" w:eastAsia="Georgia" w:hAnsi="Georgia"/>
-          <w:b w:val="1"/>
-          <w:bCs w:val="0"/>
-          <w:i w:val="0"/>
-          <w:iCs w:val="0"/>
-          <w:sz w:val="22"/>
-          <w:szCs w:val="22"/>
-          <w:rtl w:val="0"/>
-        </w:rPr>
-        <w:t xml:space="preserve">WORKING EXAMPLES: STAGE 1 RETENTION AND STAGE 2 FUNCTION (EC, P, DO)</w:t>
-      </w:r>
-      <w:r>
-        <w:rPr>
-          <w:rtl w:val="0"/>
-          <w:b w:val="1"/>
-        </w:rPr>
-      </w:r>
-    </w:p>
-    <w:p>
-      <w:pPr>
-        <w:spacing w:before="0" w:after="0" w:line="360" w:lineRule="auto"/>
-        <w:ind w:firstLine="720"/>
-        <w:jc w:val="both"/>
-        <w:rPr/>
-      </w:pPr>
-      <w:r>
-        <w:rPr>
-          <w:rFonts w:ascii="Georgia" w:hAnsi="Georgia" w:cs="Georgia" w:eastAsia="Georgia"/>
-          <w:b w:val="0"/>
-          <w:bCs w:val="0"/>
-          <w:i w:val="0"/>
-          <w:iCs w:val="0"/>
-          <w:sz w:val="22"/>
-          <w:szCs w:val="22"/>
-          <w:rtl w:val="0"/>
-        </w:rPr>
-        <w:t>Function labels (EC, P, DO) come after Stage 1 retention. Stage 1 targets how a finding is stated, not advice or recommendations. The Working Test supports EC when certainty about the claim changes. It does not block P or DO.</w:t>
-      </w:r>
-      <w:r>
-        <w:rPr>
-          <w:rtl w:val="0"/>
-        </w:rPr>
-      </w:r>
-    </w:p>
-    <w:p>
-      <w:pPr>
-        <w:spacing w:before="120" w:after="60" w:line="360" w:lineRule="auto"/>
-        <w:ind w:firstLine="720"/>
-        <w:jc w:val="both"/>
-        <w:rPr/>
-      </w:pPr>
-      <w:r>
-        <w:rPr>
-          <w:rFonts w:ascii="Georgia" w:hAnsi="Georgia" w:cs="Georgia" w:eastAsia="Georgia"/>
-          <w:b w:val="0"/>
-          <w:bCs w:val="0"/>
-          <w:i w:val="0"/>
-          <w:iCs w:val="0"/>
-          <w:sz w:val="22"/>
-          <w:szCs w:val="22"/>
-          <w:rtl w:val="0"/>
-        </w:rPr>
-        <w:t>EC (hedge): “The treatment may reduce infection rates.” Removing may raises certainty. Working Test pass. Function EC.</w:t>
-      </w:r>
-      <w:r>
-        <w:rPr>
-          <w:rtl w:val="0"/>
-        </w:rPr>
-      </w:r>
-    </w:p>
-    <w:p>
-      <w:pPr>
-        <w:spacing w:before="120" w:after="60" w:line="360" w:lineRule="auto"/>
-        <w:ind w:firstLine="720"/>
-        <w:jc w:val="both"/>
-        <w:rPr/>
-      </w:pPr>
-      <w:r>
-        <w:rPr>
-          <w:rFonts w:ascii="Georgia" w:hAnsi="Georgia" w:cs="Georgia" w:eastAsia="Georgia"/>
-          <w:b w:val="0"/>
-          <w:bCs w:val="0"/>
-          <w:i w:val="0"/>
-          <w:iCs w:val="0"/>
-          <w:sz w:val="22"/>
-          <w:szCs w:val="22"/>
-          <w:rtl w:val="0"/>
-        </w:rPr>
-        <w:t>Not a hedge (FP-Cap): “PCR can detect low concentrations.” can marks capability, not uncertainty about a finding.</w:t>
-      </w:r>
-      <w:r>
-        <w:rPr>
-          <w:rtl w:val="0"/>
-        </w:rPr>
-      </w:r>
-    </w:p>
-    <w:p>
-      <w:pPr>
-        <w:spacing w:before="120" w:after="60" w:line="360" w:lineRule="auto"/>
-        <w:ind w:firstLine="720"/>
-        <w:jc w:val="both"/>
-        <w:rPr/>
-      </w:pPr>
-      <w:r>
-        <w:rPr>
-          <w:rFonts w:ascii="Georgia" w:hAnsi="Georgia" w:cs="Georgia" w:eastAsia="Georgia"/>
-          <w:b w:val="0"/>
-          <w:bCs w:val="0"/>
-          <w:i w:val="0"/>
-          <w:iCs w:val="0"/>
-          <w:sz w:val="22"/>
-          <w:szCs w:val="22"/>
-          <w:rtl w:val="0"/>
-        </w:rPr>
-        <w:t>P possible: “As suggested by previous researchers, the treatment is effective.” Stage 1 may pass (less direct). Working Test for EC fails if certainty is unchanged. Function P.</w:t>
-      </w:r>
-      <w:r>
-        <w:rPr>
-          <w:rtl w:val="0"/>
-        </w:rPr>
-      </w:r>
-    </w:p>
-    <w:p>
-      <w:pPr>
-        <w:spacing w:before="120" w:after="60" w:line="360" w:lineRule="auto"/>
-        <w:ind w:firstLine="720"/>
-        <w:jc w:val="both"/>
-        <w:rPr/>
-      </w:pPr>
-      <w:r>
-        <w:rPr>
-          <w:rFonts w:ascii="Georgia" w:hAnsi="Georgia" w:cs="Georgia" w:eastAsia="Georgia"/>
-          <w:b w:val="0"/>
-          <w:bCs w:val="0"/>
-          <w:i w:val="0"/>
-          <w:iCs w:val="0"/>
-          <w:sz w:val="22"/>
-          <w:szCs w:val="22"/>
-          <w:rtl w:val="0"/>
-        </w:rPr>
-        <w:t>Both P and EC: Stage 1 pass and Working Test pass. Label the dominant function from context, or note dual coding in Coder Notes.</w:t>
-      </w:r>
-      <w:r>
-        <w:rPr>
-          <w:rtl w:val="0"/>
-        </w:rPr>
-      </w:r>
-    </w:p>
-    <w:p>
-      <w:pPr>
-        <w:spacing w:before="120" w:after="60" w:line="360" w:lineRule="auto"/>
-        <w:ind w:firstLine="720"/>
-        <w:jc w:val="both"/>
-        <w:rPr/>
-      </w:pPr>
-      <w:r>
-        <w:rPr>
-          <w:rFonts w:ascii="Georgia" w:hAnsi="Georgia" w:cs="Georgia" w:eastAsia="Georgia"/>
-          <w:b w:val="0"/>
-          <w:bCs w:val="0"/>
-          <w:i w:val="0"/>
-          <w:iCs w:val="0"/>
-          <w:sz w:val="22"/>
-          <w:szCs w:val="22"/>
-          <w:rtl w:val="0"/>
-        </w:rPr>
-        <w:t>DO possible: “It should be noted that the treatment increased plant height.” Removing the frame removes reader guidance, not certainty about the finding. Function DO if Stage 1 passes on framing only.</w:t>
-      </w:r>
-      <w:r>
-        <w:rPr>
-          <w:rtl w:val="0"/>
-        </w:rPr>
-      </w:r>
-    </w:p>
-    <w:p>
-      <w:pPr>
-        <w:spacing w:before="0" w:after="0" w:line="360" w:lineRule="auto"/>
-        <w:ind w:firstLine="720"/>
-        <w:jc w:val="both"/>
-        <w:rPr/>
-      </w:pPr>
-      <w:r>
-        <w:rPr>
-          <w:rFonts w:ascii="Georgia" w:cs="Georgia" w:eastAsia="Georgia" w:hAnsi="Georgia"/>
-          <w:b w:val="0"/>
-          <w:bCs w:val="0"/>
-          <w:i w:val="0"/>
-          <w:iCs w:val="0"/>
-          <w:sz w:val="22"/>
-          <w:szCs w:val="22"/>
-          <w:rtl w:val="0"/>
-        </w:rPr>
-        <w:t xml:space="preserve">DO-looking frame with a separate hedge. “It should be noted that the results may indicate a positive effect.” It should be noted that fails the Working Test on its own. may indicate passes. Code only may indicate as the hedge (EC). Do not treat the whole clause as one hedge because a later token is epistemic.</w:t>
-      </w:r>
-      <w:r>
-        <w:rPr>
-          <w:rtl w:val="0"/>
-        </w:rPr>
-      </w:r>
-    </w:p>
-    <w:p>
-      <w:pPr>
-        <w:spacing w:before="120" w:after="60" w:line="360" w:lineRule="auto"/>
-        <w:ind w:firstLine="720"/>
-        <w:jc w:val="both"/>
-        <w:rPr/>
-      </w:pPr>
-      <w:r>
-        <w:rPr>
-          <w:rFonts w:ascii="Georgia" w:cs="Georgia" w:eastAsia="Georgia" w:hAnsi="Georgia"/>
-          <w:b w:val="0"/>
-          <w:bCs w:val="0"/>
-          <w:i w:val="0"/>
-          <w:iCs w:val="0"/>
-          <w:sz w:val="22"/>
-          <w:szCs w:val="22"/>
-          <w:rtl w:val="0"/>
-        </w:rPr>
-        <w:t xml:space="preserve">Summary rule. Stage 1 can retain P-only or DO-only items when they reduce force, directness, or imposition even if certainty is unchanged. Stage 2 labels EC, P, and/or DO. The Working Test supports EC, not exclusive membership. In this corpus, every token retained in the coded set was labeled EC; no P candidates appeared in the abstracts, and sequence-only DO markers were not counted as hedges. Full corpus pass under this Stage 1 rule: recommendation/deontic forms (FP-Rec), capability (FP-Cap), procedural norms (FP-Proc), topic-naming and factive restatement (FP-Gen), pure sequence connectives (Hence/Thus/Therefore/In conclusion as move markers), and framing adverbs such as Overall remained excluded. No politeness/deference forms were present in the 60 abstracts. No additional tokens were promoted into the retained set; n=65 and all-EC function counts are unchanged.</w:t>
+        <w:t>• Summary: Stage 1 may retain P or DO when force or uptake is reduced. Stage 2 labels EC / P / DO. Working Test supports EC only. In this corpus all 65 retained tokens were EC. No P forms appeared. Sequence-only connectives were not counted.</w:t>
       </w:r>
       <w:r>
         <w:rPr>
@@ -17236,7 +17231,7 @@
       <w:pPr>
         <w:keepNext w:val="1"/>
         <w:spacing w:before="20" w:after="20" w:line="360" w:lineRule="auto"/>
-        <w:ind w:firstLine="720"/>
+        <w:ind w:left="360" w:hanging="360"/>
         <w:jc w:val="both"/>
         <w:rPr/>
       </w:pPr>
@@ -17250,7 +17245,7 @@
           <w:szCs w:val="22"/>
           <w:rtl w:val="0"/>
         </w:rPr>
-        <w:t>Token extensions (see Decision Rules table for detail). imply / implies / implying counts as suggest. can be concluded / derived / stated is inferential (hedge), not capability can (FP-Cap). potentially is adverbial. potential + noun: topic-naming in aim or methods frames is FP-Gen. In results or conclusion frames that qualify a finding, code Lexical EC. If removing potential clearly changes commitment to a proposition, code Lexical EC even in an aim sentence.</w:t>
+        <w:t>• imply / implies / implying = suggest. • can be concluded / derived / stated = inferential hedge (not capability can). • potentially = adverbial. • potential + noun: aim/methods topic-naming = FP-Gen. Results/conclusion qualifying a finding = Lexical EC. If removing potential changes commitment to a proposition, code Lexical EC.</w:t>
       </w:r>
       <w:r>
         <w:rPr>
@@ -20008,7 +20003,7 @@
       <w:pPr>
         <w:keepNext w:val="1"/>
         <w:spacing w:before="0" w:after="0" w:line="360" w:lineRule="auto"/>
-        <w:ind w:firstLine="720"/>
+        <w:ind w:left="360" w:hanging="360"/>
         <w:jc w:val="both"/>
         <w:rPr/>
       </w:pPr>
@@ -20024,7 +20019,7 @@
           <w:szCs w:val="22"/>
           <w:rtl w:val="0"/>
         </w:rPr>
-        <w:t>Marks claim-bearing clauses stated without a hedge. Reverse test: a hedge could be inserted without changing the facts. Procedural statements are never markable. Example: “Results showed X” could become “Results suggested X.”</w:t>
+        <w:t>• Layer 3: claim clauses with no hedge. Reverse test: a hedge could be inserted without changing the facts. Procedural statements never markable. Example: “Results showed X” → could be “Results suggested X.”</w:t>
       </w:r>
       <w:r>
         <w:rPr>

</xml_diff>

<commit_message>
Draft_053: uniform Appendix C discipline minor headings
Center bold, keep-with-next. Fixes Crop Science orphan and
Animal Science left alignment.
</commit_message>
<xml_diff>
--- a/thesis/003_ThesisProposal_Draft_053.docx
+++ b/thesis/003_ThesisProposal_Draft_053.docx
@@ -21586,22 +21586,25 @@
     </w:p>
     <w:p>
       <w:pPr>
-        <w:spacing w:before="0" w:after="0" w:line="480" w:lineRule="auto"/>
+        <w:spacing w:before="240" w:after="0" w:line="480" w:lineRule="auto"/>
         <w:jc w:val="center"/>
         <w:rPr/>
-      </w:pPr>
-      <w:r>
-        <w:rPr>
-          <w:rFonts w:ascii="Georgia" w:cs="Georgia" w:eastAsia="Georgia" w:hAnsi="Georgia"/>
-          <w:b w:val="1"/>
-          <w:bCs w:val="1"/>
-          <w:i w:val="0"/>
-          <w:iCs w:val="0"/>
-          <w:sz w:val="24"/>
+        <w:keepNext/>
+        <w:keepLines/>
+        <w:ind w:firstLine="0" w:left="0"/>
+      </w:pPr>
+      <w:r>
+        <w:rPr>
+          <w:rFonts w:ascii="Georgia" w:hAnsi="Georgia" w:cs="Georgia" w:eastAsia="Georgia"/>
+          <w:i w:val="0"/>
+          <w:iCs w:val="0"/>
+          <w:sz w:val="22"/>
           <w:szCs w:val="24"/>
           <w:rtl w:val="0"/>
-        </w:rPr>
-        <w:t xml:space="preserve">Biology (B1–B20)</w:t>
+          <w:b/>
+          <w:bCs/>
+        </w:rPr>
+        <w:t>Biology (B1–B20)</w:t>
       </w:r>
       <w:r>
         <w:rPr>
@@ -25907,22 +25910,25 @@
     </w:p>
     <w:p>
       <w:pPr>
-        <w:spacing w:before="0" w:after="0" w:line="480" w:lineRule="auto"/>
+        <w:spacing w:before="240" w:after="0" w:line="480" w:lineRule="auto"/>
         <w:jc w:val="center"/>
         <w:rPr/>
-      </w:pPr>
-      <w:r>
-        <w:rPr>
-          <w:rFonts w:ascii="Georgia" w:cs="Georgia" w:eastAsia="Georgia" w:hAnsi="Georgia"/>
-          <w:b w:val="1"/>
-          <w:bCs w:val="1"/>
-          <w:i w:val="0"/>
-          <w:iCs w:val="0"/>
-          <w:sz w:val="24"/>
+        <w:keepNext/>
+        <w:keepLines/>
+        <w:ind w:firstLine="0" w:left="0"/>
+      </w:pPr>
+      <w:r>
+        <w:rPr>
+          <w:rFonts w:ascii="Georgia" w:hAnsi="Georgia" w:cs="Georgia" w:eastAsia="Georgia"/>
+          <w:i w:val="0"/>
+          <w:iCs w:val="0"/>
+          <w:sz w:val="22"/>
           <w:szCs w:val="24"/>
           <w:rtl w:val="0"/>
-        </w:rPr>
-        <w:t xml:space="preserve">Veterinary Medicine (VM1–VM20)</w:t>
+          <w:b/>
+          <w:bCs/>
+        </w:rPr>
+        <w:t>Veterinary Medicine (VM1–VM20)</w:t>
       </w:r>
       <w:r>
         <w:rPr>
@@ -28588,22 +28594,25 @@
     </w:p>
     <w:p>
       <w:pPr>
-        <w:spacing w:before="0" w:after="0" w:line="480" w:lineRule="auto"/>
+        <w:spacing w:before="240" w:after="0" w:line="480" w:lineRule="auto"/>
         <w:jc w:val="center"/>
         <w:rPr/>
-      </w:pPr>
-      <w:r>
-        <w:rPr>
-          <w:rFonts w:ascii="Georgia" w:cs="Georgia" w:eastAsia="Georgia" w:hAnsi="Georgia"/>
-          <w:b w:val="1"/>
-          <w:bCs w:val="1"/>
-          <w:i w:val="0"/>
-          <w:iCs w:val="0"/>
-          <w:sz w:val="24"/>
+        <w:keepNext/>
+        <w:keepLines/>
+        <w:ind w:firstLine="0" w:left="0"/>
+      </w:pPr>
+      <w:r>
+        <w:rPr>
+          <w:rFonts w:ascii="Georgia" w:hAnsi="Georgia" w:cs="Georgia" w:eastAsia="Georgia"/>
+          <w:i w:val="0"/>
+          <w:iCs w:val="0"/>
+          <w:sz w:val="22"/>
           <w:szCs w:val="24"/>
           <w:rtl w:val="0"/>
-        </w:rPr>
-        <w:t xml:space="preserve">Agriculture, Crop Science (Acs1–Acs10)</w:t>
+          <w:b/>
+          <w:bCs/>
+        </w:rPr>
+        <w:t>Agriculture, Crop Science (Acs1–Acs10)</w:t>
       </w:r>
       <w:r>
         <w:rPr>
@@ -30365,22 +30374,25 @@
     </w:p>
     <w:p>
       <w:pPr>
-        <w:spacing w:before="0" w:after="0" w:line="480" w:lineRule="auto"/>
-        <w:jc w:val="both"/>
-        <w:rPr/>
-      </w:pPr>
-      <w:r>
-        <w:rPr>
-          <w:rFonts w:ascii="Georgia" w:cs="Georgia" w:eastAsia="Georgia" w:hAnsi="Georgia"/>
-          <w:b w:val="1"/>
-          <w:bCs w:val="1"/>
-          <w:i w:val="0"/>
-          <w:iCs w:val="0"/>
-          <w:sz w:val="24"/>
+        <w:spacing w:before="240" w:after="0" w:line="480" w:lineRule="auto"/>
+        <w:jc w:val="center"/>
+        <w:rPr/>
+        <w:keepNext/>
+        <w:keepLines/>
+        <w:ind w:firstLine="0" w:left="0"/>
+      </w:pPr>
+      <w:r>
+        <w:rPr>
+          <w:rFonts w:ascii="Georgia" w:hAnsi="Georgia" w:cs="Georgia" w:eastAsia="Georgia"/>
+          <w:i w:val="0"/>
+          <w:iCs w:val="0"/>
+          <w:sz w:val="22"/>
           <w:szCs w:val="24"/>
           <w:rtl w:val="0"/>
-        </w:rPr>
-        <w:t xml:space="preserve">Agriculture, Animal Science (Aas1–Aas10)</w:t>
+          <w:b/>
+          <w:bCs/>
+        </w:rPr>
+        <w:t>Agriculture, Animal Science (Aas1–Aas10)</w:t>
       </w:r>
       <w:r>
         <w:rPr>

</xml_diff>

<commit_message>
Draft_053: prevent table rows from splitting across pages
cantSplit on all table rows. Politeness and FP-Proc rows stay intact.
</commit_message>
<xml_diff>
--- a/thesis/003_ThesisProposal_Draft_053.docx
+++ b/thesis/003_ThesisProposal_Draft_053.docx
@@ -3112,8 +3112,8 @@
       </w:tblGrid>
       <w:tr>
         <w:trPr>
-          <w:cantSplit w:val="1"/>
-          <w:tblHeader w:val="1"/>
+          <w:cantSplit/>
+          <w:tblHeader/>
         </w:trPr>
         <w:tc>
           <w:tcPr>
@@ -3322,8 +3322,8 @@
       </w:tr>
       <w:tr>
         <w:trPr>
-          <w:cantSplit w:val="1"/>
           <w:tblHeader w:val="0"/>
+          <w:cantSplit/>
         </w:trPr>
         <w:tc>
           <w:tcPr/>
@@ -3508,8 +3508,8 @@
       </w:tr>
       <w:tr>
         <w:trPr>
-          <w:cantSplit w:val="1"/>
           <w:tblHeader w:val="0"/>
+          <w:cantSplit/>
         </w:trPr>
         <w:tc>
           <w:tcPr/>
@@ -3694,8 +3694,8 @@
       </w:tr>
       <w:tr>
         <w:trPr>
-          <w:cantSplit w:val="1"/>
           <w:tblHeader w:val="0"/>
+          <w:cantSplit/>
         </w:trPr>
         <w:tc>
           <w:tcPr/>
@@ -3880,8 +3880,8 @@
       </w:tr>
       <w:tr>
         <w:trPr>
-          <w:cantSplit w:val="1"/>
           <w:tblHeader w:val="0"/>
+          <w:cantSplit/>
         </w:trPr>
         <w:tc>
           <w:tcPr/>
@@ -4066,8 +4066,8 @@
       </w:tr>
       <w:tr>
         <w:trPr>
-          <w:cantSplit w:val="1"/>
           <w:tblHeader w:val="0"/>
+          <w:cantSplit/>
         </w:trPr>
         <w:tc>
           <w:tcPr/>
@@ -4538,8 +4538,8 @@
       </w:tblGrid>
       <w:tr>
         <w:trPr>
-          <w:cantSplit w:val="1"/>
-          <w:tblHeader w:val="1"/>
+          <w:cantSplit/>
+          <w:tblHeader/>
         </w:trPr>
         <w:tc>
           <w:tcPr>
@@ -4646,8 +4646,8 @@
       </w:tr>
       <w:tr>
         <w:trPr>
-          <w:cantSplit w:val="1"/>
           <w:tblHeader w:val="0"/>
+          <w:cantSplit/>
         </w:trPr>
         <w:tc>
           <w:tcPr/>
@@ -4742,8 +4742,8 @@
       </w:tr>
       <w:tr>
         <w:trPr>
-          <w:cantSplit w:val="1"/>
           <w:tblHeader w:val="0"/>
+          <w:cantSplit/>
         </w:trPr>
         <w:tc>
           <w:tcPr/>
@@ -4838,8 +4838,8 @@
       </w:tr>
       <w:tr>
         <w:trPr>
-          <w:cantSplit w:val="1"/>
           <w:tblHeader w:val="0"/>
+          <w:cantSplit/>
         </w:trPr>
         <w:tc>
           <w:tcPr/>
@@ -4934,8 +4934,8 @@
       </w:tr>
       <w:tr>
         <w:trPr>
-          <w:cantSplit w:val="1"/>
           <w:tblHeader w:val="0"/>
+          <w:cantSplit/>
         </w:trPr>
         <w:tc>
           <w:tcPr/>
@@ -5030,8 +5030,8 @@
       </w:tr>
       <w:tr>
         <w:trPr>
-          <w:cantSplit w:val="1"/>
           <w:tblHeader w:val="0"/>
+          <w:cantSplit/>
         </w:trPr>
         <w:tc>
           <w:tcPr/>
@@ -7111,8 +7111,8 @@
       </w:tblGrid>
       <w:tr>
         <w:trPr>
-          <w:cantSplit w:val="1"/>
-          <w:tblHeader w:val="1"/>
+          <w:cantSplit/>
+          <w:tblHeader/>
         </w:trPr>
         <w:tc>
           <w:tcPr>
@@ -7348,8 +7348,8 @@
       </w:tr>
       <w:tr>
         <w:trPr>
-          <w:cantSplit w:val="1"/>
           <w:tblHeader w:val="0"/>
+          <w:cantSplit/>
         </w:trPr>
         <w:tc>
           <w:tcPr/>
@@ -7534,8 +7534,8 @@
       </w:tr>
       <w:tr>
         <w:trPr>
-          <w:cantSplit w:val="1"/>
           <w:tblHeader w:val="0"/>
+          <w:cantSplit/>
         </w:trPr>
         <w:tc>
           <w:tcPr/>
@@ -7720,8 +7720,8 @@
       </w:tr>
       <w:tr>
         <w:trPr>
-          <w:cantSplit w:val="1"/>
           <w:tblHeader w:val="0"/>
+          <w:cantSplit/>
         </w:trPr>
         <w:tc>
           <w:tcPr/>
@@ -7906,8 +7906,8 @@
       </w:tr>
       <w:tr>
         <w:trPr>
-          <w:cantSplit w:val="1"/>
           <w:tblHeader w:val="0"/>
+          <w:cantSplit/>
         </w:trPr>
         <w:tc>
           <w:tcPr/>
@@ -8343,8 +8343,8 @@
       </w:tblGrid>
       <w:tr>
         <w:trPr>
-          <w:cantSplit w:val="1"/>
-          <w:tblHeader w:val="1"/>
+          <w:cantSplit/>
+          <w:tblHeader/>
         </w:trPr>
         <w:tc>
           <w:tcPr>
@@ -8680,8 +8680,8 @@
       </w:tr>
       <w:tr>
         <w:trPr>
-          <w:cantSplit w:val="1"/>
           <w:tblHeader w:val="0"/>
+          <w:cantSplit/>
         </w:trPr>
         <w:tc>
           <w:tcPr/>
@@ -8926,8 +8926,8 @@
       </w:tr>
       <w:tr>
         <w:trPr>
-          <w:cantSplit w:val="1"/>
           <w:tblHeader w:val="0"/>
+          <w:cantSplit/>
         </w:trPr>
         <w:tc>
           <w:tcPr/>
@@ -9172,8 +9172,8 @@
       </w:tr>
       <w:tr>
         <w:trPr>
-          <w:cantSplit w:val="1"/>
           <w:tblHeader w:val="0"/>
+          <w:cantSplit/>
         </w:trPr>
         <w:tc>
           <w:tcPr/>
@@ -9418,8 +9418,8 @@
       </w:tr>
       <w:tr>
         <w:trPr>
-          <w:cantSplit w:val="1"/>
           <w:tblHeader w:val="0"/>
+          <w:cantSplit/>
         </w:trPr>
         <w:tc>
           <w:tcPr/>
@@ -9956,8 +9956,8 @@
       </w:tblGrid>
       <w:tr>
         <w:trPr>
-          <w:cantSplit w:val="1"/>
-          <w:tblHeader w:val="1"/>
+          <w:cantSplit/>
+          <w:tblHeader/>
         </w:trPr>
         <w:tc>
           <w:tcPr>
@@ -10064,8 +10064,8 @@
       </w:tr>
       <w:tr>
         <w:trPr>
-          <w:cantSplit w:val="1"/>
           <w:tblHeader w:val="0"/>
+          <w:cantSplit/>
         </w:trPr>
         <w:tc>
           <w:tcPr/>
@@ -10160,8 +10160,8 @@
       </w:tr>
       <w:tr>
         <w:trPr>
-          <w:cantSplit w:val="1"/>
           <w:tblHeader w:val="0"/>
+          <w:cantSplit/>
         </w:trPr>
         <w:tc>
           <w:tcPr/>
@@ -10256,8 +10256,8 @@
       </w:tr>
       <w:tr>
         <w:trPr>
-          <w:cantSplit w:val="1"/>
           <w:tblHeader w:val="0"/>
+          <w:cantSplit/>
         </w:trPr>
         <w:tc>
           <w:tcPr/>
@@ -10352,8 +10352,8 @@
       </w:tr>
       <w:tr>
         <w:trPr>
-          <w:cantSplit w:val="1"/>
           <w:tblHeader w:val="0"/>
+          <w:cantSplit/>
         </w:trPr>
         <w:tc>
           <w:tcPr/>
@@ -10620,8 +10620,8 @@
       </w:tblGrid>
       <w:tr>
         <w:trPr>
-          <w:cantSplit w:val="1"/>
-          <w:tblHeader w:val="1"/>
+          <w:cantSplit/>
+          <w:tblHeader/>
         </w:trPr>
         <w:tc>
           <w:tcPr>
@@ -10741,7 +10741,7 @@
       </w:tr>
       <w:tr>
         <w:trPr>
-          <w:cantSplit w:val="1"/>
+          <w:cantSplit/>
         </w:trPr>
         <w:tc>
           <w:tcPr>
@@ -10841,7 +10841,7 @@
       </w:tr>
       <w:tr>
         <w:trPr>
-          <w:cantSplit w:val="1"/>
+          <w:cantSplit/>
         </w:trPr>
         <w:tc>
           <w:tcPr>
@@ -10941,7 +10941,7 @@
       </w:tr>
       <w:tr>
         <w:trPr>
-          <w:cantSplit w:val="1"/>
+          <w:cantSplit/>
         </w:trPr>
         <w:tc>
           <w:tcPr>
@@ -11041,7 +11041,7 @@
       </w:tr>
       <w:tr>
         <w:trPr>
-          <w:cantSplit w:val="1"/>
+          <w:cantSplit/>
         </w:trPr>
         <w:tc>
           <w:tcPr>
@@ -11141,7 +11141,7 @@
       </w:tr>
       <w:tr>
         <w:trPr>
-          <w:cantSplit w:val="1"/>
+          <w:cantSplit/>
         </w:trPr>
         <w:tc>
           <w:tcPr>
@@ -11241,7 +11241,7 @@
       </w:tr>
       <w:tr>
         <w:trPr>
-          <w:cantSplit w:val="1"/>
+          <w:cantSplit/>
         </w:trPr>
         <w:tc>
           <w:tcPr>
@@ -13398,8 +13398,8 @@
       </w:tblGrid>
       <w:tr>
         <w:trPr>
-          <w:cantSplit w:val="1"/>
-          <w:tblHeader w:val="1"/>
+          <w:cantSplit/>
+          <w:tblHeader/>
         </w:trPr>
         <w:tc>
           <w:tcPr>
@@ -13472,8 +13472,8 @@
       </w:tr>
       <w:tr>
         <w:trPr>
-          <w:cantSplit w:val="1"/>
           <w:tblHeader w:val="0"/>
+          <w:cantSplit/>
         </w:trPr>
         <w:tc>
           <w:tcPr/>
@@ -13769,8 +13769,8 @@
       </w:tr>
       <w:tr>
         <w:trPr>
-          <w:cantSplit w:val="1"/>
           <w:tblHeader w:val="0"/>
+          <w:cantSplit/>
         </w:trPr>
         <w:tc>
           <w:tcPr/>
@@ -14346,8 +14346,8 @@
       </w:tblGrid>
       <w:tr>
         <w:trPr>
-          <w:cantSplit w:val="1"/>
-          <w:tblHeader w:val="1"/>
+          <w:cantSplit/>
+          <w:tblHeader/>
         </w:trPr>
         <w:tc>
           <w:tcPr>
@@ -14624,8 +14624,8 @@
       </w:tr>
       <w:tr>
         <w:trPr>
-          <w:cantSplit w:val="1"/>
           <w:tblHeader w:val="0"/>
+          <w:cantSplit/>
         </w:trPr>
         <w:tc>
           <w:tcPr/>
@@ -14962,8 +14962,8 @@
       </w:tblGrid>
       <w:tr>
         <w:trPr>
-          <w:cantSplit w:val="1"/>
-          <w:tblHeader w:val="1"/>
+          <w:cantSplit/>
+          <w:tblHeader/>
         </w:trPr>
         <w:tc>
           <w:tcPr>
@@ -15172,8 +15172,8 @@
       </w:tr>
       <w:tr>
         <w:trPr>
-          <w:cantSplit w:val="1"/>
           <w:tblHeader w:val="0"/>
+          <w:cantSplit/>
         </w:trPr>
         <w:tc>
           <w:tcPr/>
@@ -15429,8 +15429,8 @@
       </w:tblGrid>
       <w:tr>
         <w:trPr>
-          <w:cantSplit w:val="1"/>
-          <w:tblHeader w:val="1"/>
+          <w:cantSplit/>
+          <w:tblHeader/>
         </w:trPr>
         <w:tc>
           <w:tcPr>
@@ -15639,8 +15639,8 @@
       </w:tr>
       <w:tr>
         <w:trPr>
-          <w:cantSplit w:val="1"/>
           <w:tblHeader w:val="0"/>
+          <w:cantSplit/>
         </w:trPr>
         <w:tc>
           <w:tcPr/>
@@ -16437,7 +16437,8 @@
       </w:tblGrid>
       <w:tr>
         <w:trPr>
-          <w:tblHeader w:val="1"/>
+          <w:cantSplit/>
+          <w:tblHeader/>
         </w:trPr>
         <w:tc>
           <w:tcPr>
@@ -16579,6 +16580,7 @@
       <w:tr>
         <w:trPr>
           <w:tblHeader w:val="0"/>
+          <w:cantSplit/>
         </w:trPr>
         <w:tc>
           <w:tcPr>
@@ -16728,6 +16730,7 @@
       <w:tr>
         <w:trPr>
           <w:tblHeader w:val="0"/>
+          <w:cantSplit/>
         </w:trPr>
         <w:tc>
           <w:tcPr>
@@ -16877,6 +16880,7 @@
       <w:tr>
         <w:trPr>
           <w:tblHeader w:val="0"/>
+          <w:cantSplit/>
         </w:trPr>
         <w:tc>
           <w:tcPr>
@@ -17026,6 +17030,7 @@
       <w:tr>
         <w:trPr>
           <w:tblHeader w:val="0"/>
+          <w:cantSplit/>
         </w:trPr>
         <w:tc>
           <w:tcPr>
@@ -17477,7 +17482,8 @@
       </w:tblGrid>
       <w:tr>
         <w:trPr>
-          <w:tblHeader w:val="1"/>
+          <w:cantSplit/>
+          <w:tblHeader/>
         </w:trPr>
         <w:tc>
           <w:tcPr>
@@ -17619,6 +17625,7 @@
       <w:tr>
         <w:trPr>
           <w:tblHeader w:val="0"/>
+          <w:cantSplit/>
         </w:trPr>
         <w:tc>
           <w:tcPr/>
@@ -17798,6 +17805,7 @@
       <w:tr>
         <w:trPr>
           <w:tblHeader w:val="0"/>
+          <w:cantSplit/>
         </w:trPr>
         <w:tc>
           <w:tcPr/>
@@ -17977,6 +17985,7 @@
       <w:tr>
         <w:trPr>
           <w:tblHeader w:val="0"/>
+          <w:cantSplit/>
         </w:trPr>
         <w:tc>
           <w:tcPr/>
@@ -18238,7 +18247,8 @@
       </w:tblGrid>
       <w:tr>
         <w:trPr>
-          <w:tblHeader w:val="1"/>
+          <w:cantSplit/>
+          <w:tblHeader/>
         </w:trPr>
         <w:tc>
           <w:tcPr>
@@ -18346,6 +18356,7 @@
       <w:tr>
         <w:trPr>
           <w:tblHeader w:val="0"/>
+          <w:cantSplit/>
         </w:trPr>
         <w:tc>
           <w:tcPr/>
@@ -18437,6 +18448,7 @@
       <w:tr>
         <w:trPr>
           <w:tblHeader w:val="0"/>
+          <w:cantSplit/>
         </w:trPr>
         <w:tc>
           <w:tcPr/>
@@ -18528,6 +18540,7 @@
       <w:tr>
         <w:trPr>
           <w:tblHeader w:val="0"/>
+          <w:cantSplit/>
         </w:trPr>
         <w:tc>
           <w:tcPr/>
@@ -18619,6 +18632,7 @@
       <w:tr>
         <w:trPr>
           <w:tblHeader w:val="0"/>
+          <w:cantSplit/>
         </w:trPr>
         <w:tc>
           <w:tcPr/>
@@ -18710,6 +18724,7 @@
       <w:tr>
         <w:trPr>
           <w:tblHeader w:val="0"/>
+          <w:cantSplit/>
         </w:trPr>
         <w:tc>
           <w:tcPr/>
@@ -18801,6 +18816,7 @@
       <w:tr>
         <w:trPr>
           <w:tblHeader w:val="0"/>
+          <w:cantSplit/>
         </w:trPr>
         <w:tc>
           <w:tcPr/>
@@ -18892,6 +18908,7 @@
       <w:tr>
         <w:trPr>
           <w:tblHeader w:val="0"/>
+          <w:cantSplit/>
         </w:trPr>
         <w:tc>
           <w:tcPr/>
@@ -18983,6 +19000,7 @@
       <w:tr>
         <w:trPr>
           <w:tblHeader w:val="0"/>
+          <w:cantSplit/>
         </w:trPr>
         <w:tc>
           <w:tcPr/>
@@ -19252,7 +19270,8 @@
       </w:tblGrid>
       <w:tr>
         <w:trPr>
-          <w:tblHeader w:val="1"/>
+          <w:cantSplit/>
+          <w:tblHeader/>
         </w:trPr>
         <w:tc>
           <w:tcPr>
@@ -19360,6 +19379,7 @@
       <w:tr>
         <w:trPr>
           <w:tblHeader w:val="0"/>
+          <w:cantSplit/>
         </w:trPr>
         <w:tc>
           <w:tcPr/>
@@ -19483,6 +19503,7 @@
       <w:tr>
         <w:trPr>
           <w:tblHeader w:val="0"/>
+          <w:cantSplit/>
         </w:trPr>
         <w:tc>
           <w:tcPr/>
@@ -19606,6 +19627,7 @@
       <w:tr>
         <w:trPr>
           <w:tblHeader w:val="0"/>
+          <w:cantSplit/>
         </w:trPr>
         <w:tc>
           <w:tcPr/>
@@ -19729,6 +19751,7 @@
       <w:tr>
         <w:trPr>
           <w:tblHeader w:val="0"/>
+          <w:cantSplit/>
         </w:trPr>
         <w:tc>
           <w:tcPr/>
@@ -19852,6 +19875,7 @@
       <w:tr>
         <w:trPr>
           <w:tblHeader w:val="0"/>
+          <w:cantSplit/>
         </w:trPr>
         <w:tc>
           <w:tcPr/>
@@ -20112,7 +20136,8 @@
       </w:tblGrid>
       <w:tr>
         <w:trPr>
-          <w:tblHeader w:val="1"/>
+          <w:cantSplit/>
+          <w:tblHeader/>
         </w:trPr>
         <w:tc>
           <w:tcPr>
@@ -20254,6 +20279,7 @@
       <w:tr>
         <w:trPr>
           <w:tblHeader w:val="0"/>
+          <w:cantSplit/>
         </w:trPr>
         <w:tc>
           <w:tcPr>
@@ -20403,6 +20429,7 @@
       <w:tr>
         <w:trPr>
           <w:tblHeader w:val="0"/>
+          <w:cantSplit/>
         </w:trPr>
         <w:tc>
           <w:tcPr>
@@ -20552,6 +20579,7 @@
       <w:tr>
         <w:trPr>
           <w:tblHeader w:val="0"/>
+          <w:cantSplit/>
         </w:trPr>
         <w:tc>
           <w:tcPr>

</xml_diff>

<commit_message>
Draft_053: match Appendix C mark colors to original palette
Unhedged grey BFBFBF, [R] black, modal shade 00B0F0.
</commit_message>
<xml_diff>
--- a/thesis/003_ThesisProposal_Draft_053.docx
+++ b/thesis/003_ThesisProposal_Draft_053.docx
@@ -27021,7 +27021,7 @@
         <w:rPr>
           <w:rFonts w:ascii="Georgia" w:hAnsi="Georgia" w:cs="Georgia" w:eastAsia="Georgia"/>
           <w:sz w:val="22"/>
-          <w:shd w:val="clear" w:fill="D9D9D9"/>
+          <w:shd w:val="clear" w:fill="BFBFBF"/>
           <w:strike w:val="0"/>
         </w:rPr>
         <w:t>A total of 181 microplastics were detected across all samples, wherein the concentration of microplastics was higher in Treatment 1 (74.03%).</w:t>
@@ -27029,7 +27029,7 @@
       <w:r>
         <w:rPr>
           <w:rFonts w:ascii="Georgia" w:hAnsi="Georgia" w:cs="Georgia" w:eastAsia="Georgia"/>
-          <w:color w:val="808080"/>
+          <w:color w:val="000000"/>
           <w:sz w:val="22"/>
           <w:strike w:val="0"/>
         </w:rPr>
@@ -27512,7 +27512,7 @@
         <w:rPr>
           <w:rFonts w:ascii="Georgia" w:hAnsi="Georgia" w:cs="Georgia" w:eastAsia="Georgia"/>
           <w:sz w:val="22"/>
-          <w:shd w:val="clear" w:fill="D9D9D9"/>
+          <w:shd w:val="clear" w:fill="BFBFBF"/>
           <w:strike w:val="0"/>
         </w:rPr>
         <w:t>One way ANOVA was used and the differences between the groups were statistically significant.</w:t>
@@ -27520,7 +27520,7 @@
       <w:r>
         <w:rPr>
           <w:rFonts w:ascii="Georgia" w:hAnsi="Georgia" w:cs="Georgia" w:eastAsia="Georgia"/>
-          <w:color w:val="808080"/>
+          <w:color w:val="000000"/>
           <w:sz w:val="22"/>
           <w:strike w:val="0"/>
         </w:rPr>
@@ -30750,8 +30750,8 @@
           <w:b w:val="0"/>
           <w:color w:val="000000"/>
           <w:sz w:val="22"/>
-          <w:highlight w:val="cyan"/>
           <w:strike w:val="0"/>
+          <w:shd w:val="clear" w:fill="00B0F0"/>
         </w:rPr>
         <w:t>can</w:t>
       </w:r>
@@ -31368,7 +31368,7 @@
         <w:rPr>
           <w:rFonts w:ascii="Georgia" w:hAnsi="Georgia" w:cs="Georgia" w:eastAsia="Georgia"/>
           <w:sz w:val="22"/>
-          <w:shd w:val="clear" w:fill="D9D9D9"/>
+          <w:shd w:val="clear" w:fill="BFBFBF"/>
           <w:strike w:val="0"/>
         </w:rPr>
         <w:t>The results disclosed that the percentage of mortality and moisture content were statistically significant at 1% (P&lt;0.01) and (P&lt;0.05) level with 48 hours after the post-treatment.</w:t>
@@ -31376,7 +31376,7 @@
       <w:r>
         <w:rPr>
           <w:rFonts w:ascii="Georgia" w:hAnsi="Georgia" w:cs="Georgia" w:eastAsia="Georgia"/>
-          <w:color w:val="808080"/>
+          <w:color w:val="000000"/>
           <w:sz w:val="22"/>
           <w:strike w:val="0"/>
         </w:rPr>
@@ -31396,7 +31396,7 @@
         <w:rPr>
           <w:rFonts w:ascii="Georgia" w:hAnsi="Georgia" w:cs="Georgia" w:eastAsia="Georgia"/>
           <w:sz w:val="22"/>
-          <w:shd w:val="clear" w:fill="D9D9D9"/>
+          <w:shd w:val="clear" w:fill="BFBFBF"/>
           <w:strike w:val="0"/>
         </w:rPr>
         <w:t>However, mortality rate and moisture content were not significant after 6 hours and 24 hours.</w:t>
@@ -31404,7 +31404,7 @@
       <w:r>
         <w:rPr>
           <w:rFonts w:ascii="Georgia" w:hAnsi="Georgia" w:cs="Georgia" w:eastAsia="Georgia"/>
-          <w:color w:val="808080"/>
+          <w:color w:val="000000"/>
           <w:sz w:val="22"/>
           <w:strike w:val="0"/>
         </w:rPr>

</xml_diff>

<commit_message>
Draft_053: rebuild Appendix C marks with correct highlight/shd
Remove blanket strikethrough. Match original red/yellow/blue/grey style.
</commit_message>
<xml_diff>
--- a/thesis/003_ThesisProposal_Draft_053.docx
+++ b/thesis/003_ThesisProposal_Draft_053.docx
@@ -24721,188 +24721,233 @@
       <w:r>
         <w:rPr>
           <w:rFonts w:ascii="Georgia" w:hAnsi="Georgia" w:cs="Georgia" w:eastAsia="Georgia"/>
-          <w:b w:val="0"/>
-          <w:color w:val="000000"/>
-          <w:sz w:val="22"/>
+          <w:sz w:val="22"/>
+          <w:szCs w:val="22"/>
+          <w:b w:val="0"/>
+          <w:bCs w:val="0"/>
           <w:strike w:val="0"/>
+          <w:color w:val="000000"/>
         </w:rPr>
         <w:t xml:space="preserve">Methicillin-resistant Staphylococcus aureus (MRSA) is a common and </w:t>
       </w:r>
       <w:r>
         <w:rPr>
           <w:rFonts w:ascii="Georgia" w:hAnsi="Georgia" w:cs="Georgia" w:eastAsia="Georgia"/>
-          <w:b w:val="0"/>
-          <w:color w:val="000000"/>
-          <w:sz w:val="22"/>
+          <w:sz w:val="22"/>
+          <w:szCs w:val="22"/>
+          <w:b w:val="0"/>
+          <w:bCs w:val="0"/>
+          <w:strike w:val="0"/>
           <w:highlight w:val="yellow"/>
+          <w:color w:val="000000"/>
+        </w:rPr>
+        <w:t>potentially</w:t>
+      </w:r>
+      <w:r>
+        <w:rPr>
+          <w:rFonts w:ascii="Georgia" w:hAnsi="Georgia" w:cs="Georgia" w:eastAsia="Georgia"/>
+          <w:sz w:val="20"/>
+          <w:szCs w:val="20"/>
+          <w:b w:val="0"/>
+          <w:bCs w:val="0"/>
           <w:strike w:val="0"/>
+          <w:color w:val="ED7D31"/>
+        </w:rPr>
+        <w:t xml:space="preserve"> (EC)</w:t>
+      </w:r>
+      <w:r>
+        <w:rPr>
+          <w:rFonts w:ascii="Georgia" w:hAnsi="Georgia" w:cs="Georgia" w:eastAsia="Georgia"/>
+          <w:sz w:val="22"/>
+          <w:szCs w:val="22"/>
+          <w:b w:val="0"/>
+          <w:bCs w:val="0"/>
+          <w:strike w:val="0"/>
+          <w:color w:val="000000"/>
+        </w:rPr>
+        <w:t xml:space="preserve"> severe pathogen that has developed resistance to several types of antibiotics. MRSA bacteria </w:t>
+      </w:r>
+      <w:r>
+        <w:rPr>
+          <w:rFonts w:ascii="Georgia" w:hAnsi="Georgia" w:cs="Georgia" w:eastAsia="Georgia"/>
+          <w:sz w:val="22"/>
+          <w:szCs w:val="22"/>
+          <w:b w:val="0"/>
+          <w:bCs w:val="0"/>
+          <w:color w:val="000000"/>
+          <w:strike w:val="1"/>
+        </w:rPr>
+        <w:t>can</w:t>
+      </w:r>
+      <w:r>
+        <w:rPr>
+          <w:rFonts w:ascii="Georgia" w:hAnsi="Georgia" w:cs="Georgia" w:eastAsia="Georgia"/>
+          <w:sz w:val="20"/>
+          <w:szCs w:val="20"/>
+          <w:b w:val="0"/>
+          <w:bCs w:val="0"/>
+          <w:strike w:val="0"/>
+          <w:color w:val="808080"/>
+        </w:rPr>
+        <w:t xml:space="preserve"> (FP-Cap)</w:t>
+      </w:r>
+      <w:r>
+        <w:rPr>
+          <w:rFonts w:ascii="Georgia" w:hAnsi="Georgia" w:cs="Georgia" w:eastAsia="Georgia"/>
+          <w:sz w:val="22"/>
+          <w:szCs w:val="22"/>
+          <w:b w:val="0"/>
+          <w:bCs w:val="0"/>
+          <w:strike w:val="0"/>
+          <w:color w:val="000000"/>
+        </w:rPr>
+        <w:t xml:space="preserve"> survive long on surfaces and objects, including second-hand clothing (SHC). The increasing popularity of SHC or “ukay-ukay” in the Philippines, coupled with </w:t>
+      </w:r>
+      <w:r>
+        <w:rPr>
+          <w:rFonts w:ascii="Georgia" w:hAnsi="Georgia" w:cs="Georgia" w:eastAsia="Georgia"/>
+          <w:sz w:val="22"/>
+          <w:szCs w:val="22"/>
+          <w:b w:val="0"/>
+          <w:bCs w:val="0"/>
+          <w:strike w:val="0"/>
+          <w:highlight w:val="red"/>
+          <w:color w:val="FFFFFF"/>
+        </w:rPr>
+        <w:t>potential</w:t>
+      </w:r>
+      <w:r>
+        <w:rPr>
+          <w:rFonts w:ascii="Georgia" w:hAnsi="Georgia" w:cs="Georgia" w:eastAsia="Georgia"/>
+          <w:sz w:val="20"/>
+          <w:szCs w:val="20"/>
+          <w:b w:val="0"/>
+          <w:bCs w:val="0"/>
+          <w:strike w:val="0"/>
+          <w:color w:val="ED7D31"/>
+        </w:rPr>
+        <w:t xml:space="preserve"> (EC)</w:t>
+      </w:r>
+      <w:r>
+        <w:rPr>
+          <w:rFonts w:ascii="Georgia" w:hAnsi="Georgia" w:cs="Georgia" w:eastAsia="Georgia"/>
+          <w:sz w:val="22"/>
+          <w:szCs w:val="22"/>
+          <w:b w:val="0"/>
+          <w:bCs w:val="0"/>
+          <w:strike w:val="0"/>
+          <w:color w:val="000000"/>
+        </w:rPr>
+        <w:t xml:space="preserve"> public health concerns associated with transmitting pathogenic bacteria, emphasized this research’s need. Thus, this study detected the presence of S. aureus and MRSA in second-hand clothing. A total of fifteen most frequently purchased second-hand clothing (i.e., blouses, tee shirts, crop tops, tank tops, and hoodie jackets) were collected from [REDACTED]. Bacteriological analyses demonstrated the presence of Staphylococcus species across all samples, with growth in high-salt-containing culture broth and characteristic growth on Mannitol Salt Agar (MSA). Biochemical tests revealed positive catalase and Gram-positive cocci in clusters typical of S. aureus. Antibiotic susceptibility testing indicated the presence of both methicillin-sensitive S. aureus (MSSA) and methicillin-resistant S. aureus (MRSA) strains among the collected samples, highlighting the </w:t>
+      </w:r>
+      <w:r>
+        <w:rPr>
+          <w:rFonts w:ascii="Georgia" w:hAnsi="Georgia" w:cs="Georgia" w:eastAsia="Georgia"/>
+          <w:sz w:val="22"/>
+          <w:szCs w:val="22"/>
+          <w:b w:val="0"/>
+          <w:bCs w:val="0"/>
+          <w:strike w:val="0"/>
+          <w:highlight w:val="red"/>
+          <w:color w:val="FFFFFF"/>
+        </w:rPr>
+        <w:t>potential</w:t>
+      </w:r>
+      <w:r>
+        <w:rPr>
+          <w:rFonts w:ascii="Georgia" w:hAnsi="Georgia" w:cs="Georgia" w:eastAsia="Georgia"/>
+          <w:sz w:val="20"/>
+          <w:szCs w:val="20"/>
+          <w:b w:val="0"/>
+          <w:bCs w:val="0"/>
+          <w:strike w:val="0"/>
+          <w:color w:val="ED7D31"/>
+        </w:rPr>
+        <w:t xml:space="preserve"> (EC)</w:t>
+      </w:r>
+      <w:r>
+        <w:rPr>
+          <w:rFonts w:ascii="Georgia" w:hAnsi="Georgia" w:cs="Georgia" w:eastAsia="Georgia"/>
+          <w:sz w:val="22"/>
+          <w:szCs w:val="22"/>
+          <w:b w:val="0"/>
+          <w:bCs w:val="0"/>
+          <w:strike w:val="0"/>
+          <w:color w:val="000000"/>
+        </w:rPr>
+        <w:t xml:space="preserve"> public health risks associated with the handling and purchasing of second-hand clothing. This study, therefore, underscores the need for proper precautions to mitigate the spread of </w:t>
+      </w:r>
+      <w:r>
+        <w:rPr>
+          <w:rFonts w:ascii="Georgia" w:hAnsi="Georgia" w:cs="Georgia" w:eastAsia="Georgia"/>
+          <w:sz w:val="22"/>
+          <w:szCs w:val="22"/>
+          <w:b w:val="0"/>
+          <w:bCs w:val="0"/>
+          <w:strike w:val="0"/>
+          <w:highlight w:val="yellow"/>
+          <w:color w:val="000000"/>
         </w:rPr>
         <w:t>potentially</w:t>
       </w:r>
       <w:r>
         <w:rPr>
           <w:rFonts w:ascii="Georgia" w:hAnsi="Georgia" w:cs="Georgia" w:eastAsia="Georgia"/>
+          <w:sz w:val="20"/>
+          <w:szCs w:val="20"/>
+          <w:b w:val="0"/>
+          <w:bCs w:val="0"/>
+          <w:strike w:val="0"/>
           <w:color w:val="ED7D31"/>
-          <w:sz w:val="22"/>
+        </w:rPr>
+        <w:t xml:space="preserve"> (EC)</w:t>
+      </w:r>
+      <w:r>
+        <w:rPr>
+          <w:rFonts w:ascii="Georgia" w:hAnsi="Georgia" w:cs="Georgia" w:eastAsia="Georgia"/>
+          <w:sz w:val="22"/>
+          <w:szCs w:val="22"/>
+          <w:b w:val="0"/>
+          <w:bCs w:val="0"/>
           <w:strike w:val="0"/>
+          <w:color w:val="000000"/>
+        </w:rPr>
+        <w:t xml:space="preserve"> harmful bacteria, including MRSA, on second-hand clothing. It highlights the importance of raising awareness among both vendors and consumers about the </w:t>
+      </w:r>
+      <w:r>
+        <w:rPr>
+          <w:rFonts w:ascii="Georgia" w:hAnsi="Georgia" w:cs="Georgia" w:eastAsia="Georgia"/>
+          <w:sz w:val="22"/>
+          <w:szCs w:val="22"/>
+          <w:b w:val="0"/>
+          <w:bCs w:val="0"/>
+          <w:strike w:val="0"/>
+          <w:highlight w:val="red"/>
+          <w:color w:val="FFFFFF"/>
+        </w:rPr>
+        <w:t>potential</w:t>
+      </w:r>
+      <w:r>
+        <w:rPr>
+          <w:rFonts w:ascii="Georgia" w:hAnsi="Georgia" w:cs="Georgia" w:eastAsia="Georgia"/>
+          <w:sz w:val="20"/>
+          <w:szCs w:val="20"/>
+          <w:b w:val="0"/>
+          <w:bCs w:val="0"/>
+          <w:strike w:val="0"/>
+          <w:color w:val="ED7D31"/>
         </w:rPr>
         <w:t xml:space="preserve"> (EC)</w:t>
       </w:r>
       <w:r>
         <w:rPr>
           <w:rFonts w:ascii="Georgia" w:hAnsi="Georgia" w:cs="Georgia" w:eastAsia="Georgia"/>
-          <w:b w:val="0"/>
-          <w:color w:val="000000"/>
-          <w:sz w:val="22"/>
+          <w:sz w:val="22"/>
+          <w:szCs w:val="22"/>
+          <w:b w:val="0"/>
+          <w:bCs w:val="0"/>
           <w:strike w:val="0"/>
-        </w:rPr>
-        <w:t xml:space="preserve"> severe pathogen that has developed resistance to several types of antibiotics. MRSA bacteria </w:t>
-      </w:r>
-      <w:r>
-        <w:rPr>
-          <w:rFonts w:ascii="Georgia" w:hAnsi="Georgia" w:cs="Georgia" w:eastAsia="Georgia"/>
-          <w:color w:val="000000"/>
-          <w:sz w:val="22"/>
-          <w:strike/>
-        </w:rPr>
-        <w:t>can</w:t>
-      </w:r>
-      <w:r>
-        <w:rPr>
-          <w:rFonts w:ascii="Georgia" w:hAnsi="Georgia" w:cs="Georgia" w:eastAsia="Georgia"/>
-          <w:color w:val="808080"/>
-          <w:sz w:val="22"/>
-          <w:strike w:val="0"/>
-        </w:rPr>
-        <w:t xml:space="preserve"> (FP-Cap)</w:t>
-      </w:r>
-      <w:r>
-        <w:rPr>
-          <w:rFonts w:ascii="Georgia" w:hAnsi="Georgia" w:cs="Georgia" w:eastAsia="Georgia"/>
-          <w:b w:val="0"/>
-          <w:color w:val="000000"/>
-          <w:sz w:val="22"/>
-          <w:strike w:val="0"/>
-        </w:rPr>
-        <w:t xml:space="preserve"> survive long on surfaces and objects, including second-hand clothing (SHC). The increasing popularity of SHC or “ukay-ukay” in the Philippines, coupled with </w:t>
-      </w:r>
-      <w:r>
-        <w:rPr>
-          <w:rFonts w:ascii="Georgia" w:hAnsi="Georgia" w:cs="Georgia" w:eastAsia="Georgia"/>
-          <w:b w:val="0"/>
-          <w:color w:val="FFFFFF"/>
-          <w:sz w:val="22"/>
-          <w:highlight w:val="red"/>
-          <w:strike w:val="0"/>
-        </w:rPr>
-        <w:t>potential</w:t>
-      </w:r>
-      <w:r>
-        <w:rPr>
-          <w:rFonts w:ascii="Georgia" w:hAnsi="Georgia" w:cs="Georgia" w:eastAsia="Georgia"/>
-          <w:color w:val="ED7D31"/>
-          <w:sz w:val="22"/>
-          <w:strike w:val="0"/>
-        </w:rPr>
-        <w:t xml:space="preserve"> (EC)</w:t>
-      </w:r>
-      <w:r>
-        <w:rPr>
-          <w:rFonts w:ascii="Georgia" w:hAnsi="Georgia" w:cs="Georgia" w:eastAsia="Georgia"/>
-          <w:b w:val="0"/>
-          <w:color w:val="000000"/>
-          <w:sz w:val="22"/>
-          <w:strike w:val="0"/>
-        </w:rPr>
-        <w:t xml:space="preserve"> public health concerns associated with transmitting pathogenic bacteria, emphasized this research’s need. Thus, this study detected the presence of S. aureus and MRSA in second-hand clothing. A total of fifteen most frequently purchased second-hand clothing (i.e., blouses, tee shirts, crop tops, tank tops, and hoodie jackets) were collected from [REDACTED]. Bacteriological analyses demonstrated the presence of Staphylococcus species across all samples, with growth in high-salt-containing culture broth and characteristic growth on Mannitol Salt Agar (MSA). Biochemical tests revealed positive catalase and Gram-positive cocci in clusters typical of S. aureus. Antibiotic susceptibility testing indicated the presence of both methicillin-sensitive S. aureus (MSSA) and methicillin-resistant S. aureus (MRSA) strains among the collected samples, highlighting the </w:t>
-      </w:r>
-      <w:r>
-        <w:rPr>
-          <w:rFonts w:ascii="Georgia" w:hAnsi="Georgia" w:cs="Georgia" w:eastAsia="Georgia"/>
-          <w:b w:val="0"/>
-          <w:color w:val="FFFFFF"/>
-          <w:sz w:val="22"/>
-          <w:highlight w:val="red"/>
-          <w:strike w:val="0"/>
-        </w:rPr>
-        <w:t>potential</w:t>
-      </w:r>
-      <w:r>
-        <w:rPr>
-          <w:rFonts w:ascii="Georgia" w:hAnsi="Georgia" w:cs="Georgia" w:eastAsia="Georgia"/>
-          <w:color w:val="ED7D31"/>
-          <w:sz w:val="22"/>
-          <w:strike w:val="0"/>
-        </w:rPr>
-        <w:t xml:space="preserve"> (EC)</w:t>
-      </w:r>
-      <w:r>
-        <w:rPr>
-          <w:rFonts w:ascii="Georgia" w:hAnsi="Georgia" w:cs="Georgia" w:eastAsia="Georgia"/>
-          <w:b w:val="0"/>
-          <w:color w:val="000000"/>
-          <w:sz w:val="22"/>
-          <w:strike w:val="0"/>
-        </w:rPr>
-        <w:t xml:space="preserve"> public health risks associated with the handling and purchasing of second-hand clothing. This study, therefore, underscores the need for proper precautions to mitigate the spread of </w:t>
-      </w:r>
-      <w:r>
-        <w:rPr>
-          <w:rFonts w:ascii="Georgia" w:hAnsi="Georgia" w:cs="Georgia" w:eastAsia="Georgia"/>
-          <w:b w:val="0"/>
-          <w:color w:val="000000"/>
-          <w:sz w:val="22"/>
-          <w:highlight w:val="yellow"/>
-          <w:strike w:val="0"/>
-        </w:rPr>
-        <w:t>potentially</w:t>
-      </w:r>
-      <w:r>
-        <w:rPr>
-          <w:rFonts w:ascii="Georgia" w:hAnsi="Georgia" w:cs="Georgia" w:eastAsia="Georgia"/>
-          <w:color w:val="ED7D31"/>
-          <w:sz w:val="22"/>
-          <w:strike w:val="0"/>
-        </w:rPr>
-        <w:t xml:space="preserve"> (EC)</w:t>
-      </w:r>
-      <w:r>
-        <w:rPr>
-          <w:rFonts w:ascii="Georgia" w:hAnsi="Georgia" w:cs="Georgia" w:eastAsia="Georgia"/>
-          <w:b w:val="0"/>
-          <w:color w:val="000000"/>
-          <w:sz w:val="22"/>
-          <w:strike w:val="0"/>
-        </w:rPr>
-        <w:t xml:space="preserve"> harmful bacteria, including MRSA, on second-hand clothing. It highlights the importance of raising awareness among both vendors and consumers about the </w:t>
-      </w:r>
-      <w:r>
-        <w:rPr>
-          <w:rFonts w:ascii="Georgia" w:hAnsi="Georgia" w:cs="Georgia" w:eastAsia="Georgia"/>
-          <w:b w:val="0"/>
-          <w:color w:val="FFFFFF"/>
-          <w:sz w:val="22"/>
-          <w:highlight w:val="red"/>
-          <w:strike w:val="0"/>
-        </w:rPr>
-        <w:t>potential</w:t>
-      </w:r>
-      <w:r>
-        <w:rPr>
-          <w:rFonts w:ascii="Georgia" w:hAnsi="Georgia" w:cs="Georgia" w:eastAsia="Georgia"/>
-          <w:color w:val="ED7D31"/>
-          <w:sz w:val="22"/>
-          <w:strike w:val="0"/>
-        </w:rPr>
-        <w:t xml:space="preserve"> (EC)</w:t>
-      </w:r>
-      <w:r>
-        <w:rPr>
-          <w:rFonts w:ascii="Georgia" w:hAnsi="Georgia" w:cs="Georgia" w:eastAsia="Georgia"/>
-          <w:b w:val="0"/>
-          <w:color w:val="000000"/>
-          <w:sz w:val="22"/>
-          <w:strike w:val="0"/>
+          <w:color w:val="000000"/>
         </w:rPr>
         <w:t xml:space="preserve"> health risks associated with these garments.</w:t>
       </w:r>
@@ -26980,96 +27025,122 @@
       <w:r>
         <w:rPr>
           <w:rFonts w:ascii="Georgia" w:hAnsi="Georgia" w:cs="Georgia" w:eastAsia="Georgia"/>
-          <w:b w:val="0"/>
-          <w:color w:val="000000"/>
-          <w:sz w:val="22"/>
+          <w:sz w:val="22"/>
+          <w:szCs w:val="22"/>
+          <w:b w:val="0"/>
+          <w:bCs w:val="0"/>
           <w:strike w:val="0"/>
+          <w:color w:val="000000"/>
         </w:rPr>
         <w:t xml:space="preserve">Plastic pollution has been a long-standing environmental concern due to improper waste management. Its persistence in marine environments, particularly in the form of microplastics, posed </w:t>
       </w:r>
       <w:r>
         <w:rPr>
           <w:rFonts w:ascii="Georgia" w:hAnsi="Georgia" w:cs="Georgia" w:eastAsia="Georgia"/>
-          <w:b w:val="0"/>
+          <w:sz w:val="22"/>
+          <w:szCs w:val="22"/>
+          <w:b w:val="0"/>
+          <w:bCs w:val="0"/>
+          <w:strike w:val="0"/>
+          <w:highlight w:val="red"/>
           <w:color w:val="FFFFFF"/>
-          <w:sz w:val="22"/>
-          <w:highlight w:val="red"/>
+        </w:rPr>
+        <w:t>potential</w:t>
+      </w:r>
+      <w:r>
+        <w:rPr>
+          <w:rFonts w:ascii="Georgia" w:hAnsi="Georgia" w:cs="Georgia" w:eastAsia="Georgia"/>
+          <w:sz w:val="20"/>
+          <w:szCs w:val="20"/>
+          <w:b w:val="0"/>
+          <w:bCs w:val="0"/>
           <w:strike w:val="0"/>
-        </w:rPr>
-        <w:t>potential</w:t>
+          <w:color w:val="ED7D31"/>
+        </w:rPr>
+        <w:t xml:space="preserve"> (EC)</w:t>
       </w:r>
       <w:r>
         <w:rPr>
           <w:rFonts w:ascii="Georgia" w:hAnsi="Georgia" w:cs="Georgia" w:eastAsia="Georgia"/>
-          <w:color w:val="ED7D31"/>
-          <w:sz w:val="22"/>
+          <w:sz w:val="22"/>
+          <w:szCs w:val="22"/>
+          <w:b w:val="0"/>
+          <w:bCs w:val="0"/>
           <w:strike w:val="0"/>
-        </w:rPr>
-        <w:t xml:space="preserve"> (EC)</w:t>
+          <w:color w:val="000000"/>
+        </w:rPr>
+        <w:t xml:space="preserve"> health risks to aquatic species and humans through seafood consumption. This study was conducted to detect microplastics in Whiteleg shrimp (Litopenaeus vannamei) sold at the [REDACTED]. A total of 10 shrimp samples per stall were collected, equating to 30 shrimps overall from the 3 stalls available. Composite sampling was applied in this study; hence, all individual shrimps from each stall were counted as one sample. The samples were separated into two treatments: Treatment 1, which consisted of the hepatopancreas and gastrointestinal tract of the shrimp, and Treatment 2, which consisted of the shrimp muscle. The samples were subjected to light microscopy and were categorized as follows: Treatment 1 Stall 1 (T1S1), Treatment 1 Stall 2 (T1S2), Treatment 1 Stall 3 (T1S3), Treatment 2 Stall 1 (T2S1), Treatment 2 Stall 2 (T2S2), and Treatment 2 Stall 3 (T2S3). Each sample was added to a 10% KOH solution for the digestion of soft tissue. Afterwards, 60% sodium iodide was used for the density separation of microplastics and undigested organic matter. The supernatant was collected using a pipette and then transferred to a slide before subjecting to a light microscope. In each slide, 10 µl of sample was placed. This was repeated five times in separate slides. </w:t>
       </w:r>
       <w:r>
         <w:rPr>
           <w:rFonts w:ascii="Georgia" w:hAnsi="Georgia" w:cs="Georgia" w:eastAsia="Georgia"/>
-          <w:b w:val="0"/>
-          <w:color w:val="000000"/>
-          <w:sz w:val="22"/>
+          <w:sz w:val="22"/>
+          <w:szCs w:val="22"/>
+          <w:b w:val="0"/>
+          <w:bCs w:val="0"/>
           <w:strike w:val="0"/>
-        </w:rPr>
-        <w:t xml:space="preserve"> health risks to aquatic species and humans through seafood consumption. This study was conducted to detect microplastics in Whiteleg shrimp (Litopenaeus vannamei) sold at the [REDACTED]. A total of 10 shrimp samples per stall were collected, equating to 30 shrimps overall from the 3 stalls available. Composite sampling was applied in this study; hence, all individual shrimps from each stall were counted as one sample. The samples were separated into two treatments: Treatment 1, which consisted of the hepatopancreas and gastrointestinal tract of the shrimp, and Treatment 2, which consisted of the shrimp muscle. The samples were subjected to light microscopy and were categorized as follows: Treatment 1 Stall 1 (T1S1), Treatment 1 Stall 2 (T1S2), Treatment 1 Stall 3 (T1S3), Treatment 2 Stall 1 (T2S1), Treatment 2 Stall 2 (T2S2), and Treatment 2 Stall 3 (T2S3). Each sample was added to a 10% KOH solution for the digestion of soft tissue. Afterwards, 60% sodium iodide was used for the density separation of microplastics and undigested organic matter. The supernatant was collected using a pipette and then transferred to a slide before subjecting to a light microscope. In each slide, 10 µl of sample was placed. This was repeated five times in separate slides. </w:t>
+          <w:shd w:val="clear" w:fill="BFBFBF"/>
+          <w:color w:val="000000"/>
+        </w:rPr>
+        <w:t>A total of 181 microplastics were detected across all samples, wherein the concentration of microplastics was higher in Treatment 1 (74.03%).</w:t>
       </w:r>
       <w:r>
         <w:rPr>
           <w:rFonts w:ascii="Georgia" w:hAnsi="Georgia" w:cs="Georgia" w:eastAsia="Georgia"/>
-          <w:sz w:val="22"/>
-          <w:shd w:val="clear" w:fill="BFBFBF"/>
+          <w:sz w:val="20"/>
+          <w:szCs w:val="20"/>
+          <w:b w:val="0"/>
+          <w:bCs w:val="0"/>
           <w:strike w:val="0"/>
-        </w:rPr>
-        <w:t>A total of 181 microplastics were detected across all samples, wherein the concentration of microplastics was higher in Treatment 1 (74.03%).</w:t>
+          <w:color w:val="000000"/>
+        </w:rPr>
+        <w:t xml:space="preserve"> [R]</w:t>
       </w:r>
       <w:r>
         <w:rPr>
           <w:rFonts w:ascii="Georgia" w:hAnsi="Georgia" w:cs="Georgia" w:eastAsia="Georgia"/>
-          <w:color w:val="000000"/>
-          <w:sz w:val="22"/>
+          <w:sz w:val="22"/>
+          <w:szCs w:val="22"/>
+          <w:b w:val="0"/>
+          <w:bCs w:val="0"/>
           <w:strike w:val="0"/>
-        </w:rPr>
-        <w:t xml:space="preserve"> [R]</w:t>
+          <w:color w:val="000000"/>
+        </w:rPr>
+        <w:t xml:space="preserve"> Fragments (39.02%) were the most dominant shape, followed by fibers (23.20%), lines (17.13%), and then pellets (3.31%). The most dominant color was gray (33.15%), followed by blue (24.31%), black (11.6%), red (9.39%), clear (7.73%), brown (6.63%), violet (3.31%), yellow (3.31%), and green (0.55%). Most of the particles ranged in size from 11–50 µm (58.01%), followed by &lt;10.9 µm (29.83%), 51–100 µm (6.08%), 101–200 µm (5.52%), and &gt;201 µm (1.10%). Through random sampling, one microplastic was selected from each shape for polymer analysis using Fourier Transform Infrared Spectroscopy (FTIR). The fragment had a 97% match with high-density polyethylene, the fiber had a 90% match with an olefin copolymer, and the line sample had a 96% match with polypropylene, while the pellet sample was rejected for analysis due to its small size. To reduce microplastic pollution, the findings </w:t>
       </w:r>
       <w:r>
         <w:rPr>
           <w:rFonts w:ascii="Georgia" w:hAnsi="Georgia" w:cs="Georgia" w:eastAsia="Georgia"/>
-          <w:b w:val="0"/>
-          <w:color w:val="000000"/>
-          <w:sz w:val="22"/>
+          <w:sz w:val="22"/>
+          <w:szCs w:val="22"/>
+          <w:b w:val="0"/>
+          <w:bCs w:val="0"/>
+          <w:color w:val="000000"/>
+          <w:strike w:val="1"/>
+        </w:rPr>
+        <w:t>recommend</w:t>
+      </w:r>
+      <w:r>
+        <w:rPr>
+          <w:rFonts w:ascii="Georgia" w:hAnsi="Georgia" w:cs="Georgia" w:eastAsia="Georgia"/>
+          <w:sz w:val="20"/>
+          <w:szCs w:val="20"/>
+          <w:b w:val="0"/>
+          <w:bCs w:val="0"/>
           <w:strike w:val="0"/>
-        </w:rPr>
-        <w:t xml:space="preserve"> Fragments (39.02%) were the most dominant shape, followed by fibers (23.20%), lines (17.13%), and then pellets (3.31%). The most dominant color was gray (33.15%), followed by blue (24.31%), black (11.6%), red (9.39%), clear (7.73%), brown (6.63%), violet (3.31%), yellow (3.31%), and green (0.55%). Most of the particles ranged in size from 11–50 µm (58.01%), followed by &lt;10.9 µm (29.83%), 51–100 µm (6.08%), 101–200 µm (5.52%), and &gt;201 µm (1.10%). Through random sampling, one microplastic was selected from each shape for polymer analysis using Fourier Transform Infrared Spectroscopy (FTIR). The fragment had a 97% match with high-density polyethylene, the fiber had a 90% match with an olefin copolymer, and the line sample had a 96% match with polypropylene, while the pellet sample was rejected for analysis due to its small size. To reduce microplastic pollution, the findings </w:t>
+          <w:color w:val="808080"/>
+        </w:rPr>
+        <w:t xml:space="preserve"> (FP-Rec)</w:t>
       </w:r>
       <w:r>
         <w:rPr>
           <w:rFonts w:ascii="Georgia" w:hAnsi="Georgia" w:cs="Georgia" w:eastAsia="Georgia"/>
-          <w:color w:val="000000"/>
-          <w:sz w:val="22"/>
-          <w:strike/>
-        </w:rPr>
-        <w:t>recommend</w:t>
-      </w:r>
-      <w:r>
-        <w:rPr>
-          <w:rFonts w:ascii="Georgia" w:hAnsi="Georgia" w:cs="Georgia" w:eastAsia="Georgia"/>
-          <w:color w:val="808080"/>
-          <w:sz w:val="22"/>
+          <w:sz w:val="22"/>
+          <w:szCs w:val="22"/>
+          <w:b w:val="0"/>
+          <w:bCs w:val="0"/>
           <w:strike w:val="0"/>
-        </w:rPr>
-        <w:t xml:space="preserve"> (FP-Rec)</w:t>
-      </w:r>
-      <w:r>
-        <w:rPr>
-          <w:rFonts w:ascii="Georgia" w:hAnsi="Georgia" w:cs="Georgia" w:eastAsia="Georgia"/>
-          <w:b w:val="0"/>
-          <w:color w:val="000000"/>
-          <w:sz w:val="22"/>
-          <w:strike w:val="0"/>
+          <w:color w:val="000000"/>
         </w:rPr>
         <w:t xml:space="preserve"> removing the shrimp’s GIT during preparation to avoid ingestion, use fishing gear made from durable or natural materials, regularly maintain and replace worn equipment, and properly dispose of plastics instead of discarding them into water bodies.</w:t>
       </w:r>
@@ -27501,10 +27572,12 @@
       <w:r>
         <w:rPr>
           <w:rFonts w:ascii="Georgia" w:hAnsi="Georgia" w:cs="Georgia" w:eastAsia="Georgia"/>
-          <w:b w:val="0"/>
-          <w:color w:val="000000"/>
-          <w:sz w:val="22"/>
+          <w:sz w:val="22"/>
+          <w:szCs w:val="22"/>
+          <w:b w:val="0"/>
+          <w:bCs w:val="0"/>
           <w:strike w:val="0"/>
+          <w:color w:val="000000"/>
         </w:rPr>
         <w:t xml:space="preserve">Humans and animals have historically utilized immunoglobulin Y (IgY), the most common kind of immunoglobulin generated by B cells in avian species, as a therapeutic treatment for passive immunity. This study was conducted to determine the immunogenicity of freeze-dried egg yolk against canine parvoviral enteritis. Primodog® (Merial) is a monovalent, attenuated canine parvovirus vaccine administered intramuscularly to three white Leghorn chickens. For a total of five weeks of immunization, 0.5 ml of the initial dose per bird and four further doses, each lowered to 0.25 ml, were given at weekly intervals. As described in the Hodek et al. (2013) protocol, a two-step, labor- and cost-efficient process that involves extracting yolks using tap water then precipitating specific IgY at pH 4 until the final concentration reaches 8.8% with sodium chloride was used to isolate IgY from the hyperimmunized egg yolks. Isolated IgY were freeze-dried and the products' immunogenicity was assessed using sandwich ELISA testing. The data gathered demonstrated the concentration of IgY specific to the canine parvovirus (CPV) following five weeks of immunization and freeze drying. The first week of immunization had the highest measured titer with a mean of 0.796. </w:t>
       </w:r>
@@ -27512,27 +27585,36 @@
         <w:rPr>
           <w:rFonts w:ascii="Georgia" w:hAnsi="Georgia" w:cs="Georgia" w:eastAsia="Georgia"/>
           <w:sz w:val="22"/>
+          <w:szCs w:val="22"/>
+          <w:b w:val="0"/>
+          <w:bCs w:val="0"/>
+          <w:strike w:val="0"/>
           <w:shd w:val="clear" w:fill="BFBFBF"/>
+          <w:color w:val="000000"/>
+        </w:rPr>
+        <w:t>One way ANOVA was used and the differences between the groups were statistically significant.</w:t>
+      </w:r>
+      <w:r>
+        <w:rPr>
+          <w:rFonts w:ascii="Georgia" w:hAnsi="Georgia" w:cs="Georgia" w:eastAsia="Georgia"/>
+          <w:sz w:val="20"/>
+          <w:szCs w:val="20"/>
+          <w:b w:val="0"/>
+          <w:bCs w:val="0"/>
           <w:strike w:val="0"/>
-        </w:rPr>
-        <w:t>One way ANOVA was used and the differences between the groups were statistically significant.</w:t>
+          <w:color w:val="000000"/>
+        </w:rPr>
+        <w:t xml:space="preserve"> [R]</w:t>
       </w:r>
       <w:r>
         <w:rPr>
           <w:rFonts w:ascii="Georgia" w:hAnsi="Georgia" w:cs="Georgia" w:eastAsia="Georgia"/>
-          <w:color w:val="000000"/>
-          <w:sz w:val="22"/>
+          <w:sz w:val="22"/>
+          <w:szCs w:val="22"/>
+          <w:b w:val="0"/>
+          <w:bCs w:val="0"/>
           <w:strike w:val="0"/>
-        </w:rPr>
-        <w:t xml:space="preserve"> [R]</w:t>
-      </w:r>
-      <w:r>
-        <w:rPr>
-          <w:rFonts w:ascii="Georgia" w:hAnsi="Georgia" w:cs="Georgia" w:eastAsia="Georgia"/>
-          <w:b w:val="0"/>
-          <w:color w:val="000000"/>
-          <w:sz w:val="22"/>
-          <w:strike w:val="0"/>
+          <w:color w:val="000000"/>
         </w:rPr>
         <w:t xml:space="preserve"> There were variations in the mean antibody titer measured among samples.</w:t>
       </w:r>
@@ -27572,38 +27654,48 @@
       <w:r>
         <w:rPr>
           <w:rFonts w:ascii="Georgia" w:hAnsi="Georgia" w:cs="Georgia" w:eastAsia="Georgia"/>
-          <w:b w:val="0"/>
-          <w:color w:val="000000"/>
-          <w:sz w:val="22"/>
+          <w:sz w:val="22"/>
+          <w:szCs w:val="22"/>
+          <w:b w:val="0"/>
+          <w:bCs w:val="0"/>
           <w:strike w:val="0"/>
+          <w:color w:val="000000"/>
         </w:rPr>
         <w:t xml:space="preserve">Companion animals play vital roles in enhancing human well-being but remain vulnerable to a range of toxicants including household products, medications, food items, and ornamental plants. This study assessed the level of awareness among students of Pampanga State Agricultural University (PSAU) regarding common toxicants affecting companion animals. Using a cross-sectional, descriptive design, a structured questionnaire was distributed to a stratified random sample of 393 students. The instrument focused on awareness of specific toxicants, personal experiences, and sources of information. Findings revealed that while chocolate (87.28%) and alcoholic beverages (59.79%) were widely recognized as toxic, awareness of plant-based toxicants such as Philippine lily (18.06%) and avocado (23.41%) was limited. Majority of respondents (42.5%) demonstrated only slight awareness, and 65.14% reported previous unintentional exposure of pets to toxicants, most commonly garlic. Chi-square analysis revealed significant associations between course of study, pet ownership, and source of information with awareness levels. Multiple regression analysis </w:t>
       </w:r>
       <w:r>
         <w:rPr>
           <w:rFonts w:ascii="Georgia" w:hAnsi="Georgia" w:cs="Georgia" w:eastAsia="Georgia"/>
-          <w:color w:val="000000"/>
-          <w:sz w:val="22"/>
-          <w:strike/>
+          <w:sz w:val="22"/>
+          <w:szCs w:val="22"/>
+          <w:b w:val="0"/>
+          <w:bCs w:val="0"/>
+          <w:color w:val="000000"/>
+          <w:strike w:val="1"/>
         </w:rPr>
         <w:t>indicated</w:t>
       </w:r>
       <w:r>
         <w:rPr>
           <w:rFonts w:ascii="Georgia" w:hAnsi="Georgia" w:cs="Georgia" w:eastAsia="Georgia"/>
+          <w:sz w:val="20"/>
+          <w:szCs w:val="20"/>
+          <w:b w:val="0"/>
+          <w:bCs w:val="0"/>
+          <w:strike w:val="0"/>
           <w:color w:val="808080"/>
-          <w:sz w:val="22"/>
+        </w:rPr>
+        <w:t xml:space="preserve"> (FP-Gen)</w:t>
+      </w:r>
+      <w:r>
+        <w:rPr>
+          <w:rFonts w:ascii="Georgia" w:hAnsi="Georgia" w:cs="Georgia" w:eastAsia="Georgia"/>
+          <w:sz w:val="22"/>
+          <w:szCs w:val="22"/>
+          <w:b w:val="0"/>
+          <w:bCs w:val="0"/>
           <w:strike w:val="0"/>
-        </w:rPr>
-        <w:t xml:space="preserve"> (FP-Gen)</w:t>
-      </w:r>
-      <w:r>
-        <w:rPr>
-          <w:rFonts w:ascii="Georgia" w:hAnsi="Georgia" w:cs="Georgia" w:eastAsia="Georgia"/>
-          <w:b w:val="0"/>
-          <w:color w:val="000000"/>
-          <w:sz w:val="22"/>
-          <w:strike w:val="0"/>
+          <w:color w:val="000000"/>
         </w:rPr>
         <w:t xml:space="preserve"> that knowledge significantly predicted self-assessed awareness, while personal experience did not. The findings highlight critical knowledge gaps and underscore the need for targeted educational interventions using accessible media such as social platforms.</w:t>
       </w:r>
@@ -27914,40 +28006,49 @@
       <w:r>
         <w:rPr>
           <w:rFonts w:ascii="Georgia" w:hAnsi="Georgia" w:cs="Georgia" w:eastAsia="Georgia"/>
-          <w:b w:val="0"/>
-          <w:color w:val="000000"/>
-          <w:sz w:val="22"/>
+          <w:sz w:val="22"/>
+          <w:szCs w:val="22"/>
+          <w:b w:val="0"/>
+          <w:bCs w:val="0"/>
           <w:strike w:val="0"/>
+          <w:color w:val="000000"/>
         </w:rPr>
         <w:t xml:space="preserve">This study examined the effect of utilizing butterfly pea flower aqueous extract (BPFAE) on the survival rate and locomotor activity of zebrafish larvae, as well as the water quality parameters. A total of 360 five-day post-fertilization zebrafish larvae were randomly distributed into four treatments, 0 parts per thousand (ppt) BPFAE, 5 ppt BPFAE, 10 ppt BPFAE, and 15 ppt BPFAE, with three replicates each, following a completely randomized design. The butterfly pea flower aqueous extract was administered to test subjects for 17 days. The results were analyzed using one-way analysis of variance (One-way ANOVA), P&lt;0.05. Significant comparisons were subjected to Tukey HSD. The results revealed that 10 ppt BPFAE is the optimal inclusion level among all the treatments. This concentration resulted in the highest survival rate (84.44%) as compared to the other treatment groups, 0 ppt (65.55%), 5 ppt (62.22%), and 15 ppt (68.88%). Meanwhile, no significant effects on the locomotor activities of zebrafish larvae were observed in any of the treatments. However, notable reductions in water pH during the first week of administration of treatments, and suboptimal dissolved oxygen concentrations were observed. Additionally, minimal temperature changes within the optimal range were recorded. Lastly, the levels of ammonia, nitrite, and nitrate remained at zero throughout the duration of the experiment. The results demonstrated the </w:t>
       </w:r>
       <w:r>
         <w:rPr>
           <w:rFonts w:ascii="Georgia" w:hAnsi="Georgia" w:cs="Georgia" w:eastAsia="Georgia"/>
-          <w:b w:val="0"/>
+          <w:sz w:val="22"/>
+          <w:szCs w:val="22"/>
+          <w:b w:val="0"/>
+          <w:bCs w:val="0"/>
+          <w:strike w:val="0"/>
+          <w:highlight w:val="red"/>
           <w:color w:val="FFFFFF"/>
-          <w:sz w:val="22"/>
-          <w:highlight w:val="red"/>
+        </w:rPr>
+        <w:t>potential</w:t>
+      </w:r>
+      <w:r>
+        <w:rPr>
+          <w:rFonts w:ascii="Georgia" w:hAnsi="Georgia" w:cs="Georgia" w:eastAsia="Georgia"/>
+          <w:sz w:val="20"/>
+          <w:szCs w:val="20"/>
+          <w:b w:val="0"/>
+          <w:bCs w:val="0"/>
           <w:strike w:val="0"/>
-        </w:rPr>
-        <w:t>potential</w:t>
+          <w:color w:val="ED7D31"/>
+        </w:rPr>
+        <w:t xml:space="preserve"> (EC)</w:t>
       </w:r>
       <w:r>
         <w:rPr>
           <w:rFonts w:ascii="Georgia" w:hAnsi="Georgia" w:cs="Georgia" w:eastAsia="Georgia"/>
-          <w:color w:val="ED7D31"/>
-          <w:sz w:val="22"/>
+          <w:sz w:val="22"/>
+          <w:szCs w:val="22"/>
+          <w:b w:val="0"/>
+          <w:bCs w:val="0"/>
           <w:strike w:val="0"/>
-        </w:rPr>
-        <w:t xml:space="preserve"> (EC)</w:t>
-      </w:r>
-      <w:r>
-        <w:rPr>
-          <w:rFonts w:ascii="Georgia" w:hAnsi="Georgia" w:cs="Georgia" w:eastAsia="Georgia"/>
-          <w:b w:val="0"/>
-          <w:color w:val="000000"/>
-          <w:sz w:val="22"/>
-          <w:strike w:val="0"/>
+          <w:color w:val="000000"/>
         </w:rPr>
         <w:t xml:space="preserve"> of butterfly pea flower aqueous extract in improving the survival of zebrafish at its larval stage.</w:t>
       </w:r>
@@ -28164,10 +28265,12 @@
       <w:r>
         <w:rPr>
           <w:rFonts w:ascii="Georgia" w:hAnsi="Georgia" w:cs="Georgia" w:eastAsia="Georgia"/>
-          <w:b w:val="0"/>
-          <w:color w:val="000000"/>
-          <w:sz w:val="22"/>
+          <w:sz w:val="22"/>
+          <w:szCs w:val="22"/>
+          <w:b w:val="0"/>
+          <w:bCs w:val="0"/>
           <w:strike w:val="0"/>
+          <w:color w:val="000000"/>
         </w:rPr>
         <w:t>Salmonella spp. and Escherichia coli are two significant bacteria that are a source of human foodborne illness. They result from consuming meat or fish that bacteria have contaminated. The purpose of this study was to determine the anti-microbial resistance of isolated Salmonella spp. and E. coli from commercially available fish in the [REDACTED]. A total of 30 whole fish, three (3) different fish in 10 different stalls were used to test Salmonella spp. and E. coli. Six (6) out of 30 samples in XLD were Salmonella spp. positive, where they exhibited red or yellow colonies with a black in the center, meanwhile three (3) out of 30 samples in EMB were E. coli positive, where they showed a metallic green sheen. In the antibiotic sensitivity testing of six (6) positive samples in Salmonella spp., four (4) showed resistance to ceftazidime (33.33%), chloramphenicol (16.67%), imipenem (16.17%), and tetracycline (83.33%). Of the three (3) positive samples, E. coli exhibited resistance to ceftazidime (33.33%), chloramphenicol (33.33%), imipenem (66.67%), and tetracycline (66.67%).</w:t>
       </w:r>
@@ -29438,68 +29541,85 @@
       <w:r>
         <w:rPr>
           <w:rFonts w:ascii="Georgia" w:hAnsi="Georgia" w:cs="Georgia" w:eastAsia="Georgia"/>
-          <w:b w:val="0"/>
-          <w:color w:val="000000"/>
-          <w:sz w:val="22"/>
+          <w:sz w:val="22"/>
+          <w:szCs w:val="22"/>
+          <w:b w:val="0"/>
+          <w:bCs w:val="0"/>
           <w:strike w:val="0"/>
+          <w:color w:val="000000"/>
         </w:rPr>
         <w:t xml:space="preserve">This study was conducted to evaluate the growth performance of Adansonii plant under different soil media over a 90-day period. Implemented in December 2024, the experiment followed a Completely Randomized Design (CRD) with five treatments: T1, Topsoil only (control), T2, Topsoil + Rice Hull, T3, Topsoil + Carbonized Rice Hull, T4, Topsoil + Vermicompost, and T5: Topsoil + Biochar. Parameters measured included days to shoot emergence, shoot length, number of leaves, leaf area, root length, number of penetrations, and survival rate. Significant differences were observed across treatments. Treatment 2 (Rice Hull) showed the earliest shoot emergence at 15.29 days, followed by Treatment 4 (Vermicompost) at 15.83 days. These treatments also produced the longest shoots, most leaves, largest leaf areas, and highest survival rates at 87.5%. Treatment 3 (Carbonized Rice Hull) showed moderate growth improvement, while Treatments 1 (Topsoil only) and 5 (Biochar) performed poorly in most parameters, </w:t>
       </w:r>
       <w:r>
         <w:rPr>
           <w:rFonts w:ascii="Georgia" w:hAnsi="Georgia" w:cs="Georgia" w:eastAsia="Georgia"/>
-          <w:color w:val="000000"/>
-          <w:sz w:val="22"/>
-          <w:strike/>
+          <w:sz w:val="22"/>
+          <w:szCs w:val="22"/>
+          <w:b w:val="0"/>
+          <w:bCs w:val="0"/>
+          <w:color w:val="000000"/>
+          <w:strike w:val="1"/>
         </w:rPr>
         <w:t>indicating</w:t>
       </w:r>
       <w:r>
         <w:rPr>
           <w:rFonts w:ascii="Georgia" w:hAnsi="Georgia" w:cs="Georgia" w:eastAsia="Georgia"/>
+          <w:sz w:val="20"/>
+          <w:szCs w:val="20"/>
+          <w:b w:val="0"/>
+          <w:bCs w:val="0"/>
+          <w:strike w:val="0"/>
           <w:color w:val="808080"/>
-          <w:sz w:val="22"/>
+        </w:rPr>
+        <w:t xml:space="preserve"> (FP-Gen)</w:t>
+      </w:r>
+      <w:r>
+        <w:rPr>
+          <w:rFonts w:ascii="Georgia" w:hAnsi="Georgia" w:cs="Georgia" w:eastAsia="Georgia"/>
+          <w:sz w:val="22"/>
+          <w:szCs w:val="22"/>
+          <w:b w:val="0"/>
+          <w:bCs w:val="0"/>
           <w:strike w:val="0"/>
-        </w:rPr>
-        <w:t xml:space="preserve"> (FP-Gen)</w:t>
+          <w:color w:val="000000"/>
+        </w:rPr>
+        <w:t xml:space="preserve"> limited benefits. Throughout the study, plants in Treatments 2 and 4 exhibited more vigorous and healthier growth, with well-developed roots, expanded foliage, and stable shoot formation. The positive effects of rice hull and vermicompost were attributed to better nutrient availability, improved soil aeration, enhanced microbial activity, and more efficient moisture retention. In conclusion, the use of rice hull and vermicompost significantly enhanced the growth and survival of Adansonii. These findings highlight their </w:t>
       </w:r>
       <w:r>
         <w:rPr>
           <w:rFonts w:ascii="Georgia" w:hAnsi="Georgia" w:cs="Georgia" w:eastAsia="Georgia"/>
-          <w:b w:val="0"/>
-          <w:color w:val="000000"/>
-          <w:sz w:val="22"/>
+          <w:sz w:val="22"/>
+          <w:szCs w:val="22"/>
+          <w:b w:val="0"/>
+          <w:bCs w:val="0"/>
           <w:strike w:val="0"/>
-        </w:rPr>
-        <w:t xml:space="preserve"> limited benefits. Throughout the study, plants in Treatments 2 and 4 exhibited more vigorous and healthier growth, with well-developed roots, expanded foliage, and stable shoot formation. The positive effects of rice hull and vermicompost were attributed to better nutrient availability, improved soil aeration, enhanced microbial activity, and more efficient moisture retention. In conclusion, the use of rice hull and vermicompost significantly enhanced the growth and survival of Adansonii. These findings highlight their </w:t>
+          <w:highlight w:val="red"/>
+          <w:color w:val="FFFFFF"/>
+        </w:rPr>
+        <w:t>potential</w:t>
       </w:r>
       <w:r>
         <w:rPr>
           <w:rFonts w:ascii="Georgia" w:hAnsi="Georgia" w:cs="Georgia" w:eastAsia="Georgia"/>
-          <w:b w:val="0"/>
-          <w:color w:val="FFFFFF"/>
-          <w:sz w:val="22"/>
-          <w:highlight w:val="red"/>
+          <w:sz w:val="20"/>
+          <w:szCs w:val="20"/>
+          <w:b w:val="0"/>
+          <w:bCs w:val="0"/>
           <w:strike w:val="0"/>
-        </w:rPr>
-        <w:t>potential</w:t>
+          <w:color w:val="ED7D31"/>
+        </w:rPr>
+        <w:t xml:space="preserve"> (EC)</w:t>
       </w:r>
       <w:r>
         <w:rPr>
           <w:rFonts w:ascii="Georgia" w:hAnsi="Georgia" w:cs="Georgia" w:eastAsia="Georgia"/>
-          <w:color w:val="ED7D31"/>
-          <w:sz w:val="22"/>
+          <w:sz w:val="22"/>
+          <w:szCs w:val="22"/>
+          <w:b w:val="0"/>
+          <w:bCs w:val="0"/>
           <w:strike w:val="0"/>
-        </w:rPr>
-        <w:t xml:space="preserve"> (EC)</w:t>
-      </w:r>
-      <w:r>
-        <w:rPr>
-          <w:rFonts w:ascii="Georgia" w:hAnsi="Georgia" w:cs="Georgia" w:eastAsia="Georgia"/>
-          <w:b w:val="0"/>
-          <w:color w:val="000000"/>
-          <w:sz w:val="22"/>
-          <w:strike w:val="0"/>
+          <w:color w:val="000000"/>
         </w:rPr>
         <w:t xml:space="preserve"> as effective, low-cost, and sustainable soil amendments for ornamental and horticultural cultivation, offering practical options for growers seeking eco-friendly methods to improve plant performance.</w:t>
       </w:r>
@@ -30709,98 +30829,122 @@
       <w:r>
         <w:rPr>
           <w:rFonts w:ascii="Georgia" w:hAnsi="Georgia" w:cs="Georgia" w:eastAsia="Georgia"/>
-          <w:b w:val="0"/>
-          <w:color w:val="000000"/>
-          <w:sz w:val="22"/>
+          <w:sz w:val="22"/>
+          <w:szCs w:val="22"/>
+          <w:b w:val="0"/>
+          <w:bCs w:val="0"/>
           <w:strike w:val="0"/>
+          <w:color w:val="000000"/>
         </w:rPr>
         <w:t xml:space="preserve">Protein is the most costly and restrictive ingredient in feed formulations, and the price of traditional sources of protein has risen significantly due to yield factors and competition between humans and animals. In order to meet the demand for highly nutritious animal food, the future </w:t>
       </w:r>
       <w:r>
         <w:rPr>
           <w:rFonts w:ascii="Georgia" w:hAnsi="Georgia" w:cs="Georgia" w:eastAsia="Georgia"/>
-          <w:color w:val="000000"/>
-          <w:sz w:val="22"/>
-          <w:strike/>
+          <w:sz w:val="22"/>
+          <w:szCs w:val="22"/>
+          <w:b w:val="0"/>
+          <w:bCs w:val="0"/>
+          <w:color w:val="000000"/>
+          <w:strike w:val="1"/>
         </w:rPr>
         <w:t>will</w:t>
       </w:r>
       <w:r>
         <w:rPr>
           <w:rFonts w:ascii="Georgia" w:hAnsi="Georgia" w:cs="Georgia" w:eastAsia="Georgia"/>
+          <w:sz w:val="20"/>
+          <w:szCs w:val="20"/>
+          <w:b w:val="0"/>
+          <w:bCs w:val="0"/>
+          <w:strike w:val="0"/>
           <w:color w:val="808080"/>
-          <w:sz w:val="22"/>
+        </w:rPr>
+        <w:t xml:space="preserve"> (FP-Gen)</w:t>
+      </w:r>
+      <w:r>
+        <w:rPr>
+          <w:rFonts w:ascii="Georgia" w:hAnsi="Georgia" w:cs="Georgia" w:eastAsia="Georgia"/>
+          <w:sz w:val="22"/>
+          <w:szCs w:val="22"/>
+          <w:b w:val="0"/>
+          <w:bCs w:val="0"/>
           <w:strike w:val="0"/>
-        </w:rPr>
-        <w:t xml:space="preserve"> (FP-Gen)</w:t>
+          <w:color w:val="000000"/>
+        </w:rPr>
+        <w:t xml:space="preserve"> drive animal production systems to find new sources of high-quality and sustainable protein feed raw materials. Fortunately, insect farming </w:t>
       </w:r>
       <w:r>
         <w:rPr>
           <w:rFonts w:ascii="Georgia" w:hAnsi="Georgia" w:cs="Georgia" w:eastAsia="Georgia"/>
-          <w:b w:val="0"/>
-          <w:color w:val="000000"/>
-          <w:sz w:val="22"/>
-          <w:strike w:val="0"/>
-        </w:rPr>
-        <w:t xml:space="preserve"> drive animal production systems to find new sources of high-quality and sustainable protein feed raw materials. Fortunately, insect farming </w:t>
-      </w:r>
-      <w:r>
-        <w:rPr>
-          <w:rFonts w:ascii="Georgia" w:hAnsi="Georgia" w:cs="Georgia" w:eastAsia="Georgia"/>
-          <w:b w:val="0"/>
-          <w:color w:val="000000"/>
-          <w:sz w:val="22"/>
+          <w:sz w:val="22"/>
+          <w:szCs w:val="22"/>
+          <w:b w:val="0"/>
+          <w:bCs w:val="0"/>
           <w:strike w:val="0"/>
           <w:shd w:val="clear" w:fill="00B0F0"/>
+          <w:color w:val="000000"/>
         </w:rPr>
         <w:t>can</w:t>
       </w:r>
       <w:r>
         <w:rPr>
           <w:rFonts w:ascii="Georgia" w:hAnsi="Georgia" w:cs="Georgia" w:eastAsia="Georgia"/>
+          <w:sz w:val="20"/>
+          <w:szCs w:val="20"/>
+          <w:b w:val="0"/>
+          <w:bCs w:val="0"/>
+          <w:strike w:val="0"/>
           <w:color w:val="ED7D31"/>
-          <w:sz w:val="22"/>
+        </w:rPr>
+        <w:t xml:space="preserve"> (EC)</w:t>
+      </w:r>
+      <w:r>
+        <w:rPr>
+          <w:rFonts w:ascii="Georgia" w:hAnsi="Georgia" w:cs="Georgia" w:eastAsia="Georgia"/>
+          <w:sz w:val="22"/>
+          <w:szCs w:val="22"/>
+          <w:b w:val="0"/>
+          <w:bCs w:val="0"/>
           <w:strike w:val="0"/>
+          <w:color w:val="000000"/>
+        </w:rPr>
+        <w:t xml:space="preserve"> be seen as a </w:t>
+      </w:r>
+      <w:r>
+        <w:rPr>
+          <w:rFonts w:ascii="Georgia" w:hAnsi="Georgia" w:cs="Georgia" w:eastAsia="Georgia"/>
+          <w:sz w:val="22"/>
+          <w:szCs w:val="22"/>
+          <w:b w:val="0"/>
+          <w:bCs w:val="0"/>
+          <w:strike w:val="0"/>
+          <w:highlight w:val="red"/>
+          <w:color w:val="FFFFFF"/>
+        </w:rPr>
+        <w:t>potential</w:t>
+      </w:r>
+      <w:r>
+        <w:rPr>
+          <w:rFonts w:ascii="Georgia" w:hAnsi="Georgia" w:cs="Georgia" w:eastAsia="Georgia"/>
+          <w:sz w:val="20"/>
+          <w:szCs w:val="20"/>
+          <w:b w:val="0"/>
+          <w:bCs w:val="0"/>
+          <w:strike w:val="0"/>
+          <w:color w:val="ED7D31"/>
         </w:rPr>
         <w:t xml:space="preserve"> (EC)</w:t>
       </w:r>
       <w:r>
         <w:rPr>
           <w:rFonts w:ascii="Georgia" w:hAnsi="Georgia" w:cs="Georgia" w:eastAsia="Georgia"/>
-          <w:b w:val="0"/>
-          <w:color w:val="000000"/>
-          <w:sz w:val="22"/>
+          <w:sz w:val="22"/>
+          <w:szCs w:val="22"/>
+          <w:b w:val="0"/>
+          <w:bCs w:val="0"/>
           <w:strike w:val="0"/>
-        </w:rPr>
-        <w:t xml:space="preserve"> be seen as a </w:t>
-      </w:r>
-      <w:r>
-        <w:rPr>
-          <w:rFonts w:ascii="Georgia" w:hAnsi="Georgia" w:cs="Georgia" w:eastAsia="Georgia"/>
-          <w:b w:val="0"/>
-          <w:color w:val="FFFFFF"/>
-          <w:sz w:val="22"/>
-          <w:highlight w:val="red"/>
-          <w:strike w:val="0"/>
-        </w:rPr>
-        <w:t>potential</w:t>
-      </w:r>
-      <w:r>
-        <w:rPr>
-          <w:rFonts w:ascii="Georgia" w:hAnsi="Georgia" w:cs="Georgia" w:eastAsia="Georgia"/>
-          <w:color w:val="ED7D31"/>
-          <w:sz w:val="22"/>
-          <w:strike w:val="0"/>
-        </w:rPr>
-        <w:t xml:space="preserve"> (EC)</w:t>
-      </w:r>
-      <w:r>
-        <w:rPr>
-          <w:rFonts w:ascii="Georgia" w:hAnsi="Georgia" w:cs="Georgia" w:eastAsia="Georgia"/>
-          <w:b w:val="0"/>
-          <w:color w:val="000000"/>
-          <w:sz w:val="22"/>
-          <w:strike w:val="0"/>
+          <w:color w:val="000000"/>
         </w:rPr>
         <w:t xml:space="preserve"> solution for filling the protein gap for feed and food resources in a more sustainable manned compared to other animal protein sources. In particular, there is an increasing interest in the utilization of Black Soldier Fly (BSF) larvae. The black soldier fly (BSF; Hermetia illucens) has been studied for its capability to convert recycling food and animal waste into high quality protein animal feeds. A total of 4,500 grams of nine-day-old (3rd instar) Black Soldier Fly larvae used in 3 experimental group randomly. Three (3) treatments replicated three times used for the study, namely T1- Chicken Manure (Control), T2- Rabbit Manure and T3- Goat Manure. Every replication is composed of 500g of BSF larvae. Regarding in the yield parameters of Black Soldier Fly larvae, there was a highly significant observed among all treatment used in the study. BSF larvae fed with rabbit manure had the highest mean among all parameters under yield namely final live weight, final dry weight, biomass gain and survival gain. There is highly significant differences under nutritive analysis of Black Soldier Fly larvae. Among the results discussed, Crude Protein, Crude Fat, Ash Content and Metabolizable Energy has a significant results at 1% level. In Calcium, Phosphorus and Moisture Content had a comparable results in all treatment used in the study. The BSFL in treatment 3 (14.63% Crude Fiber) and treatment 2 (13.53% Crude Fiber) had a significantly higher crude fiber than the treatment 1 group which obtain 8.73% Crude Fiber.</w:t>
       </w:r>
@@ -31357,10 +31501,12 @@
       <w:r>
         <w:rPr>
           <w:rFonts w:ascii="Georgia" w:hAnsi="Georgia" w:cs="Georgia" w:eastAsia="Georgia"/>
-          <w:b w:val="0"/>
-          <w:color w:val="000000"/>
-          <w:sz w:val="22"/>
+          <w:sz w:val="22"/>
+          <w:szCs w:val="22"/>
+          <w:b w:val="0"/>
+          <w:bCs w:val="0"/>
           <w:strike w:val="0"/>
+          <w:color w:val="000000"/>
         </w:rPr>
         <w:t xml:space="preserve">The study was conducted at [REDACTED] from April 25 to April 30, 2023 to find out the [TITLE REDACTED] where a total of nine hundred maggots (900) were used. The experiment was laid out using Complete Randomized Design (CRD) with three (3) treatments, namely, T1 –Carbonated rice hull and saw dust, T2 – Diatomaceous Earth, and T3 –Neem tree extract. The nine hundred maggots were divided into three (3) treatments at one hundred maggots (100) per treatment each treatment was replicated three (3) times with one hundred maggots (100) per replication. </w:t>
       </w:r>
@@ -31368,83 +31514,109 @@
         <w:rPr>
           <w:rFonts w:ascii="Georgia" w:hAnsi="Georgia" w:cs="Georgia" w:eastAsia="Georgia"/>
           <w:sz w:val="22"/>
+          <w:szCs w:val="22"/>
+          <w:b w:val="0"/>
+          <w:bCs w:val="0"/>
+          <w:strike w:val="0"/>
           <w:shd w:val="clear" w:fill="BFBFBF"/>
+          <w:color w:val="000000"/>
+        </w:rPr>
+        <w:t>The results disclosed that the percentage of mortality and moisture content were statistically significant at 1% (P&lt;0.01) and (P&lt;0.05) level with 48 hours after the post-treatment.</w:t>
+      </w:r>
+      <w:r>
+        <w:rPr>
+          <w:rFonts w:ascii="Georgia" w:hAnsi="Georgia" w:cs="Georgia" w:eastAsia="Georgia"/>
+          <w:sz w:val="20"/>
+          <w:szCs w:val="20"/>
+          <w:b w:val="0"/>
+          <w:bCs w:val="0"/>
           <w:strike w:val="0"/>
-        </w:rPr>
-        <w:t>The results disclosed that the percentage of mortality and moisture content were statistically significant at 1% (P&lt;0.01) and (P&lt;0.05) level with 48 hours after the post-treatment.</w:t>
+          <w:color w:val="000000"/>
+        </w:rPr>
+        <w:t xml:space="preserve"> [R]</w:t>
       </w:r>
       <w:r>
         <w:rPr>
           <w:rFonts w:ascii="Georgia" w:hAnsi="Georgia" w:cs="Georgia" w:eastAsia="Georgia"/>
-          <w:color w:val="000000"/>
-          <w:sz w:val="22"/>
+          <w:sz w:val="22"/>
+          <w:szCs w:val="22"/>
+          <w:b w:val="0"/>
+          <w:bCs w:val="0"/>
           <w:strike w:val="0"/>
+          <w:color w:val="000000"/>
+        </w:rPr>
+        <w:t xml:space="preserve"> </w:t>
+      </w:r>
+      <w:r>
+        <w:rPr>
+          <w:rFonts w:ascii="Georgia" w:hAnsi="Georgia" w:cs="Georgia" w:eastAsia="Georgia"/>
+          <w:sz w:val="22"/>
+          <w:szCs w:val="22"/>
+          <w:b w:val="0"/>
+          <w:bCs w:val="0"/>
+          <w:strike w:val="0"/>
+          <w:shd w:val="clear" w:fill="BFBFBF"/>
+          <w:color w:val="000000"/>
+        </w:rPr>
+        <w:t>However, mortality rate and moisture content were not significant after 6 hours and 24 hours.</w:t>
+      </w:r>
+      <w:r>
+        <w:rPr>
+          <w:rFonts w:ascii="Georgia" w:hAnsi="Georgia" w:cs="Georgia" w:eastAsia="Georgia"/>
+          <w:sz w:val="20"/>
+          <w:szCs w:val="20"/>
+          <w:b w:val="0"/>
+          <w:bCs w:val="0"/>
+          <w:strike w:val="0"/>
+          <w:color w:val="000000"/>
         </w:rPr>
         <w:t xml:space="preserve"> [R]</w:t>
       </w:r>
       <w:r>
         <w:rPr>
           <w:rFonts w:ascii="Georgia" w:hAnsi="Georgia" w:cs="Georgia" w:eastAsia="Georgia"/>
-          <w:b w:val="0"/>
-          <w:color w:val="000000"/>
-          <w:sz w:val="22"/>
+          <w:sz w:val="22"/>
+          <w:szCs w:val="22"/>
+          <w:b w:val="0"/>
+          <w:bCs w:val="0"/>
           <w:strike w:val="0"/>
-        </w:rPr>
-        <w:t xml:space="preserve"> </w:t>
+          <w:color w:val="000000"/>
+        </w:rPr>
+        <w:t xml:space="preserve"> Therefore, it is </w:t>
       </w:r>
       <w:r>
         <w:rPr>
           <w:rFonts w:ascii="Georgia" w:hAnsi="Georgia" w:cs="Georgia" w:eastAsia="Georgia"/>
           <w:sz w:val="22"/>
-          <w:shd w:val="clear" w:fill="BFBFBF"/>
+          <w:szCs w:val="22"/>
+          <w:b w:val="0"/>
+          <w:bCs w:val="0"/>
+          <w:color w:val="000000"/>
+          <w:strike w:val="1"/>
+        </w:rPr>
+        <w:t>recommended</w:t>
+      </w:r>
+      <w:r>
+        <w:rPr>
+          <w:rFonts w:ascii="Georgia" w:hAnsi="Georgia" w:cs="Georgia" w:eastAsia="Georgia"/>
+          <w:sz w:val="20"/>
+          <w:szCs w:val="20"/>
+          <w:b w:val="0"/>
+          <w:bCs w:val="0"/>
           <w:strike w:val="0"/>
-        </w:rPr>
-        <w:t>However, mortality rate and moisture content were not significant after 6 hours and 24 hours.</w:t>
+          <w:color w:val="808080"/>
+        </w:rPr>
+        <w:t xml:space="preserve"> (FP-Rec)</w:t>
       </w:r>
       <w:r>
         <w:rPr>
           <w:rFonts w:ascii="Georgia" w:hAnsi="Georgia" w:cs="Georgia" w:eastAsia="Georgia"/>
-          <w:color w:val="000000"/>
-          <w:sz w:val="22"/>
+          <w:sz w:val="22"/>
+          <w:szCs w:val="22"/>
+          <w:b w:val="0"/>
+          <w:bCs w:val="0"/>
           <w:strike w:val="0"/>
-        </w:rPr>
-        <w:t xml:space="preserve"> [R]</w:t>
-      </w:r>
-      <w:r>
-        <w:rPr>
-          <w:rFonts w:ascii="Georgia" w:hAnsi="Georgia" w:cs="Georgia" w:eastAsia="Georgia"/>
-          <w:b w:val="0"/>
-          <w:color w:val="000000"/>
-          <w:sz w:val="22"/>
-          <w:strike w:val="0"/>
-        </w:rPr>
-        <w:t xml:space="preserve"> Therefore, it is </w:t>
-      </w:r>
-      <w:r>
-        <w:rPr>
-          <w:rFonts w:ascii="Georgia" w:hAnsi="Georgia" w:cs="Georgia" w:eastAsia="Georgia"/>
-          <w:color w:val="000000"/>
-          <w:sz w:val="22"/>
-          <w:strike/>
-        </w:rPr>
-        <w:t>recommended</w:t>
-      </w:r>
-      <w:r>
-        <w:rPr>
-          <w:rFonts w:ascii="Georgia" w:hAnsi="Georgia" w:cs="Georgia" w:eastAsia="Georgia"/>
-          <w:color w:val="808080"/>
-          <w:sz w:val="22"/>
-          <w:strike w:val="0"/>
-        </w:rPr>
-        <w:t xml:space="preserve"> (FP-Rec)</w:t>
-      </w:r>
-      <w:r>
-        <w:rPr>
-          <w:rFonts w:ascii="Georgia" w:hAnsi="Georgia" w:cs="Georgia" w:eastAsia="Georgia"/>
-          <w:b w:val="0"/>
-          <w:color w:val="000000"/>
-          <w:sz w:val="22"/>
-          <w:strike w:val="0"/>
+          <w:color w:val="000000"/>
         </w:rPr>
         <w:t xml:space="preserve"> for future researchers to add Diatomaceous earth and neem tree extract and check the humidity. Extend data collection for 72 hours and 96 hours for future study.</w:t>
       </w:r>

</xml_diff>

<commit_message>
Draft_053: align Framework stages; alphabetize Crompton
Stage 1 retention, Stage 2 function, Layer 1 type.
Crompton after Biber in references.
</commit_message>
<xml_diff>
--- a/thesis/003_ThesisProposal_Draft_053.docx
+++ b/thesis/003_ThesisProposal_Draft_053.docx
@@ -1116,16 +1116,16 @@
       </w:pPr>
       <w:r>
         <w:rPr>
-          <w:rFonts w:ascii="Georgia" w:cs="Georgia" w:eastAsia="Georgia" w:hAnsi="Georgia"/>
-          <w:b w:val="0"/>
-          <w:bCs w:val="0"/>
-          <w:i w:val="0"/>
-          <w:iCs w:val="0"/>
-          <w:sz w:val="22"/>
-          <w:szCs w:val="22"/>
-          <w:rtl w:val="0"/>
-        </w:rPr>
-        <w:t>In practice, the coding scheme was adapted from Hyland (1998) and operationalized through the decision rules presented in Appendix A. The coding was applied in three sequential stages. First, each abstract was read holistically before any marking occurred to ensure that coding decisions were grounded in discourse context rather than keyword recognition. Second, each potential hedge was classified by type based on the decision rules in Appendix A. These types included modal verb, lexical hedge, adverbial hedge, and clause-level hedge. Third, each confirmed hedge was assigned a functional category: epistemic caution, politeness, or discourse organization. This three-stage sequence ensured that type and function were coded independently, allowing type-function pairings to be inspected. In this corpus all retained hedges were coded Epistemic Caution at Stage 2, so the cross-tab does not differentiate functions. RQ3 reports the functional profile of the Stage 1 retained set in this sample. No P candidates occurred; sequence-only DO was excluded. RQ4 is answered from frequency and functional patterns as a whole.</w:t>
+          <w:rFonts w:ascii="Georgia" w:hAnsi="Georgia" w:cs="Georgia" w:eastAsia="Georgia"/>
+          <w:b w:val="0"/>
+          <w:bCs w:val="0"/>
+          <w:i w:val="0"/>
+          <w:iCs w:val="0"/>
+          <w:sz w:val="22"/>
+          <w:szCs w:val="22"/>
+          <w:rtl w:val="0"/>
+        </w:rPr>
+        <w:t>In practice, the coding scheme was adapted from Hyland (1998) and operationalized through the decision rules presented in Appendix A. Coding proceeded in a fixed order. First, each abstract was read holistically before any marking, so decisions were grounded in discourse context rather than keyword recognition. Second, Stage 1 retention decided whether a candidate device counted as a hedge: the device was kept if removing it made a knowledge claim more categorical or more direct, or softened how that claim was put forward. Deontic recommendations, capability, pure procedure, pure move sequencing, and topic-naming without force reduction were excluded. Retained tokens were also marked for type (Layer 1: modal verb, lexical hedge, adverbial hedge, or clause-level hedge) using the Appendix A decision rules. Third, Stage 2 assigned function labels to retained tokens: Epistemic Caution, Politeness/Deference, and/or Discourse Organization. Type (Layer 1) and function (Stage 2) were recorded separately so type-function pairings could be inspected. In this corpus all retained hedges were coded Epistemic Caution at Stage 2, so the cross-tab does not differentiate functions. RQ3 reports the functional profile of the Stage 1 retained set in this sample. No P candidates occurred. Sequence-only DO was excluded. RQ4 is answered from frequency and functional patterns as a whole.</w:t>
       </w:r>
       <w:r>
         <w:rPr>
@@ -11930,6 +11930,22 @@
       </w:pPr>
       <w:r>
         <w:rPr>
+          <w:rFonts w:ascii="Georgia" w:hAnsi="Georgia"/>
+          <w:sz w:val="22"/>
+          <w:szCs w:val="22"/>
+        </w:rPr>
+        <w:t xml:space="preserve">Crompton, P. (1997). Hedging in academic writing: Some theoretical problems. English for Specific Purposes, 16(4), 271-287. https://www.academia.edu/50160307/Hedging_in_academic_writing_Some_theoretical_problems</w:t>
+      </w:r>
+    </w:p>
+    <w:p>
+      <w:pPr>
+        <w:spacing w:before="0" w:after="0" w:line="480" w:lineRule="auto"/>
+        <w:ind w:left="720" w:hanging="720"/>
+        <w:jc w:val="both"/>
+        <w:rPr/>
+      </w:pPr>
+      <w:r>
+        <w:rPr>
           <w:rFonts w:ascii="Georgia" w:cs="Georgia" w:eastAsia="Georgia" w:hAnsi="Georgia"/>
           <w:b w:val="0"/>
           <w:bCs w:val="0"/>
@@ -12075,22 +12091,6 @@
         <w:rPr>
           <w:rtl w:val="0"/>
         </w:rPr>
-      </w:r>
-    </w:p>
-    <w:p>
-      <w:pPr>
-        <w:spacing w:before="0" w:after="0" w:line="480" w:lineRule="auto"/>
-        <w:ind w:left="720" w:hanging="720"/>
-        <w:jc w:val="both"/>
-        <w:rPr/>
-      </w:pPr>
-      <w:r>
-        <w:rPr>
-          <w:rFonts w:ascii="Georgia" w:hAnsi="Georgia"/>
-          <w:sz w:val="22"/>
-          <w:szCs w:val="22"/>
-        </w:rPr>
-        <w:t xml:space="preserve">Crompton, P. (1997). Hedging in academic writing: Some theoretical problems. English for Specific Purposes, 16(4), 271-287. https://www.academia.edu/50160307/Hedging_in_academic_writing_Some_theoretical_problems</w:t>
       </w:r>
     </w:p>
     <w:p>

</xml_diff>

<commit_message>
Draft_053: replace Layer labels in main text with plain terms
Grammatical type and unhedged-site inventory. Layers stay in appendix.
</commit_message>
<xml_diff>
--- a/thesis/003_ThesisProposal_Draft_053.docx
+++ b/thesis/003_ThesisProposal_Draft_053.docx
@@ -1125,7 +1125,7 @@
           <w:szCs w:val="22"/>
           <w:rtl w:val="0"/>
         </w:rPr>
-        <w:t>In practice, the coding scheme was adapted from Hyland (1998) and operationalized through the decision rules presented in Appendix A. Coding proceeded in a fixed order. First, each abstract was read holistically before any marking, so decisions were grounded in discourse context rather than keyword recognition. Second, Stage 1 retention decided whether a candidate device counted as a hedge: the device was kept if removing it made a knowledge claim more categorical or more direct, or softened how that claim was put forward. Deontic recommendations, capability, pure procedure, pure move sequencing, and topic-naming without force reduction were excluded. Retained tokens were also marked for type (Layer 1: modal verb, lexical hedge, adverbial hedge, or clause-level hedge) using the Appendix A decision rules. Third, Stage 2 assigned function labels to retained tokens: Epistemic Caution, Politeness/Deference, and/or Discourse Organization. Type (Layer 1) and function (Stage 2) were recorded separately so type-function pairings could be inspected. In this corpus all retained hedges were coded Epistemic Caution at Stage 2, so the cross-tab does not differentiate functions. RQ3 reports the functional profile of the Stage 1 retained set in this sample. No P candidates occurred. Sequence-only DO was excluded. RQ4 is answered from frequency and functional patterns as a whole.</w:t>
+        <w:t>In practice, the coding scheme was adapted from Hyland (1998) and operationalized through the decision rules presented in Appendix A. Coding proceeded in a fixed order. First, each abstract was read holistically before any marking, so decisions were grounded in discourse context rather than keyword recognition. Second, Stage 1 retention decided whether a candidate device counted as a hedge: the device was kept if removing it made a knowledge claim more categorical or more direct, or softened how that claim was put forward. Deontic recommendations, capability, pure procedure, pure move sequencing, and topic-naming without force reduction were excluded. Retained tokens were also marked for grammatical type (modal verb, lexical hedge, adverbial hedge, or clause-level hedge) using the Appendix A decision rules. Third, Stage 2 assigned function labels to retained tokens: Epistemic Caution, Politeness/Deference, and/or Discourse Organization. Type and function were recorded separately so type-function pairings could be inspected. In this corpus all retained hedges were coded Epistemic Caution at Stage 2, so the cross-tab does not differentiate functions. RQ3 reports the functional profile of the Stage 1 retained set in this sample. No P candidates occurred. Sequence-only DO was excluded. RQ4 is answered from frequency and functional patterns as a whole.</w:t>
       </w:r>
       <w:r>
         <w:rPr>
@@ -7013,10 +7013,11 @@
       <w:r>
         <w:rPr>
           <w:rFonts w:ascii="Georgia" w:hAnsi="Georgia" w:cs="Georgia" w:eastAsia="Georgia"/>
-          <w:sz w:val="22"/>
-          <w:szCs w:val="22"/>
-        </w:rPr>
-        <w:t>Table 3 lists every retained hedge form in the corpus with its Layer 1 type and count. Counts sum to 65 and match Table 2. Surface forms of the same root are listed separately here so each tally line can be checked against the coding sheet.</w:t>
+          <w:b w:val="0"/>
+          <w:sz w:val="22"/>
+          <w:szCs w:val="22"/>
+        </w:rPr>
+        <w:t>Table 3 lists every retained hedge form in the corpus with its grammatical type and count. Counts sum to 65 and match Table 2. Surface forms of the same root are listed separately here so each tally line can be checked against the coding sheet.</w:t>
       </w:r>
     </w:p>
     <w:p>
@@ -8187,7 +8188,7 @@
           <w:szCs w:val="22"/>
           <w:rtl w:val="0"/>
         </w:rPr>
-        <w:t>Additionally, 32 unhedged assertion sites were identified in the 25 zero-hedge abstracts. Of these, 20 were classified as result claims [R], 8 as generalizations [G], and 4 as causal claims [C]. (Five further unhedged sites appear in abstracts that also contain coded hedges (B11, B12, VM9) and are excluded from this zero-hedge count. Table 5’s Unhedged sites column reports the corpus-wide total of 37.) These sites represent clauses where a hedge could have been inserted without changing the underlying facts, but no hedge was used. Layer 3 is included as a descriptive inventory of where hedging is absent in this corpus, not as a comparative claim against an expert or cross-discipline baseline. Without a matched comparison group, the counts document absence of overt hedges in specific claim environments. They do not measure underuse relative to a norm. The presence of these unhedged sites in zero-hedge abstracts records an absence of overt hedging. It does not by itself establish that the writer intended absolute commitment, especially where the underlying finding is binary or measured. Expert research articles rarely contain zero hedges (Hyland, 1998). Whether the 41.7% zero-hedge rate in this corpus is high relative to expert abstracts specifically cannot be established here, because no matched expert-abstract baseline is available.</w:t>
+        <w:t>Additionally, 32 unhedged assertion sites were identified in the 25 zero-hedge abstracts. Of these, 20 were classified as result claims [R], 8 as generalizations [G], and 4 as causal claims [C]. (Five further unhedged sites appear in abstracts that also contain coded hedges (B11, B12, VM9) and are excluded from this zero-hedge count. Table 5’s Unhedged sites column reports the corpus-wide total of 37.) These sites represent clauses where a hedge could have been inserted without changing the underlying facts, but no hedge was used. This unhedged-site inventory is included as a descriptive record of where hedging is absent in this corpus, not as a comparative claim against an expert or cross-discipline baseline. Without a matched comparison group, the counts document absence of overt hedges in specific claim environments. They do not measure underuse relative to a norm. The presence of these unhedged sites in zero-hedge abstracts records an absence of overt hedging. It does not by itself establish that the writer intended absolute commitment, especially where the underlying finding is binary or measured. Expert research articles rarely contain zero hedges (Hyland, 1998). Whether the 41.7% zero-hedge rate in this corpus is high relative to expert abstracts specifically cannot be established here, because no matched expert-abstract baseline is available.</w:t>
       </w:r>
       <w:r>
         <w:rPr>
@@ -11775,16 +11776,16 @@
       </w:pPr>
       <w:r>
         <w:rPr>
-          <w:rFonts w:ascii="Georgia" w:cs="Georgia" w:eastAsia="Georgia" w:hAnsi="Georgia"/>
-          <w:b w:val="0"/>
-          <w:bCs w:val="0"/>
-          <w:i w:val="0"/>
-          <w:iCs w:val="0"/>
-          <w:sz w:val="22"/>
-          <w:szCs w:val="22"/>
-          <w:rtl w:val="0"/>
-        </w:rPr>
-        <w:t xml:space="preserve">The coding methodology developed in this study, including the codebook’s decision rules and the Layer 3 unhedged assertion site analysis, can serve as a template for similar studies in other disciplines, genres, or institutions. Future researchers may adapt the codebook for analyzing hedging in full-length thesis sections, research articles, or other academic genres where rhetorical space allows for greater hedge variety than the compressed abstract. Additionally, future studies could examine assertive reporting forms alongside hedges, with a comparison group that includes both zero-hedge and hedged abstracts, to test whether those forms cluster with the absence of hedges or appear across the board.</w:t>
+          <w:rFonts w:ascii="Georgia" w:hAnsi="Georgia" w:cs="Georgia" w:eastAsia="Georgia"/>
+          <w:b w:val="0"/>
+          <w:bCs w:val="0"/>
+          <w:i w:val="0"/>
+          <w:iCs w:val="0"/>
+          <w:sz w:val="22"/>
+          <w:szCs w:val="22"/>
+          <w:rtl w:val="0"/>
+        </w:rPr>
+        <w:t>The coding methodology developed in this study, including the codebook’s decision rules and the unhedged assertion site analysis, can serve as a template for similar studies in other disciplines, genres, or institutions. Future researchers may adapt the codebook for analyzing hedging in full-length thesis sections, research articles, or other academic genres where rhetorical space allows for greater hedge variety than the compressed abstract. Additionally, future studies could examine assertive reporting forms alongside hedges, with a comparison group that includes both zero-hedge and hedged abstracts, to test whether those forms cluster with the absence of hedges or appear across the board.</w:t>
       </w:r>
       <w:r>
         <w:rPr>

</xml_diff>

<commit_message>
Draft_053: uniform type/function/unhedged labels in appendix
Remove Layer 1/2/3 from codebook and Appendix C intro.
</commit_message>
<xml_diff>
--- a/thesis/003_ThesisProposal_Draft_053.docx
+++ b/thesis/003_ThesisProposal_Draft_053.docx
@@ -12823,7 +12823,7 @@
           <w:sz w:val="22"/>
           <w:szCs w:val="22"/>
         </w:rPr>
-        <w:t>• Full protocol: quick-reference → legend → stages → examples → type/function tables → decision rules → false positives → Layer 3.</w:t>
+        <w:t>• Full protocol: quick-reference → legend → stages → examples → type/function tables → decision rules → false positives → unhedged sites.</w:t>
       </w:r>
     </w:p>
     <w:p>
@@ -14882,7 +14882,7 @@
       </w:pPr>
       <w:r>
         <w:rPr>
-          <w:rFonts w:ascii="Georgia" w:cs="Georgia" w:eastAsia="Georgia" w:hAnsi="Georgia"/>
+          <w:rFonts w:ascii="Georgia" w:hAnsi="Georgia" w:cs="Georgia" w:eastAsia="Georgia"/>
           <w:b w:val="0"/>
           <w:bCs w:val="0"/>
           <w:i w:val="1"/>
@@ -14892,7 +14892,7 @@
           <w:szCs w:val="22"/>
           <w:rtl w:val="0"/>
         </w:rPr>
-        <w:t xml:space="preserve">Layer 3 data, tracked separately so it never inflates RQ2 counts.</w:t>
+        <w:t>Unhedged-site data, tracked separately so it never inflates RQ2 counts.</w:t>
       </w:r>
       <w:r>
         <w:rPr>
@@ -16361,8 +16361,8 @@
       </w:pPr>
       <w:r>
         <w:rPr>
-          <w:rFonts w:ascii="Georgia" w:cs="Georgia" w:eastAsia="Georgia" w:hAnsi="Georgia"/>
-          <w:b w:val="1"/>
+          <w:rFonts w:ascii="Georgia" w:hAnsi="Georgia" w:cs="Georgia" w:eastAsia="Georgia"/>
+          <w:b/>
           <w:bCs w:val="1"/>
           <w:i w:val="0"/>
           <w:iCs w:val="0"/>
@@ -16370,7 +16370,7 @@
           <w:szCs w:val="24"/>
           <w:rtl w:val="0"/>
         </w:rPr>
-        <w:t xml:space="preserve">LAYER 1: HEDGE TYPE (PRIMARY COLORS)</w:t>
+        <w:t>HEDGE TYPE (PRIMARY COLORS)</w:t>
       </w:r>
       <w:r>
         <w:rPr>
@@ -17433,8 +17433,8 @@
       </w:pPr>
       <w:r>
         <w:rPr>
-          <w:rFonts w:ascii="Georgia" w:cs="Georgia" w:eastAsia="Georgia" w:hAnsi="Georgia"/>
-          <w:b w:val="1"/>
+          <w:rFonts w:ascii="Georgia" w:hAnsi="Georgia" w:cs="Georgia" w:eastAsia="Georgia"/>
+          <w:b/>
           <w:bCs w:val="1"/>
           <w:i w:val="0"/>
           <w:iCs w:val="0"/>
@@ -17442,7 +17442,7 @@
           <w:szCs w:val="24"/>
           <w:rtl w:val="0"/>
         </w:rPr>
-        <w:t xml:space="preserve">LAYER 2: HEDGE FUNCTION (COLORED TEXT LABELS)</w:t>
+        <w:t>HEDGE FUNCTION (COLORED TEXT LABELS)</w:t>
       </w:r>
       <w:r>
         <w:rPr>
@@ -20007,8 +20007,8 @@
       </w:pPr>
       <w:r>
         <w:rPr>
-          <w:rFonts w:ascii="Georgia" w:cs="Georgia" w:eastAsia="Georgia" w:hAnsi="Georgia"/>
-          <w:b w:val="1"/>
+          <w:rFonts w:ascii="Georgia" w:hAnsi="Georgia" w:cs="Georgia" w:eastAsia="Georgia"/>
+          <w:b/>
           <w:bCs w:val="1"/>
           <w:i w:val="0"/>
           <w:iCs w:val="0"/>
@@ -20016,7 +20016,7 @@
           <w:szCs w:val="24"/>
           <w:rtl w:val="0"/>
         </w:rPr>
-        <w:t xml:space="preserve">LAYER 3 (OPTIONAL): UNHEDGED ASSERTION SITES (NEUTRAL GREY)</w:t>
+        <w:t>UNHEDGED ASSERTION SITES (OPTIONAL, NEUTRAL GREY)</w:t>
       </w:r>
       <w:r>
         <w:rPr>
@@ -20044,7 +20044,7 @@
           <w:szCs w:val="22"/>
           <w:rtl w:val="0"/>
         </w:rPr>
-        <w:t>• Layer 3: claim clauses with no hedge. Reverse test: a hedge could be inserted without changing the facts. Procedural statements never markable. Example: “Results showed X” → could be “Results suggested X.”</w:t>
+        <w:t>• Unhedged sites: claim clauses with no hedge. Reverse test: a hedge could be inserted without changing the facts. Procedural statements never markable. Example: “Results showed X” → could be “Results suggested X.”</w:t>
       </w:r>
       <w:r>
         <w:rPr>
@@ -21596,16 +21596,16 @@
       </w:pPr>
       <w:r>
         <w:rPr>
-          <w:rFonts w:ascii="Georgia" w:cs="Georgia" w:eastAsia="Georgia" w:hAnsi="Georgia"/>
-          <w:b w:val="0"/>
-          <w:bCs w:val="0"/>
-          <w:i w:val="0"/>
-          <w:iCs w:val="0"/>
-          <w:sz w:val="22"/>
-          <w:szCs w:val="22"/>
-          <w:rtl w:val="0"/>
-        </w:rPr>
-        <w:t>This appendix presents the 60 abstracts with all coding marks applied. Layer 1 = color highlight on hedge tokens (blue = Modal Verbs, red = Lexical Hedges, yellow = Adverbial Hedges, green = Clause-Level Hedges). Layer 2 = function label in colored text (EC = orange, P = purple, DO = teal). Discourse connectors (Hence/Thus) are tagged (DO) even when not hedges. Layer 2 functions are only EC, P, and DO. False positives = strikethrough + reason code in grey (e.g. FP-Rec = recommendation, not a function). Layer 3 (unhedged sites) = grey highlight + [R]/[G]/[C] bracket.</w:t>
+          <w:rFonts w:ascii="Georgia" w:hAnsi="Georgia" w:cs="Georgia" w:eastAsia="Georgia"/>
+          <w:b w:val="0"/>
+          <w:bCs w:val="0"/>
+          <w:i w:val="0"/>
+          <w:iCs w:val="0"/>
+          <w:sz w:val="22"/>
+          <w:szCs w:val="22"/>
+          <w:rtl w:val="0"/>
+        </w:rPr>
+        <w:t>This appendix presents the 60 abstracts with all coding marks applied. Type marks = color highlight on hedge tokens (blue = Modal Verbs, red = Lexical Hedges, yellow = Adverbial Hedges, green = Clause-Level Hedges). Function marks = function label in colored text (EC = orange, P = purple, DO = teal). Discourse connectors (Hence/Thus) are tagged (DO) even when not hedges. Function functions are only EC, P, and DO. False positives = strikethrough + reason code in grey (e.g. FP-Rec = recommendation, not a function). Unhedged sites (unhedged sites) = grey highlight + [R]/[G]/[C] bracket.</w:t>
       </w:r>
       <w:r>
         <w:rPr>

</xml_diff>

<commit_message>
Draft_053: uniform APA 7 reference list
Italics, en dashes, DOIs; Crompton DOI; consistent formatting.
</commit_message>
<xml_diff>
--- a/thesis/003_ThesisProposal_Draft_053.docx
+++ b/thesis/003_ThesisProposal_Draft_053.docx
@@ -11822,887 +11822,691 @@
       <w:pPr>
         <w:spacing w:before="0" w:after="0" w:line="480" w:lineRule="auto"/>
         <w:ind w:left="720" w:hanging="720"/>
-        <w:jc w:val="both"/>
-        <w:rPr/>
-      </w:pPr>
-      <w:r>
-        <w:rPr>
-          <w:rFonts w:ascii="Georgia" w:cs="Georgia" w:eastAsia="Georgia" w:hAnsi="Georgia"/>
-          <w:b w:val="0"/>
-          <w:bCs w:val="0"/>
-          <w:i w:val="0"/>
-          <w:iCs w:val="0"/>
-          <w:sz w:val="22"/>
-          <w:szCs w:val="22"/>
-          <w:rtl w:val="0"/>
+        <w:jc w:val="left"/>
+        <w:rPr/>
+      </w:pPr>
+      <w:r>
+        <w:rPr>
+          <w:rFonts w:ascii="Georgia" w:hAnsi="Georgia" w:cs="Georgia" w:eastAsia="Georgia"/>
+          <w:b w:val="0"/>
+          <w:sz w:val="22"/>
+          <w:i w:val="0"/>
         </w:rPr>
         <w:t xml:space="preserve">Afshar, H. S., Moradi, M., &amp; Hamzavi, R. (2014). Frequency and type of hedging devices used in the research articles of humanities, basic sciences and agriculture. </w:t>
       </w:r>
       <w:r>
         <w:rPr>
-          <w:rFonts w:ascii="Georgia" w:cs="Georgia" w:eastAsia="Georgia" w:hAnsi="Georgia"/>
-          <w:b w:val="0"/>
-          <w:bCs w:val="0"/>
-          <w:i w:val="1"/>
-          <w:iCs w:val="1"/>
-          <w:sz w:val="22"/>
-          <w:szCs w:val="22"/>
-          <w:rtl w:val="0"/>
-        </w:rPr>
-        <w:t xml:space="preserve">Procedia – Social and Behavioral Sciences, 136</w:t>
-      </w:r>
-      <w:r>
-        <w:rPr>
-          <w:rFonts w:ascii="Georgia" w:cs="Georgia" w:eastAsia="Georgia" w:hAnsi="Georgia"/>
-          <w:b w:val="0"/>
-          <w:bCs w:val="0"/>
-          <w:i w:val="0"/>
-          <w:iCs w:val="0"/>
-          <w:sz w:val="22"/>
-          <w:szCs w:val="22"/>
-          <w:rtl w:val="0"/>
-        </w:rPr>
-        <w:t xml:space="preserve">, 70–74. https://doi.org/10.1016/j.sbspro.2014.05.290</w:t>
-      </w:r>
-      <w:r>
-        <w:rPr>
-          <w:rtl w:val="0"/>
-        </w:rPr>
+          <w:rFonts w:ascii="Georgia" w:hAnsi="Georgia" w:cs="Georgia" w:eastAsia="Georgia"/>
+          <w:b w:val="0"/>
+          <w:sz w:val="22"/>
+          <w:i/>
+          <w:iCs/>
+        </w:rPr>
+        <w:t>Procedia – Social and Behavioral Sciences, 136</w:t>
+      </w:r>
+      <w:r>
+        <w:rPr>
+          <w:rFonts w:ascii="Georgia" w:hAnsi="Georgia" w:cs="Georgia" w:eastAsia="Georgia"/>
+          <w:b w:val="0"/>
+          <w:sz w:val="22"/>
+          <w:i w:val="0"/>
+        </w:rPr>
+        <w:t>, 70–74. https://doi.org/10.1016/j.sbspro.2014.05.290</w:t>
       </w:r>
     </w:p>
     <w:p>
       <w:pPr>
         <w:spacing w:before="0" w:after="0" w:line="480" w:lineRule="auto"/>
         <w:ind w:left="720" w:hanging="720"/>
-        <w:jc w:val="both"/>
-        <w:rPr/>
-      </w:pPr>
-      <w:r>
-        <w:rPr>
-          <w:rFonts w:ascii="Georgia" w:cs="Georgia" w:eastAsia="Georgia" w:hAnsi="Georgia"/>
-          <w:b w:val="0"/>
-          <w:bCs w:val="0"/>
-          <w:i w:val="0"/>
-          <w:iCs w:val="0"/>
-          <w:sz w:val="22"/>
-          <w:szCs w:val="22"/>
-          <w:rtl w:val="0"/>
+        <w:jc w:val="left"/>
+        <w:rPr/>
+      </w:pPr>
+      <w:r>
+        <w:rPr>
+          <w:rFonts w:ascii="Georgia" w:hAnsi="Georgia" w:cs="Georgia" w:eastAsia="Georgia"/>
+          <w:b w:val="0"/>
+          <w:sz w:val="22"/>
+          <w:i w:val="0"/>
         </w:rPr>
         <w:t xml:space="preserve">Biber, D., Conrad, S., &amp; Reppen, R. (1998). </w:t>
       </w:r>
       <w:r>
         <w:rPr>
-          <w:rFonts w:ascii="Georgia" w:cs="Georgia" w:eastAsia="Georgia" w:hAnsi="Georgia"/>
-          <w:b w:val="0"/>
-          <w:bCs w:val="0"/>
-          <w:i w:val="1"/>
-          <w:iCs w:val="1"/>
-          <w:sz w:val="22"/>
-          <w:szCs w:val="22"/>
-          <w:rtl w:val="0"/>
-        </w:rPr>
-        <w:t xml:space="preserve">Corpus linguistics: Investigating language structure and use</w:t>
-      </w:r>
-      <w:r>
-        <w:rPr>
-          <w:rFonts w:ascii="Georgia" w:cs="Georgia" w:eastAsia="Georgia" w:hAnsi="Georgia"/>
-          <w:b w:val="0"/>
-          <w:bCs w:val="0"/>
-          <w:i w:val="0"/>
-          <w:iCs w:val="0"/>
-          <w:sz w:val="22"/>
-          <w:szCs w:val="22"/>
-          <w:rtl w:val="0"/>
-        </w:rPr>
-        <w:t xml:space="preserve">. Cambridge University Press.</w:t>
-      </w:r>
-      <w:r>
-        <w:rPr>
-          <w:rtl w:val="0"/>
-        </w:rPr>
+          <w:rFonts w:ascii="Georgia" w:hAnsi="Georgia" w:cs="Georgia" w:eastAsia="Georgia"/>
+          <w:b w:val="0"/>
+          <w:sz w:val="22"/>
+          <w:i/>
+          <w:iCs/>
+        </w:rPr>
+        <w:t>Corpus linguistics: Investigating language structure and use</w:t>
+      </w:r>
+      <w:r>
+        <w:rPr>
+          <w:rFonts w:ascii="Georgia" w:hAnsi="Georgia" w:cs="Georgia" w:eastAsia="Georgia"/>
+          <w:b w:val="0"/>
+          <w:sz w:val="22"/>
+          <w:i w:val="0"/>
+        </w:rPr>
+        <w:t>. Cambridge University Press.</w:t>
       </w:r>
     </w:p>
     <w:p>
       <w:pPr>
         <w:spacing w:before="0" w:after="0" w:line="480" w:lineRule="auto"/>
         <w:ind w:left="720" w:hanging="720"/>
-        <w:jc w:val="both"/>
-        <w:rPr/>
-      </w:pPr>
-      <w:r>
-        <w:rPr>
-          <w:rFonts w:ascii="Georgia" w:hAnsi="Georgia"/>
-          <w:sz w:val="22"/>
-          <w:szCs w:val="22"/>
-        </w:rPr>
-        <w:t xml:space="preserve">Crompton, P. (1997). Hedging in academic writing: Some theoretical problems. English for Specific Purposes, 16(4), 271-287. https://www.academia.edu/50160307/Hedging_in_academic_writing_Some_theoretical_problems</w:t>
+        <w:jc w:val="left"/>
+        <w:rPr/>
+      </w:pPr>
+      <w:r>
+        <w:rPr>
+          <w:rFonts w:ascii="Georgia" w:hAnsi="Georgia" w:cs="Georgia" w:eastAsia="Georgia"/>
+          <w:b w:val="0"/>
+          <w:sz w:val="22"/>
+          <w:i w:val="0"/>
+        </w:rPr>
+        <w:t xml:space="preserve">Crompton, P. (1997). Hedging in academic writing: Some theoretical problems. </w:t>
+      </w:r>
+      <w:r>
+        <w:rPr>
+          <w:rFonts w:ascii="Georgia" w:hAnsi="Georgia" w:cs="Georgia" w:eastAsia="Georgia"/>
+          <w:b w:val="0"/>
+          <w:sz w:val="22"/>
+          <w:i/>
+          <w:iCs/>
+        </w:rPr>
+        <w:t>English for Specific Purposes, 16</w:t>
+      </w:r>
+      <w:r>
+        <w:rPr>
+          <w:rFonts w:ascii="Georgia" w:hAnsi="Georgia" w:cs="Georgia" w:eastAsia="Georgia"/>
+          <w:b w:val="0"/>
+          <w:sz w:val="22"/>
+          <w:i w:val="0"/>
+        </w:rPr>
+        <w:t>(4), 271–287. https://doi.org/10.1016/S0889-4906(97)00007-0</w:t>
       </w:r>
     </w:p>
     <w:p>
       <w:pPr>
         <w:spacing w:before="0" w:after="0" w:line="480" w:lineRule="auto"/>
         <w:ind w:left="720" w:hanging="720"/>
-        <w:jc w:val="both"/>
-        <w:rPr/>
-      </w:pPr>
-      <w:r>
-        <w:rPr>
-          <w:rFonts w:ascii="Georgia" w:cs="Georgia" w:eastAsia="Georgia" w:hAnsi="Georgia"/>
-          <w:b w:val="0"/>
-          <w:bCs w:val="0"/>
-          <w:i w:val="0"/>
-          <w:iCs w:val="0"/>
-          <w:sz w:val="22"/>
-          <w:szCs w:val="22"/>
-          <w:rtl w:val="0"/>
+        <w:jc w:val="left"/>
+        <w:rPr/>
+      </w:pPr>
+      <w:r>
+        <w:rPr>
+          <w:rFonts w:ascii="Georgia" w:hAnsi="Georgia" w:cs="Georgia" w:eastAsia="Georgia"/>
+          <w:b w:val="0"/>
+          <w:sz w:val="22"/>
+          <w:i w:val="0"/>
         </w:rPr>
         <w:t xml:space="preserve">Demir, C. (2018). Hedging and academic writing: An analysis of lexical hedges. </w:t>
       </w:r>
       <w:r>
         <w:rPr>
-          <w:rFonts w:ascii="Georgia" w:cs="Georgia" w:eastAsia="Georgia" w:hAnsi="Georgia"/>
-          <w:b w:val="0"/>
-          <w:bCs w:val="0"/>
-          <w:i w:val="1"/>
-          <w:iCs w:val="1"/>
-          <w:sz w:val="22"/>
-          <w:szCs w:val="22"/>
-          <w:rtl w:val="0"/>
-        </w:rPr>
-        <w:t xml:space="preserve">Journal of Language and Linguistic Studies, 14</w:t>
-      </w:r>
-      <w:r>
-        <w:rPr>
-          <w:rFonts w:ascii="Georgia" w:cs="Georgia" w:eastAsia="Georgia" w:hAnsi="Georgia"/>
-          <w:b w:val="0"/>
-          <w:bCs w:val="0"/>
-          <w:i w:val="0"/>
-          <w:iCs w:val="0"/>
-          <w:sz w:val="22"/>
-          <w:szCs w:val="22"/>
-          <w:rtl w:val="0"/>
-        </w:rPr>
-        <w:t xml:space="preserve">(4), 74–92. https://files.eric.ed.gov/fulltext/EJ1201945.pdf</w:t>
-      </w:r>
-      <w:r>
-        <w:rPr>
-          <w:rtl w:val="0"/>
-        </w:rPr>
+          <w:rFonts w:ascii="Georgia" w:hAnsi="Georgia" w:cs="Georgia" w:eastAsia="Georgia"/>
+          <w:b w:val="0"/>
+          <w:sz w:val="22"/>
+          <w:i/>
+          <w:iCs/>
+        </w:rPr>
+        <w:t>Journal of Language and Linguistic Studies, 14</w:t>
+      </w:r>
+      <w:r>
+        <w:rPr>
+          <w:rFonts w:ascii="Georgia" w:hAnsi="Georgia" w:cs="Georgia" w:eastAsia="Georgia"/>
+          <w:b w:val="0"/>
+          <w:sz w:val="22"/>
+          <w:i w:val="0"/>
+        </w:rPr>
+        <w:t>(4), 74–92. https://files.eric.ed.gov/fulltext/EJ1201945.pdf</w:t>
       </w:r>
     </w:p>
     <w:p>
       <w:pPr>
         <w:spacing w:before="0" w:after="0" w:line="480" w:lineRule="auto"/>
         <w:ind w:left="720" w:hanging="720"/>
-        <w:jc w:val="both"/>
-        <w:rPr/>
-      </w:pPr>
-      <w:r>
-        <w:rPr>
-          <w:rFonts w:ascii="Georgia" w:cs="Georgia" w:eastAsia="Georgia" w:hAnsi="Georgia"/>
-          <w:b w:val="0"/>
-          <w:bCs w:val="0"/>
-          <w:i w:val="0"/>
-          <w:iCs w:val="0"/>
-          <w:sz w:val="22"/>
-          <w:szCs w:val="22"/>
-          <w:rtl w:val="0"/>
+        <w:jc w:val="left"/>
+        <w:rPr/>
+      </w:pPr>
+      <w:r>
+        <w:rPr>
+          <w:rFonts w:ascii="Georgia" w:hAnsi="Georgia" w:cs="Georgia" w:eastAsia="Georgia"/>
+          <w:b w:val="0"/>
+          <w:sz w:val="22"/>
+          <w:i w:val="0"/>
         </w:rPr>
         <w:t xml:space="preserve">Escalona, S. L. (2025). Hedges and boosters in college essays: A study of linguistic modulation in student writing. </w:t>
       </w:r>
       <w:r>
         <w:rPr>
-          <w:rFonts w:ascii="Georgia" w:cs="Georgia" w:eastAsia="Georgia" w:hAnsi="Georgia"/>
-          <w:b w:val="0"/>
-          <w:bCs w:val="0"/>
-          <w:i w:val="1"/>
-          <w:iCs w:val="1"/>
-          <w:sz w:val="22"/>
-          <w:szCs w:val="22"/>
-          <w:rtl w:val="0"/>
-        </w:rPr>
-        <w:t xml:space="preserve">International Journal of English Literature and Social Sciences, 10</w:t>
-      </w:r>
-      <w:r>
-        <w:rPr>
-          <w:rFonts w:ascii="Georgia" w:cs="Georgia" w:eastAsia="Georgia" w:hAnsi="Georgia"/>
-          <w:b w:val="0"/>
-          <w:bCs w:val="0"/>
-          <w:i w:val="0"/>
-          <w:iCs w:val="0"/>
-          <w:sz w:val="22"/>
-          <w:szCs w:val="22"/>
-          <w:rtl w:val="0"/>
-        </w:rPr>
-        <w:t xml:space="preserve">(1), 7–17. https://doi.org/10.22161/ijels.101.2</w:t>
-      </w:r>
-      <w:r>
-        <w:rPr>
-          <w:rtl w:val="0"/>
-        </w:rPr>
+          <w:rFonts w:ascii="Georgia" w:hAnsi="Georgia" w:cs="Georgia" w:eastAsia="Georgia"/>
+          <w:b w:val="0"/>
+          <w:sz w:val="22"/>
+          <w:i/>
+          <w:iCs/>
+        </w:rPr>
+        <w:t>International Journal of English Literature and Social Sciences, 10</w:t>
+      </w:r>
+      <w:r>
+        <w:rPr>
+          <w:rFonts w:ascii="Georgia" w:hAnsi="Georgia" w:cs="Georgia" w:eastAsia="Georgia"/>
+          <w:b w:val="0"/>
+          <w:sz w:val="22"/>
+          <w:i w:val="0"/>
+        </w:rPr>
+        <w:t>(1), 7–17. https://doi.org/10.22161/ijels.101.2</w:t>
       </w:r>
     </w:p>
     <w:p>
       <w:pPr>
         <w:spacing w:before="0" w:after="0" w:line="480" w:lineRule="auto"/>
         <w:ind w:left="720" w:hanging="720"/>
-        <w:jc w:val="both"/>
-        <w:rPr/>
-      </w:pPr>
-      <w:r>
-        <w:rPr>
-          <w:rFonts w:ascii="Georgia" w:cs="Georgia" w:eastAsia="Georgia" w:hAnsi="Georgia"/>
-          <w:b w:val="0"/>
-          <w:bCs w:val="0"/>
-          <w:i w:val="0"/>
-          <w:iCs w:val="0"/>
-          <w:sz w:val="22"/>
-          <w:szCs w:val="22"/>
-          <w:rtl w:val="0"/>
+        <w:jc w:val="left"/>
+        <w:rPr/>
+      </w:pPr>
+      <w:r>
+        <w:rPr>
+          <w:rFonts w:ascii="Georgia" w:hAnsi="Georgia" w:cs="Georgia" w:eastAsia="Georgia"/>
+          <w:b w:val="0"/>
+          <w:sz w:val="22"/>
+          <w:i w:val="0"/>
         </w:rPr>
         <w:t xml:space="preserve">Hamidi, H., Najafi Sarem, S., &amp; Lotfi, A. H. (2025). Exploring hedging devices in scientific research papers: A content analysis study of the “Medical Journal of the Islamic Republic of Iran.” </w:t>
       </w:r>
       <w:r>
         <w:rPr>
-          <w:rFonts w:ascii="Georgia" w:cs="Georgia" w:eastAsia="Georgia" w:hAnsi="Georgia"/>
-          <w:b w:val="0"/>
-          <w:bCs w:val="0"/>
-          <w:i w:val="1"/>
-          <w:iCs w:val="1"/>
-          <w:sz w:val="22"/>
-          <w:szCs w:val="22"/>
-          <w:rtl w:val="0"/>
-        </w:rPr>
-        <w:t xml:space="preserve">Medical Journal of the Islamic Republic of Iran, 39</w:t>
-      </w:r>
-      <w:r>
-        <w:rPr>
-          <w:rFonts w:ascii="Georgia" w:cs="Georgia" w:eastAsia="Georgia" w:hAnsi="Georgia"/>
-          <w:b w:val="0"/>
-          <w:bCs w:val="0"/>
-          <w:i w:val="0"/>
-          <w:iCs w:val="0"/>
-          <w:sz w:val="22"/>
-          <w:szCs w:val="22"/>
-          <w:rtl w:val="0"/>
-        </w:rPr>
-        <w:t xml:space="preserve">, 125. https://pmc.ncbi.nlm.nih.gov/articles/PMC12584097/</w:t>
-      </w:r>
-      <w:r>
-        <w:rPr>
-          <w:rtl w:val="0"/>
-        </w:rPr>
+          <w:rFonts w:ascii="Georgia" w:hAnsi="Georgia" w:cs="Georgia" w:eastAsia="Georgia"/>
+          <w:b w:val="0"/>
+          <w:sz w:val="22"/>
+          <w:i/>
+          <w:iCs/>
+        </w:rPr>
+        <w:t>Medical Journal of the Islamic Republic of Iran, 39</w:t>
+      </w:r>
+      <w:r>
+        <w:rPr>
+          <w:rFonts w:ascii="Georgia" w:hAnsi="Georgia" w:cs="Georgia" w:eastAsia="Georgia"/>
+          <w:b w:val="0"/>
+          <w:sz w:val="22"/>
+          <w:i w:val="0"/>
+        </w:rPr>
+        <w:t>, Article 125. https://pmc.ncbi.nlm.nih.gov/articles/PMC12584097/</w:t>
       </w:r>
     </w:p>
     <w:p>
       <w:pPr>
         <w:spacing w:before="0" w:after="0" w:line="480" w:lineRule="auto"/>
         <w:ind w:left="720" w:hanging="720"/>
-        <w:jc w:val="both"/>
-        <w:rPr/>
-      </w:pPr>
-      <w:r>
-        <w:rPr>
-          <w:rFonts w:ascii="Georgia" w:cs="Georgia" w:eastAsia="Georgia" w:hAnsi="Georgia"/>
-          <w:b w:val="0"/>
-          <w:bCs w:val="0"/>
-          <w:i w:val="0"/>
-          <w:iCs w:val="0"/>
-          <w:sz w:val="22"/>
-          <w:szCs w:val="22"/>
-          <w:rtl w:val="0"/>
+        <w:jc w:val="left"/>
+        <w:rPr/>
+      </w:pPr>
+      <w:r>
+        <w:rPr>
+          <w:rFonts w:ascii="Georgia" w:hAnsi="Georgia" w:cs="Georgia" w:eastAsia="Georgia"/>
+          <w:b w:val="0"/>
+          <w:sz w:val="22"/>
+          <w:i w:val="0"/>
         </w:rPr>
         <w:t xml:space="preserve">Hyland, K. (1998). </w:t>
       </w:r>
       <w:r>
         <w:rPr>
-          <w:rFonts w:ascii="Georgia" w:cs="Georgia" w:eastAsia="Georgia" w:hAnsi="Georgia"/>
-          <w:b w:val="0"/>
-          <w:bCs w:val="0"/>
-          <w:i w:val="1"/>
-          <w:iCs w:val="1"/>
-          <w:sz w:val="22"/>
-          <w:szCs w:val="22"/>
-          <w:rtl w:val="0"/>
-        </w:rPr>
-        <w:t xml:space="preserve">Hedging in scientific research articles</w:t>
-      </w:r>
-      <w:r>
-        <w:rPr>
-          <w:rFonts w:ascii="Georgia" w:cs="Georgia" w:eastAsia="Georgia" w:hAnsi="Georgia"/>
-          <w:b w:val="0"/>
-          <w:bCs w:val="0"/>
-          <w:i w:val="0"/>
-          <w:iCs w:val="0"/>
-          <w:sz w:val="22"/>
-          <w:szCs w:val="22"/>
-          <w:rtl w:val="0"/>
-        </w:rPr>
-        <w:t xml:space="preserve">. John Benjamins Publishing.</w:t>
-      </w:r>
-      <w:r>
-        <w:rPr>
-          <w:rtl w:val="0"/>
-        </w:rPr>
+          <w:rFonts w:ascii="Georgia" w:hAnsi="Georgia" w:cs="Georgia" w:eastAsia="Georgia"/>
+          <w:b w:val="0"/>
+          <w:sz w:val="22"/>
+          <w:i/>
+          <w:iCs/>
+        </w:rPr>
+        <w:t>Hedging in scientific research articles</w:t>
+      </w:r>
+      <w:r>
+        <w:rPr>
+          <w:rFonts w:ascii="Georgia" w:hAnsi="Georgia" w:cs="Georgia" w:eastAsia="Georgia"/>
+          <w:b w:val="0"/>
+          <w:sz w:val="22"/>
+          <w:i w:val="0"/>
+        </w:rPr>
+        <w:t>. John Benjamins Publishing.</w:t>
       </w:r>
     </w:p>
     <w:p>
       <w:pPr>
         <w:spacing w:before="0" w:after="0" w:line="480" w:lineRule="auto"/>
         <w:ind w:left="720" w:hanging="720"/>
-        <w:jc w:val="both"/>
-        <w:rPr/>
-      </w:pPr>
-      <w:r>
-        <w:rPr>
-          <w:rFonts w:ascii="Georgia" w:cs="Georgia" w:eastAsia="Georgia" w:hAnsi="Georgia"/>
-          <w:b w:val="0"/>
-          <w:bCs w:val="0"/>
-          <w:i w:val="0"/>
-          <w:iCs w:val="0"/>
-          <w:sz w:val="22"/>
-          <w:szCs w:val="22"/>
-          <w:rtl w:val="0"/>
+        <w:jc w:val="left"/>
+        <w:rPr/>
+      </w:pPr>
+      <w:r>
+        <w:rPr>
+          <w:rFonts w:ascii="Georgia" w:hAnsi="Georgia" w:cs="Georgia" w:eastAsia="Georgia"/>
+          <w:b w:val="0"/>
+          <w:sz w:val="22"/>
+          <w:i w:val="0"/>
         </w:rPr>
         <w:t xml:space="preserve">Hyland, K. (2005). Stance and engagement: A model of interaction in academic discourse. </w:t>
       </w:r>
       <w:r>
         <w:rPr>
-          <w:rFonts w:ascii="Georgia" w:cs="Georgia" w:eastAsia="Georgia" w:hAnsi="Georgia"/>
-          <w:b w:val="0"/>
-          <w:bCs w:val="0"/>
-          <w:i w:val="1"/>
-          <w:iCs w:val="1"/>
-          <w:sz w:val="22"/>
-          <w:szCs w:val="22"/>
-          <w:rtl w:val="0"/>
-        </w:rPr>
-        <w:t xml:space="preserve">Discourse Studies, 7</w:t>
-      </w:r>
-      <w:r>
-        <w:rPr>
-          <w:rFonts w:ascii="Georgia" w:cs="Georgia" w:eastAsia="Georgia" w:hAnsi="Georgia"/>
-          <w:b w:val="0"/>
-          <w:bCs w:val="0"/>
-          <w:i w:val="0"/>
-          <w:iCs w:val="0"/>
-          <w:sz w:val="22"/>
-          <w:szCs w:val="22"/>
-          <w:rtl w:val="0"/>
-        </w:rPr>
-        <w:t xml:space="preserve">(2), 173–192. https://doi.org/10.1177/1461445605050365</w:t>
-      </w:r>
-      <w:r>
-        <w:rPr>
-          <w:rtl w:val="0"/>
-        </w:rPr>
+          <w:rFonts w:ascii="Georgia" w:hAnsi="Georgia" w:cs="Georgia" w:eastAsia="Georgia"/>
+          <w:b w:val="0"/>
+          <w:sz w:val="22"/>
+          <w:i/>
+          <w:iCs/>
+        </w:rPr>
+        <w:t>Discourse Studies, 7</w:t>
+      </w:r>
+      <w:r>
+        <w:rPr>
+          <w:rFonts w:ascii="Georgia" w:hAnsi="Georgia" w:cs="Georgia" w:eastAsia="Georgia"/>
+          <w:b w:val="0"/>
+          <w:sz w:val="22"/>
+          <w:i w:val="0"/>
+        </w:rPr>
+        <w:t>(2), 173–192. https://doi.org/10.1177/1461445605050365</w:t>
       </w:r>
     </w:p>
     <w:p>
       <w:pPr>
         <w:spacing w:before="0" w:after="0" w:line="480" w:lineRule="auto"/>
         <w:ind w:left="720" w:hanging="720"/>
-        <w:jc w:val="both"/>
-        <w:rPr/>
-      </w:pPr>
-      <w:r>
-        <w:rPr>
-          <w:rFonts w:ascii="Georgia" w:cs="Georgia" w:eastAsia="Georgia" w:hAnsi="Georgia"/>
-          <w:b w:val="0"/>
-          <w:bCs w:val="0"/>
-          <w:i w:val="0"/>
-          <w:iCs w:val="0"/>
-          <w:sz w:val="22"/>
-          <w:szCs w:val="22"/>
-          <w:rtl w:val="0"/>
+        <w:jc w:val="left"/>
+        <w:rPr/>
+      </w:pPr>
+      <w:r>
+        <w:rPr>
+          <w:rFonts w:ascii="Georgia" w:hAnsi="Georgia" w:cs="Georgia" w:eastAsia="Georgia"/>
+          <w:b w:val="0"/>
+          <w:sz w:val="22"/>
+          <w:i w:val="0"/>
         </w:rPr>
         <w:t xml:space="preserve">Hyland, K., &amp; Milton, J. (1997). Qualification and certainty in L1 and L2 students’ writing. </w:t>
       </w:r>
       <w:r>
         <w:rPr>
-          <w:rFonts w:ascii="Georgia" w:cs="Georgia" w:eastAsia="Georgia" w:hAnsi="Georgia"/>
-          <w:b w:val="0"/>
-          <w:bCs w:val="0"/>
-          <w:i w:val="1"/>
-          <w:iCs w:val="1"/>
-          <w:sz w:val="22"/>
-          <w:szCs w:val="22"/>
-          <w:rtl w:val="0"/>
-        </w:rPr>
-        <w:t xml:space="preserve">Journal of Second Language Writing, 6</w:t>
-      </w:r>
-      <w:r>
-        <w:rPr>
-          <w:rFonts w:ascii="Georgia" w:cs="Georgia" w:eastAsia="Georgia" w:hAnsi="Georgia"/>
-          <w:b w:val="0"/>
-          <w:bCs w:val="0"/>
-          <w:i w:val="0"/>
-          <w:iCs w:val="0"/>
-          <w:sz w:val="22"/>
-          <w:szCs w:val="22"/>
-          <w:rtl w:val="0"/>
-        </w:rPr>
-        <w:t xml:space="preserve">(2), 183–205. https://doi.org/10.1016/S1060-3743(97)90033-3</w:t>
-      </w:r>
-      <w:r>
-        <w:rPr>
-          <w:rtl w:val="0"/>
-        </w:rPr>
+          <w:rFonts w:ascii="Georgia" w:hAnsi="Georgia" w:cs="Georgia" w:eastAsia="Georgia"/>
+          <w:b w:val="0"/>
+          <w:sz w:val="22"/>
+          <w:i/>
+          <w:iCs/>
+        </w:rPr>
+        <w:t>Journal of Second Language Writing, 6</w:t>
+      </w:r>
+      <w:r>
+        <w:rPr>
+          <w:rFonts w:ascii="Georgia" w:hAnsi="Georgia" w:cs="Georgia" w:eastAsia="Georgia"/>
+          <w:b w:val="0"/>
+          <w:sz w:val="22"/>
+          <w:i w:val="0"/>
+        </w:rPr>
+        <w:t>(2), 183–205. https://doi.org/10.1016/S1060-3743(97)90033-3</w:t>
       </w:r>
     </w:p>
     <w:p>
       <w:pPr>
         <w:spacing w:before="0" w:after="0" w:line="480" w:lineRule="auto"/>
         <w:ind w:left="720" w:hanging="720"/>
-        <w:jc w:val="both"/>
-        <w:rPr/>
-      </w:pPr>
-      <w:r>
-        <w:rPr>
-          <w:rFonts w:ascii="Georgia" w:cs="Georgia" w:eastAsia="Georgia" w:hAnsi="Georgia"/>
-          <w:b w:val="0"/>
-          <w:bCs w:val="0"/>
-          <w:i w:val="0"/>
-          <w:iCs w:val="0"/>
-          <w:sz w:val="22"/>
-          <w:szCs w:val="22"/>
-          <w:rtl w:val="0"/>
+        <w:jc w:val="left"/>
+        <w:rPr/>
+      </w:pPr>
+      <w:r>
+        <w:rPr>
+          <w:rFonts w:ascii="Georgia" w:hAnsi="Georgia" w:cs="Georgia" w:eastAsia="Georgia"/>
+          <w:b w:val="0"/>
+          <w:sz w:val="22"/>
+          <w:i w:val="0"/>
         </w:rPr>
         <w:t xml:space="preserve">Imataki, N., &amp; Kobayashi, Y. (2024). Analyzing disciplinary variation in abstracts: Linguistic features across scientific and technical fields. </w:t>
       </w:r>
       <w:r>
         <w:rPr>
-          <w:rFonts w:ascii="Georgia" w:cs="Georgia" w:eastAsia="Georgia" w:hAnsi="Georgia"/>
-          <w:b w:val="0"/>
-          <w:bCs w:val="0"/>
-          <w:i w:val="1"/>
-          <w:iCs w:val="1"/>
-          <w:sz w:val="22"/>
-          <w:szCs w:val="22"/>
-          <w:rtl w:val="0"/>
-        </w:rPr>
-        <w:t xml:space="preserve">Linguistics and Literature Studies, 12</w:t>
-      </w:r>
-      <w:r>
-        <w:rPr>
-          <w:rFonts w:ascii="Georgia" w:cs="Georgia" w:eastAsia="Georgia" w:hAnsi="Georgia"/>
-          <w:b w:val="0"/>
-          <w:bCs w:val="0"/>
-          <w:i w:val="0"/>
-          <w:iCs w:val="0"/>
-          <w:sz w:val="22"/>
-          <w:szCs w:val="22"/>
-          <w:rtl w:val="0"/>
-        </w:rPr>
-        <w:t xml:space="preserve">(3), 19–28. https://doi.org/10.13189/lls.2024.120301</w:t>
-      </w:r>
-      <w:r>
-        <w:rPr>
-          <w:rtl w:val="0"/>
-        </w:rPr>
+          <w:rFonts w:ascii="Georgia" w:hAnsi="Georgia" w:cs="Georgia" w:eastAsia="Georgia"/>
+          <w:b w:val="0"/>
+          <w:sz w:val="22"/>
+          <w:i/>
+          <w:iCs/>
+        </w:rPr>
+        <w:t>Linguistics and Literature Studies, 12</w:t>
+      </w:r>
+      <w:r>
+        <w:rPr>
+          <w:rFonts w:ascii="Georgia" w:hAnsi="Georgia" w:cs="Georgia" w:eastAsia="Georgia"/>
+          <w:b w:val="0"/>
+          <w:sz w:val="22"/>
+          <w:i w:val="0"/>
+        </w:rPr>
+        <w:t>(3), 19–28. https://doi.org/10.13189/lls.2024.120301</w:t>
       </w:r>
     </w:p>
     <w:p>
       <w:pPr>
         <w:spacing w:before="0" w:after="0" w:line="480" w:lineRule="auto"/>
         <w:ind w:left="720" w:hanging="720"/>
-        <w:jc w:val="both"/>
-        <w:rPr/>
-      </w:pPr>
-      <w:r>
-        <w:rPr>
-          <w:rFonts w:ascii="Georgia" w:cs="Georgia" w:eastAsia="Georgia" w:hAnsi="Georgia"/>
-          <w:b w:val="0"/>
-          <w:bCs w:val="0"/>
-          <w:i w:val="0"/>
-          <w:iCs w:val="0"/>
-          <w:sz w:val="22"/>
-          <w:szCs w:val="22"/>
-          <w:rtl w:val="0"/>
-        </w:rPr>
-        <w:t>Khunasathitchai, K., Sittironnarit, S., Sinturat, T., &amp; Kumdee, S. (2025). Move analysis and hedge use in the research paper abstracts of Thai EFL English-majored undergraduates. rEFLections, 32(2), 951–973. https://doi.org/10.61508/refl.v32i2.282512</w:t>
-      </w:r>
-      <w:r>
-        <w:rPr>
-          <w:rFonts w:ascii="Georgia" w:cs="Georgia" w:eastAsia="Georgia" w:hAnsi="Georgia"/>
-          <w:b w:val="0"/>
-          <w:bCs w:val="0"/>
-          <w:i w:val="1"/>
-          <w:iCs w:val="1"/>
-          <w:sz w:val="22"/>
-          <w:szCs w:val="22"/>
-          <w:rtl w:val="0"/>
-        </w:rPr>
-      </w:r>
-      <w:r>
-        <w:rPr>
-          <w:rFonts w:ascii="Georgia" w:cs="Georgia" w:eastAsia="Georgia" w:hAnsi="Georgia"/>
-          <w:b w:val="0"/>
-          <w:bCs w:val="0"/>
-          <w:i w:val="0"/>
-          <w:iCs w:val="0"/>
-          <w:sz w:val="22"/>
-          <w:szCs w:val="22"/>
-          <w:rtl w:val="0"/>
-        </w:rPr>
-      </w:r>
-      <w:r>
-        <w:rPr>
-          <w:rtl w:val="0"/>
-        </w:rPr>
+        <w:jc w:val="left"/>
+        <w:rPr/>
+      </w:pPr>
+      <w:r>
+        <w:rPr>
+          <w:rFonts w:ascii="Georgia" w:hAnsi="Georgia" w:cs="Georgia" w:eastAsia="Georgia"/>
+          <w:b w:val="0"/>
+          <w:sz w:val="22"/>
+          <w:i w:val="0"/>
+        </w:rPr>
+        <w:t xml:space="preserve">Khunasathitchai, K., Sittironnarit, S., Sinturat, T., &amp; Kumdee, S. (2025). Move analysis and hedge use in the research paper abstracts of Thai EFL English-majored undergraduates. </w:t>
+      </w:r>
+      <w:r>
+        <w:rPr>
+          <w:rFonts w:ascii="Georgia" w:hAnsi="Georgia" w:cs="Georgia" w:eastAsia="Georgia"/>
+          <w:b w:val="0"/>
+          <w:sz w:val="22"/>
+          <w:i/>
+          <w:iCs/>
+        </w:rPr>
+        <w:t>rEFLections, 32</w:t>
+      </w:r>
+      <w:r>
+        <w:rPr>
+          <w:rFonts w:ascii="Georgia" w:hAnsi="Georgia" w:cs="Georgia" w:eastAsia="Georgia"/>
+          <w:b w:val="0"/>
+          <w:sz w:val="22"/>
+          <w:i w:val="0"/>
+        </w:rPr>
+        <w:t>(2), 951–973. https://doi.org/10.61508/refl.v32i2.282512</w:t>
       </w:r>
     </w:p>
     <w:p>
       <w:pPr>
         <w:spacing w:before="0" w:after="0" w:line="480" w:lineRule="auto"/>
         <w:ind w:left="720" w:hanging="720"/>
-        <w:jc w:val="both"/>
-        <w:rPr/>
-      </w:pPr>
-      <w:r>
-        <w:rPr>
-          <w:rFonts w:ascii="Georgia" w:cs="Georgia" w:eastAsia="Georgia" w:hAnsi="Georgia"/>
-          <w:b w:val="0"/>
-          <w:bCs w:val="0"/>
-          <w:i w:val="0"/>
-          <w:iCs w:val="0"/>
-          <w:sz w:val="22"/>
-          <w:szCs w:val="22"/>
-          <w:rtl w:val="0"/>
-        </w:rPr>
-        <w:t xml:space="preserve">Landis, J. R., &amp; Koch, G. G. (1977). The measurement of observer agreement for categorical data. Biometrics, 33(1), 159–174. https://doi.org/10.2307/2529310</w:t>
-      </w:r>
-      <w:r>
-        <w:rPr>
-          <w:rtl w:val="0"/>
-        </w:rPr>
+        <w:jc w:val="left"/>
+        <w:rPr/>
+      </w:pPr>
+      <w:r>
+        <w:rPr>
+          <w:rFonts w:ascii="Georgia" w:hAnsi="Georgia" w:cs="Georgia" w:eastAsia="Georgia"/>
+          <w:b w:val="0"/>
+          <w:sz w:val="22"/>
+          <w:i w:val="0"/>
+        </w:rPr>
+        <w:t xml:space="preserve">Landis, J. R., &amp; Koch, G. G. (1977). The measurement of observer agreement for categorical data. </w:t>
+      </w:r>
+      <w:r>
+        <w:rPr>
+          <w:rFonts w:ascii="Georgia" w:hAnsi="Georgia" w:cs="Georgia" w:eastAsia="Georgia"/>
+          <w:b w:val="0"/>
+          <w:sz w:val="22"/>
+          <w:i/>
+          <w:iCs/>
+        </w:rPr>
+        <w:t>Biometrics, 33</w:t>
+      </w:r>
+      <w:r>
+        <w:rPr>
+          <w:rFonts w:ascii="Georgia" w:hAnsi="Georgia" w:cs="Georgia" w:eastAsia="Georgia"/>
+          <w:b w:val="0"/>
+          <w:sz w:val="22"/>
+          <w:i w:val="0"/>
+        </w:rPr>
+        <w:t>(1), 159–174. https://doi.org/10.2307/2529310</w:t>
       </w:r>
     </w:p>
     <w:p>
       <w:pPr>
         <w:spacing w:before="0" w:after="0" w:line="480" w:lineRule="auto"/>
         <w:ind w:left="720" w:hanging="720"/>
-        <w:jc w:val="both"/>
-        <w:rPr/>
-      </w:pPr>
-      <w:r>
-        <w:rPr>
-          <w:rFonts w:ascii="Georgia" w:cs="Georgia" w:eastAsia="Georgia" w:hAnsi="Georgia"/>
-          <w:b w:val="0"/>
-          <w:bCs w:val="0"/>
-          <w:i w:val="0"/>
-          <w:iCs w:val="0"/>
-          <w:sz w:val="22"/>
-          <w:szCs w:val="22"/>
-          <w:rtl w:val="0"/>
-        </w:rPr>
-        <w:t xml:space="preserve">Lopez, R. M. C., Pedida, J. A., Alzate, L. J. A., &amp; Eustaquio, M. T. L. (2025). Language of caution and certainty: Writing proficiency in hedges and boosters in student essays. International Journal of Research and Innovation in Social Science, 9(11), 6176–6196. https://doi.org/10.47772/IJRISS.2025.91100485</w:t>
+        <w:jc w:val="left"/>
+        <w:rPr/>
+      </w:pPr>
+      <w:r>
+        <w:rPr>
+          <w:rFonts w:ascii="Georgia" w:hAnsi="Georgia" w:cs="Georgia" w:eastAsia="Georgia"/>
+          <w:b w:val="0"/>
+          <w:sz w:val="22"/>
+          <w:i w:val="0"/>
+        </w:rPr>
+        <w:t xml:space="preserve">Lopez, R. M. C., Pedida, J. A., Alzate, L. J. A., &amp; Eustaquio, M. T. L. (2025). Language of caution and certainty: Writing proficiency in hedges and boosters in student essays. </w:t>
+      </w:r>
+      <w:r>
+        <w:rPr>
+          <w:rFonts w:ascii="Georgia" w:hAnsi="Georgia" w:cs="Georgia" w:eastAsia="Georgia"/>
+          <w:b w:val="0"/>
+          <w:sz w:val="22"/>
+          <w:i/>
+          <w:iCs/>
+        </w:rPr>
+        <w:t>International Journal of Research and Innovation in Social Science, 9</w:t>
+      </w:r>
+      <w:r>
+        <w:rPr>
+          <w:rFonts w:ascii="Georgia" w:hAnsi="Georgia" w:cs="Georgia" w:eastAsia="Georgia"/>
+          <w:b w:val="0"/>
+          <w:sz w:val="22"/>
+          <w:i w:val="0"/>
+        </w:rPr>
+        <w:t>(11), 6176–6196. https://doi.org/10.47772/IJRISS.2025.91100485</w:t>
       </w:r>
     </w:p>
     <w:p>
       <w:pPr>
         <w:spacing w:before="0" w:after="0" w:line="480" w:lineRule="auto"/>
         <w:ind w:left="720" w:hanging="720"/>
-        <w:jc w:val="both"/>
-        <w:rPr/>
-      </w:pPr>
-      <w:r>
-        <w:rPr>
-          <w:rFonts w:ascii="Georgia" w:cs="Georgia" w:eastAsia="Georgia" w:hAnsi="Georgia"/>
-          <w:b w:val="0"/>
-          <w:bCs w:val="0"/>
-          <w:i w:val="0"/>
-          <w:iCs w:val="0"/>
-          <w:sz w:val="22"/>
-          <w:szCs w:val="22"/>
-          <w:rtl w:val="0"/>
+        <w:jc w:val="left"/>
+        <w:rPr/>
+      </w:pPr>
+      <w:r>
+        <w:rPr>
+          <w:rFonts w:ascii="Georgia" w:hAnsi="Georgia" w:cs="Georgia" w:eastAsia="Georgia"/>
+          <w:b w:val="0"/>
+          <w:sz w:val="22"/>
+          <w:i w:val="0"/>
         </w:rPr>
         <w:t xml:space="preserve">Mohammed, S. J. (2011). </w:t>
       </w:r>
       <w:r>
         <w:rPr>
-          <w:rFonts w:ascii="Georgia" w:cs="Georgia" w:eastAsia="Georgia" w:hAnsi="Georgia"/>
-          <w:b w:val="0"/>
-          <w:bCs w:val="0"/>
-          <w:i w:val="1"/>
-          <w:iCs w:val="1"/>
-          <w:sz w:val="22"/>
-          <w:szCs w:val="22"/>
-          <w:rtl w:val="0"/>
-        </w:rPr>
-        <w:t xml:space="preserve">Lexical hedges: A study of cultural and disciplinary variation in academic research articles</w:t>
-      </w:r>
-      <w:r>
-        <w:rPr>
-          <w:rFonts w:ascii="Georgia" w:cs="Georgia" w:eastAsia="Georgia" w:hAnsi="Georgia"/>
-          <w:b w:val="0"/>
-          <w:bCs w:val="0"/>
-          <w:i w:val="0"/>
-          <w:iCs w:val="0"/>
-          <w:sz w:val="22"/>
-          <w:szCs w:val="22"/>
-          <w:rtl w:val="0"/>
+          <w:rFonts w:ascii="Georgia" w:hAnsi="Georgia" w:cs="Georgia" w:eastAsia="Georgia"/>
+          <w:b w:val="0"/>
+          <w:sz w:val="22"/>
+          <w:i/>
+          <w:iCs/>
+        </w:rPr>
+        <w:t>Lexical hedges: A study of cultural and disciplinary variation in academic research articles</w:t>
+      </w:r>
+      <w:r>
+        <w:rPr>
+          <w:rFonts w:ascii="Georgia" w:hAnsi="Georgia" w:cs="Georgia" w:eastAsia="Georgia"/>
+          <w:b w:val="0"/>
+          <w:sz w:val="22"/>
+          <w:i w:val="0"/>
         </w:rPr>
         <w:t xml:space="preserve"> [Master’s thesis, Universiti Teknologi MARA]. CORE. https://core.ac.uk/download/78277430.pdf</w:t>
-      </w:r>
-      <w:r>
-        <w:rPr>
-          <w:rtl w:val="0"/>
-        </w:rPr>
       </w:r>
     </w:p>
     <w:p>
       <w:pPr>
         <w:spacing w:before="0" w:after="0" w:line="480" w:lineRule="auto"/>
         <w:ind w:left="720" w:hanging="720"/>
-        <w:jc w:val="both"/>
-        <w:rPr/>
-      </w:pPr>
-      <w:r>
-        <w:rPr>
-          <w:rFonts w:ascii="Georgia" w:cs="Georgia" w:eastAsia="Georgia" w:hAnsi="Georgia"/>
-          <w:b w:val="0"/>
-          <w:bCs w:val="0"/>
-          <w:i w:val="0"/>
-          <w:iCs w:val="0"/>
-          <w:sz w:val="22"/>
-          <w:szCs w:val="22"/>
-          <w:rtl w:val="0"/>
+        <w:jc w:val="left"/>
+        <w:rPr/>
+      </w:pPr>
+      <w:r>
+        <w:rPr>
+          <w:rFonts w:ascii="Georgia" w:hAnsi="Georgia" w:cs="Georgia" w:eastAsia="Georgia"/>
+          <w:b w:val="0"/>
+          <w:sz w:val="22"/>
+          <w:i w:val="0"/>
         </w:rPr>
         <w:t xml:space="preserve">Ningrum, S., Puspita, H., &amp; Mulyadi, A. I. (2024). Hedges and boosters in academic writing of ASEAN EFL learners. </w:t>
       </w:r>
       <w:r>
         <w:rPr>
-          <w:rFonts w:ascii="Georgia" w:cs="Georgia" w:eastAsia="Georgia" w:hAnsi="Georgia"/>
-          <w:b w:val="0"/>
-          <w:bCs w:val="0"/>
-          <w:i w:val="1"/>
-          <w:iCs w:val="1"/>
-          <w:sz w:val="22"/>
-          <w:szCs w:val="22"/>
-          <w:rtl w:val="0"/>
-        </w:rPr>
-        <w:t xml:space="preserve">Journal of English Education and Teaching, 8</w:t>
-      </w:r>
-      <w:r>
-        <w:rPr>
-          <w:rFonts w:ascii="Georgia" w:cs="Georgia" w:eastAsia="Georgia" w:hAnsi="Georgia"/>
-          <w:b w:val="0"/>
-          <w:bCs w:val="0"/>
-          <w:i w:val="0"/>
-          <w:iCs w:val="0"/>
-          <w:sz w:val="22"/>
-          <w:szCs w:val="22"/>
-          <w:rtl w:val="0"/>
-        </w:rPr>
-        <w:t xml:space="preserve">(1), 202–218. https://doi.org/10.33369/jeet.8.1.202-218</w:t>
-      </w:r>
-      <w:r>
-        <w:rPr>
-          <w:rtl w:val="0"/>
-        </w:rPr>
+          <w:rFonts w:ascii="Georgia" w:hAnsi="Georgia" w:cs="Georgia" w:eastAsia="Georgia"/>
+          <w:b w:val="0"/>
+          <w:sz w:val="22"/>
+          <w:i/>
+          <w:iCs/>
+        </w:rPr>
+        <w:t>Journal of English Education and Teaching, 8</w:t>
+      </w:r>
+      <w:r>
+        <w:rPr>
+          <w:rFonts w:ascii="Georgia" w:hAnsi="Georgia" w:cs="Georgia" w:eastAsia="Georgia"/>
+          <w:b w:val="0"/>
+          <w:sz w:val="22"/>
+          <w:i w:val="0"/>
+        </w:rPr>
+        <w:t>(1), 202–218. https://doi.org/10.33369/jeet.8.1.202-218</w:t>
       </w:r>
     </w:p>
     <w:p>
       <w:pPr>
         <w:spacing w:before="0" w:after="0" w:line="480" w:lineRule="auto"/>
         <w:ind w:left="720" w:hanging="720"/>
-        <w:jc w:val="both"/>
-        <w:rPr/>
-      </w:pPr>
-      <w:r>
-        <w:rPr>
-          <w:rFonts w:ascii="Georgia" w:cs="Georgia" w:eastAsia="Georgia" w:hAnsi="Georgia"/>
-          <w:b w:val="0"/>
-          <w:bCs w:val="0"/>
-          <w:i w:val="0"/>
-          <w:iCs w:val="0"/>
-          <w:sz w:val="22"/>
-          <w:szCs w:val="22"/>
-          <w:rtl w:val="0"/>
+        <w:jc w:val="left"/>
+        <w:rPr/>
+      </w:pPr>
+      <w:r>
+        <w:rPr>
+          <w:rFonts w:ascii="Georgia" w:hAnsi="Georgia" w:cs="Georgia" w:eastAsia="Georgia"/>
+          <w:b w:val="0"/>
+          <w:sz w:val="22"/>
+          <w:i w:val="0"/>
         </w:rPr>
         <w:t xml:space="preserve">Petchkij, W. (2019). Explicit teaching of hedges: Bringing hedging in academic writing into the Thai EFL classroom. </w:t>
       </w:r>
       <w:r>
         <w:rPr>
-          <w:rFonts w:ascii="Georgia" w:cs="Georgia" w:eastAsia="Georgia" w:hAnsi="Georgia"/>
-          <w:b w:val="0"/>
-          <w:bCs w:val="0"/>
-          <w:i w:val="1"/>
-          <w:iCs w:val="1"/>
-          <w:sz w:val="22"/>
-          <w:szCs w:val="22"/>
-          <w:rtl w:val="0"/>
-        </w:rPr>
-        <w:t xml:space="preserve">Electronic Journal of Foreign Language Teaching, 16(1), 95–113. https://e-flt.nus.edu.sg/wp-content/uploads/2020/09/petchkij.pdf</w:t>
-      </w:r>
-      <w:r>
-        <w:rPr>
-          <w:rtl w:val="0"/>
-        </w:rPr>
+          <w:rFonts w:ascii="Georgia" w:hAnsi="Georgia" w:cs="Georgia" w:eastAsia="Georgia"/>
+          <w:b w:val="0"/>
+          <w:sz w:val="22"/>
+          <w:i/>
+          <w:iCs/>
+        </w:rPr>
+        <w:t>Electronic Journal of Foreign Language Teaching, 16</w:t>
+      </w:r>
+      <w:r>
+        <w:rPr>
+          <w:rFonts w:ascii="Georgia" w:hAnsi="Georgia" w:cs="Georgia" w:eastAsia="Georgia"/>
+          <w:b w:val="0"/>
+          <w:sz w:val="22"/>
+          <w:i w:val="0"/>
+        </w:rPr>
+        <w:t>(1), 95–113. https://e-flt.nus.edu.sg/wp-content/uploads/2020/09/petchkij.pdf</w:t>
       </w:r>
     </w:p>
     <w:p>
       <w:pPr>
         <w:spacing w:before="0" w:after="0" w:line="480" w:lineRule="auto"/>
         <w:ind w:left="720" w:hanging="720"/>
-        <w:jc w:val="both"/>
-        <w:rPr/>
-      </w:pPr>
-      <w:r>
-        <w:rPr>
-          <w:rFonts w:ascii="Georgia" w:cs="Georgia" w:eastAsia="Georgia" w:hAnsi="Georgia"/>
-          <w:b w:val="0"/>
-          <w:bCs w:val="0"/>
-          <w:i w:val="0"/>
-          <w:iCs w:val="0"/>
-          <w:sz w:val="22"/>
-          <w:szCs w:val="22"/>
-          <w:rtl w:val="0"/>
+        <w:jc w:val="left"/>
+        <w:rPr/>
+      </w:pPr>
+      <w:r>
+        <w:rPr>
+          <w:rFonts w:ascii="Georgia" w:hAnsi="Georgia" w:cs="Georgia" w:eastAsia="Georgia"/>
+          <w:b w:val="0"/>
+          <w:sz w:val="22"/>
+          <w:i w:val="0"/>
         </w:rPr>
         <w:t xml:space="preserve">Salager-Meyer, F. (1994). Hedges and textual communicative function in medical English written discourse. </w:t>
       </w:r>
       <w:r>
         <w:rPr>
-          <w:rFonts w:ascii="Georgia" w:cs="Georgia" w:eastAsia="Georgia" w:hAnsi="Georgia"/>
-          <w:b w:val="0"/>
-          <w:bCs w:val="0"/>
-          <w:i w:val="1"/>
-          <w:iCs w:val="1"/>
-          <w:sz w:val="22"/>
-          <w:szCs w:val="22"/>
-          <w:rtl w:val="0"/>
-        </w:rPr>
-        <w:t xml:space="preserve">English for Specific Purposes, 13</w:t>
-      </w:r>
-      <w:r>
-        <w:rPr>
-          <w:rFonts w:ascii="Georgia" w:cs="Georgia" w:eastAsia="Georgia" w:hAnsi="Georgia"/>
-          <w:b w:val="0"/>
-          <w:bCs w:val="0"/>
-          <w:i w:val="0"/>
-          <w:iCs w:val="0"/>
-          <w:sz w:val="22"/>
-          <w:szCs w:val="22"/>
-          <w:rtl w:val="0"/>
-        </w:rPr>
-        <w:t xml:space="preserve">(2), 149–170. https://doi.org/10.1016/0889-4906(94)90013-2</w:t>
-      </w:r>
-      <w:r>
-        <w:rPr>
-          <w:rtl w:val="0"/>
-        </w:rPr>
+          <w:rFonts w:ascii="Georgia" w:hAnsi="Georgia" w:cs="Georgia" w:eastAsia="Georgia"/>
+          <w:b w:val="0"/>
+          <w:sz w:val="22"/>
+          <w:i/>
+          <w:iCs/>
+        </w:rPr>
+        <w:t>English for Specific Purposes, 13</w:t>
+      </w:r>
+      <w:r>
+        <w:rPr>
+          <w:rFonts w:ascii="Georgia" w:hAnsi="Georgia" w:cs="Georgia" w:eastAsia="Georgia"/>
+          <w:b w:val="0"/>
+          <w:sz w:val="22"/>
+          <w:i w:val="0"/>
+        </w:rPr>
+        <w:t>(2), 149–170. https://doi.org/10.1016/0889-4906(94)90013-2</w:t>
       </w:r>
     </w:p>
     <w:p>
       <w:pPr>
         <w:spacing w:before="0" w:after="0" w:line="480" w:lineRule="auto"/>
         <w:ind w:left="720" w:hanging="720"/>
-        <w:jc w:val="both"/>
-        <w:rPr/>
-      </w:pPr>
-      <w:r>
-        <w:rPr>
-          <w:rFonts w:ascii="Georgia" w:cs="Georgia" w:eastAsia="Georgia" w:hAnsi="Georgia"/>
-          <w:b w:val="0"/>
-          <w:bCs w:val="0"/>
-          <w:i w:val="0"/>
-          <w:iCs w:val="0"/>
-          <w:sz w:val="22"/>
-          <w:szCs w:val="22"/>
-          <w:rtl w:val="0"/>
+        <w:jc w:val="left"/>
+        <w:rPr/>
+      </w:pPr>
+      <w:r>
+        <w:rPr>
+          <w:rFonts w:ascii="Georgia" w:hAnsi="Georgia" w:cs="Georgia" w:eastAsia="Georgia"/>
+          <w:b w:val="0"/>
+          <w:sz w:val="22"/>
+          <w:i w:val="0"/>
         </w:rPr>
         <w:t xml:space="preserve">Suratno, A., &amp; Aydawati, E. N. (2025). Hedging strategies in non-science theses: A corpus-based analysis of discussion sections. </w:t>
       </w:r>
       <w:r>
         <w:rPr>
-          <w:rFonts w:ascii="Georgia" w:cs="Georgia" w:eastAsia="Georgia" w:hAnsi="Georgia"/>
-          <w:b w:val="0"/>
-          <w:bCs w:val="0"/>
-          <w:i w:val="1"/>
-          <w:iCs w:val="1"/>
-          <w:sz w:val="22"/>
-          <w:szCs w:val="22"/>
-          <w:rtl w:val="0"/>
-        </w:rPr>
-        <w:t xml:space="preserve">ETERNAL (English Teaching Journal), 16</w:t>
-      </w:r>
-      <w:r>
-        <w:rPr>
-          <w:rFonts w:ascii="Georgia" w:cs="Georgia" w:eastAsia="Georgia" w:hAnsi="Georgia"/>
-          <w:b w:val="0"/>
-          <w:bCs w:val="0"/>
-          <w:i w:val="0"/>
-          <w:iCs w:val="0"/>
-          <w:sz w:val="22"/>
-          <w:szCs w:val="22"/>
-          <w:rtl w:val="0"/>
-        </w:rPr>
-        <w:t xml:space="preserve">(1), 37–52. https://journal2.upgris.ac.id/index.php/eternal/article/view/1059</w:t>
-      </w:r>
-      <w:r>
-        <w:rPr>
-          <w:rtl w:val="0"/>
-        </w:rPr>
+          <w:rFonts w:ascii="Georgia" w:hAnsi="Georgia" w:cs="Georgia" w:eastAsia="Georgia"/>
+          <w:b w:val="0"/>
+          <w:sz w:val="22"/>
+          <w:i/>
+          <w:iCs/>
+        </w:rPr>
+        <w:t>ETERNAL (English Teaching Journal), 16</w:t>
+      </w:r>
+      <w:r>
+        <w:rPr>
+          <w:rFonts w:ascii="Georgia" w:hAnsi="Georgia" w:cs="Georgia" w:eastAsia="Georgia"/>
+          <w:b w:val="0"/>
+          <w:sz w:val="22"/>
+          <w:i w:val="0"/>
+        </w:rPr>
+        <w:t>(1), 37–52. https://journal2.upgris.ac.id/index.php/eternal/article/view/1059</w:t>
       </w:r>
     </w:p>
     <w:p>
       <w:pPr>
         <w:spacing w:before="0" w:after="0" w:line="480" w:lineRule="auto"/>
         <w:ind w:left="720" w:hanging="720"/>
-        <w:jc w:val="both"/>
-        <w:rPr/>
-      </w:pPr>
-      <w:r>
-        <w:rPr>
-          <w:rFonts w:ascii="Georgia" w:cs="Georgia" w:eastAsia="Georgia" w:hAnsi="Georgia"/>
-          <w:b w:val="0"/>
-          <w:bCs w:val="0"/>
-          <w:i w:val="0"/>
-          <w:iCs w:val="0"/>
-          <w:sz w:val="22"/>
-          <w:szCs w:val="22"/>
-          <w:rtl w:val="0"/>
+        <w:jc w:val="left"/>
+        <w:rPr/>
+      </w:pPr>
+      <w:r>
+        <w:rPr>
+          <w:rFonts w:ascii="Georgia" w:hAnsi="Georgia" w:cs="Georgia" w:eastAsia="Georgia"/>
+          <w:b w:val="0"/>
+          <w:sz w:val="22"/>
+          <w:i w:val="0"/>
         </w:rPr>
         <w:t xml:space="preserve">Villanueva, V. S. (2014). Hedging devices in Philippine newspaper editorials. </w:t>
       </w:r>
       <w:r>
         <w:rPr>
-          <w:rFonts w:ascii="Georgia" w:cs="Georgia" w:eastAsia="Georgia" w:hAnsi="Georgia"/>
-          <w:b w:val="0"/>
-          <w:bCs w:val="0"/>
-          <w:i w:val="1"/>
-          <w:iCs w:val="1"/>
-          <w:sz w:val="22"/>
-          <w:szCs w:val="22"/>
-          <w:rtl w:val="0"/>
-        </w:rPr>
-        <w:t xml:space="preserve">Asian Journal of English Language Studies, 2</w:t>
-      </w:r>
-      <w:r>
-        <w:rPr>
-          <w:rFonts w:ascii="Georgia" w:cs="Georgia" w:eastAsia="Georgia" w:hAnsi="Georgia"/>
-          <w:b w:val="0"/>
-          <w:bCs w:val="0"/>
-          <w:i w:val="0"/>
-          <w:iCs w:val="0"/>
-          <w:sz w:val="22"/>
-          <w:szCs w:val="22"/>
-          <w:rtl w:val="0"/>
-        </w:rPr>
-        <w:t xml:space="preserve">, 103–117. https://doi.org/10.59960/2.a5</w:t>
-      </w:r>
-      <w:r>
-        <w:rPr>
-          <w:rtl w:val="0"/>
-        </w:rPr>
+          <w:rFonts w:ascii="Georgia" w:hAnsi="Georgia" w:cs="Georgia" w:eastAsia="Georgia"/>
+          <w:b w:val="0"/>
+          <w:sz w:val="22"/>
+          <w:i/>
+          <w:iCs/>
+        </w:rPr>
+        <w:t>Asian Journal of English Language Studies, 2</w:t>
+      </w:r>
+      <w:r>
+        <w:rPr>
+          <w:rFonts w:ascii="Georgia" w:hAnsi="Georgia" w:cs="Georgia" w:eastAsia="Georgia"/>
+          <w:b w:val="0"/>
+          <w:sz w:val="22"/>
+          <w:i w:val="0"/>
+        </w:rPr>
+        <w:t>, 103–117. https://doi.org/10.59960/2.a5</w:t>
       </w:r>
     </w:p>
     <w:p>
       <w:pPr>
         <w:spacing w:before="0" w:after="0" w:line="480" w:lineRule="auto"/>
         <w:ind w:left="720" w:hanging="720"/>
-        <w:jc w:val="both"/>
+        <w:jc w:val="left"/>
         <w:rPr/>
         <w:sectPr>
           <w:headerReference r:id="rId15" w:type="default"/>
@@ -12715,47 +12519,31 @@
       </w:pPr>
       <w:r>
         <w:rPr>
-          <w:rFonts w:ascii="Georgia" w:cs="Georgia" w:eastAsia="Georgia" w:hAnsi="Georgia"/>
-          <w:b w:val="0"/>
-          <w:bCs w:val="0"/>
-          <w:i w:val="0"/>
-          <w:iCs w:val="0"/>
-          <w:sz w:val="22"/>
-          <w:szCs w:val="22"/>
-          <w:rtl w:val="0"/>
+          <w:rFonts w:ascii="Georgia" w:hAnsi="Georgia" w:cs="Georgia" w:eastAsia="Georgia"/>
+          <w:b w:val="0"/>
+          <w:sz w:val="22"/>
+          <w:i w:val="0"/>
         </w:rPr>
         <w:t xml:space="preserve">Wang, X. (2022). </w:t>
       </w:r>
       <w:r>
         <w:rPr>
-          <w:rFonts w:ascii="Georgia" w:cs="Georgia" w:eastAsia="Georgia" w:hAnsi="Georgia"/>
-          <w:b w:val="0"/>
-          <w:bCs w:val="0"/>
-          <w:i w:val="1"/>
-          <w:iCs w:val="1"/>
-          <w:sz w:val="22"/>
-          <w:szCs w:val="22"/>
-          <w:rtl w:val="0"/>
-        </w:rPr>
-        <w:t xml:space="preserve">Hedging in academic writing: Cross-disciplinary comparisons in the Michigan Corpus of Upper-Level Student Papers (MICUSP)</w:t>
-      </w:r>
-      <w:r>
-        <w:rPr>
-          <w:rFonts w:ascii="Georgia" w:cs="Georgia" w:eastAsia="Georgia" w:hAnsi="Georgia"/>
-          <w:b w:val="0"/>
-          <w:bCs w:val="0"/>
-          <w:i w:val="0"/>
-          <w:iCs w:val="0"/>
-          <w:sz w:val="22"/>
-          <w:szCs w:val="22"/>
-          <w:rtl w:val="0"/>
+          <w:rFonts w:ascii="Georgia" w:hAnsi="Georgia" w:cs="Georgia" w:eastAsia="Georgia"/>
+          <w:b w:val="0"/>
+          <w:sz w:val="22"/>
+          <w:i/>
+          <w:iCs/>
+        </w:rPr>
+        <w:t>Hedging in academic writing: Cross-disciplinary comparisons in the Michigan Corpus of Upper-Level Student Papers (MICUSP)</w:t>
+      </w:r>
+      <w:r>
+        <w:rPr>
+          <w:rFonts w:ascii="Georgia" w:hAnsi="Georgia" w:cs="Georgia" w:eastAsia="Georgia"/>
+          <w:b w:val="0"/>
+          <w:sz w:val="22"/>
+          <w:i w:val="0"/>
         </w:rPr>
         <w:t xml:space="preserve"> [Preprint]. OSF Preprints. https://osf.io/preprints/edarxiv/5xj27</w:t>
-      </w:r>
-      <w:r>
-        <w:rPr>
-          <w:rtl w:val="0"/>
-        </w:rPr>
       </w:r>
     </w:p>
     <w:p>

</xml_diff>

<commit_message>
Draft_053: restore Academia.edu URL on Crompton reference
</commit_message>
<xml_diff>
--- a/thesis/003_ThesisProposal_Draft_053.docx
+++ b/thesis/003_ThesisProposal_Draft_053.docx
@@ -11902,7 +11902,6 @@
           <w:rFonts w:ascii="Georgia" w:hAnsi="Georgia" w:cs="Georgia" w:eastAsia="Georgia"/>
           <w:b w:val="0"/>
           <w:sz w:val="22"/>
-          <w:i w:val="0"/>
         </w:rPr>
         <w:t xml:space="preserve">Crompton, P. (1997). Hedging in academic writing: Some theoretical problems. </w:t>
       </w:r>
@@ -11921,9 +11920,8 @@
           <w:rFonts w:ascii="Georgia" w:hAnsi="Georgia" w:cs="Georgia" w:eastAsia="Georgia"/>
           <w:b w:val="0"/>
           <w:sz w:val="22"/>
-          <w:i w:val="0"/>
-        </w:rPr>
-        <w:t>(4), 271–287. https://doi.org/10.1016/S0889-4906(97)00007-0</w:t>
+        </w:rPr>
+        <w:t>(4), 271–287. https://www.academia.edu/50160307/Hedging_in_academic_writing_Some_theoretical_problems</w:t>
       </w:r>
     </w:p>
     <w:p>

</xml_diff>